<commit_message>
2rd Lecture on LL
</commit_message>
<xml_diff>
--- a/Notes/LL.docx
+++ b/Notes/LL.docx
@@ -203,6 +203,24 @@
     </w:p>
     <w:p>
       <w:pPr>
+        <w:pStyle w:val="ListParagraph"/>
+        <w:numPr>
+          <w:ilvl w:val="0"/>
+          <w:numId w:val="1"/>
+        </w:numPr>
+        <w:rPr>
+          <w:lang w:val="en-US"/>
+        </w:rPr>
+      </w:pPr>
+      <w:r>
+        <w:rPr>
+          <w:lang w:val="en-US"/>
+        </w:rPr>
+        <w:t>Move the mover to the temp</w:t>
+      </w:r>
+    </w:p>
+    <w:p>
+      <w:pPr>
         <w:rPr>
           <w:b/>
           <w:bCs/>
@@ -503,6 +521,1538 @@
         </w:rPr>
         <w:t>Outside the loop return 0</w:t>
       </w:r>
+    </w:p>
+    <w:p>
+      <w:pPr>
+        <w:rPr>
+          <w:lang w:val="en-US"/>
+        </w:rPr>
+      </w:pPr>
+    </w:p>
+    <w:p>
+      <w:pPr>
+        <w:rPr>
+          <w:lang w:val="en-US"/>
+        </w:rPr>
+      </w:pPr>
+    </w:p>
+    <w:p>
+      <w:pPr>
+        <w:rPr>
+          <w:lang w:val="en-US"/>
+        </w:rPr>
+      </w:pPr>
+    </w:p>
+    <w:p>
+      <w:pPr>
+        <w:rPr>
+          <w:lang w:val="en-US"/>
+        </w:rPr>
+      </w:pPr>
+    </w:p>
+    <w:p>
+      <w:pPr>
+        <w:rPr>
+          <w:b/>
+          <w:bCs/>
+          <w:lang w:val="en-US"/>
+        </w:rPr>
+      </w:pPr>
+      <w:r>
+        <w:rPr>
+          <w:b/>
+          <w:bCs/>
+          <w:lang w:val="en-US"/>
+        </w:rPr>
+        <w:lastRenderedPageBreak/>
+        <w:t>2nd LECTURE</w:t>
+      </w:r>
+    </w:p>
+    <w:p>
+      <w:pPr>
+        <w:rPr>
+          <w:lang w:val="en-US"/>
+        </w:rPr>
+      </w:pPr>
+      <w:r>
+        <w:rPr>
+          <w:lang w:val="en-US"/>
+        </w:rPr>
+        <w:t>TOPICS COVERED</w:t>
+      </w:r>
+    </w:p>
+    <w:p>
+      <w:pPr>
+        <w:rPr>
+          <w:lang w:val="en-US"/>
+        </w:rPr>
+      </w:pPr>
+      <w:r>
+        <w:rPr>
+          <w:lang w:val="en-US"/>
+        </w:rPr>
+        <w:t>DELETION OF LL</w:t>
+      </w:r>
+    </w:p>
+    <w:p>
+      <w:pPr>
+        <w:pStyle w:val="ListParagraph"/>
+        <w:numPr>
+          <w:ilvl w:val="0"/>
+          <w:numId w:val="5"/>
+        </w:numPr>
+        <w:rPr>
+          <w:lang w:val="en-US"/>
+        </w:rPr>
+      </w:pPr>
+      <w:r>
+        <w:rPr>
+          <w:lang w:val="en-US"/>
+        </w:rPr>
+        <w:t>HEAD</w:t>
+      </w:r>
+    </w:p>
+    <w:p>
+      <w:pPr>
+        <w:pStyle w:val="ListParagraph"/>
+        <w:numPr>
+          <w:ilvl w:val="0"/>
+          <w:numId w:val="5"/>
+        </w:numPr>
+        <w:rPr>
+          <w:lang w:val="en-US"/>
+        </w:rPr>
+      </w:pPr>
+      <w:r>
+        <w:rPr>
+          <w:lang w:val="en-US"/>
+        </w:rPr>
+        <w:t>TAIL</w:t>
+      </w:r>
+    </w:p>
+    <w:p>
+      <w:pPr>
+        <w:pStyle w:val="ListParagraph"/>
+        <w:numPr>
+          <w:ilvl w:val="0"/>
+          <w:numId w:val="5"/>
+        </w:numPr>
+        <w:rPr>
+          <w:lang w:val="en-US"/>
+        </w:rPr>
+      </w:pPr>
+      <w:r>
+        <w:rPr>
+          <w:lang w:val="en-US"/>
+        </w:rPr>
+        <w:t>POSITION</w:t>
+      </w:r>
+    </w:p>
+    <w:p>
+      <w:pPr>
+        <w:pStyle w:val="ListParagraph"/>
+        <w:numPr>
+          <w:ilvl w:val="0"/>
+          <w:numId w:val="5"/>
+        </w:numPr>
+        <w:rPr>
+          <w:lang w:val="en-US"/>
+        </w:rPr>
+      </w:pPr>
+      <w:r>
+        <w:rPr>
+          <w:lang w:val="en-US"/>
+        </w:rPr>
+        <w:t>POSITION VALUE</w:t>
+      </w:r>
+    </w:p>
+    <w:p>
+      <w:pPr>
+        <w:rPr>
+          <w:lang w:val="en-US"/>
+        </w:rPr>
+      </w:pPr>
+      <w:r>
+        <w:rPr>
+          <w:lang w:val="en-US"/>
+        </w:rPr>
+        <w:t>INSERTION OF LL</w:t>
+      </w:r>
+    </w:p>
+    <w:p>
+      <w:pPr>
+        <w:pStyle w:val="ListParagraph"/>
+        <w:numPr>
+          <w:ilvl w:val="0"/>
+          <w:numId w:val="6"/>
+        </w:numPr>
+        <w:rPr>
+          <w:lang w:val="en-US"/>
+        </w:rPr>
+      </w:pPr>
+      <w:r>
+        <w:rPr>
+          <w:lang w:val="en-US"/>
+        </w:rPr>
+        <w:t>HEAD</w:t>
+      </w:r>
+    </w:p>
+    <w:p>
+      <w:pPr>
+        <w:pStyle w:val="ListParagraph"/>
+        <w:numPr>
+          <w:ilvl w:val="0"/>
+          <w:numId w:val="6"/>
+        </w:numPr>
+        <w:rPr>
+          <w:lang w:val="en-US"/>
+        </w:rPr>
+      </w:pPr>
+      <w:r>
+        <w:rPr>
+          <w:lang w:val="en-US"/>
+        </w:rPr>
+        <w:t>TAIL</w:t>
+      </w:r>
+    </w:p>
+    <w:p>
+      <w:pPr>
+        <w:pStyle w:val="ListParagraph"/>
+        <w:numPr>
+          <w:ilvl w:val="0"/>
+          <w:numId w:val="6"/>
+        </w:numPr>
+        <w:rPr>
+          <w:lang w:val="en-US"/>
+        </w:rPr>
+      </w:pPr>
+      <w:r>
+        <w:rPr>
+          <w:lang w:val="en-US"/>
+        </w:rPr>
+        <w:t>POSITION</w:t>
+      </w:r>
+    </w:p>
+    <w:p>
+      <w:pPr>
+        <w:pStyle w:val="ListParagraph"/>
+        <w:numPr>
+          <w:ilvl w:val="0"/>
+          <w:numId w:val="6"/>
+        </w:numPr>
+        <w:rPr>
+          <w:lang w:val="en-US"/>
+        </w:rPr>
+      </w:pPr>
+      <w:r>
+        <w:rPr>
+          <w:lang w:val="en-US"/>
+        </w:rPr>
+        <w:t>POSITION VALUE</w:t>
+      </w:r>
+    </w:p>
+    <w:p>
+      <w:pPr>
+        <w:rPr>
+          <w:lang w:val="en-US"/>
+        </w:rPr>
+      </w:pPr>
+    </w:p>
+    <w:p>
+      <w:pPr>
+        <w:rPr>
+          <w:b/>
+          <w:bCs/>
+          <w:lang w:val="en-US"/>
+        </w:rPr>
+      </w:pPr>
+      <w:r>
+        <w:rPr>
+          <w:b/>
+          <w:bCs/>
+          <w:lang w:val="en-US"/>
+        </w:rPr>
+        <w:t>DELETION OF LL</w:t>
+      </w:r>
+    </w:p>
+    <w:p>
+      <w:pPr>
+        <w:rPr>
+          <w:b/>
+          <w:bCs/>
+          <w:lang w:val="en-US"/>
+        </w:rPr>
+      </w:pPr>
+      <w:r>
+        <w:rPr>
+          <w:b/>
+          <w:bCs/>
+          <w:lang w:val="en-US"/>
+        </w:rPr>
+        <w:t>// HEAD</w:t>
+      </w:r>
+    </w:p>
+    <w:p>
+      <w:pPr>
+        <w:pStyle w:val="ListParagraph"/>
+        <w:numPr>
+          <w:ilvl w:val="0"/>
+          <w:numId w:val="7"/>
+        </w:numPr>
+        <w:rPr>
+          <w:lang w:val="en-US"/>
+        </w:rPr>
+      </w:pPr>
+      <w:r>
+        <w:rPr>
+          <w:lang w:val="en-US"/>
+        </w:rPr>
+        <w:t xml:space="preserve">Base condition check the head is null or having the single element </w:t>
+      </w:r>
+    </w:p>
+    <w:p>
+      <w:pPr>
+        <w:pStyle w:val="ListParagraph"/>
+        <w:numPr>
+          <w:ilvl w:val="0"/>
+          <w:numId w:val="7"/>
+        </w:numPr>
+        <w:rPr>
+          <w:lang w:val="en-US"/>
+        </w:rPr>
+      </w:pPr>
+      <w:r>
+        <w:rPr>
+          <w:lang w:val="en-US"/>
+        </w:rPr>
+        <w:t>Retun null</w:t>
+      </w:r>
+    </w:p>
+    <w:p>
+      <w:pPr>
+        <w:pStyle w:val="ListParagraph"/>
+        <w:numPr>
+          <w:ilvl w:val="0"/>
+          <w:numId w:val="7"/>
+        </w:numPr>
+        <w:rPr>
+          <w:lang w:val="en-US"/>
+        </w:rPr>
+      </w:pPr>
+      <w:r>
+        <w:rPr>
+          <w:lang w:val="en-US"/>
+        </w:rPr>
+        <w:t>Assign the head to the next element</w:t>
+      </w:r>
+    </w:p>
+    <w:p>
+      <w:pPr>
+        <w:pStyle w:val="ListParagraph"/>
+        <w:numPr>
+          <w:ilvl w:val="0"/>
+          <w:numId w:val="7"/>
+        </w:numPr>
+        <w:rPr>
+          <w:lang w:val="en-US"/>
+        </w:rPr>
+      </w:pPr>
+      <w:r>
+        <w:rPr>
+          <w:lang w:val="en-US"/>
+        </w:rPr>
+        <w:t>Return the head</w:t>
+      </w:r>
+    </w:p>
+    <w:p>
+      <w:pPr>
+        <w:rPr>
+          <w:b/>
+          <w:bCs/>
+          <w:lang w:val="en-US"/>
+        </w:rPr>
+      </w:pPr>
+      <w:r>
+        <w:rPr>
+          <w:b/>
+          <w:bCs/>
+          <w:lang w:val="en-US"/>
+        </w:rPr>
+        <w:t>// TAIL</w:t>
+      </w:r>
+    </w:p>
+    <w:p>
+      <w:pPr>
+        <w:pStyle w:val="ListParagraph"/>
+        <w:numPr>
+          <w:ilvl w:val="0"/>
+          <w:numId w:val="8"/>
+        </w:numPr>
+        <w:rPr>
+          <w:lang w:val="en-US"/>
+        </w:rPr>
+      </w:pPr>
+      <w:r>
+        <w:rPr>
+          <w:lang w:val="en-US"/>
+        </w:rPr>
+        <w:t>Assign the head to the temp</w:t>
+      </w:r>
+    </w:p>
+    <w:p>
+      <w:pPr>
+        <w:pStyle w:val="ListParagraph"/>
+        <w:numPr>
+          <w:ilvl w:val="0"/>
+          <w:numId w:val="8"/>
+        </w:numPr>
+        <w:rPr>
+          <w:lang w:val="en-US"/>
+        </w:rPr>
+      </w:pPr>
+      <w:r>
+        <w:rPr>
+          <w:lang w:val="en-US"/>
+        </w:rPr>
+        <w:t>Check for 0</w:t>
+      </w:r>
+      <w:r>
+        <w:rPr>
+          <w:vertAlign w:val="superscript"/>
+          <w:lang w:val="en-US"/>
+        </w:rPr>
+        <w:t>th</w:t>
+      </w:r>
+      <w:r>
+        <w:rPr>
+          <w:lang w:val="en-US"/>
+        </w:rPr>
+        <w:t xml:space="preserve"> element </w:t>
+      </w:r>
+    </w:p>
+    <w:p>
+      <w:pPr>
+        <w:pStyle w:val="ListParagraph"/>
+        <w:numPr>
+          <w:ilvl w:val="0"/>
+          <w:numId w:val="8"/>
+        </w:numPr>
+        <w:rPr>
+          <w:lang w:val="en-US"/>
+        </w:rPr>
+      </w:pPr>
+      <w:r>
+        <w:rPr>
+          <w:lang w:val="en-US"/>
+        </w:rPr>
+        <w:t>Head == null (0 ) || head.next == null (1)</w:t>
+      </w:r>
+    </w:p>
+    <w:p>
+      <w:pPr>
+        <w:pStyle w:val="ListParagraph"/>
+        <w:numPr>
+          <w:ilvl w:val="0"/>
+          <w:numId w:val="8"/>
+        </w:numPr>
+        <w:rPr>
+          <w:lang w:val="en-US"/>
+        </w:rPr>
+      </w:pPr>
+      <w:r>
+        <w:rPr>
+          <w:lang w:val="en-US"/>
+        </w:rPr>
+        <w:t>Return null;</w:t>
+      </w:r>
+    </w:p>
+    <w:p>
+      <w:pPr>
+        <w:pStyle w:val="ListParagraph"/>
+        <w:numPr>
+          <w:ilvl w:val="0"/>
+          <w:numId w:val="8"/>
+        </w:numPr>
+        <w:rPr>
+          <w:lang w:val="en-US"/>
+        </w:rPr>
+      </w:pPr>
+      <w:r>
+        <w:rPr>
+          <w:lang w:val="en-US"/>
+        </w:rPr>
+        <w:t>Go till the second last != null</w:t>
+      </w:r>
+    </w:p>
+    <w:p>
+      <w:pPr>
+        <w:pStyle w:val="ListParagraph"/>
+        <w:numPr>
+          <w:ilvl w:val="0"/>
+          <w:numId w:val="8"/>
+        </w:numPr>
+        <w:rPr>
+          <w:lang w:val="en-US"/>
+        </w:rPr>
+      </w:pPr>
+      <w:r>
+        <w:rPr>
+          <w:lang w:val="en-US"/>
+        </w:rPr>
+        <w:t xml:space="preserve"> Temp points to the next</w:t>
+      </w:r>
+    </w:p>
+    <w:p>
+      <w:pPr>
+        <w:pStyle w:val="ListParagraph"/>
+        <w:numPr>
+          <w:ilvl w:val="0"/>
+          <w:numId w:val="8"/>
+        </w:numPr>
+        <w:rPr>
+          <w:lang w:val="en-US"/>
+        </w:rPr>
+      </w:pPr>
+      <w:r>
+        <w:rPr>
+          <w:lang w:val="en-US"/>
+        </w:rPr>
+        <w:t>Else temp points to null</w:t>
+      </w:r>
+    </w:p>
+    <w:p>
+      <w:pPr>
+        <w:rPr>
+          <w:b/>
+          <w:bCs/>
+          <w:lang w:val="en-US"/>
+        </w:rPr>
+      </w:pPr>
+      <w:r>
+        <w:rPr>
+          <w:b/>
+          <w:bCs/>
+          <w:lang w:val="en-US"/>
+        </w:rPr>
+        <w:t>// POSITION</w:t>
+      </w:r>
+    </w:p>
+    <w:p>
+      <w:pPr>
+        <w:pStyle w:val="ListParagraph"/>
+        <w:numPr>
+          <w:ilvl w:val="0"/>
+          <w:numId w:val="9"/>
+        </w:numPr>
+        <w:rPr>
+          <w:b/>
+          <w:bCs/>
+          <w:lang w:val="en-US"/>
+        </w:rPr>
+      </w:pPr>
+      <w:r>
+        <w:rPr>
+          <w:lang w:val="en-US"/>
+        </w:rPr>
+        <w:t>Check the for base condiion</w:t>
+      </w:r>
+    </w:p>
+    <w:p>
+      <w:pPr>
+        <w:pStyle w:val="ListParagraph"/>
+        <w:numPr>
+          <w:ilvl w:val="0"/>
+          <w:numId w:val="9"/>
+        </w:numPr>
+        <w:rPr>
+          <w:b/>
+          <w:bCs/>
+          <w:lang w:val="en-US"/>
+        </w:rPr>
+      </w:pPr>
+      <w:r>
+        <w:rPr>
+          <w:lang w:val="en-US"/>
+        </w:rPr>
+        <w:t>K ==1 call the head</w:t>
+      </w:r>
+    </w:p>
+    <w:p>
+      <w:pPr>
+        <w:pStyle w:val="ListParagraph"/>
+        <w:numPr>
+          <w:ilvl w:val="0"/>
+          <w:numId w:val="9"/>
+        </w:numPr>
+        <w:rPr>
+          <w:b/>
+          <w:bCs/>
+          <w:lang w:val="en-US"/>
+        </w:rPr>
+      </w:pPr>
+      <w:r>
+        <w:rPr>
+          <w:lang w:val="en-US"/>
+        </w:rPr>
+        <w:t>Assign temp to head,</w:t>
+      </w:r>
+    </w:p>
+    <w:p>
+      <w:pPr>
+        <w:pStyle w:val="ListParagraph"/>
+        <w:numPr>
+          <w:ilvl w:val="0"/>
+          <w:numId w:val="9"/>
+        </w:numPr>
+        <w:rPr>
+          <w:b/>
+          <w:bCs/>
+          <w:lang w:val="en-US"/>
+        </w:rPr>
+      </w:pPr>
+      <w:r>
+        <w:rPr>
+          <w:lang w:val="en-US"/>
+        </w:rPr>
+        <w:t>Assign prev = null</w:t>
+      </w:r>
+    </w:p>
+    <w:p>
+      <w:pPr>
+        <w:pStyle w:val="ListParagraph"/>
+        <w:numPr>
+          <w:ilvl w:val="0"/>
+          <w:numId w:val="9"/>
+        </w:numPr>
+        <w:rPr>
+          <w:lang w:val="en-US"/>
+        </w:rPr>
+      </w:pPr>
+      <w:r>
+        <w:rPr>
+          <w:lang w:val="en-US"/>
+        </w:rPr>
+        <w:t>Count = 0</w:t>
+      </w:r>
+    </w:p>
+    <w:p>
+      <w:pPr>
+        <w:pStyle w:val="ListParagraph"/>
+        <w:numPr>
+          <w:ilvl w:val="0"/>
+          <w:numId w:val="9"/>
+        </w:numPr>
+        <w:rPr>
+          <w:lang w:val="en-US"/>
+        </w:rPr>
+      </w:pPr>
+      <w:r>
+        <w:rPr>
+          <w:lang w:val="en-US"/>
+        </w:rPr>
+        <w:t xml:space="preserve">Go till </w:t>
+      </w:r>
+      <w:r>
+        <w:rPr>
+          <w:lang w:val="en-US"/>
+        </w:rPr>
+        <w:t xml:space="preserve"> the last element </w:t>
+      </w:r>
+    </w:p>
+    <w:p>
+      <w:pPr>
+        <w:pStyle w:val="ListParagraph"/>
+        <w:numPr>
+          <w:ilvl w:val="0"/>
+          <w:numId w:val="9"/>
+        </w:numPr>
+        <w:rPr>
+          <w:lang w:val="en-US"/>
+        </w:rPr>
+      </w:pPr>
+      <w:r>
+        <w:rPr>
+          <w:lang w:val="en-US"/>
+        </w:rPr>
+        <w:t>Increase the count</w:t>
+      </w:r>
+    </w:p>
+    <w:p>
+      <w:pPr>
+        <w:pStyle w:val="ListParagraph"/>
+        <w:numPr>
+          <w:ilvl w:val="0"/>
+          <w:numId w:val="9"/>
+        </w:numPr>
+        <w:rPr>
+          <w:lang w:val="en-US"/>
+        </w:rPr>
+      </w:pPr>
+      <w:r>
+        <w:rPr>
+          <w:lang w:val="en-US"/>
+        </w:rPr>
+        <w:t>Check the count == k</w:t>
+      </w:r>
+    </w:p>
+    <w:p>
+      <w:pPr>
+        <w:pStyle w:val="ListParagraph"/>
+        <w:numPr>
+          <w:ilvl w:val="0"/>
+          <w:numId w:val="9"/>
+        </w:numPr>
+        <w:rPr>
+          <w:lang w:val="en-US"/>
+        </w:rPr>
+      </w:pPr>
+      <w:r>
+        <w:rPr>
+          <w:lang w:val="en-US"/>
+        </w:rPr>
+        <w:t>Prev next = prev next next</w:t>
+      </w:r>
+    </w:p>
+    <w:p>
+      <w:pPr>
+        <w:pStyle w:val="ListParagraph"/>
+        <w:numPr>
+          <w:ilvl w:val="0"/>
+          <w:numId w:val="9"/>
+        </w:numPr>
+        <w:rPr>
+          <w:lang w:val="en-US"/>
+        </w:rPr>
+      </w:pPr>
+      <w:r>
+        <w:rPr>
+          <w:lang w:val="en-US"/>
+        </w:rPr>
+        <w:t>Else move to the prv = temp</w:t>
+      </w:r>
+    </w:p>
+    <w:p>
+      <w:pPr>
+        <w:pStyle w:val="ListParagraph"/>
+        <w:numPr>
+          <w:ilvl w:val="0"/>
+          <w:numId w:val="9"/>
+        </w:numPr>
+        <w:rPr>
+          <w:lang w:val="en-US"/>
+        </w:rPr>
+      </w:pPr>
+      <w:r>
+        <w:rPr>
+          <w:lang w:val="en-US"/>
+        </w:rPr>
+        <w:t>Move the temp to the next element</w:t>
+      </w:r>
+    </w:p>
+    <w:p>
+      <w:pPr>
+        <w:rPr>
+          <w:lang w:val="en-US"/>
+        </w:rPr>
+      </w:pPr>
+    </w:p>
+    <w:p>
+      <w:pPr>
+        <w:rPr>
+          <w:b/>
+          <w:bCs/>
+          <w:lang w:val="en-US"/>
+        </w:rPr>
+      </w:pPr>
+      <w:r>
+        <w:rPr>
+          <w:b/>
+          <w:bCs/>
+          <w:lang w:val="en-US"/>
+        </w:rPr>
+        <w:lastRenderedPageBreak/>
+        <w:t>// POSITION VALUE</w:t>
+      </w:r>
+    </w:p>
+    <w:p>
+      <w:pPr>
+        <w:pStyle w:val="ListParagraph"/>
+        <w:numPr>
+          <w:ilvl w:val="0"/>
+          <w:numId w:val="10"/>
+        </w:numPr>
+        <w:rPr>
+          <w:lang w:val="en-US"/>
+        </w:rPr>
+      </w:pPr>
+      <w:r>
+        <w:rPr>
+          <w:lang w:val="en-US"/>
+        </w:rPr>
+        <w:t xml:space="preserve">Same as the position change the k to the element </w:t>
+      </w:r>
+    </w:p>
+    <w:p>
+      <w:pPr>
+        <w:pStyle w:val="ListParagraph"/>
+        <w:numPr>
+          <w:ilvl w:val="0"/>
+          <w:numId w:val="10"/>
+        </w:numPr>
+        <w:rPr>
+          <w:lang w:val="en-US"/>
+        </w:rPr>
+      </w:pPr>
+      <w:r>
+        <w:rPr>
+          <w:lang w:val="en-US"/>
+        </w:rPr>
+        <w:t>Head.data == el</w:t>
+      </w:r>
+    </w:p>
+    <w:p>
+      <w:pPr>
+        <w:pStyle w:val="ListParagraph"/>
+        <w:numPr>
+          <w:ilvl w:val="0"/>
+          <w:numId w:val="10"/>
+        </w:numPr>
+        <w:rPr>
+          <w:lang w:val="en-US"/>
+        </w:rPr>
+      </w:pPr>
+      <w:r>
+        <w:rPr>
+          <w:lang w:val="en-US"/>
+        </w:rPr>
+        <w:t>Same as the head.data</w:t>
+      </w:r>
+    </w:p>
+    <w:p>
+      <w:pPr>
+        <w:rPr>
+          <w:lang w:val="en-US"/>
+        </w:rPr>
+      </w:pPr>
+    </w:p>
+    <w:p>
+      <w:pPr>
+        <w:rPr>
+          <w:b/>
+          <w:bCs/>
+          <w:lang w:val="en-US"/>
+        </w:rPr>
+      </w:pPr>
+      <w:r>
+        <w:rPr>
+          <w:b/>
+          <w:bCs/>
+          <w:lang w:val="en-US"/>
+        </w:rPr>
+        <w:t xml:space="preserve"> INSERTION OF LL</w:t>
+      </w:r>
+    </w:p>
+    <w:p>
+      <w:pPr>
+        <w:rPr>
+          <w:b/>
+          <w:bCs/>
+          <w:lang w:val="en-US"/>
+        </w:rPr>
+      </w:pPr>
+      <w:r>
+        <w:rPr>
+          <w:b/>
+          <w:bCs/>
+          <w:lang w:val="en-US"/>
+        </w:rPr>
+        <w:t>// HEAD</w:t>
+      </w:r>
+    </w:p>
+    <w:p>
+      <w:pPr>
+        <w:pStyle w:val="ListParagraph"/>
+        <w:numPr>
+          <w:ilvl w:val="0"/>
+          <w:numId w:val="11"/>
+        </w:numPr>
+        <w:rPr>
+          <w:lang w:val="en-US"/>
+        </w:rPr>
+      </w:pPr>
+      <w:r>
+        <w:rPr>
+          <w:lang w:val="en-US"/>
+        </w:rPr>
+        <w:t xml:space="preserve">Base condition head is null </w:t>
+      </w:r>
+    </w:p>
+    <w:p>
+      <w:pPr>
+        <w:pStyle w:val="ListParagraph"/>
+        <w:numPr>
+          <w:ilvl w:val="0"/>
+          <w:numId w:val="11"/>
+        </w:numPr>
+        <w:rPr>
+          <w:lang w:val="en-US"/>
+        </w:rPr>
+      </w:pPr>
+      <w:r>
+        <w:rPr>
+          <w:lang w:val="en-US"/>
+        </w:rPr>
+        <w:t>Create the new node</w:t>
+      </w:r>
+    </w:p>
+    <w:p>
+      <w:pPr>
+        <w:pStyle w:val="ListParagraph"/>
+        <w:numPr>
+          <w:ilvl w:val="0"/>
+          <w:numId w:val="11"/>
+        </w:numPr>
+        <w:rPr>
+          <w:lang w:val="en-US"/>
+        </w:rPr>
+      </w:pPr>
+      <w:r>
+        <w:rPr>
+          <w:lang w:val="en-US"/>
+        </w:rPr>
+        <w:t>If not create the simple node called temp</w:t>
+      </w:r>
+    </w:p>
+    <w:p>
+      <w:pPr>
+        <w:pStyle w:val="ListParagraph"/>
+        <w:numPr>
+          <w:ilvl w:val="0"/>
+          <w:numId w:val="11"/>
+        </w:numPr>
+        <w:rPr>
+          <w:lang w:val="en-US"/>
+        </w:rPr>
+      </w:pPr>
+      <w:r>
+        <w:rPr>
+          <w:lang w:val="en-US"/>
+        </w:rPr>
+        <w:t>Point the temp to the head</w:t>
+      </w:r>
+    </w:p>
+    <w:p>
+      <w:pPr>
+        <w:rPr>
+          <w:b/>
+          <w:bCs/>
+          <w:lang w:val="en-US"/>
+        </w:rPr>
+      </w:pPr>
+      <w:r>
+        <w:rPr>
+          <w:b/>
+          <w:bCs/>
+          <w:lang w:val="en-US"/>
+        </w:rPr>
+        <w:t>// TAIL</w:t>
+      </w:r>
+    </w:p>
+    <w:p>
+      <w:pPr>
+        <w:pStyle w:val="ListParagraph"/>
+        <w:numPr>
+          <w:ilvl w:val="0"/>
+          <w:numId w:val="14"/>
+        </w:numPr>
+        <w:rPr>
+          <w:lang w:val="en-US"/>
+        </w:rPr>
+      </w:pPr>
+      <w:r>
+        <w:rPr>
+          <w:lang w:val="en-US"/>
+        </w:rPr>
+        <w:t>Base condition if head Is null</w:t>
+      </w:r>
+    </w:p>
+    <w:p>
+      <w:pPr>
+        <w:pStyle w:val="ListParagraph"/>
+        <w:numPr>
+          <w:ilvl w:val="0"/>
+          <w:numId w:val="14"/>
+        </w:numPr>
+        <w:rPr>
+          <w:lang w:val="en-US"/>
+        </w:rPr>
+      </w:pPr>
+      <w:r>
+        <w:rPr>
+          <w:lang w:val="en-US"/>
+        </w:rPr>
+        <w:t>Create the new node and point to null</w:t>
+      </w:r>
+    </w:p>
+    <w:p>
+      <w:pPr>
+        <w:pStyle w:val="ListParagraph"/>
+        <w:numPr>
+          <w:ilvl w:val="0"/>
+          <w:numId w:val="14"/>
+        </w:numPr>
+        <w:rPr>
+          <w:lang w:val="en-US"/>
+        </w:rPr>
+      </w:pPr>
+      <w:r>
+        <w:rPr>
+          <w:lang w:val="en-US"/>
+        </w:rPr>
+        <w:t>Go till the last that is temp.next != null</w:t>
+      </w:r>
+    </w:p>
+    <w:p>
+      <w:pPr>
+        <w:pStyle w:val="ListParagraph"/>
+        <w:numPr>
+          <w:ilvl w:val="0"/>
+          <w:numId w:val="14"/>
+        </w:numPr>
+        <w:rPr>
+          <w:lang w:val="en-US"/>
+        </w:rPr>
+      </w:pPr>
+      <w:r>
+        <w:rPr>
+          <w:lang w:val="en-US"/>
+        </w:rPr>
+        <w:t>Create the node and it’s next points to the null</w:t>
+      </w:r>
+    </w:p>
+    <w:p>
+      <w:pPr>
+        <w:pStyle w:val="ListParagraph"/>
+        <w:numPr>
+          <w:ilvl w:val="0"/>
+          <w:numId w:val="14"/>
+        </w:numPr>
+        <w:rPr>
+          <w:lang w:val="en-US"/>
+        </w:rPr>
+      </w:pPr>
+      <w:r>
+        <w:rPr>
+          <w:lang w:val="en-US"/>
+        </w:rPr>
+        <w:t>Temp;s next points to  the nn</w:t>
+      </w:r>
+    </w:p>
+    <w:p>
+      <w:pPr>
+        <w:rPr>
+          <w:b/>
+          <w:bCs/>
+          <w:lang w:val="en-US"/>
+        </w:rPr>
+      </w:pPr>
+      <w:r>
+        <w:rPr>
+          <w:b/>
+          <w:bCs/>
+          <w:lang w:val="en-US"/>
+        </w:rPr>
+        <w:t>// POSITION</w:t>
+      </w:r>
+    </w:p>
+    <w:p>
+      <w:pPr>
+        <w:pStyle w:val="ListParagraph"/>
+        <w:numPr>
+          <w:ilvl w:val="0"/>
+          <w:numId w:val="15"/>
+        </w:numPr>
+        <w:rPr>
+          <w:lang w:val="en-US"/>
+        </w:rPr>
+      </w:pPr>
+      <w:r>
+        <w:rPr>
+          <w:lang w:val="en-US"/>
+        </w:rPr>
+        <w:t>Base condition head is null and k ==1</w:t>
+      </w:r>
+    </w:p>
+    <w:p>
+      <w:pPr>
+        <w:pStyle w:val="ListParagraph"/>
+        <w:numPr>
+          <w:ilvl w:val="0"/>
+          <w:numId w:val="15"/>
+        </w:numPr>
+        <w:rPr>
+          <w:lang w:val="en-US"/>
+        </w:rPr>
+      </w:pPr>
+      <w:r>
+        <w:rPr>
+          <w:lang w:val="en-US"/>
+        </w:rPr>
+        <w:t>Create the new node and points to null</w:t>
+      </w:r>
+    </w:p>
+    <w:p>
+      <w:pPr>
+        <w:pStyle w:val="ListParagraph"/>
+        <w:numPr>
+          <w:ilvl w:val="0"/>
+          <w:numId w:val="15"/>
+        </w:numPr>
+        <w:rPr>
+          <w:lang w:val="en-US"/>
+        </w:rPr>
+      </w:pPr>
+      <w:r>
+        <w:rPr>
+          <w:lang w:val="en-US"/>
+        </w:rPr>
+        <w:t>If the length is greater than 1  call the INSERT HEAD FUNCTION</w:t>
+      </w:r>
+    </w:p>
+    <w:p>
+      <w:pPr>
+        <w:pStyle w:val="ListParagraph"/>
+        <w:numPr>
+          <w:ilvl w:val="0"/>
+          <w:numId w:val="15"/>
+        </w:numPr>
+        <w:rPr>
+          <w:lang w:val="en-US"/>
+        </w:rPr>
+      </w:pPr>
+      <w:r>
+        <w:rPr>
+          <w:lang w:val="en-US"/>
+        </w:rPr>
+        <w:t xml:space="preserve">If the k I tail call the INSERT TAIL FUNCTION </w:t>
+      </w:r>
+    </w:p>
+    <w:p>
+      <w:pPr>
+        <w:pStyle w:val="ListParagraph"/>
+        <w:numPr>
+          <w:ilvl w:val="0"/>
+          <w:numId w:val="15"/>
+        </w:numPr>
+        <w:rPr>
+          <w:lang w:val="en-US"/>
+        </w:rPr>
+      </w:pPr>
+      <w:r>
+        <w:rPr>
+          <w:lang w:val="en-US"/>
+        </w:rPr>
+        <w:t xml:space="preserve">If k is between </w:t>
+      </w:r>
+    </w:p>
+    <w:p>
+      <w:pPr>
+        <w:pStyle w:val="ListParagraph"/>
+        <w:numPr>
+          <w:ilvl w:val="0"/>
+          <w:numId w:val="15"/>
+        </w:numPr>
+        <w:rPr>
+          <w:lang w:val="en-US"/>
+        </w:rPr>
+      </w:pPr>
+      <w:r>
+        <w:rPr>
+          <w:lang w:val="en-US"/>
+        </w:rPr>
+        <w:t>Keep the count 0</w:t>
+      </w:r>
+    </w:p>
+    <w:p>
+      <w:pPr>
+        <w:pStyle w:val="ListParagraph"/>
+        <w:numPr>
+          <w:ilvl w:val="0"/>
+          <w:numId w:val="15"/>
+        </w:numPr>
+        <w:rPr>
+          <w:lang w:val="en-US"/>
+        </w:rPr>
+      </w:pPr>
+      <w:r>
+        <w:rPr>
+          <w:lang w:val="en-US"/>
+        </w:rPr>
+        <w:t>Go till the last temp != null</w:t>
+      </w:r>
+    </w:p>
+    <w:p>
+      <w:pPr>
+        <w:pStyle w:val="ListParagraph"/>
+        <w:numPr>
+          <w:ilvl w:val="0"/>
+          <w:numId w:val="15"/>
+        </w:numPr>
+        <w:rPr>
+          <w:lang w:val="en-US"/>
+        </w:rPr>
+      </w:pPr>
+      <w:r>
+        <w:rPr>
+          <w:lang w:val="en-US"/>
+        </w:rPr>
+        <w:t>Increase the count  by 1</w:t>
+      </w:r>
+    </w:p>
+    <w:p>
+      <w:pPr>
+        <w:pStyle w:val="ListParagraph"/>
+        <w:numPr>
+          <w:ilvl w:val="0"/>
+          <w:numId w:val="15"/>
+        </w:numPr>
+        <w:rPr>
+          <w:lang w:val="en-US"/>
+        </w:rPr>
+      </w:pPr>
+      <w:r>
+        <w:rPr>
+          <w:lang w:val="en-US"/>
+        </w:rPr>
+        <w:t>If count == k-1 that Is befor the kth node</w:t>
+      </w:r>
+    </w:p>
+    <w:p>
+      <w:pPr>
+        <w:pStyle w:val="ListParagraph"/>
+        <w:numPr>
+          <w:ilvl w:val="0"/>
+          <w:numId w:val="15"/>
+        </w:numPr>
+        <w:rPr>
+          <w:lang w:val="en-US"/>
+        </w:rPr>
+      </w:pPr>
+      <w:r>
+        <w:rPr>
+          <w:lang w:val="en-US"/>
+        </w:rPr>
+        <w:t>Create the new node with the value</w:t>
+      </w:r>
+    </w:p>
+    <w:p>
+      <w:pPr>
+        <w:pStyle w:val="ListParagraph"/>
+        <w:numPr>
+          <w:ilvl w:val="0"/>
+          <w:numId w:val="15"/>
+        </w:numPr>
+        <w:rPr>
+          <w:lang w:val="en-US"/>
+        </w:rPr>
+      </w:pPr>
+      <w:r>
+        <w:rPr>
+          <w:lang w:val="en-US"/>
+        </w:rPr>
+        <w:t>Remember nn’s next points to the temp’s next</w:t>
+      </w:r>
+    </w:p>
+    <w:p>
+      <w:pPr>
+        <w:pStyle w:val="ListParagraph"/>
+        <w:numPr>
+          <w:ilvl w:val="0"/>
+          <w:numId w:val="15"/>
+        </w:numPr>
+        <w:rPr>
+          <w:lang w:val="en-US"/>
+        </w:rPr>
+      </w:pPr>
+      <w:r>
+        <w:rPr>
+          <w:lang w:val="en-US"/>
+        </w:rPr>
+        <w:t>Temp’s next points to  the nn</w:t>
+      </w:r>
+    </w:p>
+    <w:p>
+      <w:pPr>
+        <w:pStyle w:val="ListParagraph"/>
+        <w:numPr>
+          <w:ilvl w:val="0"/>
+          <w:numId w:val="15"/>
+        </w:numPr>
+        <w:rPr>
+          <w:lang w:val="en-US"/>
+        </w:rPr>
+      </w:pPr>
+      <w:r>
+        <w:rPr>
+          <w:lang w:val="en-US"/>
+        </w:rPr>
+        <w:t>Else temp = temp.next</w:t>
+      </w:r>
+    </w:p>
+    <w:p>
+      <w:pPr>
+        <w:rPr>
+          <w:b/>
+          <w:bCs/>
+          <w:lang w:val="en-US"/>
+        </w:rPr>
+      </w:pPr>
+      <w:r>
+        <w:rPr>
+          <w:b/>
+          <w:bCs/>
+          <w:lang w:val="en-US"/>
+        </w:rPr>
+        <w:t>// POSITION VALUE BEFORE</w:t>
+      </w:r>
+    </w:p>
+    <w:p>
+      <w:pPr>
+        <w:pStyle w:val="ListParagraph"/>
+        <w:numPr>
+          <w:ilvl w:val="0"/>
+          <w:numId w:val="16"/>
+        </w:numPr>
+        <w:rPr>
+          <w:lang w:val="en-US"/>
+        </w:rPr>
+      </w:pPr>
+      <w:r>
+        <w:rPr>
+          <w:lang w:val="en-US"/>
+        </w:rPr>
+        <w:t>Base condition head is null not k ==1 becoz  value Is found for the null</w:t>
+      </w:r>
+    </w:p>
+    <w:p>
+      <w:pPr>
+        <w:pStyle w:val="ListParagraph"/>
+        <w:numPr>
+          <w:ilvl w:val="0"/>
+          <w:numId w:val="16"/>
+        </w:numPr>
+        <w:rPr>
+          <w:lang w:val="en-US"/>
+        </w:rPr>
+      </w:pPr>
+      <w:r>
+        <w:rPr>
+          <w:lang w:val="en-US"/>
+        </w:rPr>
+        <w:t>If value is in the head head’s data  = given data</w:t>
+      </w:r>
+    </w:p>
+    <w:p>
+      <w:pPr>
+        <w:pStyle w:val="ListParagraph"/>
+        <w:numPr>
+          <w:ilvl w:val="0"/>
+          <w:numId w:val="16"/>
+        </w:numPr>
+        <w:rPr>
+          <w:lang w:val="en-US"/>
+        </w:rPr>
+      </w:pPr>
+      <w:r>
+        <w:rPr>
+          <w:lang w:val="en-US"/>
+        </w:rPr>
+        <w:t>Create the new node points to the head</w:t>
+      </w:r>
+    </w:p>
+    <w:p>
+      <w:pPr>
+        <w:pStyle w:val="ListParagraph"/>
+        <w:numPr>
+          <w:ilvl w:val="0"/>
+          <w:numId w:val="16"/>
+        </w:numPr>
+        <w:rPr>
+          <w:lang w:val="en-US"/>
+        </w:rPr>
+      </w:pPr>
+      <w:r>
+        <w:rPr>
+          <w:lang w:val="en-US"/>
+        </w:rPr>
+        <w:t>While temp’s next != null</w:t>
+      </w:r>
+    </w:p>
+    <w:p>
+      <w:pPr>
+        <w:pStyle w:val="ListParagraph"/>
+        <w:numPr>
+          <w:ilvl w:val="0"/>
+          <w:numId w:val="16"/>
+        </w:numPr>
+        <w:rPr>
+          <w:lang w:val="en-US"/>
+        </w:rPr>
+      </w:pPr>
+      <w:r>
+        <w:rPr>
+          <w:lang w:val="en-US"/>
+        </w:rPr>
+        <w:t>Inside the loop temp’s next data == val</w:t>
+      </w:r>
+    </w:p>
+    <w:p>
+      <w:pPr>
+        <w:pStyle w:val="ListParagraph"/>
+        <w:numPr>
+          <w:ilvl w:val="0"/>
+          <w:numId w:val="16"/>
+        </w:numPr>
+        <w:rPr>
+          <w:lang w:val="en-US"/>
+        </w:rPr>
+      </w:pPr>
+      <w:r>
+        <w:rPr>
+          <w:lang w:val="en-US"/>
+        </w:rPr>
+        <w:t>Create the node and pontes to the temp’s next</w:t>
+      </w:r>
+    </w:p>
+    <w:p>
+      <w:pPr>
+        <w:pStyle w:val="ListParagraph"/>
+        <w:numPr>
+          <w:ilvl w:val="0"/>
+          <w:numId w:val="16"/>
+        </w:numPr>
+        <w:rPr>
+          <w:lang w:val="en-US"/>
+        </w:rPr>
+      </w:pPr>
+      <w:r>
+        <w:rPr>
+          <w:lang w:val="en-US"/>
+        </w:rPr>
+        <w:t>Temp’s next points to the nn</w:t>
+      </w:r>
+    </w:p>
+    <w:p>
+      <w:pPr>
+        <w:pStyle w:val="ListParagraph"/>
+        <w:numPr>
+          <w:ilvl w:val="0"/>
+          <w:numId w:val="16"/>
+        </w:numPr>
+        <w:rPr>
+          <w:lang w:val="en-US"/>
+        </w:rPr>
+      </w:pPr>
+      <w:r>
+        <w:rPr>
+          <w:lang w:val="en-US"/>
+        </w:rPr>
+        <w:t>Else the temp = temp.next</w:t>
+      </w:r>
+    </w:p>
+    <w:p>
+      <w:pPr>
+        <w:rPr>
+          <w:lang w:val="en-US"/>
+        </w:rPr>
+      </w:pPr>
+      <w:r>
+        <w:rPr>
+          <w:b/>
+          <w:bCs/>
+          <w:lang w:val="en-US"/>
+        </w:rPr>
+        <w:t xml:space="preserve">       </w:t>
+      </w:r>
+    </w:p>
+    <w:p>
+      <w:pPr>
+        <w:rPr>
+          <w:b/>
+          <w:bCs/>
+          <w:lang w:val="en-US"/>
+        </w:rPr>
+      </w:pPr>
+    </w:p>
+    <w:p>
+      <w:pPr>
+        <w:rPr>
+          <w:lang w:val="en-US"/>
+        </w:rPr>
+      </w:pPr>
+    </w:p>
+    <w:p>
+      <w:pPr>
+        <w:rPr>
+          <w:lang w:val="en-US"/>
+        </w:rPr>
+      </w:pPr>
+    </w:p>
+    <w:p>
+      <w:pPr>
+        <w:rPr>
+          <w:b/>
+          <w:bCs/>
+          <w:lang w:val="en-US"/>
+        </w:rPr>
+      </w:pPr>
+    </w:p>
+    <w:p>
+      <w:pPr>
+        <w:rPr>
+          <w:b/>
+          <w:bCs/>
+          <w:lang w:val="en-US"/>
+        </w:rPr>
+      </w:pPr>
+    </w:p>
+    <w:p>
+      <w:pPr>
+        <w:rPr>
+          <w:lang w:val="en-US"/>
+        </w:rPr>
+      </w:pPr>
+    </w:p>
+    <w:p>
+      <w:pPr>
+        <w:rPr>
+          <w:b/>
+          <w:bCs/>
+          <w:lang w:val="en-US"/>
+        </w:rPr>
+      </w:pPr>
+      <w:r>
+        <w:rPr>
+          <w:b/>
+          <w:bCs/>
+          <w:lang w:val="en-US"/>
+        </w:rPr>
+        <w:tab/>
+      </w:r>
+    </w:p>
+    <w:p>
+      <w:pPr>
+        <w:rPr>
+          <w:lang w:val="en-US"/>
+        </w:rPr>
+      </w:pPr>
+    </w:p>
+    <w:p>
+      <w:pPr>
+        <w:rPr>
+          <w:lang w:val="en-US"/>
+        </w:rPr>
+      </w:pPr>
     </w:p>
     <w:p>
       <w:pPr>
@@ -538,6 +2088,540 @@
 <file path=word/numbering.xml><?xml version="1.0" encoding="utf-8"?>
 <w:numbering xmlns:wpc="http://schemas.microsoft.com/office/word/2010/wordprocessingCanvas" xmlns:cx="http://schemas.microsoft.com/office/drawing/2014/chartex" xmlns:cx1="http://schemas.microsoft.com/office/drawing/2015/9/8/chartex" xmlns:cx2="http://schemas.microsoft.com/office/drawing/2015/10/21/chartex" xmlns:cx3="http://schemas.microsoft.com/office/drawing/2016/5/9/chartex" xmlns:cx4="http://schemas.microsoft.com/office/drawing/2016/5/10/chartex" xmlns:cx5="http://schemas.microsoft.com/office/drawing/2016/5/11/chartex" xmlns:cx6="http://schemas.microsoft.com/office/drawing/2016/5/12/chartex" xmlns:cx7="http://schemas.microsoft.com/office/drawing/2016/5/13/chartex" xmlns:cx8="http://schemas.microsoft.com/office/drawing/2016/5/14/chartex" xmlns:mc="http://schemas.openxmlformats.org/markup-compatibility/2006" xmlns:aink="http://schemas.microsoft.com/office/drawing/2016/ink" xmlns:am3d="http://schemas.microsoft.com/office/drawing/2017/model3d" xmlns:o="urn:schemas-microsoft-com:office:office" xmlns:oel="http://schemas.microsoft.com/office/2019/extlst" xmlns:r="http://schemas.openxmlformats.org/officeDocument/2006/relationships" xmlns:m="http://schemas.openxmlformats.org/officeDocument/2006/math" xmlns:v="urn:schemas-microsoft-com:vml" xmlns:wp14="http://schemas.microsoft.com/office/word/2010/wordprocessingDrawing" xmlns:wp="http://schemas.openxmlformats.org/drawingml/2006/wordprocessingDrawing" xmlns:w10="urn:schemas-microsoft-com:office:word" xmlns:w="http://schemas.openxmlformats.org/wordprocessingml/2006/main" xmlns:w14="http://schemas.microsoft.com/office/word/2010/wordml" xmlns:w15="http://schemas.microsoft.com/office/word/2012/wordml" xmlns:w16cex="http://schemas.microsoft.com/office/word/2018/wordml/cex" xmlns:w16cid="http://schemas.microsoft.com/office/word/2016/wordml/cid" xmlns:w16="http://schemas.microsoft.com/office/word/2018/wordml" xmlns:w16du="http://schemas.microsoft.com/office/word/2023/wordml/word16du" xmlns:w16sdtdh="http://schemas.microsoft.com/office/word/2020/wordml/sdtdatahash" xmlns:w16se="http://schemas.microsoft.com/office/word/2015/wordml/symex" xmlns:wpg="http://schemas.microsoft.com/office/word/2010/wordprocessingGroup" xmlns:wpi="http://schemas.microsoft.com/office/word/2010/wordprocessingInk" xmlns:wne="http://schemas.microsoft.com/office/word/2006/wordml" xmlns:wps="http://schemas.microsoft.com/office/word/2010/wordprocessingShape" mc:Ignorable="w14 w15 w16se w16cid w16 w16cex w16sdtdh w16du wp14">
   <w:abstractNum w:abstractNumId="0" w15:restartNumberingAfterBreak="0">
+    <w:nsid w:val="144D797E"/>
+    <w:multiLevelType w:val="hybridMultilevel"/>
+    <w:tmpl w:val="81588A76"/>
+    <w:lvl w:ilvl="0" w:tplc="40090011">
+      <w:start w:val="1"/>
+      <w:numFmt w:val="decimal"/>
+      <w:lvlText w:val="%1)"/>
+      <w:lvlJc w:val="left"/>
+      <w:pPr>
+        <w:ind w:left="720" w:hanging="360"/>
+      </w:pPr>
+      <w:rPr>
+        <w:rFonts w:hint="default"/>
+      </w:rPr>
+    </w:lvl>
+    <w:lvl w:ilvl="1" w:tplc="40090019" w:tentative="1">
+      <w:start w:val="1"/>
+      <w:numFmt w:val="lowerLetter"/>
+      <w:lvlText w:val="%2."/>
+      <w:lvlJc w:val="left"/>
+      <w:pPr>
+        <w:ind w:left="1440" w:hanging="360"/>
+      </w:pPr>
+    </w:lvl>
+    <w:lvl w:ilvl="2" w:tplc="4009001B" w:tentative="1">
+      <w:start w:val="1"/>
+      <w:numFmt w:val="lowerRoman"/>
+      <w:lvlText w:val="%3."/>
+      <w:lvlJc w:val="right"/>
+      <w:pPr>
+        <w:ind w:left="2160" w:hanging="180"/>
+      </w:pPr>
+    </w:lvl>
+    <w:lvl w:ilvl="3" w:tplc="4009000F" w:tentative="1">
+      <w:start w:val="1"/>
+      <w:numFmt w:val="decimal"/>
+      <w:lvlText w:val="%4."/>
+      <w:lvlJc w:val="left"/>
+      <w:pPr>
+        <w:ind w:left="2880" w:hanging="360"/>
+      </w:pPr>
+    </w:lvl>
+    <w:lvl w:ilvl="4" w:tplc="40090019" w:tentative="1">
+      <w:start w:val="1"/>
+      <w:numFmt w:val="lowerLetter"/>
+      <w:lvlText w:val="%5."/>
+      <w:lvlJc w:val="left"/>
+      <w:pPr>
+        <w:ind w:left="3600" w:hanging="360"/>
+      </w:pPr>
+    </w:lvl>
+    <w:lvl w:ilvl="5" w:tplc="4009001B" w:tentative="1">
+      <w:start w:val="1"/>
+      <w:numFmt w:val="lowerRoman"/>
+      <w:lvlText w:val="%6."/>
+      <w:lvlJc w:val="right"/>
+      <w:pPr>
+        <w:ind w:left="4320" w:hanging="180"/>
+      </w:pPr>
+    </w:lvl>
+    <w:lvl w:ilvl="6" w:tplc="4009000F" w:tentative="1">
+      <w:start w:val="1"/>
+      <w:numFmt w:val="decimal"/>
+      <w:lvlText w:val="%7."/>
+      <w:lvlJc w:val="left"/>
+      <w:pPr>
+        <w:ind w:left="5040" w:hanging="360"/>
+      </w:pPr>
+    </w:lvl>
+    <w:lvl w:ilvl="7" w:tplc="40090019" w:tentative="1">
+      <w:start w:val="1"/>
+      <w:numFmt w:val="lowerLetter"/>
+      <w:lvlText w:val="%8."/>
+      <w:lvlJc w:val="left"/>
+      <w:pPr>
+        <w:ind w:left="5760" w:hanging="360"/>
+      </w:pPr>
+    </w:lvl>
+    <w:lvl w:ilvl="8" w:tplc="4009001B" w:tentative="1">
+      <w:start w:val="1"/>
+      <w:numFmt w:val="lowerRoman"/>
+      <w:lvlText w:val="%9."/>
+      <w:lvlJc w:val="right"/>
+      <w:pPr>
+        <w:ind w:left="6480" w:hanging="180"/>
+      </w:pPr>
+    </w:lvl>
+  </w:abstractNum>
+  <w:abstractNum w:abstractNumId="1" w15:restartNumberingAfterBreak="0">
+    <w:nsid w:val="180411F7"/>
+    <w:multiLevelType w:val="hybridMultilevel"/>
+    <w:tmpl w:val="6B2293B8"/>
+    <w:lvl w:ilvl="0" w:tplc="DE3E91F2">
+      <w:start w:val="1"/>
+      <w:numFmt w:val="decimal"/>
+      <w:lvlText w:val="%1)"/>
+      <w:lvlJc w:val="left"/>
+      <w:pPr>
+        <w:ind w:left="708" w:hanging="360"/>
+      </w:pPr>
+      <w:rPr>
+        <w:rFonts w:hint="default"/>
+      </w:rPr>
+    </w:lvl>
+    <w:lvl w:ilvl="1" w:tplc="40090019" w:tentative="1">
+      <w:start w:val="1"/>
+      <w:numFmt w:val="lowerLetter"/>
+      <w:lvlText w:val="%2."/>
+      <w:lvlJc w:val="left"/>
+      <w:pPr>
+        <w:ind w:left="1428" w:hanging="360"/>
+      </w:pPr>
+    </w:lvl>
+    <w:lvl w:ilvl="2" w:tplc="4009001B" w:tentative="1">
+      <w:start w:val="1"/>
+      <w:numFmt w:val="lowerRoman"/>
+      <w:lvlText w:val="%3."/>
+      <w:lvlJc w:val="right"/>
+      <w:pPr>
+        <w:ind w:left="2148" w:hanging="180"/>
+      </w:pPr>
+    </w:lvl>
+    <w:lvl w:ilvl="3" w:tplc="4009000F" w:tentative="1">
+      <w:start w:val="1"/>
+      <w:numFmt w:val="decimal"/>
+      <w:lvlText w:val="%4."/>
+      <w:lvlJc w:val="left"/>
+      <w:pPr>
+        <w:ind w:left="2868" w:hanging="360"/>
+      </w:pPr>
+    </w:lvl>
+    <w:lvl w:ilvl="4" w:tplc="40090019" w:tentative="1">
+      <w:start w:val="1"/>
+      <w:numFmt w:val="lowerLetter"/>
+      <w:lvlText w:val="%5."/>
+      <w:lvlJc w:val="left"/>
+      <w:pPr>
+        <w:ind w:left="3588" w:hanging="360"/>
+      </w:pPr>
+    </w:lvl>
+    <w:lvl w:ilvl="5" w:tplc="4009001B" w:tentative="1">
+      <w:start w:val="1"/>
+      <w:numFmt w:val="lowerRoman"/>
+      <w:lvlText w:val="%6."/>
+      <w:lvlJc w:val="right"/>
+      <w:pPr>
+        <w:ind w:left="4308" w:hanging="180"/>
+      </w:pPr>
+    </w:lvl>
+    <w:lvl w:ilvl="6" w:tplc="4009000F" w:tentative="1">
+      <w:start w:val="1"/>
+      <w:numFmt w:val="decimal"/>
+      <w:lvlText w:val="%7."/>
+      <w:lvlJc w:val="left"/>
+      <w:pPr>
+        <w:ind w:left="5028" w:hanging="360"/>
+      </w:pPr>
+    </w:lvl>
+    <w:lvl w:ilvl="7" w:tplc="40090019" w:tentative="1">
+      <w:start w:val="1"/>
+      <w:numFmt w:val="lowerLetter"/>
+      <w:lvlText w:val="%8."/>
+      <w:lvlJc w:val="left"/>
+      <w:pPr>
+        <w:ind w:left="5748" w:hanging="360"/>
+      </w:pPr>
+    </w:lvl>
+    <w:lvl w:ilvl="8" w:tplc="4009001B" w:tentative="1">
+      <w:start w:val="1"/>
+      <w:numFmt w:val="lowerRoman"/>
+      <w:lvlText w:val="%9."/>
+      <w:lvlJc w:val="right"/>
+      <w:pPr>
+        <w:ind w:left="6468" w:hanging="180"/>
+      </w:pPr>
+    </w:lvl>
+  </w:abstractNum>
+  <w:abstractNum w:abstractNumId="2" w15:restartNumberingAfterBreak="0">
+    <w:nsid w:val="1E4A2576"/>
+    <w:multiLevelType w:val="hybridMultilevel"/>
+    <w:tmpl w:val="20FCC3D2"/>
+    <w:lvl w:ilvl="0" w:tplc="FFFFFFFF">
+      <w:start w:val="1"/>
+      <w:numFmt w:val="decimal"/>
+      <w:lvlText w:val="%1)"/>
+      <w:lvlJc w:val="left"/>
+      <w:pPr>
+        <w:ind w:left="720" w:hanging="360"/>
+      </w:pPr>
+      <w:rPr>
+        <w:rFonts w:hint="default"/>
+      </w:rPr>
+    </w:lvl>
+    <w:lvl w:ilvl="1" w:tplc="FFFFFFFF" w:tentative="1">
+      <w:start w:val="1"/>
+      <w:numFmt w:val="lowerLetter"/>
+      <w:lvlText w:val="%2."/>
+      <w:lvlJc w:val="left"/>
+      <w:pPr>
+        <w:ind w:left="1440" w:hanging="360"/>
+      </w:pPr>
+    </w:lvl>
+    <w:lvl w:ilvl="2" w:tplc="FFFFFFFF" w:tentative="1">
+      <w:start w:val="1"/>
+      <w:numFmt w:val="lowerRoman"/>
+      <w:lvlText w:val="%3."/>
+      <w:lvlJc w:val="right"/>
+      <w:pPr>
+        <w:ind w:left="2160" w:hanging="180"/>
+      </w:pPr>
+    </w:lvl>
+    <w:lvl w:ilvl="3" w:tplc="FFFFFFFF" w:tentative="1">
+      <w:start w:val="1"/>
+      <w:numFmt w:val="decimal"/>
+      <w:lvlText w:val="%4."/>
+      <w:lvlJc w:val="left"/>
+      <w:pPr>
+        <w:ind w:left="2880" w:hanging="360"/>
+      </w:pPr>
+    </w:lvl>
+    <w:lvl w:ilvl="4" w:tplc="FFFFFFFF" w:tentative="1">
+      <w:start w:val="1"/>
+      <w:numFmt w:val="lowerLetter"/>
+      <w:lvlText w:val="%5."/>
+      <w:lvlJc w:val="left"/>
+      <w:pPr>
+        <w:ind w:left="3600" w:hanging="360"/>
+      </w:pPr>
+    </w:lvl>
+    <w:lvl w:ilvl="5" w:tplc="FFFFFFFF" w:tentative="1">
+      <w:start w:val="1"/>
+      <w:numFmt w:val="lowerRoman"/>
+      <w:lvlText w:val="%6."/>
+      <w:lvlJc w:val="right"/>
+      <w:pPr>
+        <w:ind w:left="4320" w:hanging="180"/>
+      </w:pPr>
+    </w:lvl>
+    <w:lvl w:ilvl="6" w:tplc="FFFFFFFF" w:tentative="1">
+      <w:start w:val="1"/>
+      <w:numFmt w:val="decimal"/>
+      <w:lvlText w:val="%7."/>
+      <w:lvlJc w:val="left"/>
+      <w:pPr>
+        <w:ind w:left="5040" w:hanging="360"/>
+      </w:pPr>
+    </w:lvl>
+    <w:lvl w:ilvl="7" w:tplc="FFFFFFFF" w:tentative="1">
+      <w:start w:val="1"/>
+      <w:numFmt w:val="lowerLetter"/>
+      <w:lvlText w:val="%8."/>
+      <w:lvlJc w:val="left"/>
+      <w:pPr>
+        <w:ind w:left="5760" w:hanging="360"/>
+      </w:pPr>
+    </w:lvl>
+    <w:lvl w:ilvl="8" w:tplc="FFFFFFFF" w:tentative="1">
+      <w:start w:val="1"/>
+      <w:numFmt w:val="lowerRoman"/>
+      <w:lvlText w:val="%9."/>
+      <w:lvlJc w:val="right"/>
+      <w:pPr>
+        <w:ind w:left="6480" w:hanging="180"/>
+      </w:pPr>
+    </w:lvl>
+  </w:abstractNum>
+  <w:abstractNum w:abstractNumId="3" w15:restartNumberingAfterBreak="0">
+    <w:nsid w:val="1FCF0514"/>
+    <w:multiLevelType w:val="hybridMultilevel"/>
+    <w:tmpl w:val="6BBA516E"/>
+    <w:lvl w:ilvl="0" w:tplc="00BECD3E">
+      <w:start w:val="1"/>
+      <w:numFmt w:val="decimal"/>
+      <w:lvlText w:val="%1)"/>
+      <w:lvlJc w:val="left"/>
+      <w:pPr>
+        <w:ind w:left="708" w:hanging="360"/>
+      </w:pPr>
+      <w:rPr>
+        <w:rFonts w:hint="default"/>
+      </w:rPr>
+    </w:lvl>
+    <w:lvl w:ilvl="1" w:tplc="40090019" w:tentative="1">
+      <w:start w:val="1"/>
+      <w:numFmt w:val="lowerLetter"/>
+      <w:lvlText w:val="%2."/>
+      <w:lvlJc w:val="left"/>
+      <w:pPr>
+        <w:ind w:left="1428" w:hanging="360"/>
+      </w:pPr>
+    </w:lvl>
+    <w:lvl w:ilvl="2" w:tplc="4009001B" w:tentative="1">
+      <w:start w:val="1"/>
+      <w:numFmt w:val="lowerRoman"/>
+      <w:lvlText w:val="%3."/>
+      <w:lvlJc w:val="right"/>
+      <w:pPr>
+        <w:ind w:left="2148" w:hanging="180"/>
+      </w:pPr>
+    </w:lvl>
+    <w:lvl w:ilvl="3" w:tplc="4009000F" w:tentative="1">
+      <w:start w:val="1"/>
+      <w:numFmt w:val="decimal"/>
+      <w:lvlText w:val="%4."/>
+      <w:lvlJc w:val="left"/>
+      <w:pPr>
+        <w:ind w:left="2868" w:hanging="360"/>
+      </w:pPr>
+    </w:lvl>
+    <w:lvl w:ilvl="4" w:tplc="40090019" w:tentative="1">
+      <w:start w:val="1"/>
+      <w:numFmt w:val="lowerLetter"/>
+      <w:lvlText w:val="%5."/>
+      <w:lvlJc w:val="left"/>
+      <w:pPr>
+        <w:ind w:left="3588" w:hanging="360"/>
+      </w:pPr>
+    </w:lvl>
+    <w:lvl w:ilvl="5" w:tplc="4009001B" w:tentative="1">
+      <w:start w:val="1"/>
+      <w:numFmt w:val="lowerRoman"/>
+      <w:lvlText w:val="%6."/>
+      <w:lvlJc w:val="right"/>
+      <w:pPr>
+        <w:ind w:left="4308" w:hanging="180"/>
+      </w:pPr>
+    </w:lvl>
+    <w:lvl w:ilvl="6" w:tplc="4009000F" w:tentative="1">
+      <w:start w:val="1"/>
+      <w:numFmt w:val="decimal"/>
+      <w:lvlText w:val="%7."/>
+      <w:lvlJc w:val="left"/>
+      <w:pPr>
+        <w:ind w:left="5028" w:hanging="360"/>
+      </w:pPr>
+    </w:lvl>
+    <w:lvl w:ilvl="7" w:tplc="40090019" w:tentative="1">
+      <w:start w:val="1"/>
+      <w:numFmt w:val="lowerLetter"/>
+      <w:lvlText w:val="%8."/>
+      <w:lvlJc w:val="left"/>
+      <w:pPr>
+        <w:ind w:left="5748" w:hanging="360"/>
+      </w:pPr>
+    </w:lvl>
+    <w:lvl w:ilvl="8" w:tplc="4009001B" w:tentative="1">
+      <w:start w:val="1"/>
+      <w:numFmt w:val="lowerRoman"/>
+      <w:lvlText w:val="%9."/>
+      <w:lvlJc w:val="right"/>
+      <w:pPr>
+        <w:ind w:left="6468" w:hanging="180"/>
+      </w:pPr>
+    </w:lvl>
+  </w:abstractNum>
+  <w:abstractNum w:abstractNumId="4" w15:restartNumberingAfterBreak="0">
+    <w:nsid w:val="333F3E92"/>
+    <w:multiLevelType w:val="hybridMultilevel"/>
+    <w:tmpl w:val="7AA6B9F0"/>
+    <w:lvl w:ilvl="0" w:tplc="8A38FEBE">
+      <w:start w:val="1"/>
+      <w:numFmt w:val="decimal"/>
+      <w:lvlText w:val="%1)"/>
+      <w:lvlJc w:val="left"/>
+      <w:pPr>
+        <w:ind w:left="612" w:hanging="360"/>
+      </w:pPr>
+      <w:rPr>
+        <w:rFonts w:hint="default"/>
+      </w:rPr>
+    </w:lvl>
+    <w:lvl w:ilvl="1" w:tplc="40090019" w:tentative="1">
+      <w:start w:val="1"/>
+      <w:numFmt w:val="lowerLetter"/>
+      <w:lvlText w:val="%2."/>
+      <w:lvlJc w:val="left"/>
+      <w:pPr>
+        <w:ind w:left="1332" w:hanging="360"/>
+      </w:pPr>
+    </w:lvl>
+    <w:lvl w:ilvl="2" w:tplc="4009001B" w:tentative="1">
+      <w:start w:val="1"/>
+      <w:numFmt w:val="lowerRoman"/>
+      <w:lvlText w:val="%3."/>
+      <w:lvlJc w:val="right"/>
+      <w:pPr>
+        <w:ind w:left="2052" w:hanging="180"/>
+      </w:pPr>
+    </w:lvl>
+    <w:lvl w:ilvl="3" w:tplc="4009000F" w:tentative="1">
+      <w:start w:val="1"/>
+      <w:numFmt w:val="decimal"/>
+      <w:lvlText w:val="%4."/>
+      <w:lvlJc w:val="left"/>
+      <w:pPr>
+        <w:ind w:left="2772" w:hanging="360"/>
+      </w:pPr>
+    </w:lvl>
+    <w:lvl w:ilvl="4" w:tplc="40090019" w:tentative="1">
+      <w:start w:val="1"/>
+      <w:numFmt w:val="lowerLetter"/>
+      <w:lvlText w:val="%5."/>
+      <w:lvlJc w:val="left"/>
+      <w:pPr>
+        <w:ind w:left="3492" w:hanging="360"/>
+      </w:pPr>
+    </w:lvl>
+    <w:lvl w:ilvl="5" w:tplc="4009001B" w:tentative="1">
+      <w:start w:val="1"/>
+      <w:numFmt w:val="lowerRoman"/>
+      <w:lvlText w:val="%6."/>
+      <w:lvlJc w:val="right"/>
+      <w:pPr>
+        <w:ind w:left="4212" w:hanging="180"/>
+      </w:pPr>
+    </w:lvl>
+    <w:lvl w:ilvl="6" w:tplc="4009000F" w:tentative="1">
+      <w:start w:val="1"/>
+      <w:numFmt w:val="decimal"/>
+      <w:lvlText w:val="%7."/>
+      <w:lvlJc w:val="left"/>
+      <w:pPr>
+        <w:ind w:left="4932" w:hanging="360"/>
+      </w:pPr>
+    </w:lvl>
+    <w:lvl w:ilvl="7" w:tplc="40090019" w:tentative="1">
+      <w:start w:val="1"/>
+      <w:numFmt w:val="lowerLetter"/>
+      <w:lvlText w:val="%8."/>
+      <w:lvlJc w:val="left"/>
+      <w:pPr>
+        <w:ind w:left="5652" w:hanging="360"/>
+      </w:pPr>
+    </w:lvl>
+    <w:lvl w:ilvl="8" w:tplc="4009001B" w:tentative="1">
+      <w:start w:val="1"/>
+      <w:numFmt w:val="lowerRoman"/>
+      <w:lvlText w:val="%9."/>
+      <w:lvlJc w:val="right"/>
+      <w:pPr>
+        <w:ind w:left="6372" w:hanging="180"/>
+      </w:pPr>
+    </w:lvl>
+  </w:abstractNum>
+  <w:abstractNum w:abstractNumId="5" w15:restartNumberingAfterBreak="0">
+    <w:nsid w:val="3FFE33F4"/>
+    <w:multiLevelType w:val="hybridMultilevel"/>
+    <w:tmpl w:val="D416EAD0"/>
+    <w:lvl w:ilvl="0" w:tplc="F68CEC46">
+      <w:start w:val="1"/>
+      <w:numFmt w:val="decimal"/>
+      <w:lvlText w:val="%1)"/>
+      <w:lvlJc w:val="left"/>
+      <w:pPr>
+        <w:ind w:left="804" w:hanging="360"/>
+      </w:pPr>
+      <w:rPr>
+        <w:rFonts w:hint="default"/>
+      </w:rPr>
+    </w:lvl>
+    <w:lvl w:ilvl="1" w:tplc="40090019" w:tentative="1">
+      <w:start w:val="1"/>
+      <w:numFmt w:val="lowerLetter"/>
+      <w:lvlText w:val="%2."/>
+      <w:lvlJc w:val="left"/>
+      <w:pPr>
+        <w:ind w:left="1524" w:hanging="360"/>
+      </w:pPr>
+    </w:lvl>
+    <w:lvl w:ilvl="2" w:tplc="4009001B" w:tentative="1">
+      <w:start w:val="1"/>
+      <w:numFmt w:val="lowerRoman"/>
+      <w:lvlText w:val="%3."/>
+      <w:lvlJc w:val="right"/>
+      <w:pPr>
+        <w:ind w:left="2244" w:hanging="180"/>
+      </w:pPr>
+    </w:lvl>
+    <w:lvl w:ilvl="3" w:tplc="4009000F" w:tentative="1">
+      <w:start w:val="1"/>
+      <w:numFmt w:val="decimal"/>
+      <w:lvlText w:val="%4."/>
+      <w:lvlJc w:val="left"/>
+      <w:pPr>
+        <w:ind w:left="2964" w:hanging="360"/>
+      </w:pPr>
+    </w:lvl>
+    <w:lvl w:ilvl="4" w:tplc="40090019" w:tentative="1">
+      <w:start w:val="1"/>
+      <w:numFmt w:val="lowerLetter"/>
+      <w:lvlText w:val="%5."/>
+      <w:lvlJc w:val="left"/>
+      <w:pPr>
+        <w:ind w:left="3684" w:hanging="360"/>
+      </w:pPr>
+    </w:lvl>
+    <w:lvl w:ilvl="5" w:tplc="4009001B" w:tentative="1">
+      <w:start w:val="1"/>
+      <w:numFmt w:val="lowerRoman"/>
+      <w:lvlText w:val="%6."/>
+      <w:lvlJc w:val="right"/>
+      <w:pPr>
+        <w:ind w:left="4404" w:hanging="180"/>
+      </w:pPr>
+    </w:lvl>
+    <w:lvl w:ilvl="6" w:tplc="4009000F" w:tentative="1">
+      <w:start w:val="1"/>
+      <w:numFmt w:val="decimal"/>
+      <w:lvlText w:val="%7."/>
+      <w:lvlJc w:val="left"/>
+      <w:pPr>
+        <w:ind w:left="5124" w:hanging="360"/>
+      </w:pPr>
+    </w:lvl>
+    <w:lvl w:ilvl="7" w:tplc="40090019" w:tentative="1">
+      <w:start w:val="1"/>
+      <w:numFmt w:val="lowerLetter"/>
+      <w:lvlText w:val="%8."/>
+      <w:lvlJc w:val="left"/>
+      <w:pPr>
+        <w:ind w:left="5844" w:hanging="360"/>
+      </w:pPr>
+    </w:lvl>
+    <w:lvl w:ilvl="8" w:tplc="4009001B" w:tentative="1">
+      <w:start w:val="1"/>
+      <w:numFmt w:val="lowerRoman"/>
+      <w:lvlText w:val="%9."/>
+      <w:lvlJc w:val="right"/>
+      <w:pPr>
+        <w:ind w:left="6564" w:hanging="180"/>
+      </w:pPr>
+    </w:lvl>
+  </w:abstractNum>
+  <w:abstractNum w:abstractNumId="6" w15:restartNumberingAfterBreak="0">
     <w:nsid w:val="4B860BE4"/>
     <w:multiLevelType w:val="hybridMultilevel"/>
     <w:tmpl w:val="C95074B6"/>
@@ -626,7 +2710,98 @@
       </w:pPr>
     </w:lvl>
   </w:abstractNum>
-  <w:abstractNum w:abstractNumId="1" w15:restartNumberingAfterBreak="0">
+  <w:abstractNum w:abstractNumId="7" w15:restartNumberingAfterBreak="0">
+    <w:nsid w:val="500D58EB"/>
+    <w:multiLevelType w:val="hybridMultilevel"/>
+    <w:tmpl w:val="1DA6B6BC"/>
+    <w:lvl w:ilvl="0" w:tplc="E1C2938C">
+      <w:start w:val="1"/>
+      <w:numFmt w:val="decimal"/>
+      <w:lvlText w:val="%1)"/>
+      <w:lvlJc w:val="left"/>
+      <w:pPr>
+        <w:ind w:left="660" w:hanging="360"/>
+      </w:pPr>
+      <w:rPr>
+        <w:rFonts w:hint="default"/>
+        <w:b w:val="0"/>
+        <w:bCs w:val="0"/>
+      </w:rPr>
+    </w:lvl>
+    <w:lvl w:ilvl="1" w:tplc="40090019" w:tentative="1">
+      <w:start w:val="1"/>
+      <w:numFmt w:val="lowerLetter"/>
+      <w:lvlText w:val="%2."/>
+      <w:lvlJc w:val="left"/>
+      <w:pPr>
+        <w:ind w:left="1380" w:hanging="360"/>
+      </w:pPr>
+    </w:lvl>
+    <w:lvl w:ilvl="2" w:tplc="4009001B" w:tentative="1">
+      <w:start w:val="1"/>
+      <w:numFmt w:val="lowerRoman"/>
+      <w:lvlText w:val="%3."/>
+      <w:lvlJc w:val="right"/>
+      <w:pPr>
+        <w:ind w:left="2100" w:hanging="180"/>
+      </w:pPr>
+    </w:lvl>
+    <w:lvl w:ilvl="3" w:tplc="4009000F" w:tentative="1">
+      <w:start w:val="1"/>
+      <w:numFmt w:val="decimal"/>
+      <w:lvlText w:val="%4."/>
+      <w:lvlJc w:val="left"/>
+      <w:pPr>
+        <w:ind w:left="2820" w:hanging="360"/>
+      </w:pPr>
+    </w:lvl>
+    <w:lvl w:ilvl="4" w:tplc="40090019" w:tentative="1">
+      <w:start w:val="1"/>
+      <w:numFmt w:val="lowerLetter"/>
+      <w:lvlText w:val="%5."/>
+      <w:lvlJc w:val="left"/>
+      <w:pPr>
+        <w:ind w:left="3540" w:hanging="360"/>
+      </w:pPr>
+    </w:lvl>
+    <w:lvl w:ilvl="5" w:tplc="4009001B" w:tentative="1">
+      <w:start w:val="1"/>
+      <w:numFmt w:val="lowerRoman"/>
+      <w:lvlText w:val="%6."/>
+      <w:lvlJc w:val="right"/>
+      <w:pPr>
+        <w:ind w:left="4260" w:hanging="180"/>
+      </w:pPr>
+    </w:lvl>
+    <w:lvl w:ilvl="6" w:tplc="4009000F" w:tentative="1">
+      <w:start w:val="1"/>
+      <w:numFmt w:val="decimal"/>
+      <w:lvlText w:val="%7."/>
+      <w:lvlJc w:val="left"/>
+      <w:pPr>
+        <w:ind w:left="4980" w:hanging="360"/>
+      </w:pPr>
+    </w:lvl>
+    <w:lvl w:ilvl="7" w:tplc="40090019" w:tentative="1">
+      <w:start w:val="1"/>
+      <w:numFmt w:val="lowerLetter"/>
+      <w:lvlText w:val="%8."/>
+      <w:lvlJc w:val="left"/>
+      <w:pPr>
+        <w:ind w:left="5700" w:hanging="360"/>
+      </w:pPr>
+    </w:lvl>
+    <w:lvl w:ilvl="8" w:tplc="4009001B" w:tentative="1">
+      <w:start w:val="1"/>
+      <w:numFmt w:val="lowerRoman"/>
+      <w:lvlText w:val="%9."/>
+      <w:lvlJc w:val="right"/>
+      <w:pPr>
+        <w:ind w:left="6420" w:hanging="180"/>
+      </w:pPr>
+    </w:lvl>
+  </w:abstractNum>
+  <w:abstractNum w:abstractNumId="8" w15:restartNumberingAfterBreak="0">
     <w:nsid w:val="57286165"/>
     <w:multiLevelType w:val="hybridMultilevel"/>
     <w:tmpl w:val="A9DA9432"/>
@@ -715,7 +2890,185 @@
       </w:pPr>
     </w:lvl>
   </w:abstractNum>
-  <w:abstractNum w:abstractNumId="2" w15:restartNumberingAfterBreak="0">
+  <w:abstractNum w:abstractNumId="9" w15:restartNumberingAfterBreak="0">
+    <w:nsid w:val="5ED42B1B"/>
+    <w:multiLevelType w:val="hybridMultilevel"/>
+    <w:tmpl w:val="230E4CBE"/>
+    <w:lvl w:ilvl="0" w:tplc="8506AADA">
+      <w:start w:val="1"/>
+      <w:numFmt w:val="decimal"/>
+      <w:lvlText w:val="%1)"/>
+      <w:lvlJc w:val="left"/>
+      <w:pPr>
+        <w:ind w:left="756" w:hanging="360"/>
+      </w:pPr>
+      <w:rPr>
+        <w:rFonts w:hint="default"/>
+      </w:rPr>
+    </w:lvl>
+    <w:lvl w:ilvl="1" w:tplc="40090019" w:tentative="1">
+      <w:start w:val="1"/>
+      <w:numFmt w:val="lowerLetter"/>
+      <w:lvlText w:val="%2."/>
+      <w:lvlJc w:val="left"/>
+      <w:pPr>
+        <w:ind w:left="1476" w:hanging="360"/>
+      </w:pPr>
+    </w:lvl>
+    <w:lvl w:ilvl="2" w:tplc="4009001B" w:tentative="1">
+      <w:start w:val="1"/>
+      <w:numFmt w:val="lowerRoman"/>
+      <w:lvlText w:val="%3."/>
+      <w:lvlJc w:val="right"/>
+      <w:pPr>
+        <w:ind w:left="2196" w:hanging="180"/>
+      </w:pPr>
+    </w:lvl>
+    <w:lvl w:ilvl="3" w:tplc="4009000F" w:tentative="1">
+      <w:start w:val="1"/>
+      <w:numFmt w:val="decimal"/>
+      <w:lvlText w:val="%4."/>
+      <w:lvlJc w:val="left"/>
+      <w:pPr>
+        <w:ind w:left="2916" w:hanging="360"/>
+      </w:pPr>
+    </w:lvl>
+    <w:lvl w:ilvl="4" w:tplc="40090019" w:tentative="1">
+      <w:start w:val="1"/>
+      <w:numFmt w:val="lowerLetter"/>
+      <w:lvlText w:val="%5."/>
+      <w:lvlJc w:val="left"/>
+      <w:pPr>
+        <w:ind w:left="3636" w:hanging="360"/>
+      </w:pPr>
+    </w:lvl>
+    <w:lvl w:ilvl="5" w:tplc="4009001B" w:tentative="1">
+      <w:start w:val="1"/>
+      <w:numFmt w:val="lowerRoman"/>
+      <w:lvlText w:val="%6."/>
+      <w:lvlJc w:val="right"/>
+      <w:pPr>
+        <w:ind w:left="4356" w:hanging="180"/>
+      </w:pPr>
+    </w:lvl>
+    <w:lvl w:ilvl="6" w:tplc="4009000F" w:tentative="1">
+      <w:start w:val="1"/>
+      <w:numFmt w:val="decimal"/>
+      <w:lvlText w:val="%7."/>
+      <w:lvlJc w:val="left"/>
+      <w:pPr>
+        <w:ind w:left="5076" w:hanging="360"/>
+      </w:pPr>
+    </w:lvl>
+    <w:lvl w:ilvl="7" w:tplc="40090019" w:tentative="1">
+      <w:start w:val="1"/>
+      <w:numFmt w:val="lowerLetter"/>
+      <w:lvlText w:val="%8."/>
+      <w:lvlJc w:val="left"/>
+      <w:pPr>
+        <w:ind w:left="5796" w:hanging="360"/>
+      </w:pPr>
+    </w:lvl>
+    <w:lvl w:ilvl="8" w:tplc="4009001B" w:tentative="1">
+      <w:start w:val="1"/>
+      <w:numFmt w:val="lowerRoman"/>
+      <w:lvlText w:val="%9."/>
+      <w:lvlJc w:val="right"/>
+      <w:pPr>
+        <w:ind w:left="6516" w:hanging="180"/>
+      </w:pPr>
+    </w:lvl>
+  </w:abstractNum>
+  <w:abstractNum w:abstractNumId="10" w15:restartNumberingAfterBreak="0">
+    <w:nsid w:val="5F0931D9"/>
+    <w:multiLevelType w:val="hybridMultilevel"/>
+    <w:tmpl w:val="B2F028A8"/>
+    <w:lvl w:ilvl="0" w:tplc="40090011">
+      <w:start w:val="1"/>
+      <w:numFmt w:val="decimal"/>
+      <w:lvlText w:val="%1)"/>
+      <w:lvlJc w:val="left"/>
+      <w:pPr>
+        <w:ind w:left="720" w:hanging="360"/>
+      </w:pPr>
+      <w:rPr>
+        <w:rFonts w:hint="default"/>
+      </w:rPr>
+    </w:lvl>
+    <w:lvl w:ilvl="1" w:tplc="40090019" w:tentative="1">
+      <w:start w:val="1"/>
+      <w:numFmt w:val="lowerLetter"/>
+      <w:lvlText w:val="%2."/>
+      <w:lvlJc w:val="left"/>
+      <w:pPr>
+        <w:ind w:left="1440" w:hanging="360"/>
+      </w:pPr>
+    </w:lvl>
+    <w:lvl w:ilvl="2" w:tplc="4009001B" w:tentative="1">
+      <w:start w:val="1"/>
+      <w:numFmt w:val="lowerRoman"/>
+      <w:lvlText w:val="%3."/>
+      <w:lvlJc w:val="right"/>
+      <w:pPr>
+        <w:ind w:left="2160" w:hanging="180"/>
+      </w:pPr>
+    </w:lvl>
+    <w:lvl w:ilvl="3" w:tplc="4009000F" w:tentative="1">
+      <w:start w:val="1"/>
+      <w:numFmt w:val="decimal"/>
+      <w:lvlText w:val="%4."/>
+      <w:lvlJc w:val="left"/>
+      <w:pPr>
+        <w:ind w:left="2880" w:hanging="360"/>
+      </w:pPr>
+    </w:lvl>
+    <w:lvl w:ilvl="4" w:tplc="40090019" w:tentative="1">
+      <w:start w:val="1"/>
+      <w:numFmt w:val="lowerLetter"/>
+      <w:lvlText w:val="%5."/>
+      <w:lvlJc w:val="left"/>
+      <w:pPr>
+        <w:ind w:left="3600" w:hanging="360"/>
+      </w:pPr>
+    </w:lvl>
+    <w:lvl w:ilvl="5" w:tplc="4009001B" w:tentative="1">
+      <w:start w:val="1"/>
+      <w:numFmt w:val="lowerRoman"/>
+      <w:lvlText w:val="%6."/>
+      <w:lvlJc w:val="right"/>
+      <w:pPr>
+        <w:ind w:left="4320" w:hanging="180"/>
+      </w:pPr>
+    </w:lvl>
+    <w:lvl w:ilvl="6" w:tplc="4009000F" w:tentative="1">
+      <w:start w:val="1"/>
+      <w:numFmt w:val="decimal"/>
+      <w:lvlText w:val="%7."/>
+      <w:lvlJc w:val="left"/>
+      <w:pPr>
+        <w:ind w:left="5040" w:hanging="360"/>
+      </w:pPr>
+    </w:lvl>
+    <w:lvl w:ilvl="7" w:tplc="40090019" w:tentative="1">
+      <w:start w:val="1"/>
+      <w:numFmt w:val="lowerLetter"/>
+      <w:lvlText w:val="%8."/>
+      <w:lvlJc w:val="left"/>
+      <w:pPr>
+        <w:ind w:left="5760" w:hanging="360"/>
+      </w:pPr>
+    </w:lvl>
+    <w:lvl w:ilvl="8" w:tplc="4009001B" w:tentative="1">
+      <w:start w:val="1"/>
+      <w:numFmt w:val="lowerRoman"/>
+      <w:lvlText w:val="%9."/>
+      <w:lvlJc w:val="right"/>
+      <w:pPr>
+        <w:ind w:left="6480" w:hanging="180"/>
+      </w:pPr>
+    </w:lvl>
+  </w:abstractNum>
+  <w:abstractNum w:abstractNumId="11" w15:restartNumberingAfterBreak="0">
     <w:nsid w:val="6741648B"/>
     <w:multiLevelType w:val="hybridMultilevel"/>
     <w:tmpl w:val="09D0E646"/>
@@ -804,7 +3157,96 @@
       </w:pPr>
     </w:lvl>
   </w:abstractNum>
-  <w:abstractNum w:abstractNumId="3" w15:restartNumberingAfterBreak="0">
+  <w:abstractNum w:abstractNumId="12" w15:restartNumberingAfterBreak="0">
+    <w:nsid w:val="6C891ED1"/>
+    <w:multiLevelType w:val="hybridMultilevel"/>
+    <w:tmpl w:val="AFC6B320"/>
+    <w:lvl w:ilvl="0" w:tplc="C1182640">
+      <w:start w:val="1"/>
+      <w:numFmt w:val="decimal"/>
+      <w:lvlText w:val="%1)"/>
+      <w:lvlJc w:val="left"/>
+      <w:pPr>
+        <w:ind w:left="756" w:hanging="360"/>
+      </w:pPr>
+      <w:rPr>
+        <w:rFonts w:hint="default"/>
+      </w:rPr>
+    </w:lvl>
+    <w:lvl w:ilvl="1" w:tplc="40090019" w:tentative="1">
+      <w:start w:val="1"/>
+      <w:numFmt w:val="lowerLetter"/>
+      <w:lvlText w:val="%2."/>
+      <w:lvlJc w:val="left"/>
+      <w:pPr>
+        <w:ind w:left="1476" w:hanging="360"/>
+      </w:pPr>
+    </w:lvl>
+    <w:lvl w:ilvl="2" w:tplc="4009001B" w:tentative="1">
+      <w:start w:val="1"/>
+      <w:numFmt w:val="lowerRoman"/>
+      <w:lvlText w:val="%3."/>
+      <w:lvlJc w:val="right"/>
+      <w:pPr>
+        <w:ind w:left="2196" w:hanging="180"/>
+      </w:pPr>
+    </w:lvl>
+    <w:lvl w:ilvl="3" w:tplc="4009000F" w:tentative="1">
+      <w:start w:val="1"/>
+      <w:numFmt w:val="decimal"/>
+      <w:lvlText w:val="%4."/>
+      <w:lvlJc w:val="left"/>
+      <w:pPr>
+        <w:ind w:left="2916" w:hanging="360"/>
+      </w:pPr>
+    </w:lvl>
+    <w:lvl w:ilvl="4" w:tplc="40090019" w:tentative="1">
+      <w:start w:val="1"/>
+      <w:numFmt w:val="lowerLetter"/>
+      <w:lvlText w:val="%5."/>
+      <w:lvlJc w:val="left"/>
+      <w:pPr>
+        <w:ind w:left="3636" w:hanging="360"/>
+      </w:pPr>
+    </w:lvl>
+    <w:lvl w:ilvl="5" w:tplc="4009001B" w:tentative="1">
+      <w:start w:val="1"/>
+      <w:numFmt w:val="lowerRoman"/>
+      <w:lvlText w:val="%6."/>
+      <w:lvlJc w:val="right"/>
+      <w:pPr>
+        <w:ind w:left="4356" w:hanging="180"/>
+      </w:pPr>
+    </w:lvl>
+    <w:lvl w:ilvl="6" w:tplc="4009000F" w:tentative="1">
+      <w:start w:val="1"/>
+      <w:numFmt w:val="decimal"/>
+      <w:lvlText w:val="%7."/>
+      <w:lvlJc w:val="left"/>
+      <w:pPr>
+        <w:ind w:left="5076" w:hanging="360"/>
+      </w:pPr>
+    </w:lvl>
+    <w:lvl w:ilvl="7" w:tplc="40090019" w:tentative="1">
+      <w:start w:val="1"/>
+      <w:numFmt w:val="lowerLetter"/>
+      <w:lvlText w:val="%8."/>
+      <w:lvlJc w:val="left"/>
+      <w:pPr>
+        <w:ind w:left="5796" w:hanging="360"/>
+      </w:pPr>
+    </w:lvl>
+    <w:lvl w:ilvl="8" w:tplc="4009001B" w:tentative="1">
+      <w:start w:val="1"/>
+      <w:numFmt w:val="lowerRoman"/>
+      <w:lvlText w:val="%9."/>
+      <w:lvlJc w:val="right"/>
+      <w:pPr>
+        <w:ind w:left="6516" w:hanging="180"/>
+      </w:pPr>
+    </w:lvl>
+  </w:abstractNum>
+  <w:abstractNum w:abstractNumId="13" w15:restartNumberingAfterBreak="0">
     <w:nsid w:val="73402F57"/>
     <w:multiLevelType w:val="hybridMultilevel"/>
     <w:tmpl w:val="62780A74"/>
@@ -893,17 +3335,231 @@
       </w:pPr>
     </w:lvl>
   </w:abstractNum>
+  <w:abstractNum w:abstractNumId="14" w15:restartNumberingAfterBreak="0">
+    <w:nsid w:val="74704194"/>
+    <w:multiLevelType w:val="hybridMultilevel"/>
+    <w:tmpl w:val="54C47C80"/>
+    <w:lvl w:ilvl="0" w:tplc="40090011">
+      <w:start w:val="1"/>
+      <w:numFmt w:val="decimal"/>
+      <w:lvlText w:val="%1)"/>
+      <w:lvlJc w:val="left"/>
+      <w:pPr>
+        <w:ind w:left="720" w:hanging="360"/>
+      </w:pPr>
+      <w:rPr>
+        <w:rFonts w:hint="default"/>
+      </w:rPr>
+    </w:lvl>
+    <w:lvl w:ilvl="1" w:tplc="40090019" w:tentative="1">
+      <w:start w:val="1"/>
+      <w:numFmt w:val="lowerLetter"/>
+      <w:lvlText w:val="%2."/>
+      <w:lvlJc w:val="left"/>
+      <w:pPr>
+        <w:ind w:left="1440" w:hanging="360"/>
+      </w:pPr>
+    </w:lvl>
+    <w:lvl w:ilvl="2" w:tplc="4009001B" w:tentative="1">
+      <w:start w:val="1"/>
+      <w:numFmt w:val="lowerRoman"/>
+      <w:lvlText w:val="%3."/>
+      <w:lvlJc w:val="right"/>
+      <w:pPr>
+        <w:ind w:left="2160" w:hanging="180"/>
+      </w:pPr>
+    </w:lvl>
+    <w:lvl w:ilvl="3" w:tplc="4009000F" w:tentative="1">
+      <w:start w:val="1"/>
+      <w:numFmt w:val="decimal"/>
+      <w:lvlText w:val="%4."/>
+      <w:lvlJc w:val="left"/>
+      <w:pPr>
+        <w:ind w:left="2880" w:hanging="360"/>
+      </w:pPr>
+    </w:lvl>
+    <w:lvl w:ilvl="4" w:tplc="40090019" w:tentative="1">
+      <w:start w:val="1"/>
+      <w:numFmt w:val="lowerLetter"/>
+      <w:lvlText w:val="%5."/>
+      <w:lvlJc w:val="left"/>
+      <w:pPr>
+        <w:ind w:left="3600" w:hanging="360"/>
+      </w:pPr>
+    </w:lvl>
+    <w:lvl w:ilvl="5" w:tplc="4009001B" w:tentative="1">
+      <w:start w:val="1"/>
+      <w:numFmt w:val="lowerRoman"/>
+      <w:lvlText w:val="%6."/>
+      <w:lvlJc w:val="right"/>
+      <w:pPr>
+        <w:ind w:left="4320" w:hanging="180"/>
+      </w:pPr>
+    </w:lvl>
+    <w:lvl w:ilvl="6" w:tplc="4009000F" w:tentative="1">
+      <w:start w:val="1"/>
+      <w:numFmt w:val="decimal"/>
+      <w:lvlText w:val="%7."/>
+      <w:lvlJc w:val="left"/>
+      <w:pPr>
+        <w:ind w:left="5040" w:hanging="360"/>
+      </w:pPr>
+    </w:lvl>
+    <w:lvl w:ilvl="7" w:tplc="40090019" w:tentative="1">
+      <w:start w:val="1"/>
+      <w:numFmt w:val="lowerLetter"/>
+      <w:lvlText w:val="%8."/>
+      <w:lvlJc w:val="left"/>
+      <w:pPr>
+        <w:ind w:left="5760" w:hanging="360"/>
+      </w:pPr>
+    </w:lvl>
+    <w:lvl w:ilvl="8" w:tplc="4009001B" w:tentative="1">
+      <w:start w:val="1"/>
+      <w:numFmt w:val="lowerRoman"/>
+      <w:lvlText w:val="%9."/>
+      <w:lvlJc w:val="right"/>
+      <w:pPr>
+        <w:ind w:left="6480" w:hanging="180"/>
+      </w:pPr>
+    </w:lvl>
+  </w:abstractNum>
+  <w:abstractNum w:abstractNumId="15" w15:restartNumberingAfterBreak="0">
+    <w:nsid w:val="7F715AAC"/>
+    <w:multiLevelType w:val="hybridMultilevel"/>
+    <w:tmpl w:val="20FCC3D2"/>
+    <w:lvl w:ilvl="0" w:tplc="40090011">
+      <w:start w:val="1"/>
+      <w:numFmt w:val="decimal"/>
+      <w:lvlText w:val="%1)"/>
+      <w:lvlJc w:val="left"/>
+      <w:pPr>
+        <w:ind w:left="720" w:hanging="360"/>
+      </w:pPr>
+      <w:rPr>
+        <w:rFonts w:hint="default"/>
+      </w:rPr>
+    </w:lvl>
+    <w:lvl w:ilvl="1" w:tplc="40090019" w:tentative="1">
+      <w:start w:val="1"/>
+      <w:numFmt w:val="lowerLetter"/>
+      <w:lvlText w:val="%2."/>
+      <w:lvlJc w:val="left"/>
+      <w:pPr>
+        <w:ind w:left="1440" w:hanging="360"/>
+      </w:pPr>
+    </w:lvl>
+    <w:lvl w:ilvl="2" w:tplc="4009001B" w:tentative="1">
+      <w:start w:val="1"/>
+      <w:numFmt w:val="lowerRoman"/>
+      <w:lvlText w:val="%3."/>
+      <w:lvlJc w:val="right"/>
+      <w:pPr>
+        <w:ind w:left="2160" w:hanging="180"/>
+      </w:pPr>
+    </w:lvl>
+    <w:lvl w:ilvl="3" w:tplc="4009000F" w:tentative="1">
+      <w:start w:val="1"/>
+      <w:numFmt w:val="decimal"/>
+      <w:lvlText w:val="%4."/>
+      <w:lvlJc w:val="left"/>
+      <w:pPr>
+        <w:ind w:left="2880" w:hanging="360"/>
+      </w:pPr>
+    </w:lvl>
+    <w:lvl w:ilvl="4" w:tplc="40090019" w:tentative="1">
+      <w:start w:val="1"/>
+      <w:numFmt w:val="lowerLetter"/>
+      <w:lvlText w:val="%5."/>
+      <w:lvlJc w:val="left"/>
+      <w:pPr>
+        <w:ind w:left="3600" w:hanging="360"/>
+      </w:pPr>
+    </w:lvl>
+    <w:lvl w:ilvl="5" w:tplc="4009001B" w:tentative="1">
+      <w:start w:val="1"/>
+      <w:numFmt w:val="lowerRoman"/>
+      <w:lvlText w:val="%6."/>
+      <w:lvlJc w:val="right"/>
+      <w:pPr>
+        <w:ind w:left="4320" w:hanging="180"/>
+      </w:pPr>
+    </w:lvl>
+    <w:lvl w:ilvl="6" w:tplc="4009000F" w:tentative="1">
+      <w:start w:val="1"/>
+      <w:numFmt w:val="decimal"/>
+      <w:lvlText w:val="%7."/>
+      <w:lvlJc w:val="left"/>
+      <w:pPr>
+        <w:ind w:left="5040" w:hanging="360"/>
+      </w:pPr>
+    </w:lvl>
+    <w:lvl w:ilvl="7" w:tplc="40090019" w:tentative="1">
+      <w:start w:val="1"/>
+      <w:numFmt w:val="lowerLetter"/>
+      <w:lvlText w:val="%8."/>
+      <w:lvlJc w:val="left"/>
+      <w:pPr>
+        <w:ind w:left="5760" w:hanging="360"/>
+      </w:pPr>
+    </w:lvl>
+    <w:lvl w:ilvl="8" w:tplc="4009001B" w:tentative="1">
+      <w:start w:val="1"/>
+      <w:numFmt w:val="lowerRoman"/>
+      <w:lvlText w:val="%9."/>
+      <w:lvlJc w:val="right"/>
+      <w:pPr>
+        <w:ind w:left="6480" w:hanging="180"/>
+      </w:pPr>
+    </w:lvl>
+  </w:abstractNum>
   <w:num w:numId="1" w16cid:durableId="1929191308">
+    <w:abstractNumId w:val="11"/>
+  </w:num>
+  <w:num w:numId="2" w16cid:durableId="1452818009">
+    <w:abstractNumId w:val="8"/>
+  </w:num>
+  <w:num w:numId="3" w16cid:durableId="379129943">
+    <w:abstractNumId w:val="6"/>
+  </w:num>
+  <w:num w:numId="4" w16cid:durableId="1063913110">
+    <w:abstractNumId w:val="13"/>
+  </w:num>
+  <w:num w:numId="5" w16cid:durableId="1823230013">
+    <w:abstractNumId w:val="15"/>
+  </w:num>
+  <w:num w:numId="6" w16cid:durableId="1228151261">
     <w:abstractNumId w:val="2"/>
   </w:num>
-  <w:num w:numId="2" w16cid:durableId="1452818009">
+  <w:num w:numId="7" w16cid:durableId="516432532">
+    <w:abstractNumId w:val="0"/>
+  </w:num>
+  <w:num w:numId="8" w16cid:durableId="1301885363">
     <w:abstractNumId w:val="1"/>
   </w:num>
-  <w:num w:numId="3" w16cid:durableId="379129943">
-    <w:abstractNumId w:val="0"/>
+  <w:num w:numId="9" w16cid:durableId="1485926871">
+    <w:abstractNumId w:val="7"/>
   </w:num>
-  <w:num w:numId="4" w16cid:durableId="1063913110">
+  <w:num w:numId="10" w16cid:durableId="382295947">
+    <w:abstractNumId w:val="14"/>
+  </w:num>
+  <w:num w:numId="11" w16cid:durableId="266929314">
+    <w:abstractNumId w:val="10"/>
+  </w:num>
+  <w:num w:numId="12" w16cid:durableId="858810609">
+    <w:abstractNumId w:val="4"/>
+  </w:num>
+  <w:num w:numId="13" w16cid:durableId="920332385">
+    <w:abstractNumId w:val="9"/>
+  </w:num>
+  <w:num w:numId="14" w16cid:durableId="1438059950">
     <w:abstractNumId w:val="3"/>
+  </w:num>
+  <w:num w:numId="15" w16cid:durableId="1506941495">
+    <w:abstractNumId w:val="12"/>
+  </w:num>
+  <w:num w:numId="16" w16cid:durableId="1229996536">
+    <w:abstractNumId w:val="5"/>
   </w:num>
 </w:numbering>
 </file>

</xml_diff>

<commit_message>
6th Lecture on LL
</commit_message>
<xml_diff>
--- a/Notes/LL.docx
+++ b/Notes/LL.docx
@@ -162,24 +162,8 @@
         <w:rPr>
           <w:lang w:val="en-US"/>
         </w:rPr>
-        <w:t xml:space="preserve">Assign the </w:t>
-      </w:r>
-      <w:proofErr w:type="spellStart"/>
-      <w:proofErr w:type="gramStart"/>
-      <w:r>
-        <w:rPr>
-          <w:lang w:val="en-US"/>
-        </w:rPr>
-        <w:t>temp,head</w:t>
-      </w:r>
-      <w:proofErr w:type="gramEnd"/>
-      <w:r>
-        <w:rPr>
-          <w:lang w:val="en-US"/>
-        </w:rPr>
-        <w:t>,mover</w:t>
-      </w:r>
-      <w:proofErr w:type="spellEnd"/>
+        <w:t>Assign the temp,head,mover</w:t>
+      </w:r>
     </w:p>
     <w:p>
       <w:pPr>
@@ -249,43 +233,7 @@
           <w:bCs/>
           <w:lang w:val="en-US"/>
         </w:rPr>
-        <w:t>/</w:t>
-      </w:r>
-      <w:proofErr w:type="gramStart"/>
-      <w:r>
-        <w:rPr>
-          <w:b/>
-          <w:bCs/>
-          <w:lang w:val="en-US"/>
-        </w:rPr>
-        <w:t>/  Traversal</w:t>
-      </w:r>
-      <w:proofErr w:type="gramEnd"/>
-      <w:r>
-        <w:rPr>
-          <w:b/>
-          <w:bCs/>
-          <w:lang w:val="en-US"/>
-        </w:rPr>
-        <w:t xml:space="preserve"> </w:t>
-      </w:r>
-      <w:proofErr w:type="spellStart"/>
-      <w:r>
-        <w:rPr>
-          <w:b/>
-          <w:bCs/>
-          <w:lang w:val="en-US"/>
-        </w:rPr>
-        <w:t>os</w:t>
-      </w:r>
-      <w:proofErr w:type="spellEnd"/>
-      <w:r>
-        <w:rPr>
-          <w:b/>
-          <w:bCs/>
-          <w:lang w:val="en-US"/>
-        </w:rPr>
-        <w:t xml:space="preserve"> LL</w:t>
+        <w:t>//  Traversal os LL</w:t>
       </w:r>
     </w:p>
     <w:p>
@@ -321,21 +269,7 @@
         <w:rPr>
           <w:lang w:val="en-US"/>
         </w:rPr>
-        <w:t xml:space="preserve">Till the </w:t>
-      </w:r>
-      <w:proofErr w:type="gramStart"/>
-      <w:r>
-        <w:rPr>
-          <w:lang w:val="en-US"/>
-        </w:rPr>
-        <w:t>temp !</w:t>
-      </w:r>
-      <w:proofErr w:type="gramEnd"/>
-      <w:r>
-        <w:rPr>
-          <w:lang w:val="en-US"/>
-        </w:rPr>
-        <w:t>= null</w:t>
+        <w:t>Till the temp != null</w:t>
       </w:r>
     </w:p>
     <w:p>
@@ -406,23 +340,7 @@
         <w:rPr>
           <w:lang w:val="en-US"/>
         </w:rPr>
-        <w:t xml:space="preserve">Assign the head to the </w:t>
-      </w:r>
-      <w:proofErr w:type="spellStart"/>
-      <w:proofErr w:type="gramStart"/>
-      <w:r>
-        <w:rPr>
-          <w:lang w:val="en-US"/>
-        </w:rPr>
-        <w:t>temp,count</w:t>
-      </w:r>
-      <w:proofErr w:type="spellEnd"/>
-      <w:proofErr w:type="gramEnd"/>
-      <w:r>
-        <w:rPr>
-          <w:lang w:val="en-US"/>
-        </w:rPr>
-        <w:t xml:space="preserve"> =0</w:t>
+        <w:t>Assign the head to the temp,count =0</w:t>
       </w:r>
     </w:p>
     <w:p>
@@ -440,21 +358,7 @@
         <w:rPr>
           <w:lang w:val="en-US"/>
         </w:rPr>
-        <w:t xml:space="preserve">Till the </w:t>
-      </w:r>
-      <w:proofErr w:type="gramStart"/>
-      <w:r>
-        <w:rPr>
-          <w:lang w:val="en-US"/>
-        </w:rPr>
-        <w:t>temp !</w:t>
-      </w:r>
-      <w:proofErr w:type="gramEnd"/>
-      <w:r>
-        <w:rPr>
-          <w:lang w:val="en-US"/>
-        </w:rPr>
-        <w:t>= null</w:t>
+        <w:t>Till the temp != null</w:t>
       </w:r>
     </w:p>
     <w:p>
@@ -543,21 +447,7 @@
         <w:rPr>
           <w:lang w:val="en-US"/>
         </w:rPr>
-        <w:t xml:space="preserve">Till the </w:t>
-      </w:r>
-      <w:proofErr w:type="gramStart"/>
-      <w:r>
-        <w:rPr>
-          <w:lang w:val="en-US"/>
-        </w:rPr>
-        <w:t>temp !</w:t>
-      </w:r>
-      <w:proofErr w:type="gramEnd"/>
-      <w:r>
-        <w:rPr>
-          <w:lang w:val="en-US"/>
-        </w:rPr>
-        <w:t>= null</w:t>
+        <w:t>Till the temp != null</w:t>
       </w:r>
     </w:p>
     <w:p>
@@ -575,21 +465,7 @@
         <w:rPr>
           <w:lang w:val="en-US"/>
         </w:rPr>
-        <w:t xml:space="preserve">If temp’s </w:t>
-      </w:r>
-      <w:proofErr w:type="gramStart"/>
-      <w:r>
-        <w:rPr>
-          <w:lang w:val="en-US"/>
-        </w:rPr>
-        <w:t>data  =</w:t>
-      </w:r>
-      <w:proofErr w:type="gramEnd"/>
-      <w:r>
-        <w:rPr>
-          <w:lang w:val="en-US"/>
-        </w:rPr>
-        <w:t xml:space="preserve">= target </w:t>
+        <w:t xml:space="preserve">If temp’s data  == target </w:t>
       </w:r>
     </w:p>
     <w:p>
@@ -931,21 +807,7 @@
         <w:rPr>
           <w:lang w:val="en-US"/>
         </w:rPr>
-        <w:t xml:space="preserve">Base condition </w:t>
-      </w:r>
-      <w:proofErr w:type="gramStart"/>
-      <w:r>
-        <w:rPr>
-          <w:lang w:val="en-US"/>
-        </w:rPr>
-        <w:t>check</w:t>
-      </w:r>
-      <w:proofErr w:type="gramEnd"/>
-      <w:r>
-        <w:rPr>
-          <w:lang w:val="en-US"/>
-        </w:rPr>
-        <w:t xml:space="preserve"> the head is null or having the single element </w:t>
+        <w:t xml:space="preserve">Base condition check the head is null or having the single element </w:t>
       </w:r>
     </w:p>
     <w:p>
@@ -959,19 +821,11 @@
           <w:lang w:val="en-US"/>
         </w:rPr>
       </w:pPr>
-      <w:proofErr w:type="spellStart"/>
-      <w:r>
-        <w:rPr>
-          <w:lang w:val="en-US"/>
-        </w:rPr>
-        <w:t>Retun</w:t>
-      </w:r>
-      <w:proofErr w:type="spellEnd"/>
-      <w:r>
-        <w:rPr>
-          <w:lang w:val="en-US"/>
-        </w:rPr>
-        <w:t xml:space="preserve"> null</w:t>
+      <w:r>
+        <w:rPr>
+          <w:lang w:val="en-US"/>
+        </w:rPr>
+        <w:t>Retun null</w:t>
       </w:r>
     </w:p>
     <w:p>
@@ -1091,35 +945,7 @@
         <w:rPr>
           <w:lang w:val="en-US"/>
         </w:rPr>
-        <w:t>Head == null (</w:t>
-      </w:r>
-      <w:proofErr w:type="gramStart"/>
-      <w:r>
-        <w:rPr>
-          <w:lang w:val="en-US"/>
-        </w:rPr>
-        <w:t>0 )</w:t>
-      </w:r>
-      <w:proofErr w:type="gramEnd"/>
-      <w:r>
-        <w:rPr>
-          <w:lang w:val="en-US"/>
-        </w:rPr>
-        <w:t xml:space="preserve"> || </w:t>
-      </w:r>
-      <w:proofErr w:type="spellStart"/>
-      <w:r>
-        <w:rPr>
-          <w:lang w:val="en-US"/>
-        </w:rPr>
-        <w:t>head.next</w:t>
-      </w:r>
-      <w:proofErr w:type="spellEnd"/>
-      <w:r>
-        <w:rPr>
-          <w:lang w:val="en-US"/>
-        </w:rPr>
-        <w:t xml:space="preserve"> == null (1)</w:t>
+        <w:t>Head == null (0 ) || head.next == null (1)</w:t>
       </w:r>
     </w:p>
     <w:p>
@@ -1155,21 +981,7 @@
         <w:rPr>
           <w:lang w:val="en-US"/>
         </w:rPr>
-        <w:t xml:space="preserve">Go till the second </w:t>
-      </w:r>
-      <w:proofErr w:type="gramStart"/>
-      <w:r>
-        <w:rPr>
-          <w:lang w:val="en-US"/>
-        </w:rPr>
-        <w:t>last !</w:t>
-      </w:r>
-      <w:proofErr w:type="gramEnd"/>
-      <w:r>
-        <w:rPr>
-          <w:lang w:val="en-US"/>
-        </w:rPr>
-        <w:t>= null</w:t>
+        <w:t>Go till the second last != null</w:t>
       </w:r>
     </w:p>
     <w:p>
@@ -1242,16 +1054,8 @@
         <w:rPr>
           <w:lang w:val="en-US"/>
         </w:rPr>
-        <w:t xml:space="preserve">Check the for base </w:t>
-      </w:r>
-      <w:proofErr w:type="spellStart"/>
-      <w:r>
-        <w:rPr>
-          <w:lang w:val="en-US"/>
-        </w:rPr>
-        <w:t>condiion</w:t>
-      </w:r>
-      <w:proofErr w:type="spellEnd"/>
+        <w:t>Check the for base condiion</w:t>
+      </w:r>
     </w:p>
     <w:p>
       <w:pPr>
@@ -1310,21 +1114,7 @@
         <w:rPr>
           <w:lang w:val="en-US"/>
         </w:rPr>
-        <w:t xml:space="preserve">Assign </w:t>
-      </w:r>
-      <w:proofErr w:type="spellStart"/>
-      <w:r>
-        <w:rPr>
-          <w:lang w:val="en-US"/>
-        </w:rPr>
-        <w:t>prev</w:t>
-      </w:r>
-      <w:proofErr w:type="spellEnd"/>
-      <w:r>
-        <w:rPr>
-          <w:lang w:val="en-US"/>
-        </w:rPr>
-        <w:t xml:space="preserve"> = null</w:t>
+        <w:t>Assign prev = null</w:t>
       </w:r>
     </w:p>
     <w:p>
@@ -1360,27 +1150,13 @@
         <w:rPr>
           <w:lang w:val="en-US"/>
         </w:rPr>
-        <w:t xml:space="preserve">Go </w:t>
-      </w:r>
-      <w:proofErr w:type="gramStart"/>
-      <w:r>
-        <w:rPr>
-          <w:lang w:val="en-US"/>
-        </w:rPr>
-        <w:t xml:space="preserve">till </w:t>
-      </w:r>
-      <w:r>
-        <w:rPr>
-          <w:lang w:val="en-US"/>
-        </w:rPr>
-        <w:t xml:space="preserve"> the</w:t>
-      </w:r>
-      <w:proofErr w:type="gramEnd"/>
-      <w:r>
-        <w:rPr>
-          <w:lang w:val="en-US"/>
-        </w:rPr>
-        <w:t xml:space="preserve"> last element </w:t>
+        <w:t xml:space="preserve">Go till </w:t>
+      </w:r>
+      <w:r>
+        <w:rPr>
+          <w:lang w:val="en-US"/>
+        </w:rPr>
+        <w:t xml:space="preserve"> the last element </w:t>
       </w:r>
     </w:p>
     <w:p>
@@ -1434,30 +1210,8 @@
         <w:rPr>
           <w:lang w:val="en-US"/>
         </w:rPr>
-        <w:t xml:space="preserve">Prev next = </w:t>
-      </w:r>
-      <w:proofErr w:type="spellStart"/>
-      <w:r>
-        <w:rPr>
-          <w:lang w:val="en-US"/>
-        </w:rPr>
-        <w:t>prev</w:t>
-      </w:r>
-      <w:proofErr w:type="spellEnd"/>
-      <w:r>
-        <w:rPr>
-          <w:lang w:val="en-US"/>
-        </w:rPr>
-        <w:t xml:space="preserve"> next </w:t>
-      </w:r>
-      <w:proofErr w:type="spellStart"/>
-      <w:r>
-        <w:rPr>
-          <w:lang w:val="en-US"/>
-        </w:rPr>
-        <w:t>next</w:t>
-      </w:r>
-      <w:proofErr w:type="spellEnd"/>
+        <w:t>Prev next = prev next next</w:t>
+      </w:r>
     </w:p>
     <w:p>
       <w:pPr>
@@ -1474,21 +1228,7 @@
         <w:rPr>
           <w:lang w:val="en-US"/>
         </w:rPr>
-        <w:t xml:space="preserve">Else move to the </w:t>
-      </w:r>
-      <w:proofErr w:type="spellStart"/>
-      <w:r>
-        <w:rPr>
-          <w:lang w:val="en-US"/>
-        </w:rPr>
-        <w:t>prv</w:t>
-      </w:r>
-      <w:proofErr w:type="spellEnd"/>
-      <w:r>
-        <w:rPr>
-          <w:lang w:val="en-US"/>
-        </w:rPr>
-        <w:t xml:space="preserve"> = temp</w:t>
+        <w:t>Else move to the prv = temp</w:t>
       </w:r>
     </w:p>
     <w:p>
@@ -1563,28 +1303,12 @@
           <w:lang w:val="en-US"/>
         </w:rPr>
       </w:pPr>
-      <w:proofErr w:type="spellStart"/>
-      <w:r>
-        <w:rPr>
-          <w:lang w:val="en-US"/>
-        </w:rPr>
-        <w:t>Head.data</w:t>
-      </w:r>
-      <w:proofErr w:type="spellEnd"/>
-      <w:r>
-        <w:rPr>
-          <w:lang w:val="en-US"/>
-        </w:rPr>
-        <w:t xml:space="preserve"> == </w:t>
-      </w:r>
-      <w:proofErr w:type="spellStart"/>
-      <w:r>
-        <w:rPr>
-          <w:lang w:val="en-US"/>
-        </w:rPr>
-        <w:t>el</w:t>
-      </w:r>
-      <w:proofErr w:type="spellEnd"/>
+      <w:r>
+        <w:rPr>
+          <w:lang w:val="en-US"/>
+        </w:rPr>
+        <w:t>Head.data == el</w:t>
+      </w:r>
     </w:p>
     <w:p>
       <w:pPr>
@@ -1601,16 +1325,8 @@
         <w:rPr>
           <w:lang w:val="en-US"/>
         </w:rPr>
-        <w:t xml:space="preserve">Same as the </w:t>
-      </w:r>
-      <w:proofErr w:type="spellStart"/>
-      <w:r>
-        <w:rPr>
-          <w:lang w:val="en-US"/>
-        </w:rPr>
-        <w:t>head.data</w:t>
-      </w:r>
-      <w:proofErr w:type="spellEnd"/>
+        <w:t>Same as the head.data</w:t>
+      </w:r>
     </w:p>
     <w:p>
       <w:pPr>
@@ -1793,23 +1509,7 @@
         <w:rPr>
           <w:lang w:val="en-US"/>
         </w:rPr>
-        <w:t xml:space="preserve">Go till the last that is </w:t>
-      </w:r>
-      <w:proofErr w:type="spellStart"/>
-      <w:proofErr w:type="gramStart"/>
-      <w:r>
-        <w:rPr>
-          <w:lang w:val="en-US"/>
-        </w:rPr>
-        <w:t>temp.next</w:t>
-      </w:r>
-      <w:proofErr w:type="spellEnd"/>
-      <w:proofErr w:type="gramEnd"/>
-      <w:r>
-        <w:rPr>
-          <w:lang w:val="en-US"/>
-        </w:rPr>
-        <w:t xml:space="preserve"> != null</w:t>
+        <w:t>Go till the last that is temp.next != null</w:t>
       </w:r>
     </w:p>
     <w:p>
@@ -1827,21 +1527,7 @@
         <w:rPr>
           <w:lang w:val="en-US"/>
         </w:rPr>
-        <w:t xml:space="preserve">Create the node and </w:t>
-      </w:r>
-      <w:proofErr w:type="gramStart"/>
-      <w:r>
-        <w:rPr>
-          <w:lang w:val="en-US"/>
-        </w:rPr>
-        <w:t>it’s</w:t>
-      </w:r>
-      <w:proofErr w:type="gramEnd"/>
-      <w:r>
-        <w:rPr>
-          <w:lang w:val="en-US"/>
-        </w:rPr>
-        <w:t xml:space="preserve"> next points to the null</w:t>
+        <w:t>Create the node and it’s next points to the null</w:t>
       </w:r>
     </w:p>
     <w:p>
@@ -1855,30 +1541,12 @@
           <w:lang w:val="en-US"/>
         </w:rPr>
       </w:pPr>
-      <w:proofErr w:type="spellStart"/>
-      <w:proofErr w:type="gramStart"/>
-      <w:r>
-        <w:rPr>
-          <w:lang w:val="en-US"/>
-        </w:rPr>
-        <w:t>Temp;s</w:t>
-      </w:r>
-      <w:proofErr w:type="spellEnd"/>
-      <w:proofErr w:type="gramEnd"/>
-      <w:r>
-        <w:rPr>
-          <w:lang w:val="en-US"/>
-        </w:rPr>
-        <w:t xml:space="preserve"> next points to  the </w:t>
-      </w:r>
-      <w:proofErr w:type="spellStart"/>
-      <w:r>
-        <w:rPr>
-          <w:lang w:val="en-US"/>
-        </w:rPr>
-        <w:t>nn</w:t>
-      </w:r>
-      <w:proofErr w:type="spellEnd"/>
+      <w:r>
+        <w:rPr>
+          <w:lang w:val="en-US"/>
+        </w:rPr>
+        <w:t>Temp;s next points to  the nn</w:t>
+      </w:r>
     </w:p>
     <w:p>
       <w:pPr>
@@ -1948,21 +1616,7 @@
         <w:rPr>
           <w:lang w:val="en-US"/>
         </w:rPr>
-        <w:t xml:space="preserve">If the length is greater than </w:t>
-      </w:r>
-      <w:proofErr w:type="gramStart"/>
-      <w:r>
-        <w:rPr>
-          <w:lang w:val="en-US"/>
-        </w:rPr>
-        <w:t>1  call</w:t>
-      </w:r>
-      <w:proofErr w:type="gramEnd"/>
-      <w:r>
-        <w:rPr>
-          <w:lang w:val="en-US"/>
-        </w:rPr>
-        <w:t xml:space="preserve"> the INSERT HEAD FUNCTION</w:t>
+        <w:t>If the length is greater than 1  call the INSERT HEAD FUNCTION</w:t>
       </w:r>
     </w:p>
     <w:p>
@@ -2034,21 +1688,7 @@
         <w:rPr>
           <w:lang w:val="en-US"/>
         </w:rPr>
-        <w:t xml:space="preserve">Go till the last </w:t>
-      </w:r>
-      <w:proofErr w:type="gramStart"/>
-      <w:r>
-        <w:rPr>
-          <w:lang w:val="en-US"/>
-        </w:rPr>
-        <w:t>temp !</w:t>
-      </w:r>
-      <w:proofErr w:type="gramEnd"/>
-      <w:r>
-        <w:rPr>
-          <w:lang w:val="en-US"/>
-        </w:rPr>
-        <w:t>= null</w:t>
+        <w:t>Go till the last temp != null</w:t>
       </w:r>
     </w:p>
     <w:p>
@@ -2066,21 +1706,7 @@
         <w:rPr>
           <w:lang w:val="en-US"/>
         </w:rPr>
-        <w:t xml:space="preserve">Increase the </w:t>
-      </w:r>
-      <w:proofErr w:type="gramStart"/>
-      <w:r>
-        <w:rPr>
-          <w:lang w:val="en-US"/>
-        </w:rPr>
-        <w:t>count  by</w:t>
-      </w:r>
-      <w:proofErr w:type="gramEnd"/>
-      <w:r>
-        <w:rPr>
-          <w:lang w:val="en-US"/>
-        </w:rPr>
-        <w:t xml:space="preserve"> 1</w:t>
+        <w:t>Increase the count  by 1</w:t>
       </w:r>
     </w:p>
     <w:p>
@@ -2098,21 +1724,7 @@
         <w:rPr>
           <w:lang w:val="en-US"/>
         </w:rPr>
-        <w:t xml:space="preserve">If count == k-1 that Is </w:t>
-      </w:r>
-      <w:proofErr w:type="spellStart"/>
-      <w:r>
-        <w:rPr>
-          <w:lang w:val="en-US"/>
-        </w:rPr>
-        <w:t>befor</w:t>
-      </w:r>
-      <w:proofErr w:type="spellEnd"/>
-      <w:r>
-        <w:rPr>
-          <w:lang w:val="en-US"/>
-        </w:rPr>
-        <w:t xml:space="preserve"> the kth node</w:t>
+        <w:t>If count == k-1 that Is befor the kth node</w:t>
       </w:r>
     </w:p>
     <w:p>
@@ -2148,21 +1760,7 @@
         <w:rPr>
           <w:lang w:val="en-US"/>
         </w:rPr>
-        <w:t xml:space="preserve">Remember </w:t>
-      </w:r>
-      <w:proofErr w:type="spellStart"/>
-      <w:r>
-        <w:rPr>
-          <w:lang w:val="en-US"/>
-        </w:rPr>
-        <w:t>nn’s</w:t>
-      </w:r>
-      <w:proofErr w:type="spellEnd"/>
-      <w:r>
-        <w:rPr>
-          <w:lang w:val="en-US"/>
-        </w:rPr>
-        <w:t xml:space="preserve"> next points to the temp’s next</w:t>
+        <w:t>Remember nn’s next points to the temp’s next</w:t>
       </w:r>
     </w:p>
     <w:p>
@@ -2180,30 +1778,8 @@
         <w:rPr>
           <w:lang w:val="en-US"/>
         </w:rPr>
-        <w:t xml:space="preserve">Temp’s next points </w:t>
-      </w:r>
-      <w:proofErr w:type="gramStart"/>
-      <w:r>
-        <w:rPr>
-          <w:lang w:val="en-US"/>
-        </w:rPr>
-        <w:t>to  the</w:t>
-      </w:r>
-      <w:proofErr w:type="gramEnd"/>
-      <w:r>
-        <w:rPr>
-          <w:lang w:val="en-US"/>
-        </w:rPr>
-        <w:t xml:space="preserve"> </w:t>
-      </w:r>
-      <w:proofErr w:type="spellStart"/>
-      <w:r>
-        <w:rPr>
-          <w:lang w:val="en-US"/>
-        </w:rPr>
-        <w:t>nn</w:t>
-      </w:r>
-      <w:proofErr w:type="spellEnd"/>
+        <w:t>Temp’s next points to  the nn</w:t>
+      </w:r>
     </w:p>
     <w:p>
       <w:pPr>
@@ -2220,18 +1796,8 @@
         <w:rPr>
           <w:lang w:val="en-US"/>
         </w:rPr>
-        <w:t xml:space="preserve">Else temp = </w:t>
-      </w:r>
-      <w:proofErr w:type="spellStart"/>
-      <w:proofErr w:type="gramStart"/>
-      <w:r>
-        <w:rPr>
-          <w:lang w:val="en-US"/>
-        </w:rPr>
-        <w:t>temp.next</w:t>
-      </w:r>
-      <w:proofErr w:type="spellEnd"/>
-      <w:proofErr w:type="gramEnd"/>
+        <w:t>Else temp = temp.next</w:t>
+      </w:r>
     </w:p>
     <w:p>
       <w:pPr>
@@ -2265,29 +1831,7 @@
         <w:rPr>
           <w:lang w:val="en-US"/>
         </w:rPr>
-        <w:t xml:space="preserve">Base condition head is null not k ==1 </w:t>
-      </w:r>
-      <w:proofErr w:type="spellStart"/>
-      <w:proofErr w:type="gramStart"/>
-      <w:r>
-        <w:rPr>
-          <w:lang w:val="en-US"/>
-        </w:rPr>
-        <w:t>becoz</w:t>
-      </w:r>
-      <w:proofErr w:type="spellEnd"/>
-      <w:r>
-        <w:rPr>
-          <w:lang w:val="en-US"/>
-        </w:rPr>
-        <w:t xml:space="preserve">  value</w:t>
-      </w:r>
-      <w:proofErr w:type="gramEnd"/>
-      <w:r>
-        <w:rPr>
-          <w:lang w:val="en-US"/>
-        </w:rPr>
-        <w:t xml:space="preserve"> Is found for the null</w:t>
+        <w:t>Base condition head is null not k ==1 becoz  value Is found for the null</w:t>
       </w:r>
     </w:p>
     <w:p>
@@ -2305,21 +1849,7 @@
         <w:rPr>
           <w:lang w:val="en-US"/>
         </w:rPr>
-        <w:t xml:space="preserve">If value is in the head head’s </w:t>
-      </w:r>
-      <w:proofErr w:type="gramStart"/>
-      <w:r>
-        <w:rPr>
-          <w:lang w:val="en-US"/>
-        </w:rPr>
-        <w:t>data  =</w:t>
-      </w:r>
-      <w:proofErr w:type="gramEnd"/>
-      <w:r>
-        <w:rPr>
-          <w:lang w:val="en-US"/>
-        </w:rPr>
-        <w:t xml:space="preserve"> given data</w:t>
+        <w:t>If value is in the head head’s data  = given data</w:t>
       </w:r>
     </w:p>
     <w:p>
@@ -2355,21 +1885,7 @@
         <w:rPr>
           <w:lang w:val="en-US"/>
         </w:rPr>
-        <w:t xml:space="preserve">While temp’s </w:t>
-      </w:r>
-      <w:proofErr w:type="gramStart"/>
-      <w:r>
-        <w:rPr>
-          <w:lang w:val="en-US"/>
-        </w:rPr>
-        <w:t>next !</w:t>
-      </w:r>
-      <w:proofErr w:type="gramEnd"/>
-      <w:r>
-        <w:rPr>
-          <w:lang w:val="en-US"/>
-        </w:rPr>
-        <w:t>= null</w:t>
+        <w:t>While temp’s next != null</w:t>
       </w:r>
     </w:p>
     <w:p>
@@ -2387,16 +1903,8 @@
         <w:rPr>
           <w:lang w:val="en-US"/>
         </w:rPr>
-        <w:t xml:space="preserve">Inside the loop temp’s next data == </w:t>
-      </w:r>
-      <w:proofErr w:type="spellStart"/>
-      <w:r>
-        <w:rPr>
-          <w:lang w:val="en-US"/>
-        </w:rPr>
-        <w:t>val</w:t>
-      </w:r>
-      <w:proofErr w:type="spellEnd"/>
+        <w:t>Inside the loop temp’s next data == val</w:t>
+      </w:r>
     </w:p>
     <w:p>
       <w:pPr>
@@ -2431,16 +1939,8 @@
         <w:rPr>
           <w:lang w:val="en-US"/>
         </w:rPr>
-        <w:t xml:space="preserve">Temp’s next points to the </w:t>
-      </w:r>
-      <w:proofErr w:type="spellStart"/>
-      <w:r>
-        <w:rPr>
-          <w:lang w:val="en-US"/>
-        </w:rPr>
-        <w:t>nn</w:t>
-      </w:r>
-      <w:proofErr w:type="spellEnd"/>
+        <w:t>Temp’s next points to the nn</w:t>
+      </w:r>
     </w:p>
     <w:p>
       <w:pPr>
@@ -2457,18 +1957,8 @@
         <w:rPr>
           <w:lang w:val="en-US"/>
         </w:rPr>
-        <w:t xml:space="preserve">Else the temp = </w:t>
-      </w:r>
-      <w:proofErr w:type="spellStart"/>
-      <w:proofErr w:type="gramStart"/>
-      <w:r>
-        <w:rPr>
-          <w:lang w:val="en-US"/>
-        </w:rPr>
-        <w:t>temp.next</w:t>
-      </w:r>
-      <w:proofErr w:type="spellEnd"/>
-      <w:proofErr w:type="gramEnd"/>
+        <w:t>Else the temp = temp.next</w:t>
+      </w:r>
     </w:p>
     <w:p>
       <w:pPr>
@@ -2625,7 +2115,6 @@
           <w:lang w:val="en-US"/>
         </w:rPr>
       </w:pPr>
-      <w:proofErr w:type="gramStart"/>
       <w:r>
         <w:rPr>
           <w:b/>
@@ -2640,16 +2129,7 @@
           <w:bCs/>
           <w:lang w:val="en-US"/>
         </w:rPr>
-        <w:t>OF</w:t>
-      </w:r>
-      <w:proofErr w:type="gramEnd"/>
-      <w:r>
-        <w:rPr>
-          <w:b/>
-          <w:bCs/>
-          <w:lang w:val="en-US"/>
-        </w:rPr>
-        <w:t xml:space="preserve"> DLL</w:t>
+        <w:t>OF DLL</w:t>
       </w:r>
     </w:p>
     <w:p>
@@ -2773,21 +2253,7 @@
         <w:rPr>
           <w:lang w:val="en-US"/>
         </w:rPr>
-        <w:t xml:space="preserve">Remember the head using </w:t>
-      </w:r>
-      <w:proofErr w:type="spellStart"/>
-      <w:r>
-        <w:rPr>
-          <w:lang w:val="en-US"/>
-        </w:rPr>
-        <w:t>prev</w:t>
-      </w:r>
-      <w:proofErr w:type="spellEnd"/>
-      <w:r>
-        <w:rPr>
-          <w:lang w:val="en-US"/>
-        </w:rPr>
-        <w:t xml:space="preserve"> variable</w:t>
+        <w:t>Remember the head using prev variable</w:t>
       </w:r>
     </w:p>
     <w:p>
@@ -2807,18 +2273,8 @@
         <w:rPr>
           <w:lang w:val="en-US"/>
         </w:rPr>
-        <w:t xml:space="preserve">Loop till </w:t>
-      </w:r>
-      <w:proofErr w:type="spellStart"/>
-      <w:proofErr w:type="gramStart"/>
-      <w:r>
-        <w:rPr>
-          <w:lang w:val="en-US"/>
-        </w:rPr>
-        <w:t>arr.length</w:t>
-      </w:r>
-      <w:proofErr w:type="spellEnd"/>
-      <w:proofErr w:type="gramEnd"/>
+        <w:t>Loop till arr.length</w:t>
+      </w:r>
     </w:p>
     <w:p>
       <w:pPr>
@@ -2877,30 +2333,8 @@
         <w:rPr>
           <w:lang w:val="en-US"/>
         </w:rPr>
-        <w:t xml:space="preserve">Point the </w:t>
-      </w:r>
-      <w:proofErr w:type="spellStart"/>
-      <w:r>
-        <w:rPr>
-          <w:lang w:val="en-US"/>
-        </w:rPr>
-        <w:t>temp’back</w:t>
-      </w:r>
-      <w:proofErr w:type="spellEnd"/>
-      <w:r>
-        <w:rPr>
-          <w:lang w:val="en-US"/>
-        </w:rPr>
-        <w:t xml:space="preserve"> to the </w:t>
-      </w:r>
-      <w:proofErr w:type="spellStart"/>
-      <w:r>
-        <w:rPr>
-          <w:lang w:val="en-US"/>
-        </w:rPr>
-        <w:t>prev</w:t>
-      </w:r>
-      <w:proofErr w:type="spellEnd"/>
+        <w:t>Point the temp’back to the prev</w:t>
+      </w:r>
     </w:p>
     <w:p>
       <w:pPr>
@@ -2915,21 +2349,11 @@
           <w:lang w:val="en-US"/>
         </w:rPr>
       </w:pPr>
-      <w:proofErr w:type="spellStart"/>
-      <w:proofErr w:type="gramStart"/>
-      <w:r>
-        <w:rPr>
-          <w:lang w:val="en-US"/>
-        </w:rPr>
-        <w:t>Prev,s</w:t>
-      </w:r>
-      <w:proofErr w:type="spellEnd"/>
-      <w:proofErr w:type="gramEnd"/>
-      <w:r>
-        <w:rPr>
-          <w:lang w:val="en-US"/>
-        </w:rPr>
-        <w:t xml:space="preserve"> next points to the temp</w:t>
+      <w:r>
+        <w:rPr>
+          <w:lang w:val="en-US"/>
+        </w:rPr>
+        <w:t>Prev,s next points to the temp</w:t>
       </w:r>
     </w:p>
     <w:p>
@@ -3003,21 +2427,7 @@
         <w:rPr>
           <w:lang w:val="en-US"/>
         </w:rPr>
-        <w:t xml:space="preserve">Base </w:t>
-      </w:r>
-      <w:proofErr w:type="spellStart"/>
-      <w:r>
-        <w:rPr>
-          <w:lang w:val="en-US"/>
-        </w:rPr>
-        <w:t>codition</w:t>
-      </w:r>
-      <w:proofErr w:type="spellEnd"/>
-      <w:r>
-        <w:rPr>
-          <w:lang w:val="en-US"/>
-        </w:rPr>
-        <w:t xml:space="preserve"> </w:t>
+        <w:t xml:space="preserve">Base codition </w:t>
       </w:r>
     </w:p>
     <w:p>
@@ -3071,21 +2481,7 @@
         <w:rPr>
           <w:lang w:val="en-US"/>
         </w:rPr>
-        <w:t xml:space="preserve">Remember the head use the </w:t>
-      </w:r>
-      <w:proofErr w:type="spellStart"/>
-      <w:r>
-        <w:rPr>
-          <w:lang w:val="en-US"/>
-        </w:rPr>
-        <w:t>prev</w:t>
-      </w:r>
-      <w:proofErr w:type="spellEnd"/>
-      <w:r>
-        <w:rPr>
-          <w:lang w:val="en-US"/>
-        </w:rPr>
-        <w:t xml:space="preserve"> variable</w:t>
+        <w:t>Remember the head use the prev variable</w:t>
       </w:r>
     </w:p>
     <w:p>
@@ -3121,21 +2517,7 @@
         <w:rPr>
           <w:lang w:val="en-US"/>
         </w:rPr>
-        <w:t xml:space="preserve">Point the </w:t>
-      </w:r>
-      <w:proofErr w:type="spellStart"/>
-      <w:r>
-        <w:rPr>
-          <w:lang w:val="en-US"/>
-        </w:rPr>
-        <w:t>prev’s</w:t>
-      </w:r>
-      <w:proofErr w:type="spellEnd"/>
-      <w:r>
-        <w:rPr>
-          <w:lang w:val="en-US"/>
-        </w:rPr>
-        <w:t xml:space="preserve"> next to the new head</w:t>
+        <w:t>Point the prev’s next to the new head</w:t>
       </w:r>
     </w:p>
     <w:p>
@@ -3153,16 +2535,8 @@
         <w:rPr>
           <w:lang w:val="en-US"/>
         </w:rPr>
-        <w:t xml:space="preserve">Head’s back points to the </w:t>
-      </w:r>
-      <w:proofErr w:type="spellStart"/>
-      <w:r>
-        <w:rPr>
-          <w:lang w:val="en-US"/>
-        </w:rPr>
-        <w:t>prev</w:t>
-      </w:r>
-      <w:proofErr w:type="spellEnd"/>
+        <w:t>Head’s back points to the prev</w:t>
+      </w:r>
     </w:p>
     <w:p>
       <w:pPr>
@@ -3276,23 +2650,7 @@
         <w:rPr>
           <w:lang w:val="en-US"/>
         </w:rPr>
-        <w:t>Head’s next == null (</w:t>
-      </w:r>
-      <w:proofErr w:type="spellStart"/>
-      <w:proofErr w:type="gramStart"/>
-      <w:r>
-        <w:rPr>
-          <w:lang w:val="en-US"/>
-        </w:rPr>
-        <w:t>i,e</w:t>
-      </w:r>
-      <w:proofErr w:type="spellEnd"/>
-      <w:proofErr w:type="gramEnd"/>
-      <w:r>
-        <w:rPr>
-          <w:lang w:val="en-US"/>
-        </w:rPr>
-        <w:t>) last element or single element</w:t>
+        <w:t>Head’s next == null (i,e) last element or single element</w:t>
       </w:r>
     </w:p>
     <w:p>
@@ -3328,21 +2686,7 @@
         <w:rPr>
           <w:lang w:val="en-US"/>
         </w:rPr>
-        <w:t xml:space="preserve">Remember the head using </w:t>
-      </w:r>
-      <w:proofErr w:type="spellStart"/>
-      <w:r>
-        <w:rPr>
-          <w:lang w:val="en-US"/>
-        </w:rPr>
-        <w:t>prev</w:t>
-      </w:r>
-      <w:proofErr w:type="spellEnd"/>
-      <w:r>
-        <w:rPr>
-          <w:lang w:val="en-US"/>
-        </w:rPr>
-        <w:t xml:space="preserve"> variable</w:t>
+        <w:t>Remember the head using prev variable</w:t>
       </w:r>
     </w:p>
     <w:p>
@@ -3414,16 +2758,8 @@
         <w:rPr>
           <w:lang w:val="en-US"/>
         </w:rPr>
-        <w:t xml:space="preserve">Prev’s next points to </w:t>
-      </w:r>
-      <w:proofErr w:type="gramStart"/>
-      <w:r>
-        <w:rPr>
-          <w:lang w:val="en-US"/>
-        </w:rPr>
-        <w:t>the  null</w:t>
-      </w:r>
-      <w:proofErr w:type="gramEnd"/>
+        <w:t>Prev’s next points to the  null</w:t>
+      </w:r>
     </w:p>
     <w:p>
       <w:pPr>
@@ -3691,21 +3027,7 @@
         <w:rPr>
           <w:lang w:val="en-US"/>
         </w:rPr>
-        <w:t xml:space="preserve">Front’s back points to the </w:t>
-      </w:r>
-      <w:proofErr w:type="spellStart"/>
-      <w:r>
-        <w:rPr>
-          <w:lang w:val="en-US"/>
-        </w:rPr>
-        <w:t>prev</w:t>
-      </w:r>
-      <w:proofErr w:type="spellEnd"/>
-      <w:r>
-        <w:rPr>
-          <w:lang w:val="en-US"/>
-        </w:rPr>
-        <w:t xml:space="preserve"> </w:t>
+        <w:t xml:space="preserve">Front’s back points to the prev </w:t>
       </w:r>
     </w:p>
     <w:p>
@@ -3741,21 +3063,7 @@
         <w:rPr>
           <w:lang w:val="en-US"/>
         </w:rPr>
-        <w:t xml:space="preserve">Temp’s </w:t>
-      </w:r>
-      <w:proofErr w:type="gramStart"/>
-      <w:r>
-        <w:rPr>
-          <w:lang w:val="en-US"/>
-        </w:rPr>
-        <w:t>back  =</w:t>
-      </w:r>
-      <w:proofErr w:type="gramEnd"/>
-      <w:r>
-        <w:rPr>
-          <w:lang w:val="en-US"/>
-        </w:rPr>
-        <w:t xml:space="preserve"> null</w:t>
+        <w:t>Temp’s back  = null</w:t>
       </w:r>
     </w:p>
     <w:p>
@@ -3809,63 +3117,7 @@
         <w:rPr>
           <w:lang w:val="en-US"/>
         </w:rPr>
-        <w:t xml:space="preserve">If </w:t>
-      </w:r>
-      <w:proofErr w:type="gramStart"/>
-      <w:r>
-        <w:rPr>
-          <w:lang w:val="en-US"/>
-        </w:rPr>
-        <w:t>k  is</w:t>
-      </w:r>
-      <w:proofErr w:type="gramEnd"/>
-      <w:r>
-        <w:rPr>
-          <w:lang w:val="en-US"/>
-        </w:rPr>
-        <w:t xml:space="preserve"> tail node (</w:t>
-      </w:r>
-      <w:proofErr w:type="spellStart"/>
-      <w:r>
-        <w:rPr>
-          <w:lang w:val="en-US"/>
-        </w:rPr>
-        <w:t>i,e</w:t>
-      </w:r>
-      <w:proofErr w:type="spellEnd"/>
-      <w:r>
-        <w:rPr>
-          <w:lang w:val="en-US"/>
-        </w:rPr>
-        <w:t xml:space="preserve">) </w:t>
-      </w:r>
-      <w:proofErr w:type="spellStart"/>
-      <w:r>
-        <w:rPr>
-          <w:lang w:val="en-US"/>
-        </w:rPr>
-        <w:t>Dll</w:t>
-      </w:r>
-      <w:proofErr w:type="spellEnd"/>
-      <w:r>
-        <w:rPr>
-          <w:lang w:val="en-US"/>
-        </w:rPr>
-        <w:t xml:space="preserve"> have the </w:t>
-      </w:r>
-      <w:proofErr w:type="spellStart"/>
-      <w:r>
-        <w:rPr>
-          <w:lang w:val="en-US"/>
-        </w:rPr>
-        <w:t>prev</w:t>
-      </w:r>
-      <w:proofErr w:type="spellEnd"/>
-      <w:r>
-        <w:rPr>
-          <w:lang w:val="en-US"/>
-        </w:rPr>
-        <w:t xml:space="preserve"> and  front element</w:t>
+        <w:t>If k  is tail node (i,e) Dll have the prev and  front element</w:t>
       </w:r>
     </w:p>
     <w:p>
@@ -3901,14 +3153,7 @@
         <w:rPr>
           <w:lang w:val="en-US"/>
         </w:rPr>
-        <w:t xml:space="preserve">Front points to the </w:t>
-      </w:r>
-      <w:proofErr w:type="gramStart"/>
-      <w:r>
-        <w:rPr>
-          <w:lang w:val="en-US"/>
-        </w:rPr>
-        <w:t xml:space="preserve">temp’s </w:t>
+        <w:t xml:space="preserve">Front points to the temp’s </w:t>
       </w:r>
       <w:r>
         <w:rPr>
@@ -3916,7 +3161,6 @@
         </w:rPr>
         <w:t xml:space="preserve"> next</w:t>
       </w:r>
-      <w:proofErr w:type="gramEnd"/>
     </w:p>
     <w:p>
       <w:pPr>
@@ -4100,21 +3344,7 @@
         <w:rPr>
           <w:lang w:val="en-US"/>
         </w:rPr>
-        <w:t xml:space="preserve">Create the new node called </w:t>
-      </w:r>
-      <w:proofErr w:type="gramStart"/>
-      <w:r>
-        <w:rPr>
-          <w:lang w:val="en-US"/>
-        </w:rPr>
-        <w:t>temp  with</w:t>
-      </w:r>
-      <w:proofErr w:type="gramEnd"/>
-      <w:r>
-        <w:rPr>
-          <w:lang w:val="en-US"/>
-        </w:rPr>
-        <w:t xml:space="preserve"> the value</w:t>
+        <w:t>Create the new node called temp  with the value</w:t>
       </w:r>
     </w:p>
     <w:p>
@@ -4269,21 +3499,7 @@
         <w:rPr>
           <w:lang w:val="en-US"/>
         </w:rPr>
-        <w:t xml:space="preserve">Create the new </w:t>
-      </w:r>
-      <w:proofErr w:type="gramStart"/>
-      <w:r>
-        <w:rPr>
-          <w:lang w:val="en-US"/>
-        </w:rPr>
-        <w:t>node  and</w:t>
-      </w:r>
-      <w:proofErr w:type="gramEnd"/>
-      <w:r>
-        <w:rPr>
-          <w:lang w:val="en-US"/>
-        </w:rPr>
-        <w:t xml:space="preserve"> points next and back to null</w:t>
+        <w:t>Create the new node  and points next and back to null</w:t>
       </w:r>
     </w:p>
     <w:p>
@@ -4333,19 +3549,11 @@
           <w:lang w:val="en-US"/>
         </w:rPr>
       </w:pPr>
-      <w:proofErr w:type="spellStart"/>
-      <w:r>
-        <w:rPr>
-          <w:lang w:val="en-US"/>
-        </w:rPr>
-        <w:t>Nn’s</w:t>
-      </w:r>
-      <w:proofErr w:type="spellEnd"/>
-      <w:r>
-        <w:rPr>
-          <w:lang w:val="en-US"/>
-        </w:rPr>
-        <w:t xml:space="preserve"> next points to the null</w:t>
+      <w:r>
+        <w:rPr>
+          <w:lang w:val="en-US"/>
+        </w:rPr>
+        <w:t>Nn’s next points to the null</w:t>
       </w:r>
     </w:p>
     <w:p>
@@ -4363,16 +3571,8 @@
         <w:rPr>
           <w:lang w:val="en-US"/>
         </w:rPr>
-        <w:t xml:space="preserve">Head’s next points to the </w:t>
-      </w:r>
-      <w:proofErr w:type="spellStart"/>
-      <w:r>
-        <w:rPr>
-          <w:lang w:val="en-US"/>
-        </w:rPr>
-        <w:t>nn</w:t>
-      </w:r>
-      <w:proofErr w:type="spellEnd"/>
+        <w:t>Head’s next points to the nn</w:t>
+      </w:r>
     </w:p>
     <w:p>
       <w:pPr>
@@ -4385,19 +3585,11 @@
           <w:lang w:val="en-US"/>
         </w:rPr>
       </w:pPr>
-      <w:proofErr w:type="spellStart"/>
-      <w:r>
-        <w:rPr>
-          <w:lang w:val="en-US"/>
-        </w:rPr>
-        <w:t>Nn’s</w:t>
-      </w:r>
-      <w:proofErr w:type="spellEnd"/>
-      <w:r>
-        <w:rPr>
-          <w:lang w:val="en-US"/>
-        </w:rPr>
-        <w:t xml:space="preserve"> back points to the head</w:t>
+      <w:r>
+        <w:rPr>
+          <w:lang w:val="en-US"/>
+        </w:rPr>
+        <w:t>Nn’s back points to the head</w:t>
       </w:r>
     </w:p>
     <w:p>
@@ -4432,21 +3624,7 @@
         <w:rPr>
           <w:lang w:val="en-US"/>
         </w:rPr>
-        <w:t>Base condition head == null k ==</w:t>
-      </w:r>
-      <w:proofErr w:type="gramStart"/>
-      <w:r>
-        <w:rPr>
-          <w:lang w:val="en-US"/>
-        </w:rPr>
-        <w:t>1  :</w:t>
-      </w:r>
-      <w:proofErr w:type="gramEnd"/>
-      <w:r>
-        <w:rPr>
-          <w:lang w:val="en-US"/>
-        </w:rPr>
-        <w:t xml:space="preserve"> length =  0</w:t>
+        <w:t>Base condition head == null k ==1  : length =  0</w:t>
       </w:r>
     </w:p>
     <w:p>
@@ -4482,21 +3660,7 @@
         <w:rPr>
           <w:lang w:val="en-US"/>
         </w:rPr>
-        <w:t xml:space="preserve">k == </w:t>
-      </w:r>
-      <w:proofErr w:type="gramStart"/>
-      <w:r>
-        <w:rPr>
-          <w:lang w:val="en-US"/>
-        </w:rPr>
-        <w:t>1 :</w:t>
-      </w:r>
-      <w:proofErr w:type="gramEnd"/>
-      <w:r>
-        <w:rPr>
-          <w:lang w:val="en-US"/>
-        </w:rPr>
-        <w:t xml:space="preserve"> length = n</w:t>
+        <w:t>k == 1 : length = n</w:t>
       </w:r>
     </w:p>
     <w:p>
@@ -4604,21 +3768,7 @@
         <w:rPr>
           <w:lang w:val="en-US"/>
         </w:rPr>
-        <w:t xml:space="preserve">initialize </w:t>
-      </w:r>
-      <w:proofErr w:type="spellStart"/>
-      <w:r>
-        <w:rPr>
-          <w:lang w:val="en-US"/>
-        </w:rPr>
-        <w:t>prev</w:t>
-      </w:r>
-      <w:proofErr w:type="spellEnd"/>
-      <w:r>
-        <w:rPr>
-          <w:lang w:val="en-US"/>
-        </w:rPr>
-        <w:t xml:space="preserve"> front count = 0</w:t>
+        <w:t>initialize prev front count = 0</w:t>
       </w:r>
     </w:p>
     <w:p>
@@ -4690,21 +3840,7 @@
         <w:rPr>
           <w:lang w:val="en-US"/>
         </w:rPr>
-        <w:t xml:space="preserve">Point the </w:t>
-      </w:r>
-      <w:proofErr w:type="spellStart"/>
-      <w:r>
-        <w:rPr>
-          <w:lang w:val="en-US"/>
-        </w:rPr>
-        <w:t>prev</w:t>
-      </w:r>
-      <w:proofErr w:type="spellEnd"/>
-      <w:r>
-        <w:rPr>
-          <w:lang w:val="en-US"/>
-        </w:rPr>
-        <w:t xml:space="preserve"> to the temp’s back</w:t>
+        <w:t>Point the prev to the temp’s back</w:t>
       </w:r>
     </w:p>
     <w:p>
@@ -4754,19 +3890,11 @@
           <w:lang w:val="en-US"/>
         </w:rPr>
       </w:pPr>
-      <w:proofErr w:type="spellStart"/>
-      <w:r>
-        <w:rPr>
-          <w:lang w:val="en-US"/>
-        </w:rPr>
-        <w:t>Nn’s</w:t>
-      </w:r>
-      <w:proofErr w:type="spellEnd"/>
-      <w:r>
-        <w:rPr>
-          <w:lang w:val="en-US"/>
-        </w:rPr>
-        <w:t xml:space="preserve"> next points to the front</w:t>
+      <w:r>
+        <w:rPr>
+          <w:lang w:val="en-US"/>
+        </w:rPr>
+        <w:t>Nn’s next points to the front</w:t>
       </w:r>
     </w:p>
     <w:p>
@@ -4784,16 +3912,8 @@
         <w:rPr>
           <w:lang w:val="en-US"/>
         </w:rPr>
-        <w:t xml:space="preserve">Front’s back points to the </w:t>
-      </w:r>
-      <w:proofErr w:type="spellStart"/>
-      <w:r>
-        <w:rPr>
-          <w:lang w:val="en-US"/>
-        </w:rPr>
-        <w:t>nn</w:t>
-      </w:r>
-      <w:proofErr w:type="spellEnd"/>
+        <w:t>Front’s back points to the nn</w:t>
+      </w:r>
     </w:p>
     <w:p>
       <w:pPr>
@@ -4810,16 +3930,8 @@
         <w:rPr>
           <w:lang w:val="en-US"/>
         </w:rPr>
-        <w:t xml:space="preserve">Prev’s next points to the </w:t>
-      </w:r>
-      <w:proofErr w:type="spellStart"/>
-      <w:r>
-        <w:rPr>
-          <w:lang w:val="en-US"/>
-        </w:rPr>
-        <w:t>nn</w:t>
-      </w:r>
-      <w:proofErr w:type="spellEnd"/>
+        <w:t>Prev’s next points to the nn</w:t>
+      </w:r>
     </w:p>
     <w:p>
       <w:pPr>
@@ -4832,28 +3944,12 @@
           <w:lang w:val="en-US"/>
         </w:rPr>
       </w:pPr>
-      <w:proofErr w:type="spellStart"/>
-      <w:r>
-        <w:rPr>
-          <w:lang w:val="en-US"/>
-        </w:rPr>
-        <w:t>Nn’s</w:t>
-      </w:r>
-      <w:proofErr w:type="spellEnd"/>
-      <w:r>
-        <w:rPr>
-          <w:lang w:val="en-US"/>
-        </w:rPr>
-        <w:t xml:space="preserve"> back points to the </w:t>
-      </w:r>
-      <w:proofErr w:type="spellStart"/>
-      <w:r>
-        <w:rPr>
-          <w:lang w:val="en-US"/>
-        </w:rPr>
-        <w:t>prev</w:t>
-      </w:r>
-      <w:proofErr w:type="spellEnd"/>
+      <w:r>
+        <w:rPr>
+          <w:lang w:val="en-US"/>
+        </w:rPr>
+        <w:t>Nn’s back points to the prev</w:t>
+      </w:r>
     </w:p>
     <w:p>
       <w:pPr>
@@ -4907,33 +4003,11 @@
         </w:rPr>
         <w:t xml:space="preserve">Same as the kth position one difference is </w:t>
       </w:r>
-      <w:proofErr w:type="spellStart"/>
-      <w:r>
-        <w:rPr>
-          <w:lang w:val="en-US"/>
-        </w:rPr>
-        <w:t>temp.</w:t>
-      </w:r>
-      <w:proofErr w:type="gramStart"/>
-      <w:r>
-        <w:rPr>
-          <w:lang w:val="en-US"/>
-        </w:rPr>
-        <w:t>data</w:t>
-      </w:r>
-      <w:proofErr w:type="spellEnd"/>
-      <w:r>
-        <w:rPr>
-          <w:lang w:val="en-US"/>
-        </w:rPr>
-        <w:t xml:space="preserve">  =</w:t>
-      </w:r>
-      <w:proofErr w:type="gramEnd"/>
-      <w:r>
-        <w:rPr>
-          <w:lang w:val="en-US"/>
-        </w:rPr>
-        <w:t>= given data</w:t>
+      <w:r>
+        <w:rPr>
+          <w:lang w:val="en-US"/>
+        </w:rPr>
+        <w:t>temp.data  == given data</w:t>
       </w:r>
     </w:p>
     <w:p>
@@ -5034,25 +4108,7 @@
           <w:bCs/>
           <w:lang w:val="en-US"/>
         </w:rPr>
-        <w:t xml:space="preserve">//REVERSE THE DLL </w:t>
-      </w:r>
-      <w:proofErr w:type="gramStart"/>
-      <w:r>
-        <w:rPr>
-          <w:b/>
-          <w:bCs/>
-          <w:lang w:val="en-US"/>
-        </w:rPr>
-        <w:t>-  BRUTE</w:t>
-      </w:r>
-      <w:proofErr w:type="gramEnd"/>
-      <w:r>
-        <w:rPr>
-          <w:b/>
-          <w:bCs/>
-          <w:lang w:val="en-US"/>
-        </w:rPr>
-        <w:t xml:space="preserve"> FORCE</w:t>
+        <w:t>//REVERSE THE DLL -  BRUTE FORCE</w:t>
       </w:r>
     </w:p>
     <w:p>
@@ -5196,35 +4252,7 @@
         <w:rPr>
           <w:lang w:val="en-US"/>
         </w:rPr>
-        <w:t xml:space="preserve">Store the temp </w:t>
-      </w:r>
-      <w:proofErr w:type="gramStart"/>
-      <w:r>
-        <w:rPr>
-          <w:lang w:val="en-US"/>
-        </w:rPr>
-        <w:t>data  =</w:t>
-      </w:r>
-      <w:proofErr w:type="gramEnd"/>
-      <w:r>
-        <w:rPr>
-          <w:lang w:val="en-US"/>
-        </w:rPr>
-        <w:t xml:space="preserve"> </w:t>
-      </w:r>
-      <w:proofErr w:type="spellStart"/>
-      <w:r>
-        <w:rPr>
-          <w:lang w:val="en-US"/>
-        </w:rPr>
-        <w:t>stack.peek</w:t>
-      </w:r>
-      <w:proofErr w:type="spellEnd"/>
-      <w:r>
-        <w:rPr>
-          <w:lang w:val="en-US"/>
-        </w:rPr>
-        <w:t xml:space="preserve"> (first element in the stack)</w:t>
+        <w:t>Store the temp data  = stack.peek (first element in the stack)</w:t>
       </w:r>
     </w:p>
     <w:p>
@@ -5349,21 +4377,7 @@
         <w:rPr>
           <w:lang w:val="en-US"/>
         </w:rPr>
-        <w:t xml:space="preserve">Remember the last that is current back </w:t>
-      </w:r>
-      <w:proofErr w:type="spellStart"/>
-      <w:r>
-        <w:rPr>
-          <w:lang w:val="en-US"/>
-        </w:rPr>
-        <w:t>befor</w:t>
-      </w:r>
-      <w:proofErr w:type="spellEnd"/>
-      <w:r>
-        <w:rPr>
-          <w:lang w:val="en-US"/>
-        </w:rPr>
-        <w:t xml:space="preserve"> swapping</w:t>
+        <w:t>Remember the last that is current back befor swapping</w:t>
       </w:r>
     </w:p>
     <w:p>
@@ -5413,19 +4427,11 @@
           <w:lang w:val="en-US"/>
         </w:rPr>
       </w:pPr>
-      <w:proofErr w:type="gramStart"/>
-      <w:r>
-        <w:rPr>
-          <w:lang w:val="en-US"/>
-        </w:rPr>
-        <w:t>Current  moves</w:t>
-      </w:r>
-      <w:proofErr w:type="gramEnd"/>
-      <w:r>
-        <w:rPr>
-          <w:lang w:val="en-US"/>
-        </w:rPr>
-        <w:t xml:space="preserve"> to the current back (After swapping)</w:t>
+      <w:r>
+        <w:rPr>
+          <w:lang w:val="en-US"/>
+        </w:rPr>
+        <w:t>Current  moves to the current back (After swapping)</w:t>
       </w:r>
     </w:p>
     <w:p>
@@ -5443,21 +4449,7 @@
         <w:rPr>
           <w:lang w:val="en-US"/>
         </w:rPr>
-        <w:t xml:space="preserve">Return the last </w:t>
-      </w:r>
-      <w:proofErr w:type="spellStart"/>
-      <w:r>
-        <w:rPr>
-          <w:lang w:val="en-US"/>
-        </w:rPr>
-        <w:t>bach</w:t>
-      </w:r>
-      <w:proofErr w:type="spellEnd"/>
-      <w:r>
-        <w:rPr>
-          <w:lang w:val="en-US"/>
-        </w:rPr>
-        <w:t xml:space="preserve"> as new head</w:t>
+        <w:t>Return the last bach as new head</w:t>
       </w:r>
     </w:p>
     <w:p>
@@ -5666,31 +4658,7 @@
         <w:rPr>
           <w:lang w:val="en-US"/>
         </w:rPr>
-        <w:t>Check if t</w:t>
-      </w:r>
-      <w:r>
-        <w:rPr>
-          <w:lang w:val="en-US"/>
-        </w:rPr>
-        <w:t>2</w:t>
-      </w:r>
-      <w:r>
-        <w:rPr>
-          <w:lang w:val="en-US"/>
-        </w:rPr>
-        <w:t xml:space="preserve"> is not null add the sum + t</w:t>
-      </w:r>
-      <w:r>
-        <w:rPr>
-          <w:lang w:val="en-US"/>
-        </w:rPr>
-        <w:t>2</w:t>
-      </w:r>
-      <w:r>
-        <w:rPr>
-          <w:lang w:val="en-US"/>
-        </w:rPr>
-        <w:t>.data</w:t>
+        <w:t>Check if t2 is not null add the sum + t2.data</w:t>
       </w:r>
     </w:p>
     <w:p>
@@ -5779,33 +4747,11 @@
           <w:lang w:val="en-US"/>
         </w:rPr>
       </w:pPr>
-      <w:proofErr w:type="spellStart"/>
-      <w:r>
-        <w:rPr>
-          <w:lang w:val="en-US"/>
-        </w:rPr>
-        <w:t>Out side</w:t>
-      </w:r>
-      <w:proofErr w:type="spellEnd"/>
-      <w:r>
-        <w:rPr>
-          <w:lang w:val="en-US"/>
-        </w:rPr>
-        <w:t xml:space="preserve"> while loop add the carry if have the value create the </w:t>
-      </w:r>
-      <w:proofErr w:type="spellStart"/>
-      <w:r>
-        <w:rPr>
-          <w:lang w:val="en-US"/>
-        </w:rPr>
-        <w:t>nn</w:t>
-      </w:r>
-      <w:proofErr w:type="spellEnd"/>
-      <w:r>
-        <w:rPr>
-          <w:lang w:val="en-US"/>
-        </w:rPr>
-        <w:t xml:space="preserve"> and put the value</w:t>
+      <w:r>
+        <w:rPr>
+          <w:lang w:val="en-US"/>
+        </w:rPr>
+        <w:t>Out side while loop add the carry if have the value create the nn and put the value</w:t>
       </w:r>
     </w:p>
     <w:p>
@@ -5824,16 +4770,8 @@
         <w:rPr>
           <w:lang w:val="en-US"/>
         </w:rPr>
-        <w:t xml:space="preserve">Point the current next to the </w:t>
-      </w:r>
-      <w:proofErr w:type="spellStart"/>
-      <w:r>
-        <w:rPr>
-          <w:lang w:val="en-US"/>
-        </w:rPr>
-        <w:t>nn</w:t>
-      </w:r>
-      <w:proofErr w:type="spellEnd"/>
+        <w:t>Point the current next to the nn</w:t>
+      </w:r>
     </w:p>
     <w:p>
       <w:pPr>
@@ -5857,9 +4795,516 @@
     <w:p>
       <w:pPr>
         <w:rPr>
-          <w:lang w:val="en-US"/>
-        </w:rPr>
-      </w:pPr>
+          <w:b/>
+          <w:bCs/>
+          <w:lang w:val="en-US"/>
+        </w:rPr>
+      </w:pPr>
+      <w:r>
+        <w:rPr>
+          <w:b/>
+          <w:bCs/>
+          <w:lang w:val="en-US"/>
+        </w:rPr>
+        <w:lastRenderedPageBreak/>
+        <w:t>LECTURE 7</w:t>
+      </w:r>
+    </w:p>
+    <w:p>
+      <w:pPr>
+        <w:rPr>
+          <w:lang w:val="en-US"/>
+        </w:rPr>
+      </w:pPr>
+      <w:r>
+        <w:rPr>
+          <w:lang w:val="en-US"/>
+        </w:rPr>
+        <w:t xml:space="preserve">TOPIC COVERED </w:t>
+      </w:r>
+    </w:p>
+    <w:p>
+      <w:pPr>
+        <w:rPr>
+          <w:b/>
+          <w:bCs/>
+          <w:lang w:val="en-US"/>
+        </w:rPr>
+      </w:pPr>
+      <w:r>
+        <w:rPr>
+          <w:b/>
+          <w:bCs/>
+          <w:lang w:val="en-US"/>
+        </w:rPr>
+        <w:t>MIDDLE OF LL</w:t>
+      </w:r>
+    </w:p>
+    <w:p>
+      <w:pPr>
+        <w:rPr>
+          <w:b/>
+          <w:bCs/>
+          <w:lang w:val="en-US"/>
+        </w:rPr>
+      </w:pPr>
+      <w:r>
+        <w:rPr>
+          <w:b/>
+          <w:bCs/>
+          <w:lang w:val="en-US"/>
+        </w:rPr>
+        <w:t>// BRUTE FORCE</w:t>
+      </w:r>
+    </w:p>
+    <w:p>
+      <w:pPr>
+        <w:pStyle w:val="ListParagraph"/>
+        <w:numPr>
+          <w:ilvl w:val="0"/>
+          <w:numId w:val="36"/>
+        </w:numPr>
+        <w:rPr>
+          <w:lang w:val="en-US"/>
+        </w:rPr>
+      </w:pPr>
+      <w:r>
+        <w:rPr>
+          <w:lang w:val="en-US"/>
+        </w:rPr>
+        <w:t>Check for the length even or odd</w:t>
+      </w:r>
+    </w:p>
+    <w:p>
+      <w:pPr>
+        <w:pStyle w:val="ListParagraph"/>
+        <w:numPr>
+          <w:ilvl w:val="0"/>
+          <w:numId w:val="36"/>
+        </w:numPr>
+        <w:rPr>
+          <w:lang w:val="en-US"/>
+        </w:rPr>
+      </w:pPr>
+      <w:r>
+        <w:rPr>
+          <w:lang w:val="en-US"/>
+        </w:rPr>
+        <w:t>If even call even length function</w:t>
+      </w:r>
+    </w:p>
+    <w:p>
+      <w:pPr>
+        <w:pStyle w:val="ListParagraph"/>
+        <w:numPr>
+          <w:ilvl w:val="0"/>
+          <w:numId w:val="36"/>
+        </w:numPr>
+        <w:rPr>
+          <w:lang w:val="en-US"/>
+        </w:rPr>
+      </w:pPr>
+      <w:r>
+        <w:rPr>
+          <w:lang w:val="en-US"/>
+        </w:rPr>
+        <w:t>If odd call odd length function</w:t>
+      </w:r>
+    </w:p>
+    <w:p>
+      <w:pPr>
+        <w:pStyle w:val="ListParagraph"/>
+        <w:numPr>
+          <w:ilvl w:val="0"/>
+          <w:numId w:val="36"/>
+        </w:numPr>
+        <w:rPr>
+          <w:lang w:val="en-US"/>
+        </w:rPr>
+      </w:pPr>
+      <w:r>
+        <w:rPr>
+          <w:lang w:val="en-US"/>
+        </w:rPr>
+        <w:t>Even function :</w:t>
+      </w:r>
+    </w:p>
+    <w:p>
+      <w:pPr>
+        <w:pStyle w:val="ListParagraph"/>
+        <w:numPr>
+          <w:ilvl w:val="0"/>
+          <w:numId w:val="36"/>
+        </w:numPr>
+        <w:rPr>
+          <w:lang w:val="en-US"/>
+        </w:rPr>
+      </w:pPr>
+      <w:r>
+        <w:rPr>
+          <w:lang w:val="en-US"/>
+        </w:rPr>
+        <w:t>Val  = n/2 it’s integer and floor decreasecount - 0</w:t>
+      </w:r>
+    </w:p>
+    <w:p>
+      <w:pPr>
+        <w:pStyle w:val="ListParagraph"/>
+        <w:numPr>
+          <w:ilvl w:val="0"/>
+          <w:numId w:val="36"/>
+        </w:numPr>
+        <w:rPr>
+          <w:lang w:val="en-US"/>
+        </w:rPr>
+      </w:pPr>
+      <w:r>
+        <w:rPr>
+          <w:lang w:val="en-US"/>
+        </w:rPr>
+        <w:t xml:space="preserve">Traverse till the last </w:t>
+      </w:r>
+    </w:p>
+    <w:p>
+      <w:pPr>
+        <w:pStyle w:val="ListParagraph"/>
+        <w:numPr>
+          <w:ilvl w:val="0"/>
+          <w:numId w:val="36"/>
+        </w:numPr>
+        <w:rPr>
+          <w:lang w:val="en-US"/>
+        </w:rPr>
+      </w:pPr>
+      <w:r>
+        <w:rPr>
+          <w:lang w:val="en-US"/>
+        </w:rPr>
+        <w:t>Count ++</w:t>
+      </w:r>
+    </w:p>
+    <w:p>
+      <w:pPr>
+        <w:pStyle w:val="ListParagraph"/>
+        <w:numPr>
+          <w:ilvl w:val="0"/>
+          <w:numId w:val="36"/>
+        </w:numPr>
+        <w:rPr>
+          <w:lang w:val="en-US"/>
+        </w:rPr>
+      </w:pPr>
+      <w:r>
+        <w:rPr>
+          <w:lang w:val="en-US"/>
+        </w:rPr>
+        <w:t>If count == val</w:t>
+      </w:r>
+    </w:p>
+    <w:p>
+      <w:pPr>
+        <w:pStyle w:val="ListParagraph"/>
+        <w:numPr>
+          <w:ilvl w:val="0"/>
+          <w:numId w:val="36"/>
+        </w:numPr>
+        <w:rPr>
+          <w:lang w:val="en-US"/>
+        </w:rPr>
+      </w:pPr>
+      <w:r>
+        <w:rPr>
+          <w:lang w:val="en-US"/>
+        </w:rPr>
+        <w:t>Return temp’s next</w:t>
+      </w:r>
+    </w:p>
+    <w:p>
+      <w:pPr>
+        <w:pStyle w:val="ListParagraph"/>
+        <w:numPr>
+          <w:ilvl w:val="0"/>
+          <w:numId w:val="36"/>
+        </w:numPr>
+        <w:rPr>
+          <w:lang w:val="en-US"/>
+        </w:rPr>
+      </w:pPr>
+      <w:r>
+        <w:rPr>
+          <w:lang w:val="en-US"/>
+        </w:rPr>
+        <w:t>Else move the temp = temp.next</w:t>
+      </w:r>
+    </w:p>
+    <w:p>
+      <w:pPr>
+        <w:pStyle w:val="ListParagraph"/>
+        <w:numPr>
+          <w:ilvl w:val="0"/>
+          <w:numId w:val="36"/>
+        </w:numPr>
+        <w:rPr>
+          <w:lang w:val="en-US"/>
+        </w:rPr>
+      </w:pPr>
+      <w:r>
+        <w:rPr>
+          <w:lang w:val="en-US"/>
+        </w:rPr>
+        <w:t>Odd function :</w:t>
+      </w:r>
+    </w:p>
+    <w:p>
+      <w:pPr>
+        <w:pStyle w:val="ListParagraph"/>
+        <w:numPr>
+          <w:ilvl w:val="0"/>
+          <w:numId w:val="36"/>
+        </w:numPr>
+        <w:rPr>
+          <w:lang w:val="en-US"/>
+        </w:rPr>
+      </w:pPr>
+      <w:r>
+        <w:rPr>
+          <w:lang w:val="en-US"/>
+        </w:rPr>
+        <w:t>Val = n/2 ceil value increase</w:t>
+      </w:r>
+    </w:p>
+    <w:p>
+      <w:pPr>
+        <w:pStyle w:val="ListParagraph"/>
+        <w:numPr>
+          <w:ilvl w:val="0"/>
+          <w:numId w:val="36"/>
+        </w:numPr>
+        <w:rPr>
+          <w:lang w:val="en-US"/>
+        </w:rPr>
+      </w:pPr>
+      <w:r>
+        <w:rPr>
+          <w:lang w:val="en-US"/>
+        </w:rPr>
+        <w:t>Count = 0</w:t>
+      </w:r>
+    </w:p>
+    <w:p>
+      <w:pPr>
+        <w:pStyle w:val="ListParagraph"/>
+        <w:numPr>
+          <w:ilvl w:val="0"/>
+          <w:numId w:val="36"/>
+        </w:numPr>
+        <w:rPr>
+          <w:lang w:val="en-US"/>
+        </w:rPr>
+      </w:pPr>
+      <w:r>
+        <w:rPr>
+          <w:lang w:val="en-US"/>
+        </w:rPr>
+        <w:t>Traverse till the last</w:t>
+      </w:r>
+    </w:p>
+    <w:p>
+      <w:pPr>
+        <w:pStyle w:val="ListParagraph"/>
+        <w:numPr>
+          <w:ilvl w:val="0"/>
+          <w:numId w:val="36"/>
+        </w:numPr>
+        <w:rPr>
+          <w:lang w:val="en-US"/>
+        </w:rPr>
+      </w:pPr>
+      <w:r>
+        <w:rPr>
+          <w:lang w:val="en-US"/>
+        </w:rPr>
+        <w:t>Count ++</w:t>
+      </w:r>
+    </w:p>
+    <w:p>
+      <w:pPr>
+        <w:pStyle w:val="ListParagraph"/>
+        <w:numPr>
+          <w:ilvl w:val="0"/>
+          <w:numId w:val="36"/>
+        </w:numPr>
+        <w:rPr>
+          <w:lang w:val="en-US"/>
+        </w:rPr>
+      </w:pPr>
+      <w:r>
+        <w:rPr>
+          <w:lang w:val="en-US"/>
+        </w:rPr>
+        <w:t>If count == val</w:t>
+      </w:r>
+    </w:p>
+    <w:p>
+      <w:pPr>
+        <w:pStyle w:val="ListParagraph"/>
+        <w:numPr>
+          <w:ilvl w:val="0"/>
+          <w:numId w:val="36"/>
+        </w:numPr>
+        <w:rPr>
+          <w:lang w:val="en-US"/>
+        </w:rPr>
+      </w:pPr>
+      <w:r>
+        <w:rPr>
+          <w:lang w:val="en-US"/>
+        </w:rPr>
+        <w:t>Return the temp</w:t>
+      </w:r>
+    </w:p>
+    <w:p>
+      <w:pPr>
+        <w:pStyle w:val="ListParagraph"/>
+        <w:numPr>
+          <w:ilvl w:val="0"/>
+          <w:numId w:val="36"/>
+        </w:numPr>
+        <w:rPr>
+          <w:lang w:val="en-US"/>
+        </w:rPr>
+      </w:pPr>
+      <w:r>
+        <w:rPr>
+          <w:lang w:val="en-US"/>
+        </w:rPr>
+        <w:t>Else move the temp = temp’s next</w:t>
+      </w:r>
+    </w:p>
+    <w:p>
+      <w:pPr>
+        <w:rPr>
+          <w:b/>
+          <w:bCs/>
+          <w:lang w:val="en-US"/>
+        </w:rPr>
+      </w:pPr>
+      <w:r>
+        <w:rPr>
+          <w:b/>
+          <w:bCs/>
+          <w:lang w:val="en-US"/>
+        </w:rPr>
+        <w:t>// OPTIMAL</w:t>
+      </w:r>
+    </w:p>
+    <w:p>
+      <w:pPr>
+        <w:pStyle w:val="ListParagraph"/>
+        <w:numPr>
+          <w:ilvl w:val="0"/>
+          <w:numId w:val="37"/>
+        </w:numPr>
+        <w:rPr>
+          <w:lang w:val="en-US"/>
+        </w:rPr>
+      </w:pPr>
+      <w:r>
+        <w:rPr>
+          <w:lang w:val="en-US"/>
+        </w:rPr>
+        <w:t>Initialize slow = head</w:t>
+      </w:r>
+    </w:p>
+    <w:p>
+      <w:pPr>
+        <w:pStyle w:val="ListParagraph"/>
+        <w:numPr>
+          <w:ilvl w:val="0"/>
+          <w:numId w:val="37"/>
+        </w:numPr>
+        <w:rPr>
+          <w:lang w:val="en-US"/>
+        </w:rPr>
+      </w:pPr>
+      <w:r>
+        <w:rPr>
+          <w:lang w:val="en-US"/>
+        </w:rPr>
+        <w:t>Initialize fast = head</w:t>
+      </w:r>
+    </w:p>
+    <w:p>
+      <w:pPr>
+        <w:pStyle w:val="ListParagraph"/>
+        <w:numPr>
+          <w:ilvl w:val="0"/>
+          <w:numId w:val="37"/>
+        </w:numPr>
+        <w:rPr>
+          <w:lang w:val="en-US"/>
+        </w:rPr>
+      </w:pPr>
+      <w:r>
+        <w:rPr>
+          <w:lang w:val="en-US"/>
+        </w:rPr>
+        <w:t>Traverse till the fast.next != null and fast != null</w:t>
+      </w:r>
+    </w:p>
+    <w:p>
+      <w:pPr>
+        <w:pStyle w:val="ListParagraph"/>
+        <w:numPr>
+          <w:ilvl w:val="0"/>
+          <w:numId w:val="37"/>
+        </w:numPr>
+        <w:rPr>
+          <w:lang w:val="en-US"/>
+        </w:rPr>
+      </w:pPr>
+      <w:r>
+        <w:rPr>
+          <w:lang w:val="en-US"/>
+        </w:rPr>
+        <w:t xml:space="preserve">Slow to one move </w:t>
+      </w:r>
+    </w:p>
+    <w:p>
+      <w:pPr>
+        <w:pStyle w:val="ListParagraph"/>
+        <w:numPr>
+          <w:ilvl w:val="0"/>
+          <w:numId w:val="37"/>
+        </w:numPr>
+        <w:rPr>
+          <w:lang w:val="en-US"/>
+        </w:rPr>
+      </w:pPr>
+      <w:r>
+        <w:rPr>
+          <w:lang w:val="en-US"/>
+        </w:rPr>
+        <w:t>Fast to double  ove</w:t>
+      </w:r>
+    </w:p>
+    <w:p>
+      <w:pPr>
+        <w:pStyle w:val="ListParagraph"/>
+        <w:numPr>
+          <w:ilvl w:val="0"/>
+          <w:numId w:val="37"/>
+        </w:numPr>
+        <w:rPr>
+          <w:lang w:val="en-US"/>
+        </w:rPr>
+      </w:pPr>
+      <w:r>
+        <w:rPr>
+          <w:lang w:val="en-US"/>
+        </w:rPr>
+        <w:t>Return slow</w:t>
+      </w:r>
     </w:p>
     <w:p>
       <w:pPr>
@@ -7192,6 +6637,95 @@
     </w:lvl>
   </w:abstractNum>
   <w:abstractNum w:abstractNumId="14" w15:restartNumberingAfterBreak="0">
+    <w:nsid w:val="3B850DBE"/>
+    <w:multiLevelType w:val="hybridMultilevel"/>
+    <w:tmpl w:val="4FC6AD1C"/>
+    <w:lvl w:ilvl="0" w:tplc="C4F201DA">
+      <w:start w:val="1"/>
+      <w:numFmt w:val="decimal"/>
+      <w:lvlText w:val="%1)"/>
+      <w:lvlJc w:val="left"/>
+      <w:pPr>
+        <w:ind w:left="612" w:hanging="360"/>
+      </w:pPr>
+      <w:rPr>
+        <w:rFonts w:hint="default"/>
+      </w:rPr>
+    </w:lvl>
+    <w:lvl w:ilvl="1" w:tplc="40090019" w:tentative="1">
+      <w:start w:val="1"/>
+      <w:numFmt w:val="lowerLetter"/>
+      <w:lvlText w:val="%2."/>
+      <w:lvlJc w:val="left"/>
+      <w:pPr>
+        <w:ind w:left="1332" w:hanging="360"/>
+      </w:pPr>
+    </w:lvl>
+    <w:lvl w:ilvl="2" w:tplc="4009001B" w:tentative="1">
+      <w:start w:val="1"/>
+      <w:numFmt w:val="lowerRoman"/>
+      <w:lvlText w:val="%3."/>
+      <w:lvlJc w:val="right"/>
+      <w:pPr>
+        <w:ind w:left="2052" w:hanging="180"/>
+      </w:pPr>
+    </w:lvl>
+    <w:lvl w:ilvl="3" w:tplc="4009000F" w:tentative="1">
+      <w:start w:val="1"/>
+      <w:numFmt w:val="decimal"/>
+      <w:lvlText w:val="%4."/>
+      <w:lvlJc w:val="left"/>
+      <w:pPr>
+        <w:ind w:left="2772" w:hanging="360"/>
+      </w:pPr>
+    </w:lvl>
+    <w:lvl w:ilvl="4" w:tplc="40090019" w:tentative="1">
+      <w:start w:val="1"/>
+      <w:numFmt w:val="lowerLetter"/>
+      <w:lvlText w:val="%5."/>
+      <w:lvlJc w:val="left"/>
+      <w:pPr>
+        <w:ind w:left="3492" w:hanging="360"/>
+      </w:pPr>
+    </w:lvl>
+    <w:lvl w:ilvl="5" w:tplc="4009001B" w:tentative="1">
+      <w:start w:val="1"/>
+      <w:numFmt w:val="lowerRoman"/>
+      <w:lvlText w:val="%6."/>
+      <w:lvlJc w:val="right"/>
+      <w:pPr>
+        <w:ind w:left="4212" w:hanging="180"/>
+      </w:pPr>
+    </w:lvl>
+    <w:lvl w:ilvl="6" w:tplc="4009000F" w:tentative="1">
+      <w:start w:val="1"/>
+      <w:numFmt w:val="decimal"/>
+      <w:lvlText w:val="%7."/>
+      <w:lvlJc w:val="left"/>
+      <w:pPr>
+        <w:ind w:left="4932" w:hanging="360"/>
+      </w:pPr>
+    </w:lvl>
+    <w:lvl w:ilvl="7" w:tplc="40090019" w:tentative="1">
+      <w:start w:val="1"/>
+      <w:numFmt w:val="lowerLetter"/>
+      <w:lvlText w:val="%8."/>
+      <w:lvlJc w:val="left"/>
+      <w:pPr>
+        <w:ind w:left="5652" w:hanging="360"/>
+      </w:pPr>
+    </w:lvl>
+    <w:lvl w:ilvl="8" w:tplc="4009001B" w:tentative="1">
+      <w:start w:val="1"/>
+      <w:numFmt w:val="lowerRoman"/>
+      <w:lvlText w:val="%9."/>
+      <w:lvlJc w:val="right"/>
+      <w:pPr>
+        <w:ind w:left="6372" w:hanging="180"/>
+      </w:pPr>
+    </w:lvl>
+  </w:abstractNum>
+  <w:abstractNum w:abstractNumId="15" w15:restartNumberingAfterBreak="0">
     <w:nsid w:val="3F8223B4"/>
     <w:multiLevelType w:val="hybridMultilevel"/>
     <w:tmpl w:val="52FAA676"/>
@@ -7280,7 +6814,7 @@
       </w:pPr>
     </w:lvl>
   </w:abstractNum>
-  <w:abstractNum w:abstractNumId="15" w15:restartNumberingAfterBreak="0">
+  <w:abstractNum w:abstractNumId="16" w15:restartNumberingAfterBreak="0">
     <w:nsid w:val="3FFE33F4"/>
     <w:multiLevelType w:val="hybridMultilevel"/>
     <w:tmpl w:val="D416EAD0"/>
@@ -7369,7 +6903,7 @@
       </w:pPr>
     </w:lvl>
   </w:abstractNum>
-  <w:abstractNum w:abstractNumId="16" w15:restartNumberingAfterBreak="0">
+  <w:abstractNum w:abstractNumId="17" w15:restartNumberingAfterBreak="0">
     <w:nsid w:val="44B80AD7"/>
     <w:multiLevelType w:val="hybridMultilevel"/>
     <w:tmpl w:val="9EA6BB22"/>
@@ -7458,7 +6992,96 @@
       </w:pPr>
     </w:lvl>
   </w:abstractNum>
-  <w:abstractNum w:abstractNumId="17" w15:restartNumberingAfterBreak="0">
+  <w:abstractNum w:abstractNumId="18" w15:restartNumberingAfterBreak="0">
+    <w:nsid w:val="4AB40EFA"/>
+    <w:multiLevelType w:val="hybridMultilevel"/>
+    <w:tmpl w:val="4DB23E4A"/>
+    <w:lvl w:ilvl="0" w:tplc="8BC8F194">
+      <w:start w:val="1"/>
+      <w:numFmt w:val="decimal"/>
+      <w:lvlText w:val="%1)"/>
+      <w:lvlJc w:val="left"/>
+      <w:pPr>
+        <w:ind w:left="612" w:hanging="360"/>
+      </w:pPr>
+      <w:rPr>
+        <w:rFonts w:hint="default"/>
+      </w:rPr>
+    </w:lvl>
+    <w:lvl w:ilvl="1" w:tplc="40090019" w:tentative="1">
+      <w:start w:val="1"/>
+      <w:numFmt w:val="lowerLetter"/>
+      <w:lvlText w:val="%2."/>
+      <w:lvlJc w:val="left"/>
+      <w:pPr>
+        <w:ind w:left="1332" w:hanging="360"/>
+      </w:pPr>
+    </w:lvl>
+    <w:lvl w:ilvl="2" w:tplc="4009001B" w:tentative="1">
+      <w:start w:val="1"/>
+      <w:numFmt w:val="lowerRoman"/>
+      <w:lvlText w:val="%3."/>
+      <w:lvlJc w:val="right"/>
+      <w:pPr>
+        <w:ind w:left="2052" w:hanging="180"/>
+      </w:pPr>
+    </w:lvl>
+    <w:lvl w:ilvl="3" w:tplc="4009000F" w:tentative="1">
+      <w:start w:val="1"/>
+      <w:numFmt w:val="decimal"/>
+      <w:lvlText w:val="%4."/>
+      <w:lvlJc w:val="left"/>
+      <w:pPr>
+        <w:ind w:left="2772" w:hanging="360"/>
+      </w:pPr>
+    </w:lvl>
+    <w:lvl w:ilvl="4" w:tplc="40090019" w:tentative="1">
+      <w:start w:val="1"/>
+      <w:numFmt w:val="lowerLetter"/>
+      <w:lvlText w:val="%5."/>
+      <w:lvlJc w:val="left"/>
+      <w:pPr>
+        <w:ind w:left="3492" w:hanging="360"/>
+      </w:pPr>
+    </w:lvl>
+    <w:lvl w:ilvl="5" w:tplc="4009001B" w:tentative="1">
+      <w:start w:val="1"/>
+      <w:numFmt w:val="lowerRoman"/>
+      <w:lvlText w:val="%6."/>
+      <w:lvlJc w:val="right"/>
+      <w:pPr>
+        <w:ind w:left="4212" w:hanging="180"/>
+      </w:pPr>
+    </w:lvl>
+    <w:lvl w:ilvl="6" w:tplc="4009000F" w:tentative="1">
+      <w:start w:val="1"/>
+      <w:numFmt w:val="decimal"/>
+      <w:lvlText w:val="%7."/>
+      <w:lvlJc w:val="left"/>
+      <w:pPr>
+        <w:ind w:left="4932" w:hanging="360"/>
+      </w:pPr>
+    </w:lvl>
+    <w:lvl w:ilvl="7" w:tplc="40090019" w:tentative="1">
+      <w:start w:val="1"/>
+      <w:numFmt w:val="lowerLetter"/>
+      <w:lvlText w:val="%8."/>
+      <w:lvlJc w:val="left"/>
+      <w:pPr>
+        <w:ind w:left="5652" w:hanging="360"/>
+      </w:pPr>
+    </w:lvl>
+    <w:lvl w:ilvl="8" w:tplc="4009001B" w:tentative="1">
+      <w:start w:val="1"/>
+      <w:numFmt w:val="lowerRoman"/>
+      <w:lvlText w:val="%9."/>
+      <w:lvlJc w:val="right"/>
+      <w:pPr>
+        <w:ind w:left="6372" w:hanging="180"/>
+      </w:pPr>
+    </w:lvl>
+  </w:abstractNum>
+  <w:abstractNum w:abstractNumId="19" w15:restartNumberingAfterBreak="0">
     <w:nsid w:val="4B860BE4"/>
     <w:multiLevelType w:val="hybridMultilevel"/>
     <w:tmpl w:val="C95074B6"/>
@@ -7547,7 +7170,7 @@
       </w:pPr>
     </w:lvl>
   </w:abstractNum>
-  <w:abstractNum w:abstractNumId="18" w15:restartNumberingAfterBreak="0">
+  <w:abstractNum w:abstractNumId="20" w15:restartNumberingAfterBreak="0">
     <w:nsid w:val="4CFC2CCB"/>
     <w:multiLevelType w:val="hybridMultilevel"/>
     <w:tmpl w:val="538EE982"/>
@@ -7636,7 +7259,7 @@
       </w:pPr>
     </w:lvl>
   </w:abstractNum>
-  <w:abstractNum w:abstractNumId="19" w15:restartNumberingAfterBreak="0">
+  <w:abstractNum w:abstractNumId="21" w15:restartNumberingAfterBreak="0">
     <w:nsid w:val="4DBB4D77"/>
     <w:multiLevelType w:val="hybridMultilevel"/>
     <w:tmpl w:val="BFCA3FA0"/>
@@ -7725,7 +7348,7 @@
       </w:pPr>
     </w:lvl>
   </w:abstractNum>
-  <w:abstractNum w:abstractNumId="20" w15:restartNumberingAfterBreak="0">
+  <w:abstractNum w:abstractNumId="22" w15:restartNumberingAfterBreak="0">
     <w:nsid w:val="500D58EB"/>
     <w:multiLevelType w:val="hybridMultilevel"/>
     <w:tmpl w:val="1DA6B6BC"/>
@@ -7816,7 +7439,7 @@
       </w:pPr>
     </w:lvl>
   </w:abstractNum>
-  <w:abstractNum w:abstractNumId="21" w15:restartNumberingAfterBreak="0">
+  <w:abstractNum w:abstractNumId="23" w15:restartNumberingAfterBreak="0">
     <w:nsid w:val="57286165"/>
     <w:multiLevelType w:val="hybridMultilevel"/>
     <w:tmpl w:val="A9DA9432"/>
@@ -7905,7 +7528,96 @@
       </w:pPr>
     </w:lvl>
   </w:abstractNum>
-  <w:abstractNum w:abstractNumId="22" w15:restartNumberingAfterBreak="0">
+  <w:abstractNum w:abstractNumId="24" w15:restartNumberingAfterBreak="0">
+    <w:nsid w:val="59875CC3"/>
+    <w:multiLevelType w:val="hybridMultilevel"/>
+    <w:tmpl w:val="8D9052A8"/>
+    <w:lvl w:ilvl="0" w:tplc="B8342E10">
+      <w:start w:val="1"/>
+      <w:numFmt w:val="decimal"/>
+      <w:lvlText w:val="%1)"/>
+      <w:lvlJc w:val="left"/>
+      <w:pPr>
+        <w:ind w:left="660" w:hanging="360"/>
+      </w:pPr>
+      <w:rPr>
+        <w:rFonts w:hint="default"/>
+      </w:rPr>
+    </w:lvl>
+    <w:lvl w:ilvl="1" w:tplc="40090019" w:tentative="1">
+      <w:start w:val="1"/>
+      <w:numFmt w:val="lowerLetter"/>
+      <w:lvlText w:val="%2."/>
+      <w:lvlJc w:val="left"/>
+      <w:pPr>
+        <w:ind w:left="1380" w:hanging="360"/>
+      </w:pPr>
+    </w:lvl>
+    <w:lvl w:ilvl="2" w:tplc="4009001B" w:tentative="1">
+      <w:start w:val="1"/>
+      <w:numFmt w:val="lowerRoman"/>
+      <w:lvlText w:val="%3."/>
+      <w:lvlJc w:val="right"/>
+      <w:pPr>
+        <w:ind w:left="2100" w:hanging="180"/>
+      </w:pPr>
+    </w:lvl>
+    <w:lvl w:ilvl="3" w:tplc="4009000F" w:tentative="1">
+      <w:start w:val="1"/>
+      <w:numFmt w:val="decimal"/>
+      <w:lvlText w:val="%4."/>
+      <w:lvlJc w:val="left"/>
+      <w:pPr>
+        <w:ind w:left="2820" w:hanging="360"/>
+      </w:pPr>
+    </w:lvl>
+    <w:lvl w:ilvl="4" w:tplc="40090019" w:tentative="1">
+      <w:start w:val="1"/>
+      <w:numFmt w:val="lowerLetter"/>
+      <w:lvlText w:val="%5."/>
+      <w:lvlJc w:val="left"/>
+      <w:pPr>
+        <w:ind w:left="3540" w:hanging="360"/>
+      </w:pPr>
+    </w:lvl>
+    <w:lvl w:ilvl="5" w:tplc="4009001B" w:tentative="1">
+      <w:start w:val="1"/>
+      <w:numFmt w:val="lowerRoman"/>
+      <w:lvlText w:val="%6."/>
+      <w:lvlJc w:val="right"/>
+      <w:pPr>
+        <w:ind w:left="4260" w:hanging="180"/>
+      </w:pPr>
+    </w:lvl>
+    <w:lvl w:ilvl="6" w:tplc="4009000F" w:tentative="1">
+      <w:start w:val="1"/>
+      <w:numFmt w:val="decimal"/>
+      <w:lvlText w:val="%7."/>
+      <w:lvlJc w:val="left"/>
+      <w:pPr>
+        <w:ind w:left="4980" w:hanging="360"/>
+      </w:pPr>
+    </w:lvl>
+    <w:lvl w:ilvl="7" w:tplc="40090019" w:tentative="1">
+      <w:start w:val="1"/>
+      <w:numFmt w:val="lowerLetter"/>
+      <w:lvlText w:val="%8."/>
+      <w:lvlJc w:val="left"/>
+      <w:pPr>
+        <w:ind w:left="5700" w:hanging="360"/>
+      </w:pPr>
+    </w:lvl>
+    <w:lvl w:ilvl="8" w:tplc="4009001B" w:tentative="1">
+      <w:start w:val="1"/>
+      <w:numFmt w:val="lowerRoman"/>
+      <w:lvlText w:val="%9."/>
+      <w:lvlJc w:val="right"/>
+      <w:pPr>
+        <w:ind w:left="6420" w:hanging="180"/>
+      </w:pPr>
+    </w:lvl>
+  </w:abstractNum>
+  <w:abstractNum w:abstractNumId="25" w15:restartNumberingAfterBreak="0">
     <w:nsid w:val="5ED42B1B"/>
     <w:multiLevelType w:val="hybridMultilevel"/>
     <w:tmpl w:val="230E4CBE"/>
@@ -7994,7 +7706,7 @@
       </w:pPr>
     </w:lvl>
   </w:abstractNum>
-  <w:abstractNum w:abstractNumId="23" w15:restartNumberingAfterBreak="0">
+  <w:abstractNum w:abstractNumId="26" w15:restartNumberingAfterBreak="0">
     <w:nsid w:val="5F0931D9"/>
     <w:multiLevelType w:val="hybridMultilevel"/>
     <w:tmpl w:val="B2F028A8"/>
@@ -8083,7 +7795,7 @@
       </w:pPr>
     </w:lvl>
   </w:abstractNum>
-  <w:abstractNum w:abstractNumId="24" w15:restartNumberingAfterBreak="0">
+  <w:abstractNum w:abstractNumId="27" w15:restartNumberingAfterBreak="0">
     <w:nsid w:val="61512C07"/>
     <w:multiLevelType w:val="hybridMultilevel"/>
     <w:tmpl w:val="78526BF0"/>
@@ -8172,7 +7884,7 @@
       </w:pPr>
     </w:lvl>
   </w:abstractNum>
-  <w:abstractNum w:abstractNumId="25" w15:restartNumberingAfterBreak="0">
+  <w:abstractNum w:abstractNumId="28" w15:restartNumberingAfterBreak="0">
     <w:nsid w:val="6741648B"/>
     <w:multiLevelType w:val="hybridMultilevel"/>
     <w:tmpl w:val="09D0E646"/>
@@ -8261,7 +7973,7 @@
       </w:pPr>
     </w:lvl>
   </w:abstractNum>
-  <w:abstractNum w:abstractNumId="26" w15:restartNumberingAfterBreak="0">
+  <w:abstractNum w:abstractNumId="29" w15:restartNumberingAfterBreak="0">
     <w:nsid w:val="6BBD7F97"/>
     <w:multiLevelType w:val="hybridMultilevel"/>
     <w:tmpl w:val="C712AB82"/>
@@ -8350,7 +8062,7 @@
       </w:pPr>
     </w:lvl>
   </w:abstractNum>
-  <w:abstractNum w:abstractNumId="27" w15:restartNumberingAfterBreak="0">
+  <w:abstractNum w:abstractNumId="30" w15:restartNumberingAfterBreak="0">
     <w:nsid w:val="6C787C33"/>
     <w:multiLevelType w:val="hybridMultilevel"/>
     <w:tmpl w:val="52226456"/>
@@ -8439,7 +8151,7 @@
       </w:pPr>
     </w:lvl>
   </w:abstractNum>
-  <w:abstractNum w:abstractNumId="28" w15:restartNumberingAfterBreak="0">
+  <w:abstractNum w:abstractNumId="31" w15:restartNumberingAfterBreak="0">
     <w:nsid w:val="6C891ED1"/>
     <w:multiLevelType w:val="hybridMultilevel"/>
     <w:tmpl w:val="AFC6B320"/>
@@ -8528,7 +8240,7 @@
       </w:pPr>
     </w:lvl>
   </w:abstractNum>
-  <w:abstractNum w:abstractNumId="29" w15:restartNumberingAfterBreak="0">
+  <w:abstractNum w:abstractNumId="32" w15:restartNumberingAfterBreak="0">
     <w:nsid w:val="6FA56498"/>
     <w:multiLevelType w:val="hybridMultilevel"/>
     <w:tmpl w:val="EC9CE2A6"/>
@@ -8619,7 +8331,7 @@
       </w:pPr>
     </w:lvl>
   </w:abstractNum>
-  <w:abstractNum w:abstractNumId="30" w15:restartNumberingAfterBreak="0">
+  <w:abstractNum w:abstractNumId="33" w15:restartNumberingAfterBreak="0">
     <w:nsid w:val="73402F57"/>
     <w:multiLevelType w:val="hybridMultilevel"/>
     <w:tmpl w:val="62780A74"/>
@@ -8708,7 +8420,7 @@
       </w:pPr>
     </w:lvl>
   </w:abstractNum>
-  <w:abstractNum w:abstractNumId="31" w15:restartNumberingAfterBreak="0">
+  <w:abstractNum w:abstractNumId="34" w15:restartNumberingAfterBreak="0">
     <w:nsid w:val="74704194"/>
     <w:multiLevelType w:val="hybridMultilevel"/>
     <w:tmpl w:val="54C47C80"/>
@@ -8797,7 +8509,7 @@
       </w:pPr>
     </w:lvl>
   </w:abstractNum>
-  <w:abstractNum w:abstractNumId="32" w15:restartNumberingAfterBreak="0">
+  <w:abstractNum w:abstractNumId="35" w15:restartNumberingAfterBreak="0">
     <w:nsid w:val="7527302C"/>
     <w:multiLevelType w:val="hybridMultilevel"/>
     <w:tmpl w:val="4A6C8924"/>
@@ -8886,7 +8598,7 @@
       </w:pPr>
     </w:lvl>
   </w:abstractNum>
-  <w:abstractNum w:abstractNumId="33" w15:restartNumberingAfterBreak="0">
+  <w:abstractNum w:abstractNumId="36" w15:restartNumberingAfterBreak="0">
     <w:nsid w:val="7F715AAC"/>
     <w:multiLevelType w:val="hybridMultilevel"/>
     <w:tmpl w:val="20FCC3D2"/>
@@ -8976,19 +8688,19 @@
     </w:lvl>
   </w:abstractNum>
   <w:num w:numId="1" w16cid:durableId="1929191308">
-    <w:abstractNumId w:val="25"/>
+    <w:abstractNumId w:val="28"/>
   </w:num>
   <w:num w:numId="2" w16cid:durableId="1452818009">
-    <w:abstractNumId w:val="21"/>
+    <w:abstractNumId w:val="23"/>
   </w:num>
   <w:num w:numId="3" w16cid:durableId="379129943">
-    <w:abstractNumId w:val="17"/>
+    <w:abstractNumId w:val="19"/>
   </w:num>
   <w:num w:numId="4" w16cid:durableId="1063913110">
-    <w:abstractNumId w:val="30"/>
+    <w:abstractNumId w:val="33"/>
   </w:num>
   <w:num w:numId="5" w16cid:durableId="1823230013">
-    <w:abstractNumId w:val="33"/>
+    <w:abstractNumId w:val="36"/>
   </w:num>
   <w:num w:numId="6" w16cid:durableId="1228151261">
     <w:abstractNumId w:val="7"/>
@@ -9000,55 +8712,55 @@
     <w:abstractNumId w:val="6"/>
   </w:num>
   <w:num w:numId="9" w16cid:durableId="1485926871">
-    <w:abstractNumId w:val="20"/>
+    <w:abstractNumId w:val="22"/>
   </w:num>
   <w:num w:numId="10" w16cid:durableId="382295947">
-    <w:abstractNumId w:val="31"/>
+    <w:abstractNumId w:val="34"/>
   </w:num>
   <w:num w:numId="11" w16cid:durableId="266929314">
-    <w:abstractNumId w:val="23"/>
+    <w:abstractNumId w:val="26"/>
   </w:num>
   <w:num w:numId="12" w16cid:durableId="858810609">
     <w:abstractNumId w:val="13"/>
   </w:num>
   <w:num w:numId="13" w16cid:durableId="920332385">
-    <w:abstractNumId w:val="22"/>
+    <w:abstractNumId w:val="25"/>
   </w:num>
   <w:num w:numId="14" w16cid:durableId="1438059950">
     <w:abstractNumId w:val="8"/>
   </w:num>
   <w:num w:numId="15" w16cid:durableId="1506941495">
-    <w:abstractNumId w:val="28"/>
+    <w:abstractNumId w:val="31"/>
   </w:num>
   <w:num w:numId="16" w16cid:durableId="1229996536">
-    <w:abstractNumId w:val="15"/>
+    <w:abstractNumId w:val="16"/>
   </w:num>
   <w:num w:numId="17" w16cid:durableId="47920956">
-    <w:abstractNumId w:val="26"/>
+    <w:abstractNumId w:val="29"/>
   </w:num>
   <w:num w:numId="18" w16cid:durableId="1369448543">
-    <w:abstractNumId w:val="29"/>
+    <w:abstractNumId w:val="32"/>
   </w:num>
   <w:num w:numId="19" w16cid:durableId="283193473">
     <w:abstractNumId w:val="2"/>
   </w:num>
   <w:num w:numId="20" w16cid:durableId="848714178">
-    <w:abstractNumId w:val="19"/>
+    <w:abstractNumId w:val="21"/>
   </w:num>
   <w:num w:numId="21" w16cid:durableId="857545553">
-    <w:abstractNumId w:val="14"/>
+    <w:abstractNumId w:val="15"/>
   </w:num>
   <w:num w:numId="22" w16cid:durableId="492532390">
-    <w:abstractNumId w:val="32"/>
+    <w:abstractNumId w:val="35"/>
   </w:num>
   <w:num w:numId="23" w16cid:durableId="396367076">
-    <w:abstractNumId w:val="24"/>
+    <w:abstractNumId w:val="27"/>
   </w:num>
   <w:num w:numId="24" w16cid:durableId="227307955">
     <w:abstractNumId w:val="9"/>
   </w:num>
   <w:num w:numId="25" w16cid:durableId="17509084">
-    <w:abstractNumId w:val="18"/>
+    <w:abstractNumId w:val="20"/>
   </w:num>
   <w:num w:numId="26" w16cid:durableId="1146581446">
     <w:abstractNumId w:val="0"/>
@@ -9057,7 +8769,7 @@
     <w:abstractNumId w:val="10"/>
   </w:num>
   <w:num w:numId="28" w16cid:durableId="1149519509">
-    <w:abstractNumId w:val="16"/>
+    <w:abstractNumId w:val="17"/>
   </w:num>
   <w:num w:numId="29" w16cid:durableId="1244485211">
     <w:abstractNumId w:val="11"/>
@@ -9072,10 +8784,19 @@
     <w:abstractNumId w:val="5"/>
   </w:num>
   <w:num w:numId="33" w16cid:durableId="1618953520">
-    <w:abstractNumId w:val="27"/>
+    <w:abstractNumId w:val="30"/>
   </w:num>
   <w:num w:numId="34" w16cid:durableId="211234391">
     <w:abstractNumId w:val="1"/>
+  </w:num>
+  <w:num w:numId="35" w16cid:durableId="1606377627">
+    <w:abstractNumId w:val="24"/>
+  </w:num>
+  <w:num w:numId="36" w16cid:durableId="360866260">
+    <w:abstractNumId w:val="18"/>
+  </w:num>
+  <w:num w:numId="37" w16cid:durableId="527376701">
+    <w:abstractNumId w:val="14"/>
   </w:num>
 </w:numbering>
 </file>

</xml_diff>

<commit_message>
7th Lecture on LL
</commit_message>
<xml_diff>
--- a/Notes/LL.docx
+++ b/Notes/LL.docx
@@ -162,8 +162,24 @@
         <w:rPr>
           <w:lang w:val="en-US"/>
         </w:rPr>
-        <w:t>Assign the temp,head,mover</w:t>
-      </w:r>
+        <w:t xml:space="preserve">Assign the </w:t>
+      </w:r>
+      <w:proofErr w:type="spellStart"/>
+      <w:proofErr w:type="gramStart"/>
+      <w:r>
+        <w:rPr>
+          <w:lang w:val="en-US"/>
+        </w:rPr>
+        <w:t>temp,head</w:t>
+      </w:r>
+      <w:proofErr w:type="gramEnd"/>
+      <w:r>
+        <w:rPr>
+          <w:lang w:val="en-US"/>
+        </w:rPr>
+        <w:t>,mover</w:t>
+      </w:r>
+      <w:proofErr w:type="spellEnd"/>
     </w:p>
     <w:p>
       <w:pPr>
@@ -233,7 +249,43 @@
           <w:bCs/>
           <w:lang w:val="en-US"/>
         </w:rPr>
-        <w:t>//  Traversal os LL</w:t>
+        <w:t>/</w:t>
+      </w:r>
+      <w:proofErr w:type="gramStart"/>
+      <w:r>
+        <w:rPr>
+          <w:b/>
+          <w:bCs/>
+          <w:lang w:val="en-US"/>
+        </w:rPr>
+        <w:t>/  Traversal</w:t>
+      </w:r>
+      <w:proofErr w:type="gramEnd"/>
+      <w:r>
+        <w:rPr>
+          <w:b/>
+          <w:bCs/>
+          <w:lang w:val="en-US"/>
+        </w:rPr>
+        <w:t xml:space="preserve"> </w:t>
+      </w:r>
+      <w:proofErr w:type="spellStart"/>
+      <w:r>
+        <w:rPr>
+          <w:b/>
+          <w:bCs/>
+          <w:lang w:val="en-US"/>
+        </w:rPr>
+        <w:t>os</w:t>
+      </w:r>
+      <w:proofErr w:type="spellEnd"/>
+      <w:r>
+        <w:rPr>
+          <w:b/>
+          <w:bCs/>
+          <w:lang w:val="en-US"/>
+        </w:rPr>
+        <w:t xml:space="preserve"> LL</w:t>
       </w:r>
     </w:p>
     <w:p>
@@ -269,7 +321,21 @@
         <w:rPr>
           <w:lang w:val="en-US"/>
         </w:rPr>
-        <w:t>Till the temp != null</w:t>
+        <w:t xml:space="preserve">Till the </w:t>
+      </w:r>
+      <w:proofErr w:type="gramStart"/>
+      <w:r>
+        <w:rPr>
+          <w:lang w:val="en-US"/>
+        </w:rPr>
+        <w:t>temp !</w:t>
+      </w:r>
+      <w:proofErr w:type="gramEnd"/>
+      <w:r>
+        <w:rPr>
+          <w:lang w:val="en-US"/>
+        </w:rPr>
+        <w:t>= null</w:t>
       </w:r>
     </w:p>
     <w:p>
@@ -340,7 +406,23 @@
         <w:rPr>
           <w:lang w:val="en-US"/>
         </w:rPr>
-        <w:t>Assign the head to the temp,count =0</w:t>
+        <w:t xml:space="preserve">Assign the head to the </w:t>
+      </w:r>
+      <w:proofErr w:type="spellStart"/>
+      <w:proofErr w:type="gramStart"/>
+      <w:r>
+        <w:rPr>
+          <w:lang w:val="en-US"/>
+        </w:rPr>
+        <w:t>temp,count</w:t>
+      </w:r>
+      <w:proofErr w:type="spellEnd"/>
+      <w:proofErr w:type="gramEnd"/>
+      <w:r>
+        <w:rPr>
+          <w:lang w:val="en-US"/>
+        </w:rPr>
+        <w:t xml:space="preserve"> =0</w:t>
       </w:r>
     </w:p>
     <w:p>
@@ -358,7 +440,21 @@
         <w:rPr>
           <w:lang w:val="en-US"/>
         </w:rPr>
-        <w:t>Till the temp != null</w:t>
+        <w:t xml:space="preserve">Till the </w:t>
+      </w:r>
+      <w:proofErr w:type="gramStart"/>
+      <w:r>
+        <w:rPr>
+          <w:lang w:val="en-US"/>
+        </w:rPr>
+        <w:t>temp !</w:t>
+      </w:r>
+      <w:proofErr w:type="gramEnd"/>
+      <w:r>
+        <w:rPr>
+          <w:lang w:val="en-US"/>
+        </w:rPr>
+        <w:t>= null</w:t>
       </w:r>
     </w:p>
     <w:p>
@@ -447,7 +543,21 @@
         <w:rPr>
           <w:lang w:val="en-US"/>
         </w:rPr>
-        <w:t>Till the temp != null</w:t>
+        <w:t xml:space="preserve">Till the </w:t>
+      </w:r>
+      <w:proofErr w:type="gramStart"/>
+      <w:r>
+        <w:rPr>
+          <w:lang w:val="en-US"/>
+        </w:rPr>
+        <w:t>temp !</w:t>
+      </w:r>
+      <w:proofErr w:type="gramEnd"/>
+      <w:r>
+        <w:rPr>
+          <w:lang w:val="en-US"/>
+        </w:rPr>
+        <w:t>= null</w:t>
       </w:r>
     </w:p>
     <w:p>
@@ -465,7 +575,21 @@
         <w:rPr>
           <w:lang w:val="en-US"/>
         </w:rPr>
-        <w:t xml:space="preserve">If temp’s data  == target </w:t>
+        <w:t xml:space="preserve">If temp’s </w:t>
+      </w:r>
+      <w:proofErr w:type="gramStart"/>
+      <w:r>
+        <w:rPr>
+          <w:lang w:val="en-US"/>
+        </w:rPr>
+        <w:t>data  =</w:t>
+      </w:r>
+      <w:proofErr w:type="gramEnd"/>
+      <w:r>
+        <w:rPr>
+          <w:lang w:val="en-US"/>
+        </w:rPr>
+        <w:t xml:space="preserve">= target </w:t>
       </w:r>
     </w:p>
     <w:p>
@@ -807,7 +931,21 @@
         <w:rPr>
           <w:lang w:val="en-US"/>
         </w:rPr>
-        <w:t xml:space="preserve">Base condition check the head is null or having the single element </w:t>
+        <w:t xml:space="preserve">Base condition </w:t>
+      </w:r>
+      <w:proofErr w:type="gramStart"/>
+      <w:r>
+        <w:rPr>
+          <w:lang w:val="en-US"/>
+        </w:rPr>
+        <w:t>check</w:t>
+      </w:r>
+      <w:proofErr w:type="gramEnd"/>
+      <w:r>
+        <w:rPr>
+          <w:lang w:val="en-US"/>
+        </w:rPr>
+        <w:t xml:space="preserve"> the head is null or having the single element </w:t>
       </w:r>
     </w:p>
     <w:p>
@@ -821,11 +959,19 @@
           <w:lang w:val="en-US"/>
         </w:rPr>
       </w:pPr>
-      <w:r>
-        <w:rPr>
-          <w:lang w:val="en-US"/>
-        </w:rPr>
-        <w:t>Retun null</w:t>
+      <w:proofErr w:type="spellStart"/>
+      <w:r>
+        <w:rPr>
+          <w:lang w:val="en-US"/>
+        </w:rPr>
+        <w:t>Retun</w:t>
+      </w:r>
+      <w:proofErr w:type="spellEnd"/>
+      <w:r>
+        <w:rPr>
+          <w:lang w:val="en-US"/>
+        </w:rPr>
+        <w:t xml:space="preserve"> null</w:t>
       </w:r>
     </w:p>
     <w:p>
@@ -945,7 +1091,35 @@
         <w:rPr>
           <w:lang w:val="en-US"/>
         </w:rPr>
-        <w:t>Head == null (0 ) || head.next == null (1)</w:t>
+        <w:t>Head == null (</w:t>
+      </w:r>
+      <w:proofErr w:type="gramStart"/>
+      <w:r>
+        <w:rPr>
+          <w:lang w:val="en-US"/>
+        </w:rPr>
+        <w:t>0 )</w:t>
+      </w:r>
+      <w:proofErr w:type="gramEnd"/>
+      <w:r>
+        <w:rPr>
+          <w:lang w:val="en-US"/>
+        </w:rPr>
+        <w:t xml:space="preserve"> || </w:t>
+      </w:r>
+      <w:proofErr w:type="spellStart"/>
+      <w:r>
+        <w:rPr>
+          <w:lang w:val="en-US"/>
+        </w:rPr>
+        <w:t>head.next</w:t>
+      </w:r>
+      <w:proofErr w:type="spellEnd"/>
+      <w:r>
+        <w:rPr>
+          <w:lang w:val="en-US"/>
+        </w:rPr>
+        <w:t xml:space="preserve"> == null (1)</w:t>
       </w:r>
     </w:p>
     <w:p>
@@ -981,7 +1155,21 @@
         <w:rPr>
           <w:lang w:val="en-US"/>
         </w:rPr>
-        <w:t>Go till the second last != null</w:t>
+        <w:t xml:space="preserve">Go till the second </w:t>
+      </w:r>
+      <w:proofErr w:type="gramStart"/>
+      <w:r>
+        <w:rPr>
+          <w:lang w:val="en-US"/>
+        </w:rPr>
+        <w:t>last !</w:t>
+      </w:r>
+      <w:proofErr w:type="gramEnd"/>
+      <w:r>
+        <w:rPr>
+          <w:lang w:val="en-US"/>
+        </w:rPr>
+        <w:t>= null</w:t>
       </w:r>
     </w:p>
     <w:p>
@@ -1054,8 +1242,16 @@
         <w:rPr>
           <w:lang w:val="en-US"/>
         </w:rPr>
-        <w:t>Check the for base condiion</w:t>
-      </w:r>
+        <w:t xml:space="preserve">Check the for base </w:t>
+      </w:r>
+      <w:proofErr w:type="spellStart"/>
+      <w:r>
+        <w:rPr>
+          <w:lang w:val="en-US"/>
+        </w:rPr>
+        <w:t>condiion</w:t>
+      </w:r>
+      <w:proofErr w:type="spellEnd"/>
     </w:p>
     <w:p>
       <w:pPr>
@@ -1114,7 +1310,21 @@
         <w:rPr>
           <w:lang w:val="en-US"/>
         </w:rPr>
-        <w:t>Assign prev = null</w:t>
+        <w:t xml:space="preserve">Assign </w:t>
+      </w:r>
+      <w:proofErr w:type="spellStart"/>
+      <w:r>
+        <w:rPr>
+          <w:lang w:val="en-US"/>
+        </w:rPr>
+        <w:t>prev</w:t>
+      </w:r>
+      <w:proofErr w:type="spellEnd"/>
+      <w:r>
+        <w:rPr>
+          <w:lang w:val="en-US"/>
+        </w:rPr>
+        <w:t xml:space="preserve"> = null</w:t>
       </w:r>
     </w:p>
     <w:p>
@@ -1150,13 +1360,27 @@
         <w:rPr>
           <w:lang w:val="en-US"/>
         </w:rPr>
-        <w:t xml:space="preserve">Go till </w:t>
-      </w:r>
-      <w:r>
-        <w:rPr>
-          <w:lang w:val="en-US"/>
-        </w:rPr>
-        <w:t xml:space="preserve"> the last element </w:t>
+        <w:t xml:space="preserve">Go </w:t>
+      </w:r>
+      <w:proofErr w:type="gramStart"/>
+      <w:r>
+        <w:rPr>
+          <w:lang w:val="en-US"/>
+        </w:rPr>
+        <w:t xml:space="preserve">till </w:t>
+      </w:r>
+      <w:r>
+        <w:rPr>
+          <w:lang w:val="en-US"/>
+        </w:rPr>
+        <w:t xml:space="preserve"> the</w:t>
+      </w:r>
+      <w:proofErr w:type="gramEnd"/>
+      <w:r>
+        <w:rPr>
+          <w:lang w:val="en-US"/>
+        </w:rPr>
+        <w:t xml:space="preserve"> last element </w:t>
       </w:r>
     </w:p>
     <w:p>
@@ -1210,8 +1434,30 @@
         <w:rPr>
           <w:lang w:val="en-US"/>
         </w:rPr>
-        <w:t>Prev next = prev next next</w:t>
-      </w:r>
+        <w:t xml:space="preserve">Prev next = </w:t>
+      </w:r>
+      <w:proofErr w:type="spellStart"/>
+      <w:r>
+        <w:rPr>
+          <w:lang w:val="en-US"/>
+        </w:rPr>
+        <w:t>prev</w:t>
+      </w:r>
+      <w:proofErr w:type="spellEnd"/>
+      <w:r>
+        <w:rPr>
+          <w:lang w:val="en-US"/>
+        </w:rPr>
+        <w:t xml:space="preserve"> next </w:t>
+      </w:r>
+      <w:proofErr w:type="spellStart"/>
+      <w:r>
+        <w:rPr>
+          <w:lang w:val="en-US"/>
+        </w:rPr>
+        <w:t>next</w:t>
+      </w:r>
+      <w:proofErr w:type="spellEnd"/>
     </w:p>
     <w:p>
       <w:pPr>
@@ -1228,7 +1474,21 @@
         <w:rPr>
           <w:lang w:val="en-US"/>
         </w:rPr>
-        <w:t>Else move to the prv = temp</w:t>
+        <w:t xml:space="preserve">Else move to the </w:t>
+      </w:r>
+      <w:proofErr w:type="spellStart"/>
+      <w:r>
+        <w:rPr>
+          <w:lang w:val="en-US"/>
+        </w:rPr>
+        <w:t>prv</w:t>
+      </w:r>
+      <w:proofErr w:type="spellEnd"/>
+      <w:r>
+        <w:rPr>
+          <w:lang w:val="en-US"/>
+        </w:rPr>
+        <w:t xml:space="preserve"> = temp</w:t>
       </w:r>
     </w:p>
     <w:p>
@@ -1303,12 +1563,28 @@
           <w:lang w:val="en-US"/>
         </w:rPr>
       </w:pPr>
-      <w:r>
-        <w:rPr>
-          <w:lang w:val="en-US"/>
-        </w:rPr>
-        <w:t>Head.data == el</w:t>
-      </w:r>
+      <w:proofErr w:type="spellStart"/>
+      <w:r>
+        <w:rPr>
+          <w:lang w:val="en-US"/>
+        </w:rPr>
+        <w:t>Head.data</w:t>
+      </w:r>
+      <w:proofErr w:type="spellEnd"/>
+      <w:r>
+        <w:rPr>
+          <w:lang w:val="en-US"/>
+        </w:rPr>
+        <w:t xml:space="preserve"> == </w:t>
+      </w:r>
+      <w:proofErr w:type="spellStart"/>
+      <w:r>
+        <w:rPr>
+          <w:lang w:val="en-US"/>
+        </w:rPr>
+        <w:t>el</w:t>
+      </w:r>
+      <w:proofErr w:type="spellEnd"/>
     </w:p>
     <w:p>
       <w:pPr>
@@ -1325,8 +1601,16 @@
         <w:rPr>
           <w:lang w:val="en-US"/>
         </w:rPr>
-        <w:t>Same as the head.data</w:t>
-      </w:r>
+        <w:t xml:space="preserve">Same as the </w:t>
+      </w:r>
+      <w:proofErr w:type="spellStart"/>
+      <w:r>
+        <w:rPr>
+          <w:lang w:val="en-US"/>
+        </w:rPr>
+        <w:t>head.data</w:t>
+      </w:r>
+      <w:proofErr w:type="spellEnd"/>
     </w:p>
     <w:p>
       <w:pPr>
@@ -1509,7 +1793,23 @@
         <w:rPr>
           <w:lang w:val="en-US"/>
         </w:rPr>
-        <w:t>Go till the last that is temp.next != null</w:t>
+        <w:t xml:space="preserve">Go till the last that is </w:t>
+      </w:r>
+      <w:proofErr w:type="spellStart"/>
+      <w:proofErr w:type="gramStart"/>
+      <w:r>
+        <w:rPr>
+          <w:lang w:val="en-US"/>
+        </w:rPr>
+        <w:t>temp.next</w:t>
+      </w:r>
+      <w:proofErr w:type="spellEnd"/>
+      <w:proofErr w:type="gramEnd"/>
+      <w:r>
+        <w:rPr>
+          <w:lang w:val="en-US"/>
+        </w:rPr>
+        <w:t xml:space="preserve"> != null</w:t>
       </w:r>
     </w:p>
     <w:p>
@@ -1527,7 +1827,21 @@
         <w:rPr>
           <w:lang w:val="en-US"/>
         </w:rPr>
-        <w:t>Create the node and it’s next points to the null</w:t>
+        <w:t xml:space="preserve">Create the node and </w:t>
+      </w:r>
+      <w:proofErr w:type="gramStart"/>
+      <w:r>
+        <w:rPr>
+          <w:lang w:val="en-US"/>
+        </w:rPr>
+        <w:t>it’s</w:t>
+      </w:r>
+      <w:proofErr w:type="gramEnd"/>
+      <w:r>
+        <w:rPr>
+          <w:lang w:val="en-US"/>
+        </w:rPr>
+        <w:t xml:space="preserve"> next points to the null</w:t>
       </w:r>
     </w:p>
     <w:p>
@@ -1541,12 +1855,30 @@
           <w:lang w:val="en-US"/>
         </w:rPr>
       </w:pPr>
-      <w:r>
-        <w:rPr>
-          <w:lang w:val="en-US"/>
-        </w:rPr>
-        <w:t>Temp;s next points to  the nn</w:t>
-      </w:r>
+      <w:proofErr w:type="spellStart"/>
+      <w:proofErr w:type="gramStart"/>
+      <w:r>
+        <w:rPr>
+          <w:lang w:val="en-US"/>
+        </w:rPr>
+        <w:t>Temp;s</w:t>
+      </w:r>
+      <w:proofErr w:type="spellEnd"/>
+      <w:proofErr w:type="gramEnd"/>
+      <w:r>
+        <w:rPr>
+          <w:lang w:val="en-US"/>
+        </w:rPr>
+        <w:t xml:space="preserve"> next points to  the </w:t>
+      </w:r>
+      <w:proofErr w:type="spellStart"/>
+      <w:r>
+        <w:rPr>
+          <w:lang w:val="en-US"/>
+        </w:rPr>
+        <w:t>nn</w:t>
+      </w:r>
+      <w:proofErr w:type="spellEnd"/>
     </w:p>
     <w:p>
       <w:pPr>
@@ -1616,7 +1948,21 @@
         <w:rPr>
           <w:lang w:val="en-US"/>
         </w:rPr>
-        <w:t>If the length is greater than 1  call the INSERT HEAD FUNCTION</w:t>
+        <w:t xml:space="preserve">If the length is greater than </w:t>
+      </w:r>
+      <w:proofErr w:type="gramStart"/>
+      <w:r>
+        <w:rPr>
+          <w:lang w:val="en-US"/>
+        </w:rPr>
+        <w:t>1  call</w:t>
+      </w:r>
+      <w:proofErr w:type="gramEnd"/>
+      <w:r>
+        <w:rPr>
+          <w:lang w:val="en-US"/>
+        </w:rPr>
+        <w:t xml:space="preserve"> the INSERT HEAD FUNCTION</w:t>
       </w:r>
     </w:p>
     <w:p>
@@ -1688,7 +2034,21 @@
         <w:rPr>
           <w:lang w:val="en-US"/>
         </w:rPr>
-        <w:t>Go till the last temp != null</w:t>
+        <w:t xml:space="preserve">Go till the last </w:t>
+      </w:r>
+      <w:proofErr w:type="gramStart"/>
+      <w:r>
+        <w:rPr>
+          <w:lang w:val="en-US"/>
+        </w:rPr>
+        <w:t>temp !</w:t>
+      </w:r>
+      <w:proofErr w:type="gramEnd"/>
+      <w:r>
+        <w:rPr>
+          <w:lang w:val="en-US"/>
+        </w:rPr>
+        <w:t>= null</w:t>
       </w:r>
     </w:p>
     <w:p>
@@ -1706,7 +2066,21 @@
         <w:rPr>
           <w:lang w:val="en-US"/>
         </w:rPr>
-        <w:t>Increase the count  by 1</w:t>
+        <w:t xml:space="preserve">Increase the </w:t>
+      </w:r>
+      <w:proofErr w:type="gramStart"/>
+      <w:r>
+        <w:rPr>
+          <w:lang w:val="en-US"/>
+        </w:rPr>
+        <w:t>count  by</w:t>
+      </w:r>
+      <w:proofErr w:type="gramEnd"/>
+      <w:r>
+        <w:rPr>
+          <w:lang w:val="en-US"/>
+        </w:rPr>
+        <w:t xml:space="preserve"> 1</w:t>
       </w:r>
     </w:p>
     <w:p>
@@ -1724,7 +2098,21 @@
         <w:rPr>
           <w:lang w:val="en-US"/>
         </w:rPr>
-        <w:t>If count == k-1 that Is befor the kth node</w:t>
+        <w:t xml:space="preserve">If count == k-1 that Is </w:t>
+      </w:r>
+      <w:proofErr w:type="spellStart"/>
+      <w:r>
+        <w:rPr>
+          <w:lang w:val="en-US"/>
+        </w:rPr>
+        <w:t>befor</w:t>
+      </w:r>
+      <w:proofErr w:type="spellEnd"/>
+      <w:r>
+        <w:rPr>
+          <w:lang w:val="en-US"/>
+        </w:rPr>
+        <w:t xml:space="preserve"> the kth node</w:t>
       </w:r>
     </w:p>
     <w:p>
@@ -1760,7 +2148,21 @@
         <w:rPr>
           <w:lang w:val="en-US"/>
         </w:rPr>
-        <w:t>Remember nn’s next points to the temp’s next</w:t>
+        <w:t xml:space="preserve">Remember </w:t>
+      </w:r>
+      <w:proofErr w:type="spellStart"/>
+      <w:r>
+        <w:rPr>
+          <w:lang w:val="en-US"/>
+        </w:rPr>
+        <w:t>nn’s</w:t>
+      </w:r>
+      <w:proofErr w:type="spellEnd"/>
+      <w:r>
+        <w:rPr>
+          <w:lang w:val="en-US"/>
+        </w:rPr>
+        <w:t xml:space="preserve"> next points to the temp’s next</w:t>
       </w:r>
     </w:p>
     <w:p>
@@ -1778,8 +2180,30 @@
         <w:rPr>
           <w:lang w:val="en-US"/>
         </w:rPr>
-        <w:t>Temp’s next points to  the nn</w:t>
-      </w:r>
+        <w:t xml:space="preserve">Temp’s next points </w:t>
+      </w:r>
+      <w:proofErr w:type="gramStart"/>
+      <w:r>
+        <w:rPr>
+          <w:lang w:val="en-US"/>
+        </w:rPr>
+        <w:t>to  the</w:t>
+      </w:r>
+      <w:proofErr w:type="gramEnd"/>
+      <w:r>
+        <w:rPr>
+          <w:lang w:val="en-US"/>
+        </w:rPr>
+        <w:t xml:space="preserve"> </w:t>
+      </w:r>
+      <w:proofErr w:type="spellStart"/>
+      <w:r>
+        <w:rPr>
+          <w:lang w:val="en-US"/>
+        </w:rPr>
+        <w:t>nn</w:t>
+      </w:r>
+      <w:proofErr w:type="spellEnd"/>
     </w:p>
     <w:p>
       <w:pPr>
@@ -1796,8 +2220,18 @@
         <w:rPr>
           <w:lang w:val="en-US"/>
         </w:rPr>
-        <w:t>Else temp = temp.next</w:t>
-      </w:r>
+        <w:t xml:space="preserve">Else temp = </w:t>
+      </w:r>
+      <w:proofErr w:type="spellStart"/>
+      <w:proofErr w:type="gramStart"/>
+      <w:r>
+        <w:rPr>
+          <w:lang w:val="en-US"/>
+        </w:rPr>
+        <w:t>temp.next</w:t>
+      </w:r>
+      <w:proofErr w:type="spellEnd"/>
+      <w:proofErr w:type="gramEnd"/>
     </w:p>
     <w:p>
       <w:pPr>
@@ -1831,7 +2265,29 @@
         <w:rPr>
           <w:lang w:val="en-US"/>
         </w:rPr>
-        <w:t>Base condition head is null not k ==1 becoz  value Is found for the null</w:t>
+        <w:t xml:space="preserve">Base condition head is null not k ==1 </w:t>
+      </w:r>
+      <w:proofErr w:type="spellStart"/>
+      <w:proofErr w:type="gramStart"/>
+      <w:r>
+        <w:rPr>
+          <w:lang w:val="en-US"/>
+        </w:rPr>
+        <w:t>becoz</w:t>
+      </w:r>
+      <w:proofErr w:type="spellEnd"/>
+      <w:r>
+        <w:rPr>
+          <w:lang w:val="en-US"/>
+        </w:rPr>
+        <w:t xml:space="preserve">  value</w:t>
+      </w:r>
+      <w:proofErr w:type="gramEnd"/>
+      <w:r>
+        <w:rPr>
+          <w:lang w:val="en-US"/>
+        </w:rPr>
+        <w:t xml:space="preserve"> Is found for the null</w:t>
       </w:r>
     </w:p>
     <w:p>
@@ -1849,7 +2305,21 @@
         <w:rPr>
           <w:lang w:val="en-US"/>
         </w:rPr>
-        <w:t>If value is in the head head’s data  = given data</w:t>
+        <w:t xml:space="preserve">If value is in the head head’s </w:t>
+      </w:r>
+      <w:proofErr w:type="gramStart"/>
+      <w:r>
+        <w:rPr>
+          <w:lang w:val="en-US"/>
+        </w:rPr>
+        <w:t>data  =</w:t>
+      </w:r>
+      <w:proofErr w:type="gramEnd"/>
+      <w:r>
+        <w:rPr>
+          <w:lang w:val="en-US"/>
+        </w:rPr>
+        <w:t xml:space="preserve"> given data</w:t>
       </w:r>
     </w:p>
     <w:p>
@@ -1885,7 +2355,21 @@
         <w:rPr>
           <w:lang w:val="en-US"/>
         </w:rPr>
-        <w:t>While temp’s next != null</w:t>
+        <w:t xml:space="preserve">While temp’s </w:t>
+      </w:r>
+      <w:proofErr w:type="gramStart"/>
+      <w:r>
+        <w:rPr>
+          <w:lang w:val="en-US"/>
+        </w:rPr>
+        <w:t>next !</w:t>
+      </w:r>
+      <w:proofErr w:type="gramEnd"/>
+      <w:r>
+        <w:rPr>
+          <w:lang w:val="en-US"/>
+        </w:rPr>
+        <w:t>= null</w:t>
       </w:r>
     </w:p>
     <w:p>
@@ -1903,8 +2387,16 @@
         <w:rPr>
           <w:lang w:val="en-US"/>
         </w:rPr>
-        <w:t>Inside the loop temp’s next data == val</w:t>
-      </w:r>
+        <w:t xml:space="preserve">Inside the loop temp’s next data == </w:t>
+      </w:r>
+      <w:proofErr w:type="spellStart"/>
+      <w:r>
+        <w:rPr>
+          <w:lang w:val="en-US"/>
+        </w:rPr>
+        <w:t>val</w:t>
+      </w:r>
+      <w:proofErr w:type="spellEnd"/>
     </w:p>
     <w:p>
       <w:pPr>
@@ -1939,8 +2431,16 @@
         <w:rPr>
           <w:lang w:val="en-US"/>
         </w:rPr>
-        <w:t>Temp’s next points to the nn</w:t>
-      </w:r>
+        <w:t xml:space="preserve">Temp’s next points to the </w:t>
+      </w:r>
+      <w:proofErr w:type="spellStart"/>
+      <w:r>
+        <w:rPr>
+          <w:lang w:val="en-US"/>
+        </w:rPr>
+        <w:t>nn</w:t>
+      </w:r>
+      <w:proofErr w:type="spellEnd"/>
     </w:p>
     <w:p>
       <w:pPr>
@@ -1957,8 +2457,18 @@
         <w:rPr>
           <w:lang w:val="en-US"/>
         </w:rPr>
-        <w:t>Else the temp = temp.next</w:t>
-      </w:r>
+        <w:t xml:space="preserve">Else the temp = </w:t>
+      </w:r>
+      <w:proofErr w:type="spellStart"/>
+      <w:proofErr w:type="gramStart"/>
+      <w:r>
+        <w:rPr>
+          <w:lang w:val="en-US"/>
+        </w:rPr>
+        <w:t>temp.next</w:t>
+      </w:r>
+      <w:proofErr w:type="spellEnd"/>
+      <w:proofErr w:type="gramEnd"/>
     </w:p>
     <w:p>
       <w:pPr>
@@ -2115,6 +2625,7 @@
           <w:lang w:val="en-US"/>
         </w:rPr>
       </w:pPr>
+      <w:proofErr w:type="gramStart"/>
       <w:r>
         <w:rPr>
           <w:b/>
@@ -2129,7 +2640,16 @@
           <w:bCs/>
           <w:lang w:val="en-US"/>
         </w:rPr>
-        <w:t>OF DLL</w:t>
+        <w:t>OF</w:t>
+      </w:r>
+      <w:proofErr w:type="gramEnd"/>
+      <w:r>
+        <w:rPr>
+          <w:b/>
+          <w:bCs/>
+          <w:lang w:val="en-US"/>
+        </w:rPr>
+        <w:t xml:space="preserve"> DLL</w:t>
       </w:r>
     </w:p>
     <w:p>
@@ -2253,7 +2773,21 @@
         <w:rPr>
           <w:lang w:val="en-US"/>
         </w:rPr>
-        <w:t>Remember the head using prev variable</w:t>
+        <w:t xml:space="preserve">Remember the head using </w:t>
+      </w:r>
+      <w:proofErr w:type="spellStart"/>
+      <w:r>
+        <w:rPr>
+          <w:lang w:val="en-US"/>
+        </w:rPr>
+        <w:t>prev</w:t>
+      </w:r>
+      <w:proofErr w:type="spellEnd"/>
+      <w:r>
+        <w:rPr>
+          <w:lang w:val="en-US"/>
+        </w:rPr>
+        <w:t xml:space="preserve"> variable</w:t>
       </w:r>
     </w:p>
     <w:p>
@@ -2273,8 +2807,18 @@
         <w:rPr>
           <w:lang w:val="en-US"/>
         </w:rPr>
-        <w:t>Loop till arr.length</w:t>
-      </w:r>
+        <w:t xml:space="preserve">Loop till </w:t>
+      </w:r>
+      <w:proofErr w:type="spellStart"/>
+      <w:proofErr w:type="gramStart"/>
+      <w:r>
+        <w:rPr>
+          <w:lang w:val="en-US"/>
+        </w:rPr>
+        <w:t>arr.length</w:t>
+      </w:r>
+      <w:proofErr w:type="spellEnd"/>
+      <w:proofErr w:type="gramEnd"/>
     </w:p>
     <w:p>
       <w:pPr>
@@ -2333,8 +2877,30 @@
         <w:rPr>
           <w:lang w:val="en-US"/>
         </w:rPr>
-        <w:t>Point the temp’back to the prev</w:t>
-      </w:r>
+        <w:t xml:space="preserve">Point the </w:t>
+      </w:r>
+      <w:proofErr w:type="spellStart"/>
+      <w:r>
+        <w:rPr>
+          <w:lang w:val="en-US"/>
+        </w:rPr>
+        <w:t>temp’back</w:t>
+      </w:r>
+      <w:proofErr w:type="spellEnd"/>
+      <w:r>
+        <w:rPr>
+          <w:lang w:val="en-US"/>
+        </w:rPr>
+        <w:t xml:space="preserve"> to the </w:t>
+      </w:r>
+      <w:proofErr w:type="spellStart"/>
+      <w:r>
+        <w:rPr>
+          <w:lang w:val="en-US"/>
+        </w:rPr>
+        <w:t>prev</w:t>
+      </w:r>
+      <w:proofErr w:type="spellEnd"/>
     </w:p>
     <w:p>
       <w:pPr>
@@ -2349,11 +2915,21 @@
           <w:lang w:val="en-US"/>
         </w:rPr>
       </w:pPr>
-      <w:r>
-        <w:rPr>
-          <w:lang w:val="en-US"/>
-        </w:rPr>
-        <w:t>Prev,s next points to the temp</w:t>
+      <w:proofErr w:type="spellStart"/>
+      <w:proofErr w:type="gramStart"/>
+      <w:r>
+        <w:rPr>
+          <w:lang w:val="en-US"/>
+        </w:rPr>
+        <w:t>Prev,s</w:t>
+      </w:r>
+      <w:proofErr w:type="spellEnd"/>
+      <w:proofErr w:type="gramEnd"/>
+      <w:r>
+        <w:rPr>
+          <w:lang w:val="en-US"/>
+        </w:rPr>
+        <w:t xml:space="preserve"> next points to the temp</w:t>
       </w:r>
     </w:p>
     <w:p>
@@ -2427,7 +3003,21 @@
         <w:rPr>
           <w:lang w:val="en-US"/>
         </w:rPr>
-        <w:t xml:space="preserve">Base codition </w:t>
+        <w:t xml:space="preserve">Base </w:t>
+      </w:r>
+      <w:proofErr w:type="spellStart"/>
+      <w:r>
+        <w:rPr>
+          <w:lang w:val="en-US"/>
+        </w:rPr>
+        <w:t>codition</w:t>
+      </w:r>
+      <w:proofErr w:type="spellEnd"/>
+      <w:r>
+        <w:rPr>
+          <w:lang w:val="en-US"/>
+        </w:rPr>
+        <w:t xml:space="preserve"> </w:t>
       </w:r>
     </w:p>
     <w:p>
@@ -2481,7 +3071,21 @@
         <w:rPr>
           <w:lang w:val="en-US"/>
         </w:rPr>
-        <w:t>Remember the head use the prev variable</w:t>
+        <w:t xml:space="preserve">Remember the head use the </w:t>
+      </w:r>
+      <w:proofErr w:type="spellStart"/>
+      <w:r>
+        <w:rPr>
+          <w:lang w:val="en-US"/>
+        </w:rPr>
+        <w:t>prev</w:t>
+      </w:r>
+      <w:proofErr w:type="spellEnd"/>
+      <w:r>
+        <w:rPr>
+          <w:lang w:val="en-US"/>
+        </w:rPr>
+        <w:t xml:space="preserve"> variable</w:t>
       </w:r>
     </w:p>
     <w:p>
@@ -2517,7 +3121,21 @@
         <w:rPr>
           <w:lang w:val="en-US"/>
         </w:rPr>
-        <w:t>Point the prev’s next to the new head</w:t>
+        <w:t xml:space="preserve">Point the </w:t>
+      </w:r>
+      <w:proofErr w:type="spellStart"/>
+      <w:r>
+        <w:rPr>
+          <w:lang w:val="en-US"/>
+        </w:rPr>
+        <w:t>prev’s</w:t>
+      </w:r>
+      <w:proofErr w:type="spellEnd"/>
+      <w:r>
+        <w:rPr>
+          <w:lang w:val="en-US"/>
+        </w:rPr>
+        <w:t xml:space="preserve"> next to the new head</w:t>
       </w:r>
     </w:p>
     <w:p>
@@ -2535,8 +3153,16 @@
         <w:rPr>
           <w:lang w:val="en-US"/>
         </w:rPr>
-        <w:t>Head’s back points to the prev</w:t>
-      </w:r>
+        <w:t xml:space="preserve">Head’s back points to the </w:t>
+      </w:r>
+      <w:proofErr w:type="spellStart"/>
+      <w:r>
+        <w:rPr>
+          <w:lang w:val="en-US"/>
+        </w:rPr>
+        <w:t>prev</w:t>
+      </w:r>
+      <w:proofErr w:type="spellEnd"/>
     </w:p>
     <w:p>
       <w:pPr>
@@ -2650,7 +3276,23 @@
         <w:rPr>
           <w:lang w:val="en-US"/>
         </w:rPr>
-        <w:t>Head’s next == null (i,e) last element or single element</w:t>
+        <w:t>Head’s next == null (</w:t>
+      </w:r>
+      <w:proofErr w:type="spellStart"/>
+      <w:proofErr w:type="gramStart"/>
+      <w:r>
+        <w:rPr>
+          <w:lang w:val="en-US"/>
+        </w:rPr>
+        <w:t>i,e</w:t>
+      </w:r>
+      <w:proofErr w:type="spellEnd"/>
+      <w:proofErr w:type="gramEnd"/>
+      <w:r>
+        <w:rPr>
+          <w:lang w:val="en-US"/>
+        </w:rPr>
+        <w:t>) last element or single element</w:t>
       </w:r>
     </w:p>
     <w:p>
@@ -2686,7 +3328,21 @@
         <w:rPr>
           <w:lang w:val="en-US"/>
         </w:rPr>
-        <w:t>Remember the head using prev variable</w:t>
+        <w:t xml:space="preserve">Remember the head using </w:t>
+      </w:r>
+      <w:proofErr w:type="spellStart"/>
+      <w:r>
+        <w:rPr>
+          <w:lang w:val="en-US"/>
+        </w:rPr>
+        <w:t>prev</w:t>
+      </w:r>
+      <w:proofErr w:type="spellEnd"/>
+      <w:r>
+        <w:rPr>
+          <w:lang w:val="en-US"/>
+        </w:rPr>
+        <w:t xml:space="preserve"> variable</w:t>
       </w:r>
     </w:p>
     <w:p>
@@ -2758,8 +3414,16 @@
         <w:rPr>
           <w:lang w:val="en-US"/>
         </w:rPr>
-        <w:t>Prev’s next points to the  null</w:t>
-      </w:r>
+        <w:t xml:space="preserve">Prev’s next points to </w:t>
+      </w:r>
+      <w:proofErr w:type="gramStart"/>
+      <w:r>
+        <w:rPr>
+          <w:lang w:val="en-US"/>
+        </w:rPr>
+        <w:t>the  null</w:t>
+      </w:r>
+      <w:proofErr w:type="gramEnd"/>
     </w:p>
     <w:p>
       <w:pPr>
@@ -3027,7 +3691,21 @@
         <w:rPr>
           <w:lang w:val="en-US"/>
         </w:rPr>
-        <w:t xml:space="preserve">Front’s back points to the prev </w:t>
+        <w:t xml:space="preserve">Front’s back points to the </w:t>
+      </w:r>
+      <w:proofErr w:type="spellStart"/>
+      <w:r>
+        <w:rPr>
+          <w:lang w:val="en-US"/>
+        </w:rPr>
+        <w:t>prev</w:t>
+      </w:r>
+      <w:proofErr w:type="spellEnd"/>
+      <w:r>
+        <w:rPr>
+          <w:lang w:val="en-US"/>
+        </w:rPr>
+        <w:t xml:space="preserve"> </w:t>
       </w:r>
     </w:p>
     <w:p>
@@ -3063,7 +3741,21 @@
         <w:rPr>
           <w:lang w:val="en-US"/>
         </w:rPr>
-        <w:t>Temp’s back  = null</w:t>
+        <w:t xml:space="preserve">Temp’s </w:t>
+      </w:r>
+      <w:proofErr w:type="gramStart"/>
+      <w:r>
+        <w:rPr>
+          <w:lang w:val="en-US"/>
+        </w:rPr>
+        <w:t>back  =</w:t>
+      </w:r>
+      <w:proofErr w:type="gramEnd"/>
+      <w:r>
+        <w:rPr>
+          <w:lang w:val="en-US"/>
+        </w:rPr>
+        <w:t xml:space="preserve"> null</w:t>
       </w:r>
     </w:p>
     <w:p>
@@ -3117,7 +3809,63 @@
         <w:rPr>
           <w:lang w:val="en-US"/>
         </w:rPr>
-        <w:t>If k  is tail node (i,e) Dll have the prev and  front element</w:t>
+        <w:t xml:space="preserve">If </w:t>
+      </w:r>
+      <w:proofErr w:type="gramStart"/>
+      <w:r>
+        <w:rPr>
+          <w:lang w:val="en-US"/>
+        </w:rPr>
+        <w:t>k  is</w:t>
+      </w:r>
+      <w:proofErr w:type="gramEnd"/>
+      <w:r>
+        <w:rPr>
+          <w:lang w:val="en-US"/>
+        </w:rPr>
+        <w:t xml:space="preserve"> tail node (</w:t>
+      </w:r>
+      <w:proofErr w:type="spellStart"/>
+      <w:r>
+        <w:rPr>
+          <w:lang w:val="en-US"/>
+        </w:rPr>
+        <w:t>i,e</w:t>
+      </w:r>
+      <w:proofErr w:type="spellEnd"/>
+      <w:r>
+        <w:rPr>
+          <w:lang w:val="en-US"/>
+        </w:rPr>
+        <w:t xml:space="preserve">) </w:t>
+      </w:r>
+      <w:proofErr w:type="spellStart"/>
+      <w:r>
+        <w:rPr>
+          <w:lang w:val="en-US"/>
+        </w:rPr>
+        <w:t>Dll</w:t>
+      </w:r>
+      <w:proofErr w:type="spellEnd"/>
+      <w:r>
+        <w:rPr>
+          <w:lang w:val="en-US"/>
+        </w:rPr>
+        <w:t xml:space="preserve"> have the </w:t>
+      </w:r>
+      <w:proofErr w:type="spellStart"/>
+      <w:r>
+        <w:rPr>
+          <w:lang w:val="en-US"/>
+        </w:rPr>
+        <w:t>prev</w:t>
+      </w:r>
+      <w:proofErr w:type="spellEnd"/>
+      <w:r>
+        <w:rPr>
+          <w:lang w:val="en-US"/>
+        </w:rPr>
+        <w:t xml:space="preserve"> and  front element</w:t>
       </w:r>
     </w:p>
     <w:p>
@@ -3153,7 +3901,14 @@
         <w:rPr>
           <w:lang w:val="en-US"/>
         </w:rPr>
-        <w:t xml:space="preserve">Front points to the temp’s </w:t>
+        <w:t xml:space="preserve">Front points to the </w:t>
+      </w:r>
+      <w:proofErr w:type="gramStart"/>
+      <w:r>
+        <w:rPr>
+          <w:lang w:val="en-US"/>
+        </w:rPr>
+        <w:t xml:space="preserve">temp’s </w:t>
       </w:r>
       <w:r>
         <w:rPr>
@@ -3161,6 +3916,7 @@
         </w:rPr>
         <w:t xml:space="preserve"> next</w:t>
       </w:r>
+      <w:proofErr w:type="gramEnd"/>
     </w:p>
     <w:p>
       <w:pPr>
@@ -3344,7 +4100,21 @@
         <w:rPr>
           <w:lang w:val="en-US"/>
         </w:rPr>
-        <w:t>Create the new node called temp  with the value</w:t>
+        <w:t xml:space="preserve">Create the new node called </w:t>
+      </w:r>
+      <w:proofErr w:type="gramStart"/>
+      <w:r>
+        <w:rPr>
+          <w:lang w:val="en-US"/>
+        </w:rPr>
+        <w:t>temp  with</w:t>
+      </w:r>
+      <w:proofErr w:type="gramEnd"/>
+      <w:r>
+        <w:rPr>
+          <w:lang w:val="en-US"/>
+        </w:rPr>
+        <w:t xml:space="preserve"> the value</w:t>
       </w:r>
     </w:p>
     <w:p>
@@ -3499,7 +4269,21 @@
         <w:rPr>
           <w:lang w:val="en-US"/>
         </w:rPr>
-        <w:t>Create the new node  and points next and back to null</w:t>
+        <w:t xml:space="preserve">Create the new </w:t>
+      </w:r>
+      <w:proofErr w:type="gramStart"/>
+      <w:r>
+        <w:rPr>
+          <w:lang w:val="en-US"/>
+        </w:rPr>
+        <w:t>node  and</w:t>
+      </w:r>
+      <w:proofErr w:type="gramEnd"/>
+      <w:r>
+        <w:rPr>
+          <w:lang w:val="en-US"/>
+        </w:rPr>
+        <w:t xml:space="preserve"> points next and back to null</w:t>
       </w:r>
     </w:p>
     <w:p>
@@ -3549,11 +4333,19 @@
           <w:lang w:val="en-US"/>
         </w:rPr>
       </w:pPr>
-      <w:r>
-        <w:rPr>
-          <w:lang w:val="en-US"/>
-        </w:rPr>
-        <w:t>Nn’s next points to the null</w:t>
+      <w:proofErr w:type="spellStart"/>
+      <w:r>
+        <w:rPr>
+          <w:lang w:val="en-US"/>
+        </w:rPr>
+        <w:t>Nn’s</w:t>
+      </w:r>
+      <w:proofErr w:type="spellEnd"/>
+      <w:r>
+        <w:rPr>
+          <w:lang w:val="en-US"/>
+        </w:rPr>
+        <w:t xml:space="preserve"> next points to the null</w:t>
       </w:r>
     </w:p>
     <w:p>
@@ -3571,8 +4363,16 @@
         <w:rPr>
           <w:lang w:val="en-US"/>
         </w:rPr>
-        <w:t>Head’s next points to the nn</w:t>
-      </w:r>
+        <w:t xml:space="preserve">Head’s next points to the </w:t>
+      </w:r>
+      <w:proofErr w:type="spellStart"/>
+      <w:r>
+        <w:rPr>
+          <w:lang w:val="en-US"/>
+        </w:rPr>
+        <w:t>nn</w:t>
+      </w:r>
+      <w:proofErr w:type="spellEnd"/>
     </w:p>
     <w:p>
       <w:pPr>
@@ -3585,11 +4385,19 @@
           <w:lang w:val="en-US"/>
         </w:rPr>
       </w:pPr>
-      <w:r>
-        <w:rPr>
-          <w:lang w:val="en-US"/>
-        </w:rPr>
-        <w:t>Nn’s back points to the head</w:t>
+      <w:proofErr w:type="spellStart"/>
+      <w:r>
+        <w:rPr>
+          <w:lang w:val="en-US"/>
+        </w:rPr>
+        <w:t>Nn’s</w:t>
+      </w:r>
+      <w:proofErr w:type="spellEnd"/>
+      <w:r>
+        <w:rPr>
+          <w:lang w:val="en-US"/>
+        </w:rPr>
+        <w:t xml:space="preserve"> back points to the head</w:t>
       </w:r>
     </w:p>
     <w:p>
@@ -3624,7 +4432,21 @@
         <w:rPr>
           <w:lang w:val="en-US"/>
         </w:rPr>
-        <w:t>Base condition head == null k ==1  : length =  0</w:t>
+        <w:t>Base condition head == null k ==</w:t>
+      </w:r>
+      <w:proofErr w:type="gramStart"/>
+      <w:r>
+        <w:rPr>
+          <w:lang w:val="en-US"/>
+        </w:rPr>
+        <w:t>1  :</w:t>
+      </w:r>
+      <w:proofErr w:type="gramEnd"/>
+      <w:r>
+        <w:rPr>
+          <w:lang w:val="en-US"/>
+        </w:rPr>
+        <w:t xml:space="preserve"> length =  0</w:t>
       </w:r>
     </w:p>
     <w:p>
@@ -3660,7 +4482,21 @@
         <w:rPr>
           <w:lang w:val="en-US"/>
         </w:rPr>
-        <w:t>k == 1 : length = n</w:t>
+        <w:t xml:space="preserve">k == </w:t>
+      </w:r>
+      <w:proofErr w:type="gramStart"/>
+      <w:r>
+        <w:rPr>
+          <w:lang w:val="en-US"/>
+        </w:rPr>
+        <w:t>1 :</w:t>
+      </w:r>
+      <w:proofErr w:type="gramEnd"/>
+      <w:r>
+        <w:rPr>
+          <w:lang w:val="en-US"/>
+        </w:rPr>
+        <w:t xml:space="preserve"> length = n</w:t>
       </w:r>
     </w:p>
     <w:p>
@@ -3768,7 +4604,21 @@
         <w:rPr>
           <w:lang w:val="en-US"/>
         </w:rPr>
-        <w:t>initialize prev front count = 0</w:t>
+        <w:t xml:space="preserve">initialize </w:t>
+      </w:r>
+      <w:proofErr w:type="spellStart"/>
+      <w:r>
+        <w:rPr>
+          <w:lang w:val="en-US"/>
+        </w:rPr>
+        <w:t>prev</w:t>
+      </w:r>
+      <w:proofErr w:type="spellEnd"/>
+      <w:r>
+        <w:rPr>
+          <w:lang w:val="en-US"/>
+        </w:rPr>
+        <w:t xml:space="preserve"> front count = 0</w:t>
       </w:r>
     </w:p>
     <w:p>
@@ -3840,7 +4690,21 @@
         <w:rPr>
           <w:lang w:val="en-US"/>
         </w:rPr>
-        <w:t>Point the prev to the temp’s back</w:t>
+        <w:t xml:space="preserve">Point the </w:t>
+      </w:r>
+      <w:proofErr w:type="spellStart"/>
+      <w:r>
+        <w:rPr>
+          <w:lang w:val="en-US"/>
+        </w:rPr>
+        <w:t>prev</w:t>
+      </w:r>
+      <w:proofErr w:type="spellEnd"/>
+      <w:r>
+        <w:rPr>
+          <w:lang w:val="en-US"/>
+        </w:rPr>
+        <w:t xml:space="preserve"> to the temp’s back</w:t>
       </w:r>
     </w:p>
     <w:p>
@@ -3890,11 +4754,19 @@
           <w:lang w:val="en-US"/>
         </w:rPr>
       </w:pPr>
-      <w:r>
-        <w:rPr>
-          <w:lang w:val="en-US"/>
-        </w:rPr>
-        <w:t>Nn’s next points to the front</w:t>
+      <w:proofErr w:type="spellStart"/>
+      <w:r>
+        <w:rPr>
+          <w:lang w:val="en-US"/>
+        </w:rPr>
+        <w:t>Nn’s</w:t>
+      </w:r>
+      <w:proofErr w:type="spellEnd"/>
+      <w:r>
+        <w:rPr>
+          <w:lang w:val="en-US"/>
+        </w:rPr>
+        <w:t xml:space="preserve"> next points to the front</w:t>
       </w:r>
     </w:p>
     <w:p>
@@ -3912,8 +4784,16 @@
         <w:rPr>
           <w:lang w:val="en-US"/>
         </w:rPr>
-        <w:t>Front’s back points to the nn</w:t>
-      </w:r>
+        <w:t xml:space="preserve">Front’s back points to the </w:t>
+      </w:r>
+      <w:proofErr w:type="spellStart"/>
+      <w:r>
+        <w:rPr>
+          <w:lang w:val="en-US"/>
+        </w:rPr>
+        <w:t>nn</w:t>
+      </w:r>
+      <w:proofErr w:type="spellEnd"/>
     </w:p>
     <w:p>
       <w:pPr>
@@ -3930,8 +4810,16 @@
         <w:rPr>
           <w:lang w:val="en-US"/>
         </w:rPr>
-        <w:t>Prev’s next points to the nn</w:t>
-      </w:r>
+        <w:t xml:space="preserve">Prev’s next points to the </w:t>
+      </w:r>
+      <w:proofErr w:type="spellStart"/>
+      <w:r>
+        <w:rPr>
+          <w:lang w:val="en-US"/>
+        </w:rPr>
+        <w:t>nn</w:t>
+      </w:r>
+      <w:proofErr w:type="spellEnd"/>
     </w:p>
     <w:p>
       <w:pPr>
@@ -3944,12 +4832,28 @@
           <w:lang w:val="en-US"/>
         </w:rPr>
       </w:pPr>
-      <w:r>
-        <w:rPr>
-          <w:lang w:val="en-US"/>
-        </w:rPr>
-        <w:t>Nn’s back points to the prev</w:t>
-      </w:r>
+      <w:proofErr w:type="spellStart"/>
+      <w:r>
+        <w:rPr>
+          <w:lang w:val="en-US"/>
+        </w:rPr>
+        <w:t>Nn’s</w:t>
+      </w:r>
+      <w:proofErr w:type="spellEnd"/>
+      <w:r>
+        <w:rPr>
+          <w:lang w:val="en-US"/>
+        </w:rPr>
+        <w:t xml:space="preserve"> back points to the </w:t>
+      </w:r>
+      <w:proofErr w:type="spellStart"/>
+      <w:r>
+        <w:rPr>
+          <w:lang w:val="en-US"/>
+        </w:rPr>
+        <w:t>prev</w:t>
+      </w:r>
+      <w:proofErr w:type="spellEnd"/>
     </w:p>
     <w:p>
       <w:pPr>
@@ -4003,11 +4907,33 @@
         </w:rPr>
         <w:t xml:space="preserve">Same as the kth position one difference is </w:t>
       </w:r>
-      <w:r>
-        <w:rPr>
-          <w:lang w:val="en-US"/>
-        </w:rPr>
-        <w:t>temp.data  == given data</w:t>
+      <w:proofErr w:type="spellStart"/>
+      <w:r>
+        <w:rPr>
+          <w:lang w:val="en-US"/>
+        </w:rPr>
+        <w:t>temp.</w:t>
+      </w:r>
+      <w:proofErr w:type="gramStart"/>
+      <w:r>
+        <w:rPr>
+          <w:lang w:val="en-US"/>
+        </w:rPr>
+        <w:t>data</w:t>
+      </w:r>
+      <w:proofErr w:type="spellEnd"/>
+      <w:r>
+        <w:rPr>
+          <w:lang w:val="en-US"/>
+        </w:rPr>
+        <w:t xml:space="preserve">  =</w:t>
+      </w:r>
+      <w:proofErr w:type="gramEnd"/>
+      <w:r>
+        <w:rPr>
+          <w:lang w:val="en-US"/>
+        </w:rPr>
+        <w:t>= given data</w:t>
       </w:r>
     </w:p>
     <w:p>
@@ -4061,7 +4987,15 @@
           <w:lang w:val="en-US"/>
         </w:rPr>
         <w:lastRenderedPageBreak/>
-        <w:t>LECTURE 5</w:t>
+        <w:t xml:space="preserve">LECTURE </w:t>
+      </w:r>
+      <w:r>
+        <w:rPr>
+          <w:b/>
+          <w:bCs/>
+          <w:lang w:val="en-US"/>
+        </w:rPr>
+        <w:t>4</w:t>
       </w:r>
     </w:p>
     <w:p>
@@ -4108,7 +5042,25 @@
           <w:bCs/>
           <w:lang w:val="en-US"/>
         </w:rPr>
-        <w:t>//REVERSE THE DLL -  BRUTE FORCE</w:t>
+        <w:t xml:space="preserve">//REVERSE THE DLL </w:t>
+      </w:r>
+      <w:proofErr w:type="gramStart"/>
+      <w:r>
+        <w:rPr>
+          <w:b/>
+          <w:bCs/>
+          <w:lang w:val="en-US"/>
+        </w:rPr>
+        <w:t>-  BRUTE</w:t>
+      </w:r>
+      <w:proofErr w:type="gramEnd"/>
+      <w:r>
+        <w:rPr>
+          <w:b/>
+          <w:bCs/>
+          <w:lang w:val="en-US"/>
+        </w:rPr>
+        <w:t xml:space="preserve"> FORCE</w:t>
       </w:r>
     </w:p>
     <w:p>
@@ -4252,7 +5204,35 @@
         <w:rPr>
           <w:lang w:val="en-US"/>
         </w:rPr>
-        <w:t>Store the temp data  = stack.peek (first element in the stack)</w:t>
+        <w:t xml:space="preserve">Store the temp </w:t>
+      </w:r>
+      <w:proofErr w:type="gramStart"/>
+      <w:r>
+        <w:rPr>
+          <w:lang w:val="en-US"/>
+        </w:rPr>
+        <w:t>data  =</w:t>
+      </w:r>
+      <w:proofErr w:type="gramEnd"/>
+      <w:r>
+        <w:rPr>
+          <w:lang w:val="en-US"/>
+        </w:rPr>
+        <w:t xml:space="preserve"> </w:t>
+      </w:r>
+      <w:proofErr w:type="spellStart"/>
+      <w:r>
+        <w:rPr>
+          <w:lang w:val="en-US"/>
+        </w:rPr>
+        <w:t>stack.peek</w:t>
+      </w:r>
+      <w:proofErr w:type="spellEnd"/>
+      <w:r>
+        <w:rPr>
+          <w:lang w:val="en-US"/>
+        </w:rPr>
+        <w:t xml:space="preserve"> (first element in the stack)</w:t>
       </w:r>
     </w:p>
     <w:p>
@@ -4377,7 +5357,21 @@
         <w:rPr>
           <w:lang w:val="en-US"/>
         </w:rPr>
-        <w:t>Remember the last that is current back befor swapping</w:t>
+        <w:t xml:space="preserve">Remember the last that is current back </w:t>
+      </w:r>
+      <w:proofErr w:type="spellStart"/>
+      <w:r>
+        <w:rPr>
+          <w:lang w:val="en-US"/>
+        </w:rPr>
+        <w:t>befor</w:t>
+      </w:r>
+      <w:proofErr w:type="spellEnd"/>
+      <w:r>
+        <w:rPr>
+          <w:lang w:val="en-US"/>
+        </w:rPr>
+        <w:t xml:space="preserve"> swapping</w:t>
       </w:r>
     </w:p>
     <w:p>
@@ -4427,11 +5421,19 @@
           <w:lang w:val="en-US"/>
         </w:rPr>
       </w:pPr>
-      <w:r>
-        <w:rPr>
-          <w:lang w:val="en-US"/>
-        </w:rPr>
-        <w:t>Current  moves to the current back (After swapping)</w:t>
+      <w:proofErr w:type="gramStart"/>
+      <w:r>
+        <w:rPr>
+          <w:lang w:val="en-US"/>
+        </w:rPr>
+        <w:t>Current  moves</w:t>
+      </w:r>
+      <w:proofErr w:type="gramEnd"/>
+      <w:r>
+        <w:rPr>
+          <w:lang w:val="en-US"/>
+        </w:rPr>
+        <w:t xml:space="preserve"> to the current back (After swapping)</w:t>
       </w:r>
     </w:p>
     <w:p>
@@ -4449,24 +5451,46 @@
         <w:rPr>
           <w:lang w:val="en-US"/>
         </w:rPr>
-        <w:t>Return the last bach as new head</w:t>
-      </w:r>
-    </w:p>
-    <w:p>
-      <w:pPr>
-        <w:rPr>
-          <w:b/>
-          <w:bCs/>
-          <w:lang w:val="en-US"/>
-        </w:rPr>
-      </w:pPr>
-      <w:r>
-        <w:rPr>
-          <w:b/>
-          <w:bCs/>
-          <w:lang w:val="en-US"/>
-        </w:rPr>
-        <w:t>LECTURE 6</w:t>
+        <w:t xml:space="preserve">Return the last </w:t>
+      </w:r>
+      <w:proofErr w:type="spellStart"/>
+      <w:r>
+        <w:rPr>
+          <w:lang w:val="en-US"/>
+        </w:rPr>
+        <w:t>bach</w:t>
+      </w:r>
+      <w:proofErr w:type="spellEnd"/>
+      <w:r>
+        <w:rPr>
+          <w:lang w:val="en-US"/>
+        </w:rPr>
+        <w:t xml:space="preserve"> as new head</w:t>
+      </w:r>
+    </w:p>
+    <w:p>
+      <w:pPr>
+        <w:rPr>
+          <w:b/>
+          <w:bCs/>
+          <w:lang w:val="en-US"/>
+        </w:rPr>
+      </w:pPr>
+      <w:r>
+        <w:rPr>
+          <w:b/>
+          <w:bCs/>
+          <w:lang w:val="en-US"/>
+        </w:rPr>
+        <w:t xml:space="preserve">LECTURE </w:t>
+      </w:r>
+      <w:r>
+        <w:rPr>
+          <w:b/>
+          <w:bCs/>
+          <w:lang w:val="en-US"/>
+        </w:rPr>
+        <w:t>5</w:t>
       </w:r>
     </w:p>
     <w:p>
@@ -4747,11 +5771,33 @@
           <w:lang w:val="en-US"/>
         </w:rPr>
       </w:pPr>
-      <w:r>
-        <w:rPr>
-          <w:lang w:val="en-US"/>
-        </w:rPr>
-        <w:t>Out side while loop add the carry if have the value create the nn and put the value</w:t>
+      <w:proofErr w:type="spellStart"/>
+      <w:r>
+        <w:rPr>
+          <w:lang w:val="en-US"/>
+        </w:rPr>
+        <w:t>Out side</w:t>
+      </w:r>
+      <w:proofErr w:type="spellEnd"/>
+      <w:r>
+        <w:rPr>
+          <w:lang w:val="en-US"/>
+        </w:rPr>
+        <w:t xml:space="preserve"> while loop add the carry if have the value create the </w:t>
+      </w:r>
+      <w:proofErr w:type="spellStart"/>
+      <w:r>
+        <w:rPr>
+          <w:lang w:val="en-US"/>
+        </w:rPr>
+        <w:t>nn</w:t>
+      </w:r>
+      <w:proofErr w:type="spellEnd"/>
+      <w:r>
+        <w:rPr>
+          <w:lang w:val="en-US"/>
+        </w:rPr>
+        <w:t xml:space="preserve"> and put the value</w:t>
       </w:r>
     </w:p>
     <w:p>
@@ -4770,8 +5816,16 @@
         <w:rPr>
           <w:lang w:val="en-US"/>
         </w:rPr>
-        <w:t>Point the current next to the nn</w:t>
-      </w:r>
+        <w:t xml:space="preserve">Point the current next to the </w:t>
+      </w:r>
+      <w:proofErr w:type="spellStart"/>
+      <w:r>
+        <w:rPr>
+          <w:lang w:val="en-US"/>
+        </w:rPr>
+        <w:t>nn</w:t>
+      </w:r>
+      <w:proofErr w:type="spellEnd"/>
     </w:p>
     <w:p>
       <w:pPr>
@@ -4807,6 +5861,627 @@
           <w:lang w:val="en-US"/>
         </w:rPr>
         <w:lastRenderedPageBreak/>
+        <w:t xml:space="preserve">LECTURE </w:t>
+      </w:r>
+      <w:r>
+        <w:rPr>
+          <w:b/>
+          <w:bCs/>
+          <w:lang w:val="en-US"/>
+        </w:rPr>
+        <w:t>6</w:t>
+      </w:r>
+    </w:p>
+    <w:p>
+      <w:pPr>
+        <w:rPr>
+          <w:lang w:val="en-US"/>
+        </w:rPr>
+      </w:pPr>
+      <w:r>
+        <w:rPr>
+          <w:lang w:val="en-US"/>
+        </w:rPr>
+        <w:t xml:space="preserve">TOPIC COVERED </w:t>
+      </w:r>
+    </w:p>
+    <w:p>
+      <w:pPr>
+        <w:rPr>
+          <w:b/>
+          <w:bCs/>
+          <w:lang w:val="en-US"/>
+        </w:rPr>
+      </w:pPr>
+      <w:r>
+        <w:rPr>
+          <w:b/>
+          <w:bCs/>
+          <w:lang w:val="en-US"/>
+        </w:rPr>
+        <w:t>MIDDLE OF LL</w:t>
+      </w:r>
+    </w:p>
+    <w:p>
+      <w:pPr>
+        <w:rPr>
+          <w:b/>
+          <w:bCs/>
+          <w:lang w:val="en-US"/>
+        </w:rPr>
+      </w:pPr>
+      <w:r>
+        <w:rPr>
+          <w:b/>
+          <w:bCs/>
+          <w:lang w:val="en-US"/>
+        </w:rPr>
+        <w:t>// BRUTE FORCE</w:t>
+      </w:r>
+    </w:p>
+    <w:p>
+      <w:pPr>
+        <w:pStyle w:val="ListParagraph"/>
+        <w:numPr>
+          <w:ilvl w:val="0"/>
+          <w:numId w:val="36"/>
+        </w:numPr>
+        <w:rPr>
+          <w:lang w:val="en-US"/>
+        </w:rPr>
+      </w:pPr>
+      <w:r>
+        <w:rPr>
+          <w:lang w:val="en-US"/>
+        </w:rPr>
+        <w:t>Check for the length even or odd</w:t>
+      </w:r>
+    </w:p>
+    <w:p>
+      <w:pPr>
+        <w:pStyle w:val="ListParagraph"/>
+        <w:numPr>
+          <w:ilvl w:val="0"/>
+          <w:numId w:val="36"/>
+        </w:numPr>
+        <w:rPr>
+          <w:lang w:val="en-US"/>
+        </w:rPr>
+      </w:pPr>
+      <w:r>
+        <w:rPr>
+          <w:lang w:val="en-US"/>
+        </w:rPr>
+        <w:t>If even call even length function</w:t>
+      </w:r>
+    </w:p>
+    <w:p>
+      <w:pPr>
+        <w:pStyle w:val="ListParagraph"/>
+        <w:numPr>
+          <w:ilvl w:val="0"/>
+          <w:numId w:val="36"/>
+        </w:numPr>
+        <w:rPr>
+          <w:lang w:val="en-US"/>
+        </w:rPr>
+      </w:pPr>
+      <w:r>
+        <w:rPr>
+          <w:lang w:val="en-US"/>
+        </w:rPr>
+        <w:t>If odd call odd length function</w:t>
+      </w:r>
+    </w:p>
+    <w:p>
+      <w:pPr>
+        <w:pStyle w:val="ListParagraph"/>
+        <w:numPr>
+          <w:ilvl w:val="0"/>
+          <w:numId w:val="36"/>
+        </w:numPr>
+        <w:rPr>
+          <w:lang w:val="en-US"/>
+        </w:rPr>
+      </w:pPr>
+      <w:r>
+        <w:rPr>
+          <w:lang w:val="en-US"/>
+        </w:rPr>
+        <w:t xml:space="preserve">Even </w:t>
+      </w:r>
+      <w:proofErr w:type="gramStart"/>
+      <w:r>
+        <w:rPr>
+          <w:lang w:val="en-US"/>
+        </w:rPr>
+        <w:t>function :</w:t>
+      </w:r>
+      <w:proofErr w:type="gramEnd"/>
+    </w:p>
+    <w:p>
+      <w:pPr>
+        <w:pStyle w:val="ListParagraph"/>
+        <w:numPr>
+          <w:ilvl w:val="0"/>
+          <w:numId w:val="36"/>
+        </w:numPr>
+        <w:rPr>
+          <w:lang w:val="en-US"/>
+        </w:rPr>
+      </w:pPr>
+      <w:proofErr w:type="gramStart"/>
+      <w:r>
+        <w:rPr>
+          <w:lang w:val="en-US"/>
+        </w:rPr>
+        <w:t>Val  =</w:t>
+      </w:r>
+      <w:proofErr w:type="gramEnd"/>
+      <w:r>
+        <w:rPr>
+          <w:lang w:val="en-US"/>
+        </w:rPr>
+        <w:t xml:space="preserve"> n/2 it’s integer and floor </w:t>
+      </w:r>
+      <w:proofErr w:type="spellStart"/>
+      <w:r>
+        <w:rPr>
+          <w:lang w:val="en-US"/>
+        </w:rPr>
+        <w:t>decreasecount</w:t>
+      </w:r>
+      <w:proofErr w:type="spellEnd"/>
+      <w:r>
+        <w:rPr>
+          <w:lang w:val="en-US"/>
+        </w:rPr>
+        <w:t xml:space="preserve"> - 0</w:t>
+      </w:r>
+    </w:p>
+    <w:p>
+      <w:pPr>
+        <w:pStyle w:val="ListParagraph"/>
+        <w:numPr>
+          <w:ilvl w:val="0"/>
+          <w:numId w:val="36"/>
+        </w:numPr>
+        <w:rPr>
+          <w:lang w:val="en-US"/>
+        </w:rPr>
+      </w:pPr>
+      <w:r>
+        <w:rPr>
+          <w:lang w:val="en-US"/>
+        </w:rPr>
+        <w:t xml:space="preserve">Traverse till the last </w:t>
+      </w:r>
+    </w:p>
+    <w:p>
+      <w:pPr>
+        <w:pStyle w:val="ListParagraph"/>
+        <w:numPr>
+          <w:ilvl w:val="0"/>
+          <w:numId w:val="36"/>
+        </w:numPr>
+        <w:rPr>
+          <w:lang w:val="en-US"/>
+        </w:rPr>
+      </w:pPr>
+      <w:r>
+        <w:rPr>
+          <w:lang w:val="en-US"/>
+        </w:rPr>
+        <w:t>Count ++</w:t>
+      </w:r>
+    </w:p>
+    <w:p>
+      <w:pPr>
+        <w:pStyle w:val="ListParagraph"/>
+        <w:numPr>
+          <w:ilvl w:val="0"/>
+          <w:numId w:val="36"/>
+        </w:numPr>
+        <w:rPr>
+          <w:lang w:val="en-US"/>
+        </w:rPr>
+      </w:pPr>
+      <w:r>
+        <w:rPr>
+          <w:lang w:val="en-US"/>
+        </w:rPr>
+        <w:t xml:space="preserve">If count == </w:t>
+      </w:r>
+      <w:proofErr w:type="spellStart"/>
+      <w:r>
+        <w:rPr>
+          <w:lang w:val="en-US"/>
+        </w:rPr>
+        <w:t>val</w:t>
+      </w:r>
+      <w:proofErr w:type="spellEnd"/>
+    </w:p>
+    <w:p>
+      <w:pPr>
+        <w:pStyle w:val="ListParagraph"/>
+        <w:numPr>
+          <w:ilvl w:val="0"/>
+          <w:numId w:val="36"/>
+        </w:numPr>
+        <w:rPr>
+          <w:lang w:val="en-US"/>
+        </w:rPr>
+      </w:pPr>
+      <w:r>
+        <w:rPr>
+          <w:lang w:val="en-US"/>
+        </w:rPr>
+        <w:t>Return temp’s next</w:t>
+      </w:r>
+    </w:p>
+    <w:p>
+      <w:pPr>
+        <w:pStyle w:val="ListParagraph"/>
+        <w:numPr>
+          <w:ilvl w:val="0"/>
+          <w:numId w:val="36"/>
+        </w:numPr>
+        <w:rPr>
+          <w:lang w:val="en-US"/>
+        </w:rPr>
+      </w:pPr>
+      <w:r>
+        <w:rPr>
+          <w:lang w:val="en-US"/>
+        </w:rPr>
+        <w:t xml:space="preserve">Else move the temp = </w:t>
+      </w:r>
+      <w:proofErr w:type="spellStart"/>
+      <w:proofErr w:type="gramStart"/>
+      <w:r>
+        <w:rPr>
+          <w:lang w:val="en-US"/>
+        </w:rPr>
+        <w:t>temp.next</w:t>
+      </w:r>
+      <w:proofErr w:type="spellEnd"/>
+      <w:proofErr w:type="gramEnd"/>
+    </w:p>
+    <w:p>
+      <w:pPr>
+        <w:pStyle w:val="ListParagraph"/>
+        <w:numPr>
+          <w:ilvl w:val="0"/>
+          <w:numId w:val="36"/>
+        </w:numPr>
+        <w:rPr>
+          <w:lang w:val="en-US"/>
+        </w:rPr>
+      </w:pPr>
+      <w:r>
+        <w:rPr>
+          <w:lang w:val="en-US"/>
+        </w:rPr>
+        <w:t xml:space="preserve">Odd </w:t>
+      </w:r>
+      <w:proofErr w:type="gramStart"/>
+      <w:r>
+        <w:rPr>
+          <w:lang w:val="en-US"/>
+        </w:rPr>
+        <w:t>function :</w:t>
+      </w:r>
+      <w:proofErr w:type="gramEnd"/>
+    </w:p>
+    <w:p>
+      <w:pPr>
+        <w:pStyle w:val="ListParagraph"/>
+        <w:numPr>
+          <w:ilvl w:val="0"/>
+          <w:numId w:val="36"/>
+        </w:numPr>
+        <w:rPr>
+          <w:lang w:val="en-US"/>
+        </w:rPr>
+      </w:pPr>
+      <w:r>
+        <w:rPr>
+          <w:lang w:val="en-US"/>
+        </w:rPr>
+        <w:t>Val = n/2 ceil value increase</w:t>
+      </w:r>
+    </w:p>
+    <w:p>
+      <w:pPr>
+        <w:pStyle w:val="ListParagraph"/>
+        <w:numPr>
+          <w:ilvl w:val="0"/>
+          <w:numId w:val="36"/>
+        </w:numPr>
+        <w:rPr>
+          <w:lang w:val="en-US"/>
+        </w:rPr>
+      </w:pPr>
+      <w:r>
+        <w:rPr>
+          <w:lang w:val="en-US"/>
+        </w:rPr>
+        <w:t>Count = 0</w:t>
+      </w:r>
+    </w:p>
+    <w:p>
+      <w:pPr>
+        <w:pStyle w:val="ListParagraph"/>
+        <w:numPr>
+          <w:ilvl w:val="0"/>
+          <w:numId w:val="36"/>
+        </w:numPr>
+        <w:rPr>
+          <w:lang w:val="en-US"/>
+        </w:rPr>
+      </w:pPr>
+      <w:r>
+        <w:rPr>
+          <w:lang w:val="en-US"/>
+        </w:rPr>
+        <w:t>Traverse till the last</w:t>
+      </w:r>
+    </w:p>
+    <w:p>
+      <w:pPr>
+        <w:pStyle w:val="ListParagraph"/>
+        <w:numPr>
+          <w:ilvl w:val="0"/>
+          <w:numId w:val="36"/>
+        </w:numPr>
+        <w:rPr>
+          <w:lang w:val="en-US"/>
+        </w:rPr>
+      </w:pPr>
+      <w:r>
+        <w:rPr>
+          <w:lang w:val="en-US"/>
+        </w:rPr>
+        <w:t>Count ++</w:t>
+      </w:r>
+    </w:p>
+    <w:p>
+      <w:pPr>
+        <w:pStyle w:val="ListParagraph"/>
+        <w:numPr>
+          <w:ilvl w:val="0"/>
+          <w:numId w:val="36"/>
+        </w:numPr>
+        <w:rPr>
+          <w:lang w:val="en-US"/>
+        </w:rPr>
+      </w:pPr>
+      <w:r>
+        <w:rPr>
+          <w:lang w:val="en-US"/>
+        </w:rPr>
+        <w:t xml:space="preserve">If count == </w:t>
+      </w:r>
+      <w:proofErr w:type="spellStart"/>
+      <w:r>
+        <w:rPr>
+          <w:lang w:val="en-US"/>
+        </w:rPr>
+        <w:t>val</w:t>
+      </w:r>
+      <w:proofErr w:type="spellEnd"/>
+    </w:p>
+    <w:p>
+      <w:pPr>
+        <w:pStyle w:val="ListParagraph"/>
+        <w:numPr>
+          <w:ilvl w:val="0"/>
+          <w:numId w:val="36"/>
+        </w:numPr>
+        <w:rPr>
+          <w:lang w:val="en-US"/>
+        </w:rPr>
+      </w:pPr>
+      <w:r>
+        <w:rPr>
+          <w:lang w:val="en-US"/>
+        </w:rPr>
+        <w:t>Return the temp</w:t>
+      </w:r>
+    </w:p>
+    <w:p>
+      <w:pPr>
+        <w:pStyle w:val="ListParagraph"/>
+        <w:numPr>
+          <w:ilvl w:val="0"/>
+          <w:numId w:val="36"/>
+        </w:numPr>
+        <w:rPr>
+          <w:lang w:val="en-US"/>
+        </w:rPr>
+      </w:pPr>
+      <w:r>
+        <w:rPr>
+          <w:lang w:val="en-US"/>
+        </w:rPr>
+        <w:t>Else move the temp = temp’s next</w:t>
+      </w:r>
+    </w:p>
+    <w:p>
+      <w:pPr>
+        <w:rPr>
+          <w:b/>
+          <w:bCs/>
+          <w:lang w:val="en-US"/>
+        </w:rPr>
+      </w:pPr>
+      <w:r>
+        <w:rPr>
+          <w:b/>
+          <w:bCs/>
+          <w:lang w:val="en-US"/>
+        </w:rPr>
+        <w:t>// OPTIMAL</w:t>
+      </w:r>
+    </w:p>
+    <w:p>
+      <w:pPr>
+        <w:pStyle w:val="ListParagraph"/>
+        <w:numPr>
+          <w:ilvl w:val="0"/>
+          <w:numId w:val="37"/>
+        </w:numPr>
+        <w:rPr>
+          <w:lang w:val="en-US"/>
+        </w:rPr>
+      </w:pPr>
+      <w:r>
+        <w:rPr>
+          <w:lang w:val="en-US"/>
+        </w:rPr>
+        <w:t>Initialize slow = head</w:t>
+      </w:r>
+    </w:p>
+    <w:p>
+      <w:pPr>
+        <w:pStyle w:val="ListParagraph"/>
+        <w:numPr>
+          <w:ilvl w:val="0"/>
+          <w:numId w:val="37"/>
+        </w:numPr>
+        <w:rPr>
+          <w:lang w:val="en-US"/>
+        </w:rPr>
+      </w:pPr>
+      <w:r>
+        <w:rPr>
+          <w:lang w:val="en-US"/>
+        </w:rPr>
+        <w:t>Initialize fast = head</w:t>
+      </w:r>
+    </w:p>
+    <w:p>
+      <w:pPr>
+        <w:pStyle w:val="ListParagraph"/>
+        <w:numPr>
+          <w:ilvl w:val="0"/>
+          <w:numId w:val="37"/>
+        </w:numPr>
+        <w:rPr>
+          <w:lang w:val="en-US"/>
+        </w:rPr>
+      </w:pPr>
+      <w:r>
+        <w:rPr>
+          <w:lang w:val="en-US"/>
+        </w:rPr>
+        <w:t xml:space="preserve">Traverse till the </w:t>
+      </w:r>
+      <w:proofErr w:type="spellStart"/>
+      <w:proofErr w:type="gramStart"/>
+      <w:r>
+        <w:rPr>
+          <w:lang w:val="en-US"/>
+        </w:rPr>
+        <w:t>fast.next</w:t>
+      </w:r>
+      <w:proofErr w:type="spellEnd"/>
+      <w:proofErr w:type="gramEnd"/>
+      <w:r>
+        <w:rPr>
+          <w:lang w:val="en-US"/>
+        </w:rPr>
+        <w:t xml:space="preserve"> != null and fast != null</w:t>
+      </w:r>
+    </w:p>
+    <w:p>
+      <w:pPr>
+        <w:pStyle w:val="ListParagraph"/>
+        <w:numPr>
+          <w:ilvl w:val="0"/>
+          <w:numId w:val="37"/>
+        </w:numPr>
+        <w:rPr>
+          <w:lang w:val="en-US"/>
+        </w:rPr>
+      </w:pPr>
+      <w:r>
+        <w:rPr>
+          <w:lang w:val="en-US"/>
+        </w:rPr>
+        <w:t xml:space="preserve">Slow to one move </w:t>
+      </w:r>
+    </w:p>
+    <w:p>
+      <w:pPr>
+        <w:pStyle w:val="ListParagraph"/>
+        <w:numPr>
+          <w:ilvl w:val="0"/>
+          <w:numId w:val="37"/>
+        </w:numPr>
+        <w:rPr>
+          <w:lang w:val="en-US"/>
+        </w:rPr>
+      </w:pPr>
+      <w:r>
+        <w:rPr>
+          <w:lang w:val="en-US"/>
+        </w:rPr>
+        <w:t xml:space="preserve">Fast to </w:t>
+      </w:r>
+      <w:proofErr w:type="gramStart"/>
+      <w:r>
+        <w:rPr>
+          <w:lang w:val="en-US"/>
+        </w:rPr>
+        <w:t xml:space="preserve">double  </w:t>
+      </w:r>
+      <w:r>
+        <w:rPr>
+          <w:lang w:val="en-US"/>
+        </w:rPr>
+        <w:t>m</w:t>
+      </w:r>
+      <w:r>
+        <w:rPr>
+          <w:lang w:val="en-US"/>
+        </w:rPr>
+        <w:t>ove</w:t>
+      </w:r>
+      <w:proofErr w:type="gramEnd"/>
+    </w:p>
+    <w:p>
+      <w:pPr>
+        <w:pStyle w:val="ListParagraph"/>
+        <w:numPr>
+          <w:ilvl w:val="0"/>
+          <w:numId w:val="37"/>
+        </w:numPr>
+        <w:rPr>
+          <w:lang w:val="en-US"/>
+        </w:rPr>
+      </w:pPr>
+      <w:r>
+        <w:rPr>
+          <w:lang w:val="en-US"/>
+        </w:rPr>
+        <w:t>Return slow</w:t>
+      </w:r>
+    </w:p>
+    <w:p>
+      <w:pPr>
+        <w:rPr>
+          <w:b/>
+          <w:bCs/>
+          <w:lang w:val="en-US"/>
+        </w:rPr>
+      </w:pPr>
+      <w:r>
+        <w:rPr>
+          <w:b/>
+          <w:bCs/>
+          <w:lang w:val="en-US"/>
+        </w:rPr>
         <w:t>LECTURE 7</w:t>
       </w:r>
     </w:p>
@@ -4820,498 +6495,585 @@
         <w:rPr>
           <w:lang w:val="en-US"/>
         </w:rPr>
-        <w:t xml:space="preserve">TOPIC COVERED </w:t>
-      </w:r>
-    </w:p>
-    <w:p>
-      <w:pPr>
-        <w:rPr>
-          <w:b/>
-          <w:bCs/>
-          <w:lang w:val="en-US"/>
-        </w:rPr>
-      </w:pPr>
-      <w:r>
-        <w:rPr>
-          <w:b/>
-          <w:bCs/>
-          <w:lang w:val="en-US"/>
-        </w:rPr>
-        <w:t>MIDDLE OF LL</w:t>
-      </w:r>
-    </w:p>
-    <w:p>
-      <w:pPr>
-        <w:rPr>
-          <w:b/>
-          <w:bCs/>
-          <w:lang w:val="en-US"/>
-        </w:rPr>
-      </w:pPr>
-      <w:r>
-        <w:rPr>
-          <w:b/>
-          <w:bCs/>
-          <w:lang w:val="en-US"/>
-        </w:rPr>
-        <w:t>// BRUTE FORCE</w:t>
-      </w:r>
-    </w:p>
-    <w:p>
-      <w:pPr>
-        <w:pStyle w:val="ListParagraph"/>
-        <w:numPr>
-          <w:ilvl w:val="0"/>
-          <w:numId w:val="36"/>
-        </w:numPr>
-        <w:rPr>
-          <w:lang w:val="en-US"/>
-        </w:rPr>
-      </w:pPr>
-      <w:r>
-        <w:rPr>
-          <w:lang w:val="en-US"/>
-        </w:rPr>
-        <w:t>Check for the length even or odd</w:t>
-      </w:r>
-    </w:p>
-    <w:p>
-      <w:pPr>
-        <w:pStyle w:val="ListParagraph"/>
-        <w:numPr>
-          <w:ilvl w:val="0"/>
-          <w:numId w:val="36"/>
-        </w:numPr>
-        <w:rPr>
-          <w:lang w:val="en-US"/>
-        </w:rPr>
-      </w:pPr>
-      <w:r>
-        <w:rPr>
-          <w:lang w:val="en-US"/>
-        </w:rPr>
-        <w:t>If even call even length function</w:t>
-      </w:r>
-    </w:p>
-    <w:p>
-      <w:pPr>
-        <w:pStyle w:val="ListParagraph"/>
-        <w:numPr>
-          <w:ilvl w:val="0"/>
-          <w:numId w:val="36"/>
-        </w:numPr>
-        <w:rPr>
-          <w:lang w:val="en-US"/>
-        </w:rPr>
-      </w:pPr>
-      <w:r>
-        <w:rPr>
-          <w:lang w:val="en-US"/>
-        </w:rPr>
-        <w:t>If odd call odd length function</w:t>
-      </w:r>
-    </w:p>
-    <w:p>
-      <w:pPr>
-        <w:pStyle w:val="ListParagraph"/>
-        <w:numPr>
-          <w:ilvl w:val="0"/>
-          <w:numId w:val="36"/>
-        </w:numPr>
-        <w:rPr>
-          <w:lang w:val="en-US"/>
-        </w:rPr>
-      </w:pPr>
-      <w:r>
-        <w:rPr>
-          <w:lang w:val="en-US"/>
-        </w:rPr>
-        <w:t>Even function :</w:t>
-      </w:r>
-    </w:p>
-    <w:p>
-      <w:pPr>
-        <w:pStyle w:val="ListParagraph"/>
-        <w:numPr>
-          <w:ilvl w:val="0"/>
-          <w:numId w:val="36"/>
-        </w:numPr>
-        <w:rPr>
-          <w:lang w:val="en-US"/>
-        </w:rPr>
-      </w:pPr>
-      <w:r>
-        <w:rPr>
-          <w:lang w:val="en-US"/>
-        </w:rPr>
-        <w:t>Val  = n/2 it’s integer and floor decreasecount - 0</w:t>
-      </w:r>
-    </w:p>
-    <w:p>
-      <w:pPr>
-        <w:pStyle w:val="ListParagraph"/>
-        <w:numPr>
-          <w:ilvl w:val="0"/>
-          <w:numId w:val="36"/>
-        </w:numPr>
-        <w:rPr>
-          <w:lang w:val="en-US"/>
-        </w:rPr>
-      </w:pPr>
-      <w:r>
-        <w:rPr>
-          <w:lang w:val="en-US"/>
-        </w:rPr>
-        <w:t xml:space="preserve">Traverse till the last </w:t>
-      </w:r>
-    </w:p>
-    <w:p>
-      <w:pPr>
-        <w:pStyle w:val="ListParagraph"/>
-        <w:numPr>
-          <w:ilvl w:val="0"/>
-          <w:numId w:val="36"/>
-        </w:numPr>
-        <w:rPr>
-          <w:lang w:val="en-US"/>
-        </w:rPr>
-      </w:pPr>
-      <w:r>
-        <w:rPr>
-          <w:lang w:val="en-US"/>
-        </w:rPr>
-        <w:t>Count ++</w:t>
-      </w:r>
-    </w:p>
-    <w:p>
-      <w:pPr>
-        <w:pStyle w:val="ListParagraph"/>
-        <w:numPr>
-          <w:ilvl w:val="0"/>
-          <w:numId w:val="36"/>
-        </w:numPr>
-        <w:rPr>
-          <w:lang w:val="en-US"/>
-        </w:rPr>
-      </w:pPr>
-      <w:r>
-        <w:rPr>
-          <w:lang w:val="en-US"/>
-        </w:rPr>
-        <w:t>If count == val</w:t>
-      </w:r>
-    </w:p>
-    <w:p>
-      <w:pPr>
-        <w:pStyle w:val="ListParagraph"/>
-        <w:numPr>
-          <w:ilvl w:val="0"/>
-          <w:numId w:val="36"/>
-        </w:numPr>
-        <w:rPr>
-          <w:lang w:val="en-US"/>
-        </w:rPr>
-      </w:pPr>
-      <w:r>
-        <w:rPr>
-          <w:lang w:val="en-US"/>
-        </w:rPr>
-        <w:t>Return temp’s next</w:t>
-      </w:r>
-    </w:p>
-    <w:p>
-      <w:pPr>
-        <w:pStyle w:val="ListParagraph"/>
-        <w:numPr>
-          <w:ilvl w:val="0"/>
-          <w:numId w:val="36"/>
-        </w:numPr>
-        <w:rPr>
-          <w:lang w:val="en-US"/>
-        </w:rPr>
-      </w:pPr>
-      <w:r>
-        <w:rPr>
-          <w:lang w:val="en-US"/>
-        </w:rPr>
-        <w:t>Else move the temp = temp.next</w:t>
-      </w:r>
-    </w:p>
-    <w:p>
-      <w:pPr>
-        <w:pStyle w:val="ListParagraph"/>
-        <w:numPr>
-          <w:ilvl w:val="0"/>
-          <w:numId w:val="36"/>
-        </w:numPr>
-        <w:rPr>
-          <w:lang w:val="en-US"/>
-        </w:rPr>
-      </w:pPr>
-      <w:r>
-        <w:rPr>
-          <w:lang w:val="en-US"/>
-        </w:rPr>
-        <w:t>Odd function :</w:t>
-      </w:r>
-    </w:p>
-    <w:p>
-      <w:pPr>
-        <w:pStyle w:val="ListParagraph"/>
-        <w:numPr>
-          <w:ilvl w:val="0"/>
-          <w:numId w:val="36"/>
-        </w:numPr>
-        <w:rPr>
-          <w:lang w:val="en-US"/>
-        </w:rPr>
-      </w:pPr>
-      <w:r>
-        <w:rPr>
-          <w:lang w:val="en-US"/>
-        </w:rPr>
-        <w:t>Val = n/2 ceil value increase</w:t>
-      </w:r>
-    </w:p>
-    <w:p>
-      <w:pPr>
-        <w:pStyle w:val="ListParagraph"/>
-        <w:numPr>
-          <w:ilvl w:val="0"/>
-          <w:numId w:val="36"/>
-        </w:numPr>
-        <w:rPr>
-          <w:lang w:val="en-US"/>
-        </w:rPr>
-      </w:pPr>
-      <w:r>
-        <w:rPr>
-          <w:lang w:val="en-US"/>
-        </w:rPr>
-        <w:t>Count = 0</w:t>
-      </w:r>
-    </w:p>
-    <w:p>
-      <w:pPr>
-        <w:pStyle w:val="ListParagraph"/>
-        <w:numPr>
-          <w:ilvl w:val="0"/>
-          <w:numId w:val="36"/>
-        </w:numPr>
-        <w:rPr>
-          <w:lang w:val="en-US"/>
-        </w:rPr>
-      </w:pPr>
-      <w:r>
-        <w:rPr>
-          <w:lang w:val="en-US"/>
-        </w:rPr>
-        <w:t>Traverse till the last</w:t>
-      </w:r>
-    </w:p>
-    <w:p>
-      <w:pPr>
-        <w:pStyle w:val="ListParagraph"/>
-        <w:numPr>
-          <w:ilvl w:val="0"/>
-          <w:numId w:val="36"/>
-        </w:numPr>
-        <w:rPr>
-          <w:lang w:val="en-US"/>
-        </w:rPr>
-      </w:pPr>
-      <w:r>
-        <w:rPr>
-          <w:lang w:val="en-US"/>
-        </w:rPr>
-        <w:t>Count ++</w:t>
-      </w:r>
-    </w:p>
-    <w:p>
-      <w:pPr>
-        <w:pStyle w:val="ListParagraph"/>
-        <w:numPr>
-          <w:ilvl w:val="0"/>
-          <w:numId w:val="36"/>
-        </w:numPr>
-        <w:rPr>
-          <w:lang w:val="en-US"/>
-        </w:rPr>
-      </w:pPr>
-      <w:r>
-        <w:rPr>
-          <w:lang w:val="en-US"/>
-        </w:rPr>
-        <w:t>If count == val</w:t>
-      </w:r>
-    </w:p>
-    <w:p>
-      <w:pPr>
-        <w:pStyle w:val="ListParagraph"/>
-        <w:numPr>
-          <w:ilvl w:val="0"/>
-          <w:numId w:val="36"/>
-        </w:numPr>
-        <w:rPr>
-          <w:lang w:val="en-US"/>
-        </w:rPr>
-      </w:pPr>
-      <w:r>
-        <w:rPr>
-          <w:lang w:val="en-US"/>
-        </w:rPr>
-        <w:t>Return the temp</w:t>
-      </w:r>
-    </w:p>
-    <w:p>
-      <w:pPr>
-        <w:pStyle w:val="ListParagraph"/>
-        <w:numPr>
-          <w:ilvl w:val="0"/>
-          <w:numId w:val="36"/>
-        </w:numPr>
-        <w:rPr>
-          <w:lang w:val="en-US"/>
-        </w:rPr>
-      </w:pPr>
-      <w:r>
-        <w:rPr>
-          <w:lang w:val="en-US"/>
-        </w:rPr>
-        <w:t>Else move the temp = temp’s next</w:t>
-      </w:r>
-    </w:p>
-    <w:p>
-      <w:pPr>
-        <w:rPr>
-          <w:b/>
-          <w:bCs/>
-          <w:lang w:val="en-US"/>
-        </w:rPr>
-      </w:pPr>
-      <w:r>
-        <w:rPr>
-          <w:b/>
-          <w:bCs/>
-          <w:lang w:val="en-US"/>
-        </w:rPr>
-        <w:t>// OPTIMAL</w:t>
-      </w:r>
-    </w:p>
-    <w:p>
-      <w:pPr>
-        <w:pStyle w:val="ListParagraph"/>
-        <w:numPr>
-          <w:ilvl w:val="0"/>
-          <w:numId w:val="37"/>
-        </w:numPr>
-        <w:rPr>
-          <w:lang w:val="en-US"/>
-        </w:rPr>
-      </w:pPr>
-      <w:r>
-        <w:rPr>
-          <w:lang w:val="en-US"/>
-        </w:rPr>
-        <w:t>Initialize slow = head</w:t>
-      </w:r>
-    </w:p>
-    <w:p>
-      <w:pPr>
-        <w:pStyle w:val="ListParagraph"/>
-        <w:numPr>
-          <w:ilvl w:val="0"/>
-          <w:numId w:val="37"/>
-        </w:numPr>
-        <w:rPr>
-          <w:lang w:val="en-US"/>
-        </w:rPr>
-      </w:pPr>
-      <w:r>
-        <w:rPr>
-          <w:lang w:val="en-US"/>
-        </w:rPr>
-        <w:t>Initialize fast = head</w:t>
-      </w:r>
-    </w:p>
-    <w:p>
-      <w:pPr>
-        <w:pStyle w:val="ListParagraph"/>
-        <w:numPr>
-          <w:ilvl w:val="0"/>
-          <w:numId w:val="37"/>
-        </w:numPr>
-        <w:rPr>
-          <w:lang w:val="en-US"/>
-        </w:rPr>
-      </w:pPr>
-      <w:r>
-        <w:rPr>
-          <w:lang w:val="en-US"/>
-        </w:rPr>
-        <w:t>Traverse till the fast.next != null and fast != null</w:t>
-      </w:r>
-    </w:p>
-    <w:p>
-      <w:pPr>
-        <w:pStyle w:val="ListParagraph"/>
-        <w:numPr>
-          <w:ilvl w:val="0"/>
-          <w:numId w:val="37"/>
-        </w:numPr>
-        <w:rPr>
-          <w:lang w:val="en-US"/>
-        </w:rPr>
-      </w:pPr>
-      <w:r>
-        <w:rPr>
-          <w:lang w:val="en-US"/>
-        </w:rPr>
-        <w:t xml:space="preserve">Slow to one move </w:t>
-      </w:r>
-    </w:p>
-    <w:p>
-      <w:pPr>
-        <w:pStyle w:val="ListParagraph"/>
-        <w:numPr>
-          <w:ilvl w:val="0"/>
-          <w:numId w:val="37"/>
-        </w:numPr>
-        <w:rPr>
-          <w:lang w:val="en-US"/>
-        </w:rPr>
-      </w:pPr>
-      <w:r>
-        <w:rPr>
-          <w:lang w:val="en-US"/>
-        </w:rPr>
-        <w:t>Fast to double  ove</w:t>
-      </w:r>
-    </w:p>
-    <w:p>
-      <w:pPr>
-        <w:pStyle w:val="ListParagraph"/>
-        <w:numPr>
-          <w:ilvl w:val="0"/>
-          <w:numId w:val="37"/>
-        </w:numPr>
-        <w:rPr>
-          <w:lang w:val="en-US"/>
-        </w:rPr>
-      </w:pPr>
-      <w:r>
-        <w:rPr>
-          <w:lang w:val="en-US"/>
-        </w:rPr>
-        <w:t>Return slow</w:t>
-      </w:r>
-    </w:p>
-    <w:p>
-      <w:pPr>
-        <w:rPr>
-          <w:lang w:val="en-US"/>
-        </w:rPr>
-      </w:pPr>
+        <w:t>TOPIC COVERED</w:t>
+      </w:r>
+    </w:p>
+    <w:p>
+      <w:pPr>
+        <w:rPr>
+          <w:b/>
+          <w:bCs/>
+          <w:lang w:val="en-US"/>
+        </w:rPr>
+      </w:pPr>
+      <w:r>
+        <w:rPr>
+          <w:b/>
+          <w:bCs/>
+          <w:lang w:val="en-US"/>
+        </w:rPr>
+        <w:t>REVERSE LL ITERATIVELY AND RECURSIVELY</w:t>
+      </w:r>
+    </w:p>
+    <w:p>
+      <w:pPr>
+        <w:rPr>
+          <w:b/>
+          <w:bCs/>
+          <w:lang w:val="en-US"/>
+        </w:rPr>
+      </w:pPr>
+      <w:r>
+        <w:rPr>
+          <w:b/>
+          <w:bCs/>
+          <w:lang w:val="en-US"/>
+        </w:rPr>
+        <w:t>// ITERATIVERLY – BRUTE FORCE</w:t>
+      </w:r>
+    </w:p>
+    <w:p>
+      <w:pPr>
+        <w:pStyle w:val="ListParagraph"/>
+        <w:numPr>
+          <w:ilvl w:val="0"/>
+          <w:numId w:val="39"/>
+        </w:numPr>
+        <w:rPr>
+          <w:lang w:val="en-US"/>
+        </w:rPr>
+      </w:pPr>
+      <w:r>
+        <w:rPr>
+          <w:lang w:val="en-US"/>
+        </w:rPr>
+        <w:t>Using data only</w:t>
+      </w:r>
+    </w:p>
+    <w:p>
+      <w:pPr>
+        <w:pStyle w:val="ListParagraph"/>
+        <w:numPr>
+          <w:ilvl w:val="0"/>
+          <w:numId w:val="39"/>
+        </w:numPr>
+        <w:rPr>
+          <w:lang w:val="en-US"/>
+        </w:rPr>
+      </w:pPr>
+      <w:r>
+        <w:rPr>
+          <w:lang w:val="en-US"/>
+        </w:rPr>
+        <w:t>Initialize the stack and temp = head</w:t>
+      </w:r>
+    </w:p>
+    <w:p>
+      <w:pPr>
+        <w:pStyle w:val="ListParagraph"/>
+        <w:numPr>
+          <w:ilvl w:val="0"/>
+          <w:numId w:val="39"/>
+        </w:numPr>
+        <w:rPr>
+          <w:lang w:val="en-US"/>
+        </w:rPr>
+      </w:pPr>
+      <w:r>
+        <w:rPr>
+          <w:lang w:val="en-US"/>
+        </w:rPr>
+        <w:t>Traverse till the last not null</w:t>
+      </w:r>
+    </w:p>
+    <w:p>
+      <w:pPr>
+        <w:pStyle w:val="ListParagraph"/>
+        <w:numPr>
+          <w:ilvl w:val="0"/>
+          <w:numId w:val="39"/>
+        </w:numPr>
+        <w:rPr>
+          <w:lang w:val="en-US"/>
+        </w:rPr>
+      </w:pPr>
+      <w:r>
+        <w:rPr>
+          <w:lang w:val="en-US"/>
+        </w:rPr>
+        <w:t>Push the temp’s data to the stack</w:t>
+      </w:r>
+    </w:p>
+    <w:p>
+      <w:pPr>
+        <w:pStyle w:val="ListParagraph"/>
+        <w:numPr>
+          <w:ilvl w:val="0"/>
+          <w:numId w:val="39"/>
+        </w:numPr>
+        <w:rPr>
+          <w:lang w:val="en-US"/>
+        </w:rPr>
+      </w:pPr>
+      <w:r>
+        <w:rPr>
+          <w:lang w:val="en-US"/>
+        </w:rPr>
+        <w:t xml:space="preserve">Move the temp to temp’s next </w:t>
+      </w:r>
+    </w:p>
+    <w:p>
+      <w:pPr>
+        <w:pStyle w:val="ListParagraph"/>
+        <w:numPr>
+          <w:ilvl w:val="0"/>
+          <w:numId w:val="39"/>
+        </w:numPr>
+        <w:rPr>
+          <w:lang w:val="en-US"/>
+        </w:rPr>
+      </w:pPr>
+      <w:r>
+        <w:rPr>
+          <w:lang w:val="en-US"/>
+        </w:rPr>
+        <w:t>Reinitialize the temp to head</w:t>
+      </w:r>
+    </w:p>
+    <w:p>
+      <w:pPr>
+        <w:pStyle w:val="ListParagraph"/>
+        <w:numPr>
+          <w:ilvl w:val="0"/>
+          <w:numId w:val="39"/>
+        </w:numPr>
+        <w:rPr>
+          <w:lang w:val="en-US"/>
+        </w:rPr>
+      </w:pPr>
+      <w:r>
+        <w:rPr>
+          <w:lang w:val="en-US"/>
+        </w:rPr>
+        <w:t>Traverse till the last not null</w:t>
+      </w:r>
+    </w:p>
+    <w:p>
+      <w:pPr>
+        <w:pStyle w:val="ListParagraph"/>
+        <w:numPr>
+          <w:ilvl w:val="0"/>
+          <w:numId w:val="39"/>
+        </w:numPr>
+        <w:rPr>
+          <w:lang w:val="en-US"/>
+        </w:rPr>
+      </w:pPr>
+      <w:r>
+        <w:rPr>
+          <w:lang w:val="en-US"/>
+        </w:rPr>
+        <w:t xml:space="preserve">Pop the </w:t>
+      </w:r>
+      <w:proofErr w:type="spellStart"/>
+      <w:r>
+        <w:rPr>
+          <w:lang w:val="en-US"/>
+        </w:rPr>
+        <w:t>temp.data</w:t>
+      </w:r>
+      <w:proofErr w:type="spellEnd"/>
+      <w:r>
+        <w:rPr>
+          <w:lang w:val="en-US"/>
+        </w:rPr>
+        <w:t xml:space="preserve"> at the </w:t>
+      </w:r>
+      <w:proofErr w:type="spellStart"/>
+      <w:r>
+        <w:rPr>
+          <w:lang w:val="en-US"/>
+        </w:rPr>
+        <w:t>peek</w:t>
+      </w:r>
+      <w:proofErr w:type="spellEnd"/>
+      <w:r>
+        <w:rPr>
+          <w:lang w:val="en-US"/>
+        </w:rPr>
+        <w:t xml:space="preserve"> of the stack</w:t>
+      </w:r>
+    </w:p>
+    <w:p>
+      <w:pPr>
+        <w:pStyle w:val="ListParagraph"/>
+        <w:numPr>
+          <w:ilvl w:val="0"/>
+          <w:numId w:val="39"/>
+        </w:numPr>
+        <w:rPr>
+          <w:lang w:val="en-US"/>
+        </w:rPr>
+      </w:pPr>
+      <w:r>
+        <w:rPr>
+          <w:lang w:val="en-US"/>
+        </w:rPr>
+        <w:t>Temp = temp’s next</w:t>
+      </w:r>
+    </w:p>
+    <w:p>
+      <w:pPr>
+        <w:rPr>
+          <w:b/>
+          <w:bCs/>
+          <w:lang w:val="en-US"/>
+        </w:rPr>
+      </w:pPr>
+      <w:r>
+        <w:rPr>
+          <w:b/>
+          <w:bCs/>
+          <w:lang w:val="en-US"/>
+        </w:rPr>
+        <w:lastRenderedPageBreak/>
+        <w:t>// ITERATIVELY – OPTIMAL</w:t>
+      </w:r>
+    </w:p>
+    <w:p>
+      <w:pPr>
+        <w:pStyle w:val="ListParagraph"/>
+        <w:numPr>
+          <w:ilvl w:val="0"/>
+          <w:numId w:val="40"/>
+        </w:numPr>
+        <w:rPr>
+          <w:lang w:val="en-US"/>
+        </w:rPr>
+      </w:pPr>
+      <w:r>
+        <w:rPr>
+          <w:lang w:val="en-US"/>
+        </w:rPr>
+        <w:t xml:space="preserve">Initialize the </w:t>
+      </w:r>
+      <w:proofErr w:type="spellStart"/>
+      <w:r>
+        <w:rPr>
+          <w:lang w:val="en-US"/>
+        </w:rPr>
+        <w:t>prev</w:t>
+      </w:r>
+      <w:proofErr w:type="spellEnd"/>
+      <w:r>
+        <w:rPr>
+          <w:lang w:val="en-US"/>
+        </w:rPr>
+        <w:t xml:space="preserve"> = null</w:t>
+      </w:r>
+    </w:p>
+    <w:p>
+      <w:pPr>
+        <w:pStyle w:val="ListParagraph"/>
+        <w:numPr>
+          <w:ilvl w:val="0"/>
+          <w:numId w:val="40"/>
+        </w:numPr>
+        <w:rPr>
+          <w:lang w:val="en-US"/>
+        </w:rPr>
+      </w:pPr>
+      <w:r>
+        <w:rPr>
+          <w:lang w:val="en-US"/>
+        </w:rPr>
+        <w:t>Temp = head and front = head</w:t>
+      </w:r>
+    </w:p>
+    <w:p>
+      <w:pPr>
+        <w:pStyle w:val="ListParagraph"/>
+        <w:numPr>
+          <w:ilvl w:val="0"/>
+          <w:numId w:val="40"/>
+        </w:numPr>
+        <w:rPr>
+          <w:lang w:val="en-US"/>
+        </w:rPr>
+      </w:pPr>
+      <w:r>
+        <w:rPr>
+          <w:lang w:val="en-US"/>
+        </w:rPr>
+        <w:t>Traverse till the last not null</w:t>
+      </w:r>
+    </w:p>
+    <w:p>
+      <w:pPr>
+        <w:pStyle w:val="ListParagraph"/>
+        <w:numPr>
+          <w:ilvl w:val="0"/>
+          <w:numId w:val="40"/>
+        </w:numPr>
+        <w:rPr>
+          <w:lang w:val="en-US"/>
+        </w:rPr>
+      </w:pPr>
+      <w:r>
+        <w:rPr>
+          <w:lang w:val="en-US"/>
+        </w:rPr>
+        <w:t xml:space="preserve"> Front = temp’s next</w:t>
+      </w:r>
+    </w:p>
+    <w:p>
+      <w:pPr>
+        <w:pStyle w:val="ListParagraph"/>
+        <w:numPr>
+          <w:ilvl w:val="0"/>
+          <w:numId w:val="40"/>
+        </w:numPr>
+        <w:rPr>
+          <w:lang w:val="en-US"/>
+        </w:rPr>
+      </w:pPr>
+      <w:r>
+        <w:rPr>
+          <w:lang w:val="en-US"/>
+        </w:rPr>
+        <w:t xml:space="preserve">Temp’s next points to the </w:t>
+      </w:r>
+      <w:proofErr w:type="spellStart"/>
+      <w:r>
+        <w:rPr>
+          <w:lang w:val="en-US"/>
+        </w:rPr>
+        <w:t>prev</w:t>
+      </w:r>
+      <w:proofErr w:type="spellEnd"/>
+    </w:p>
+    <w:p>
+      <w:pPr>
+        <w:pStyle w:val="ListParagraph"/>
+        <w:numPr>
+          <w:ilvl w:val="0"/>
+          <w:numId w:val="40"/>
+        </w:numPr>
+        <w:rPr>
+          <w:lang w:val="en-US"/>
+        </w:rPr>
+      </w:pPr>
+      <w:r>
+        <w:rPr>
+          <w:lang w:val="en-US"/>
+        </w:rPr>
+        <w:t xml:space="preserve">Move the </w:t>
+      </w:r>
+      <w:proofErr w:type="spellStart"/>
+      <w:r>
+        <w:rPr>
+          <w:lang w:val="en-US"/>
+        </w:rPr>
+        <w:t>prev</w:t>
+      </w:r>
+      <w:proofErr w:type="spellEnd"/>
+      <w:r>
+        <w:rPr>
+          <w:lang w:val="en-US"/>
+        </w:rPr>
+        <w:t xml:space="preserve"> to the temp </w:t>
+      </w:r>
+    </w:p>
+    <w:p>
+      <w:pPr>
+        <w:pStyle w:val="ListParagraph"/>
+        <w:numPr>
+          <w:ilvl w:val="0"/>
+          <w:numId w:val="40"/>
+        </w:numPr>
+        <w:rPr>
+          <w:lang w:val="en-US"/>
+        </w:rPr>
+      </w:pPr>
+      <w:r>
+        <w:rPr>
+          <w:lang w:val="en-US"/>
+        </w:rPr>
+        <w:t>Move the temp to the front</w:t>
+      </w:r>
+    </w:p>
+    <w:p>
+      <w:pPr>
+        <w:rPr>
+          <w:b/>
+          <w:bCs/>
+          <w:lang w:val="en-US"/>
+        </w:rPr>
+      </w:pPr>
+      <w:r>
+        <w:rPr>
+          <w:b/>
+          <w:bCs/>
+          <w:lang w:val="en-US"/>
+        </w:rPr>
+        <w:t xml:space="preserve">RECURSIVELY </w:t>
+      </w:r>
+    </w:p>
+    <w:p>
+      <w:pPr>
+        <w:pStyle w:val="ListParagraph"/>
+        <w:numPr>
+          <w:ilvl w:val="0"/>
+          <w:numId w:val="42"/>
+        </w:numPr>
+        <w:rPr>
+          <w:lang w:val="en-US"/>
+        </w:rPr>
+      </w:pPr>
+      <w:r>
+        <w:rPr>
+          <w:lang w:val="en-US"/>
+        </w:rPr>
+        <w:t xml:space="preserve">Base condition head == null or </w:t>
+      </w:r>
+      <w:proofErr w:type="spellStart"/>
+      <w:proofErr w:type="gramStart"/>
+      <w:r>
+        <w:rPr>
+          <w:lang w:val="en-US"/>
+        </w:rPr>
+        <w:t>head.next</w:t>
+      </w:r>
+      <w:proofErr w:type="spellEnd"/>
+      <w:proofErr w:type="gramEnd"/>
+      <w:r>
+        <w:rPr>
+          <w:lang w:val="en-US"/>
+        </w:rPr>
+        <w:t xml:space="preserve"> == null</w:t>
+      </w:r>
+    </w:p>
+    <w:p>
+      <w:pPr>
+        <w:pStyle w:val="ListParagraph"/>
+        <w:numPr>
+          <w:ilvl w:val="0"/>
+          <w:numId w:val="42"/>
+        </w:numPr>
+        <w:rPr>
+          <w:lang w:val="en-US"/>
+        </w:rPr>
+      </w:pPr>
+      <w:r>
+        <w:rPr>
+          <w:lang w:val="en-US"/>
+        </w:rPr>
+        <w:t>Return the head</w:t>
+      </w:r>
+    </w:p>
+    <w:p>
+      <w:pPr>
+        <w:pStyle w:val="ListParagraph"/>
+        <w:numPr>
+          <w:ilvl w:val="0"/>
+          <w:numId w:val="42"/>
+        </w:numPr>
+        <w:rPr>
+          <w:lang w:val="en-US"/>
+        </w:rPr>
+      </w:pPr>
+      <w:r>
+        <w:rPr>
+          <w:lang w:val="en-US"/>
+        </w:rPr>
+        <w:t>New head = call the reverse function recursively with the head’s next</w:t>
+      </w:r>
+    </w:p>
+    <w:p>
+      <w:pPr>
+        <w:pStyle w:val="ListParagraph"/>
+        <w:numPr>
+          <w:ilvl w:val="0"/>
+          <w:numId w:val="42"/>
+        </w:numPr>
+        <w:rPr>
+          <w:lang w:val="en-US"/>
+        </w:rPr>
+      </w:pPr>
+      <w:r>
+        <w:rPr>
+          <w:lang w:val="en-US"/>
+        </w:rPr>
+        <w:t xml:space="preserve">Remember the </w:t>
+      </w:r>
+      <w:proofErr w:type="gramStart"/>
+      <w:r>
+        <w:rPr>
+          <w:lang w:val="en-US"/>
+        </w:rPr>
+        <w:t>front  =</w:t>
+      </w:r>
+      <w:proofErr w:type="gramEnd"/>
+      <w:r>
+        <w:rPr>
+          <w:lang w:val="en-US"/>
+        </w:rPr>
+        <w:t xml:space="preserve"> head’s next</w:t>
+      </w:r>
+    </w:p>
+    <w:p>
+      <w:pPr>
+        <w:pStyle w:val="ListParagraph"/>
+        <w:numPr>
+          <w:ilvl w:val="0"/>
+          <w:numId w:val="42"/>
+        </w:numPr>
+        <w:rPr>
+          <w:lang w:val="en-US"/>
+        </w:rPr>
+      </w:pPr>
+      <w:r>
+        <w:rPr>
+          <w:lang w:val="en-US"/>
+        </w:rPr>
+        <w:t>Front’ next points to the head</w:t>
+      </w:r>
+    </w:p>
+    <w:p>
+      <w:pPr>
+        <w:pStyle w:val="ListParagraph"/>
+        <w:numPr>
+          <w:ilvl w:val="0"/>
+          <w:numId w:val="42"/>
+        </w:numPr>
+        <w:rPr>
+          <w:lang w:val="en-US"/>
+        </w:rPr>
+      </w:pPr>
+      <w:r>
+        <w:rPr>
+          <w:lang w:val="en-US"/>
+        </w:rPr>
+        <w:t>Head’s next points to the null</w:t>
+      </w:r>
+    </w:p>
+    <w:p>
+      <w:pPr>
+        <w:pStyle w:val="ListParagraph"/>
+        <w:numPr>
+          <w:ilvl w:val="0"/>
+          <w:numId w:val="42"/>
+        </w:numPr>
+        <w:rPr>
+          <w:lang w:val="en-US"/>
+        </w:rPr>
+      </w:pPr>
+      <w:r>
+        <w:rPr>
+          <w:lang w:val="en-US"/>
+        </w:rPr>
+        <w:t>Return the new head</w:t>
+      </w:r>
     </w:p>
     <w:p>
       <w:pPr>
@@ -6103,6 +7865,95 @@
     </w:lvl>
   </w:abstractNum>
   <w:abstractNum w:abstractNumId="8" w15:restartNumberingAfterBreak="0">
+    <w:nsid w:val="1F960227"/>
+    <w:multiLevelType w:val="hybridMultilevel"/>
+    <w:tmpl w:val="B00A1B04"/>
+    <w:lvl w:ilvl="0" w:tplc="B1825C84">
+      <w:start w:val="1"/>
+      <w:numFmt w:val="decimal"/>
+      <w:lvlText w:val="%1)"/>
+      <w:lvlJc w:val="left"/>
+      <w:pPr>
+        <w:ind w:left="564" w:hanging="360"/>
+      </w:pPr>
+      <w:rPr>
+        <w:rFonts w:hint="default"/>
+      </w:rPr>
+    </w:lvl>
+    <w:lvl w:ilvl="1" w:tplc="40090019" w:tentative="1">
+      <w:start w:val="1"/>
+      <w:numFmt w:val="lowerLetter"/>
+      <w:lvlText w:val="%2."/>
+      <w:lvlJc w:val="left"/>
+      <w:pPr>
+        <w:ind w:left="1284" w:hanging="360"/>
+      </w:pPr>
+    </w:lvl>
+    <w:lvl w:ilvl="2" w:tplc="4009001B" w:tentative="1">
+      <w:start w:val="1"/>
+      <w:numFmt w:val="lowerRoman"/>
+      <w:lvlText w:val="%3."/>
+      <w:lvlJc w:val="right"/>
+      <w:pPr>
+        <w:ind w:left="2004" w:hanging="180"/>
+      </w:pPr>
+    </w:lvl>
+    <w:lvl w:ilvl="3" w:tplc="4009000F" w:tentative="1">
+      <w:start w:val="1"/>
+      <w:numFmt w:val="decimal"/>
+      <w:lvlText w:val="%4."/>
+      <w:lvlJc w:val="left"/>
+      <w:pPr>
+        <w:ind w:left="2724" w:hanging="360"/>
+      </w:pPr>
+    </w:lvl>
+    <w:lvl w:ilvl="4" w:tplc="40090019" w:tentative="1">
+      <w:start w:val="1"/>
+      <w:numFmt w:val="lowerLetter"/>
+      <w:lvlText w:val="%5."/>
+      <w:lvlJc w:val="left"/>
+      <w:pPr>
+        <w:ind w:left="3444" w:hanging="360"/>
+      </w:pPr>
+    </w:lvl>
+    <w:lvl w:ilvl="5" w:tplc="4009001B" w:tentative="1">
+      <w:start w:val="1"/>
+      <w:numFmt w:val="lowerRoman"/>
+      <w:lvlText w:val="%6."/>
+      <w:lvlJc w:val="right"/>
+      <w:pPr>
+        <w:ind w:left="4164" w:hanging="180"/>
+      </w:pPr>
+    </w:lvl>
+    <w:lvl w:ilvl="6" w:tplc="4009000F" w:tentative="1">
+      <w:start w:val="1"/>
+      <w:numFmt w:val="decimal"/>
+      <w:lvlText w:val="%7."/>
+      <w:lvlJc w:val="left"/>
+      <w:pPr>
+        <w:ind w:left="4884" w:hanging="360"/>
+      </w:pPr>
+    </w:lvl>
+    <w:lvl w:ilvl="7" w:tplc="40090019" w:tentative="1">
+      <w:start w:val="1"/>
+      <w:numFmt w:val="lowerLetter"/>
+      <w:lvlText w:val="%8."/>
+      <w:lvlJc w:val="left"/>
+      <w:pPr>
+        <w:ind w:left="5604" w:hanging="360"/>
+      </w:pPr>
+    </w:lvl>
+    <w:lvl w:ilvl="8" w:tplc="4009001B" w:tentative="1">
+      <w:start w:val="1"/>
+      <w:numFmt w:val="lowerRoman"/>
+      <w:lvlText w:val="%9."/>
+      <w:lvlJc w:val="right"/>
+      <w:pPr>
+        <w:ind w:left="6324" w:hanging="180"/>
+      </w:pPr>
+    </w:lvl>
+  </w:abstractNum>
+  <w:abstractNum w:abstractNumId="9" w15:restartNumberingAfterBreak="0">
     <w:nsid w:val="1FCF0514"/>
     <w:multiLevelType w:val="hybridMultilevel"/>
     <w:tmpl w:val="6BBA516E"/>
@@ -6191,7 +8042,7 @@
       </w:pPr>
     </w:lvl>
   </w:abstractNum>
-  <w:abstractNum w:abstractNumId="9" w15:restartNumberingAfterBreak="0">
+  <w:abstractNum w:abstractNumId="10" w15:restartNumberingAfterBreak="0">
     <w:nsid w:val="20337965"/>
     <w:multiLevelType w:val="hybridMultilevel"/>
     <w:tmpl w:val="B86A740E"/>
@@ -6280,7 +8131,7 @@
       </w:pPr>
     </w:lvl>
   </w:abstractNum>
-  <w:abstractNum w:abstractNumId="10" w15:restartNumberingAfterBreak="0">
+  <w:abstractNum w:abstractNumId="11" w15:restartNumberingAfterBreak="0">
     <w:nsid w:val="242A296D"/>
     <w:multiLevelType w:val="hybridMultilevel"/>
     <w:tmpl w:val="060C32C2"/>
@@ -6369,7 +8220,7 @@
       </w:pPr>
     </w:lvl>
   </w:abstractNum>
-  <w:abstractNum w:abstractNumId="11" w15:restartNumberingAfterBreak="0">
+  <w:abstractNum w:abstractNumId="12" w15:restartNumberingAfterBreak="0">
     <w:nsid w:val="275F100E"/>
     <w:multiLevelType w:val="hybridMultilevel"/>
     <w:tmpl w:val="48F094D4"/>
@@ -6458,7 +8309,96 @@
       </w:pPr>
     </w:lvl>
   </w:abstractNum>
-  <w:abstractNum w:abstractNumId="12" w15:restartNumberingAfterBreak="0">
+  <w:abstractNum w:abstractNumId="13" w15:restartNumberingAfterBreak="0">
+    <w:nsid w:val="2E5F2160"/>
+    <w:multiLevelType w:val="hybridMultilevel"/>
+    <w:tmpl w:val="E9EA74D6"/>
+    <w:lvl w:ilvl="0" w:tplc="185287B0">
+      <w:start w:val="1"/>
+      <w:numFmt w:val="decimal"/>
+      <w:lvlText w:val="%1)"/>
+      <w:lvlJc w:val="left"/>
+      <w:pPr>
+        <w:ind w:left="564" w:hanging="360"/>
+      </w:pPr>
+      <w:rPr>
+        <w:rFonts w:hint="default"/>
+      </w:rPr>
+    </w:lvl>
+    <w:lvl w:ilvl="1" w:tplc="40090019" w:tentative="1">
+      <w:start w:val="1"/>
+      <w:numFmt w:val="lowerLetter"/>
+      <w:lvlText w:val="%2."/>
+      <w:lvlJc w:val="left"/>
+      <w:pPr>
+        <w:ind w:left="1284" w:hanging="360"/>
+      </w:pPr>
+    </w:lvl>
+    <w:lvl w:ilvl="2" w:tplc="4009001B" w:tentative="1">
+      <w:start w:val="1"/>
+      <w:numFmt w:val="lowerRoman"/>
+      <w:lvlText w:val="%3."/>
+      <w:lvlJc w:val="right"/>
+      <w:pPr>
+        <w:ind w:left="2004" w:hanging="180"/>
+      </w:pPr>
+    </w:lvl>
+    <w:lvl w:ilvl="3" w:tplc="4009000F" w:tentative="1">
+      <w:start w:val="1"/>
+      <w:numFmt w:val="decimal"/>
+      <w:lvlText w:val="%4."/>
+      <w:lvlJc w:val="left"/>
+      <w:pPr>
+        <w:ind w:left="2724" w:hanging="360"/>
+      </w:pPr>
+    </w:lvl>
+    <w:lvl w:ilvl="4" w:tplc="40090019" w:tentative="1">
+      <w:start w:val="1"/>
+      <w:numFmt w:val="lowerLetter"/>
+      <w:lvlText w:val="%5."/>
+      <w:lvlJc w:val="left"/>
+      <w:pPr>
+        <w:ind w:left="3444" w:hanging="360"/>
+      </w:pPr>
+    </w:lvl>
+    <w:lvl w:ilvl="5" w:tplc="4009001B" w:tentative="1">
+      <w:start w:val="1"/>
+      <w:numFmt w:val="lowerRoman"/>
+      <w:lvlText w:val="%6."/>
+      <w:lvlJc w:val="right"/>
+      <w:pPr>
+        <w:ind w:left="4164" w:hanging="180"/>
+      </w:pPr>
+    </w:lvl>
+    <w:lvl w:ilvl="6" w:tplc="4009000F" w:tentative="1">
+      <w:start w:val="1"/>
+      <w:numFmt w:val="decimal"/>
+      <w:lvlText w:val="%7."/>
+      <w:lvlJc w:val="left"/>
+      <w:pPr>
+        <w:ind w:left="4884" w:hanging="360"/>
+      </w:pPr>
+    </w:lvl>
+    <w:lvl w:ilvl="7" w:tplc="40090019" w:tentative="1">
+      <w:start w:val="1"/>
+      <w:numFmt w:val="lowerLetter"/>
+      <w:lvlText w:val="%8."/>
+      <w:lvlJc w:val="left"/>
+      <w:pPr>
+        <w:ind w:left="5604" w:hanging="360"/>
+      </w:pPr>
+    </w:lvl>
+    <w:lvl w:ilvl="8" w:tplc="4009001B" w:tentative="1">
+      <w:start w:val="1"/>
+      <w:numFmt w:val="lowerRoman"/>
+      <w:lvlText w:val="%9."/>
+      <w:lvlJc w:val="right"/>
+      <w:pPr>
+        <w:ind w:left="6324" w:hanging="180"/>
+      </w:pPr>
+    </w:lvl>
+  </w:abstractNum>
+  <w:abstractNum w:abstractNumId="14" w15:restartNumberingAfterBreak="0">
     <w:nsid w:val="3197186A"/>
     <w:multiLevelType w:val="hybridMultilevel"/>
     <w:tmpl w:val="C4687E7C"/>
@@ -6547,7 +8487,7 @@
       </w:pPr>
     </w:lvl>
   </w:abstractNum>
-  <w:abstractNum w:abstractNumId="13" w15:restartNumberingAfterBreak="0">
+  <w:abstractNum w:abstractNumId="15" w15:restartNumberingAfterBreak="0">
     <w:nsid w:val="333F3E92"/>
     <w:multiLevelType w:val="hybridMultilevel"/>
     <w:tmpl w:val="7AA6B9F0"/>
@@ -6636,7 +8576,96 @@
       </w:pPr>
     </w:lvl>
   </w:abstractNum>
-  <w:abstractNum w:abstractNumId="14" w15:restartNumberingAfterBreak="0">
+  <w:abstractNum w:abstractNumId="16" w15:restartNumberingAfterBreak="0">
+    <w:nsid w:val="3B4A32D1"/>
+    <w:multiLevelType w:val="hybridMultilevel"/>
+    <w:tmpl w:val="FEE09E62"/>
+    <w:lvl w:ilvl="0" w:tplc="40090011">
+      <w:start w:val="1"/>
+      <w:numFmt w:val="decimal"/>
+      <w:lvlText w:val="%1)"/>
+      <w:lvlJc w:val="left"/>
+      <w:pPr>
+        <w:ind w:left="720" w:hanging="360"/>
+      </w:pPr>
+      <w:rPr>
+        <w:rFonts w:hint="default"/>
+      </w:rPr>
+    </w:lvl>
+    <w:lvl w:ilvl="1" w:tplc="40090019" w:tentative="1">
+      <w:start w:val="1"/>
+      <w:numFmt w:val="lowerLetter"/>
+      <w:lvlText w:val="%2."/>
+      <w:lvlJc w:val="left"/>
+      <w:pPr>
+        <w:ind w:left="1440" w:hanging="360"/>
+      </w:pPr>
+    </w:lvl>
+    <w:lvl w:ilvl="2" w:tplc="4009001B" w:tentative="1">
+      <w:start w:val="1"/>
+      <w:numFmt w:val="lowerRoman"/>
+      <w:lvlText w:val="%3."/>
+      <w:lvlJc w:val="right"/>
+      <w:pPr>
+        <w:ind w:left="2160" w:hanging="180"/>
+      </w:pPr>
+    </w:lvl>
+    <w:lvl w:ilvl="3" w:tplc="4009000F" w:tentative="1">
+      <w:start w:val="1"/>
+      <w:numFmt w:val="decimal"/>
+      <w:lvlText w:val="%4."/>
+      <w:lvlJc w:val="left"/>
+      <w:pPr>
+        <w:ind w:left="2880" w:hanging="360"/>
+      </w:pPr>
+    </w:lvl>
+    <w:lvl w:ilvl="4" w:tplc="40090019" w:tentative="1">
+      <w:start w:val="1"/>
+      <w:numFmt w:val="lowerLetter"/>
+      <w:lvlText w:val="%5."/>
+      <w:lvlJc w:val="left"/>
+      <w:pPr>
+        <w:ind w:left="3600" w:hanging="360"/>
+      </w:pPr>
+    </w:lvl>
+    <w:lvl w:ilvl="5" w:tplc="4009001B" w:tentative="1">
+      <w:start w:val="1"/>
+      <w:numFmt w:val="lowerRoman"/>
+      <w:lvlText w:val="%6."/>
+      <w:lvlJc w:val="right"/>
+      <w:pPr>
+        <w:ind w:left="4320" w:hanging="180"/>
+      </w:pPr>
+    </w:lvl>
+    <w:lvl w:ilvl="6" w:tplc="4009000F" w:tentative="1">
+      <w:start w:val="1"/>
+      <w:numFmt w:val="decimal"/>
+      <w:lvlText w:val="%7."/>
+      <w:lvlJc w:val="left"/>
+      <w:pPr>
+        <w:ind w:left="5040" w:hanging="360"/>
+      </w:pPr>
+    </w:lvl>
+    <w:lvl w:ilvl="7" w:tplc="40090019" w:tentative="1">
+      <w:start w:val="1"/>
+      <w:numFmt w:val="lowerLetter"/>
+      <w:lvlText w:val="%8."/>
+      <w:lvlJc w:val="left"/>
+      <w:pPr>
+        <w:ind w:left="5760" w:hanging="360"/>
+      </w:pPr>
+    </w:lvl>
+    <w:lvl w:ilvl="8" w:tplc="4009001B" w:tentative="1">
+      <w:start w:val="1"/>
+      <w:numFmt w:val="lowerRoman"/>
+      <w:lvlText w:val="%9."/>
+      <w:lvlJc w:val="right"/>
+      <w:pPr>
+        <w:ind w:left="6480" w:hanging="180"/>
+      </w:pPr>
+    </w:lvl>
+  </w:abstractNum>
+  <w:abstractNum w:abstractNumId="17" w15:restartNumberingAfterBreak="0">
     <w:nsid w:val="3B850DBE"/>
     <w:multiLevelType w:val="hybridMultilevel"/>
     <w:tmpl w:val="4FC6AD1C"/>
@@ -6725,7 +8754,96 @@
       </w:pPr>
     </w:lvl>
   </w:abstractNum>
-  <w:abstractNum w:abstractNumId="15" w15:restartNumberingAfterBreak="0">
+  <w:abstractNum w:abstractNumId="18" w15:restartNumberingAfterBreak="0">
+    <w:nsid w:val="3CDF784D"/>
+    <w:multiLevelType w:val="hybridMultilevel"/>
+    <w:tmpl w:val="0900C048"/>
+    <w:lvl w:ilvl="0" w:tplc="A3D23288">
+      <w:start w:val="1"/>
+      <w:numFmt w:val="decimal"/>
+      <w:lvlText w:val="%1)"/>
+      <w:lvlJc w:val="left"/>
+      <w:pPr>
+        <w:ind w:left="612" w:hanging="360"/>
+      </w:pPr>
+      <w:rPr>
+        <w:rFonts w:hint="default"/>
+      </w:rPr>
+    </w:lvl>
+    <w:lvl w:ilvl="1" w:tplc="40090019" w:tentative="1">
+      <w:start w:val="1"/>
+      <w:numFmt w:val="lowerLetter"/>
+      <w:lvlText w:val="%2."/>
+      <w:lvlJc w:val="left"/>
+      <w:pPr>
+        <w:ind w:left="1332" w:hanging="360"/>
+      </w:pPr>
+    </w:lvl>
+    <w:lvl w:ilvl="2" w:tplc="4009001B" w:tentative="1">
+      <w:start w:val="1"/>
+      <w:numFmt w:val="lowerRoman"/>
+      <w:lvlText w:val="%3."/>
+      <w:lvlJc w:val="right"/>
+      <w:pPr>
+        <w:ind w:left="2052" w:hanging="180"/>
+      </w:pPr>
+    </w:lvl>
+    <w:lvl w:ilvl="3" w:tplc="4009000F" w:tentative="1">
+      <w:start w:val="1"/>
+      <w:numFmt w:val="decimal"/>
+      <w:lvlText w:val="%4."/>
+      <w:lvlJc w:val="left"/>
+      <w:pPr>
+        <w:ind w:left="2772" w:hanging="360"/>
+      </w:pPr>
+    </w:lvl>
+    <w:lvl w:ilvl="4" w:tplc="40090019" w:tentative="1">
+      <w:start w:val="1"/>
+      <w:numFmt w:val="lowerLetter"/>
+      <w:lvlText w:val="%5."/>
+      <w:lvlJc w:val="left"/>
+      <w:pPr>
+        <w:ind w:left="3492" w:hanging="360"/>
+      </w:pPr>
+    </w:lvl>
+    <w:lvl w:ilvl="5" w:tplc="4009001B" w:tentative="1">
+      <w:start w:val="1"/>
+      <w:numFmt w:val="lowerRoman"/>
+      <w:lvlText w:val="%6."/>
+      <w:lvlJc w:val="right"/>
+      <w:pPr>
+        <w:ind w:left="4212" w:hanging="180"/>
+      </w:pPr>
+    </w:lvl>
+    <w:lvl w:ilvl="6" w:tplc="4009000F" w:tentative="1">
+      <w:start w:val="1"/>
+      <w:numFmt w:val="decimal"/>
+      <w:lvlText w:val="%7."/>
+      <w:lvlJc w:val="left"/>
+      <w:pPr>
+        <w:ind w:left="4932" w:hanging="360"/>
+      </w:pPr>
+    </w:lvl>
+    <w:lvl w:ilvl="7" w:tplc="40090019" w:tentative="1">
+      <w:start w:val="1"/>
+      <w:numFmt w:val="lowerLetter"/>
+      <w:lvlText w:val="%8."/>
+      <w:lvlJc w:val="left"/>
+      <w:pPr>
+        <w:ind w:left="5652" w:hanging="360"/>
+      </w:pPr>
+    </w:lvl>
+    <w:lvl w:ilvl="8" w:tplc="4009001B" w:tentative="1">
+      <w:start w:val="1"/>
+      <w:numFmt w:val="lowerRoman"/>
+      <w:lvlText w:val="%9."/>
+      <w:lvlJc w:val="right"/>
+      <w:pPr>
+        <w:ind w:left="6372" w:hanging="180"/>
+      </w:pPr>
+    </w:lvl>
+  </w:abstractNum>
+  <w:abstractNum w:abstractNumId="19" w15:restartNumberingAfterBreak="0">
     <w:nsid w:val="3F8223B4"/>
     <w:multiLevelType w:val="hybridMultilevel"/>
     <w:tmpl w:val="52FAA676"/>
@@ -6814,7 +8932,7 @@
       </w:pPr>
     </w:lvl>
   </w:abstractNum>
-  <w:abstractNum w:abstractNumId="16" w15:restartNumberingAfterBreak="0">
+  <w:abstractNum w:abstractNumId="20" w15:restartNumberingAfterBreak="0">
     <w:nsid w:val="3FFE33F4"/>
     <w:multiLevelType w:val="hybridMultilevel"/>
     <w:tmpl w:val="D416EAD0"/>
@@ -6903,7 +9021,7 @@
       </w:pPr>
     </w:lvl>
   </w:abstractNum>
-  <w:abstractNum w:abstractNumId="17" w15:restartNumberingAfterBreak="0">
+  <w:abstractNum w:abstractNumId="21" w15:restartNumberingAfterBreak="0">
     <w:nsid w:val="44B80AD7"/>
     <w:multiLevelType w:val="hybridMultilevel"/>
     <w:tmpl w:val="9EA6BB22"/>
@@ -6992,7 +9110,96 @@
       </w:pPr>
     </w:lvl>
   </w:abstractNum>
-  <w:abstractNum w:abstractNumId="18" w15:restartNumberingAfterBreak="0">
+  <w:abstractNum w:abstractNumId="22" w15:restartNumberingAfterBreak="0">
+    <w:nsid w:val="49CB4204"/>
+    <w:multiLevelType w:val="hybridMultilevel"/>
+    <w:tmpl w:val="DC765278"/>
+    <w:lvl w:ilvl="0" w:tplc="658069CA">
+      <w:start w:val="1"/>
+      <w:numFmt w:val="decimal"/>
+      <w:lvlText w:val="%1)"/>
+      <w:lvlJc w:val="left"/>
+      <w:pPr>
+        <w:ind w:left="660" w:hanging="360"/>
+      </w:pPr>
+      <w:rPr>
+        <w:rFonts w:hint="default"/>
+      </w:rPr>
+    </w:lvl>
+    <w:lvl w:ilvl="1" w:tplc="40090019" w:tentative="1">
+      <w:start w:val="1"/>
+      <w:numFmt w:val="lowerLetter"/>
+      <w:lvlText w:val="%2."/>
+      <w:lvlJc w:val="left"/>
+      <w:pPr>
+        <w:ind w:left="1380" w:hanging="360"/>
+      </w:pPr>
+    </w:lvl>
+    <w:lvl w:ilvl="2" w:tplc="4009001B" w:tentative="1">
+      <w:start w:val="1"/>
+      <w:numFmt w:val="lowerRoman"/>
+      <w:lvlText w:val="%3."/>
+      <w:lvlJc w:val="right"/>
+      <w:pPr>
+        <w:ind w:left="2100" w:hanging="180"/>
+      </w:pPr>
+    </w:lvl>
+    <w:lvl w:ilvl="3" w:tplc="4009000F" w:tentative="1">
+      <w:start w:val="1"/>
+      <w:numFmt w:val="decimal"/>
+      <w:lvlText w:val="%4."/>
+      <w:lvlJc w:val="left"/>
+      <w:pPr>
+        <w:ind w:left="2820" w:hanging="360"/>
+      </w:pPr>
+    </w:lvl>
+    <w:lvl w:ilvl="4" w:tplc="40090019" w:tentative="1">
+      <w:start w:val="1"/>
+      <w:numFmt w:val="lowerLetter"/>
+      <w:lvlText w:val="%5."/>
+      <w:lvlJc w:val="left"/>
+      <w:pPr>
+        <w:ind w:left="3540" w:hanging="360"/>
+      </w:pPr>
+    </w:lvl>
+    <w:lvl w:ilvl="5" w:tplc="4009001B" w:tentative="1">
+      <w:start w:val="1"/>
+      <w:numFmt w:val="lowerRoman"/>
+      <w:lvlText w:val="%6."/>
+      <w:lvlJc w:val="right"/>
+      <w:pPr>
+        <w:ind w:left="4260" w:hanging="180"/>
+      </w:pPr>
+    </w:lvl>
+    <w:lvl w:ilvl="6" w:tplc="4009000F" w:tentative="1">
+      <w:start w:val="1"/>
+      <w:numFmt w:val="decimal"/>
+      <w:lvlText w:val="%7."/>
+      <w:lvlJc w:val="left"/>
+      <w:pPr>
+        <w:ind w:left="4980" w:hanging="360"/>
+      </w:pPr>
+    </w:lvl>
+    <w:lvl w:ilvl="7" w:tplc="40090019" w:tentative="1">
+      <w:start w:val="1"/>
+      <w:numFmt w:val="lowerLetter"/>
+      <w:lvlText w:val="%8."/>
+      <w:lvlJc w:val="left"/>
+      <w:pPr>
+        <w:ind w:left="5700" w:hanging="360"/>
+      </w:pPr>
+    </w:lvl>
+    <w:lvl w:ilvl="8" w:tplc="4009001B" w:tentative="1">
+      <w:start w:val="1"/>
+      <w:numFmt w:val="lowerRoman"/>
+      <w:lvlText w:val="%9."/>
+      <w:lvlJc w:val="right"/>
+      <w:pPr>
+        <w:ind w:left="6420" w:hanging="180"/>
+      </w:pPr>
+    </w:lvl>
+  </w:abstractNum>
+  <w:abstractNum w:abstractNumId="23" w15:restartNumberingAfterBreak="0">
     <w:nsid w:val="4AB40EFA"/>
     <w:multiLevelType w:val="hybridMultilevel"/>
     <w:tmpl w:val="4DB23E4A"/>
@@ -7081,7 +9288,7 @@
       </w:pPr>
     </w:lvl>
   </w:abstractNum>
-  <w:abstractNum w:abstractNumId="19" w15:restartNumberingAfterBreak="0">
+  <w:abstractNum w:abstractNumId="24" w15:restartNumberingAfterBreak="0">
     <w:nsid w:val="4B860BE4"/>
     <w:multiLevelType w:val="hybridMultilevel"/>
     <w:tmpl w:val="C95074B6"/>
@@ -7170,7 +9377,7 @@
       </w:pPr>
     </w:lvl>
   </w:abstractNum>
-  <w:abstractNum w:abstractNumId="20" w15:restartNumberingAfterBreak="0">
+  <w:abstractNum w:abstractNumId="25" w15:restartNumberingAfterBreak="0">
     <w:nsid w:val="4CFC2CCB"/>
     <w:multiLevelType w:val="hybridMultilevel"/>
     <w:tmpl w:val="538EE982"/>
@@ -7259,7 +9466,7 @@
       </w:pPr>
     </w:lvl>
   </w:abstractNum>
-  <w:abstractNum w:abstractNumId="21" w15:restartNumberingAfterBreak="0">
+  <w:abstractNum w:abstractNumId="26" w15:restartNumberingAfterBreak="0">
     <w:nsid w:val="4DBB4D77"/>
     <w:multiLevelType w:val="hybridMultilevel"/>
     <w:tmpl w:val="BFCA3FA0"/>
@@ -7348,7 +9555,7 @@
       </w:pPr>
     </w:lvl>
   </w:abstractNum>
-  <w:abstractNum w:abstractNumId="22" w15:restartNumberingAfterBreak="0">
+  <w:abstractNum w:abstractNumId="27" w15:restartNumberingAfterBreak="0">
     <w:nsid w:val="500D58EB"/>
     <w:multiLevelType w:val="hybridMultilevel"/>
     <w:tmpl w:val="1DA6B6BC"/>
@@ -7439,7 +9646,7 @@
       </w:pPr>
     </w:lvl>
   </w:abstractNum>
-  <w:abstractNum w:abstractNumId="23" w15:restartNumberingAfterBreak="0">
+  <w:abstractNum w:abstractNumId="28" w15:restartNumberingAfterBreak="0">
     <w:nsid w:val="57286165"/>
     <w:multiLevelType w:val="hybridMultilevel"/>
     <w:tmpl w:val="A9DA9432"/>
@@ -7528,7 +9735,7 @@
       </w:pPr>
     </w:lvl>
   </w:abstractNum>
-  <w:abstractNum w:abstractNumId="24" w15:restartNumberingAfterBreak="0">
+  <w:abstractNum w:abstractNumId="29" w15:restartNumberingAfterBreak="0">
     <w:nsid w:val="59875CC3"/>
     <w:multiLevelType w:val="hybridMultilevel"/>
     <w:tmpl w:val="8D9052A8"/>
@@ -7617,7 +9824,7 @@
       </w:pPr>
     </w:lvl>
   </w:abstractNum>
-  <w:abstractNum w:abstractNumId="25" w15:restartNumberingAfterBreak="0">
+  <w:abstractNum w:abstractNumId="30" w15:restartNumberingAfterBreak="0">
     <w:nsid w:val="5ED42B1B"/>
     <w:multiLevelType w:val="hybridMultilevel"/>
     <w:tmpl w:val="230E4CBE"/>
@@ -7706,7 +9913,7 @@
       </w:pPr>
     </w:lvl>
   </w:abstractNum>
-  <w:abstractNum w:abstractNumId="26" w15:restartNumberingAfterBreak="0">
+  <w:abstractNum w:abstractNumId="31" w15:restartNumberingAfterBreak="0">
     <w:nsid w:val="5F0931D9"/>
     <w:multiLevelType w:val="hybridMultilevel"/>
     <w:tmpl w:val="B2F028A8"/>
@@ -7795,7 +10002,7 @@
       </w:pPr>
     </w:lvl>
   </w:abstractNum>
-  <w:abstractNum w:abstractNumId="27" w15:restartNumberingAfterBreak="0">
+  <w:abstractNum w:abstractNumId="32" w15:restartNumberingAfterBreak="0">
     <w:nsid w:val="61512C07"/>
     <w:multiLevelType w:val="hybridMultilevel"/>
     <w:tmpl w:val="78526BF0"/>
@@ -7884,7 +10091,7 @@
       </w:pPr>
     </w:lvl>
   </w:abstractNum>
-  <w:abstractNum w:abstractNumId="28" w15:restartNumberingAfterBreak="0">
+  <w:abstractNum w:abstractNumId="33" w15:restartNumberingAfterBreak="0">
     <w:nsid w:val="6741648B"/>
     <w:multiLevelType w:val="hybridMultilevel"/>
     <w:tmpl w:val="09D0E646"/>
@@ -7973,7 +10180,7 @@
       </w:pPr>
     </w:lvl>
   </w:abstractNum>
-  <w:abstractNum w:abstractNumId="29" w15:restartNumberingAfterBreak="0">
+  <w:abstractNum w:abstractNumId="34" w15:restartNumberingAfterBreak="0">
     <w:nsid w:val="6BBD7F97"/>
     <w:multiLevelType w:val="hybridMultilevel"/>
     <w:tmpl w:val="C712AB82"/>
@@ -8062,7 +10269,7 @@
       </w:pPr>
     </w:lvl>
   </w:abstractNum>
-  <w:abstractNum w:abstractNumId="30" w15:restartNumberingAfterBreak="0">
+  <w:abstractNum w:abstractNumId="35" w15:restartNumberingAfterBreak="0">
     <w:nsid w:val="6C787C33"/>
     <w:multiLevelType w:val="hybridMultilevel"/>
     <w:tmpl w:val="52226456"/>
@@ -8151,7 +10358,7 @@
       </w:pPr>
     </w:lvl>
   </w:abstractNum>
-  <w:abstractNum w:abstractNumId="31" w15:restartNumberingAfterBreak="0">
+  <w:abstractNum w:abstractNumId="36" w15:restartNumberingAfterBreak="0">
     <w:nsid w:val="6C891ED1"/>
     <w:multiLevelType w:val="hybridMultilevel"/>
     <w:tmpl w:val="AFC6B320"/>
@@ -8240,7 +10447,7 @@
       </w:pPr>
     </w:lvl>
   </w:abstractNum>
-  <w:abstractNum w:abstractNumId="32" w15:restartNumberingAfterBreak="0">
+  <w:abstractNum w:abstractNumId="37" w15:restartNumberingAfterBreak="0">
     <w:nsid w:val="6FA56498"/>
     <w:multiLevelType w:val="hybridMultilevel"/>
     <w:tmpl w:val="EC9CE2A6"/>
@@ -8331,7 +10538,7 @@
       </w:pPr>
     </w:lvl>
   </w:abstractNum>
-  <w:abstractNum w:abstractNumId="33" w15:restartNumberingAfterBreak="0">
+  <w:abstractNum w:abstractNumId="38" w15:restartNumberingAfterBreak="0">
     <w:nsid w:val="73402F57"/>
     <w:multiLevelType w:val="hybridMultilevel"/>
     <w:tmpl w:val="62780A74"/>
@@ -8420,7 +10627,7 @@
       </w:pPr>
     </w:lvl>
   </w:abstractNum>
-  <w:abstractNum w:abstractNumId="34" w15:restartNumberingAfterBreak="0">
+  <w:abstractNum w:abstractNumId="39" w15:restartNumberingAfterBreak="0">
     <w:nsid w:val="74704194"/>
     <w:multiLevelType w:val="hybridMultilevel"/>
     <w:tmpl w:val="54C47C80"/>
@@ -8509,7 +10716,7 @@
       </w:pPr>
     </w:lvl>
   </w:abstractNum>
-  <w:abstractNum w:abstractNumId="35" w15:restartNumberingAfterBreak="0">
+  <w:abstractNum w:abstractNumId="40" w15:restartNumberingAfterBreak="0">
     <w:nsid w:val="7527302C"/>
     <w:multiLevelType w:val="hybridMultilevel"/>
     <w:tmpl w:val="4A6C8924"/>
@@ -8598,7 +10805,7 @@
       </w:pPr>
     </w:lvl>
   </w:abstractNum>
-  <w:abstractNum w:abstractNumId="36" w15:restartNumberingAfterBreak="0">
+  <w:abstractNum w:abstractNumId="41" w15:restartNumberingAfterBreak="0">
     <w:nsid w:val="7F715AAC"/>
     <w:multiLevelType w:val="hybridMultilevel"/>
     <w:tmpl w:val="20FCC3D2"/>
@@ -8688,19 +10895,19 @@
     </w:lvl>
   </w:abstractNum>
   <w:num w:numId="1" w16cid:durableId="1929191308">
+    <w:abstractNumId w:val="33"/>
+  </w:num>
+  <w:num w:numId="2" w16cid:durableId="1452818009">
     <w:abstractNumId w:val="28"/>
   </w:num>
-  <w:num w:numId="2" w16cid:durableId="1452818009">
-    <w:abstractNumId w:val="23"/>
-  </w:num>
   <w:num w:numId="3" w16cid:durableId="379129943">
-    <w:abstractNumId w:val="19"/>
+    <w:abstractNumId w:val="24"/>
   </w:num>
   <w:num w:numId="4" w16cid:durableId="1063913110">
-    <w:abstractNumId w:val="33"/>
+    <w:abstractNumId w:val="38"/>
   </w:num>
   <w:num w:numId="5" w16cid:durableId="1823230013">
-    <w:abstractNumId w:val="36"/>
+    <w:abstractNumId w:val="41"/>
   </w:num>
   <w:num w:numId="6" w16cid:durableId="1228151261">
     <w:abstractNumId w:val="7"/>
@@ -8712,91 +10919,106 @@
     <w:abstractNumId w:val="6"/>
   </w:num>
   <w:num w:numId="9" w16cid:durableId="1485926871">
-    <w:abstractNumId w:val="22"/>
+    <w:abstractNumId w:val="27"/>
   </w:num>
   <w:num w:numId="10" w16cid:durableId="382295947">
+    <w:abstractNumId w:val="39"/>
+  </w:num>
+  <w:num w:numId="11" w16cid:durableId="266929314">
+    <w:abstractNumId w:val="31"/>
+  </w:num>
+  <w:num w:numId="12" w16cid:durableId="858810609">
+    <w:abstractNumId w:val="15"/>
+  </w:num>
+  <w:num w:numId="13" w16cid:durableId="920332385">
+    <w:abstractNumId w:val="30"/>
+  </w:num>
+  <w:num w:numId="14" w16cid:durableId="1438059950">
+    <w:abstractNumId w:val="9"/>
+  </w:num>
+  <w:num w:numId="15" w16cid:durableId="1506941495">
+    <w:abstractNumId w:val="36"/>
+  </w:num>
+  <w:num w:numId="16" w16cid:durableId="1229996536">
+    <w:abstractNumId w:val="20"/>
+  </w:num>
+  <w:num w:numId="17" w16cid:durableId="47920956">
     <w:abstractNumId w:val="34"/>
   </w:num>
-  <w:num w:numId="11" w16cid:durableId="266929314">
-    <w:abstractNumId w:val="26"/>
-  </w:num>
-  <w:num w:numId="12" w16cid:durableId="858810609">
-    <w:abstractNumId w:val="13"/>
-  </w:num>
-  <w:num w:numId="13" w16cid:durableId="920332385">
-    <w:abstractNumId w:val="25"/>
-  </w:num>
-  <w:num w:numId="14" w16cid:durableId="1438059950">
-    <w:abstractNumId w:val="8"/>
-  </w:num>
-  <w:num w:numId="15" w16cid:durableId="1506941495">
-    <w:abstractNumId w:val="31"/>
-  </w:num>
-  <w:num w:numId="16" w16cid:durableId="1229996536">
-    <w:abstractNumId w:val="16"/>
-  </w:num>
-  <w:num w:numId="17" w16cid:durableId="47920956">
-    <w:abstractNumId w:val="29"/>
-  </w:num>
   <w:num w:numId="18" w16cid:durableId="1369448543">
-    <w:abstractNumId w:val="32"/>
+    <w:abstractNumId w:val="37"/>
   </w:num>
   <w:num w:numId="19" w16cid:durableId="283193473">
     <w:abstractNumId w:val="2"/>
   </w:num>
   <w:num w:numId="20" w16cid:durableId="848714178">
-    <w:abstractNumId w:val="21"/>
+    <w:abstractNumId w:val="26"/>
   </w:num>
   <w:num w:numId="21" w16cid:durableId="857545553">
-    <w:abstractNumId w:val="15"/>
+    <w:abstractNumId w:val="19"/>
   </w:num>
   <w:num w:numId="22" w16cid:durableId="492532390">
-    <w:abstractNumId w:val="35"/>
+    <w:abstractNumId w:val="40"/>
   </w:num>
   <w:num w:numId="23" w16cid:durableId="396367076">
-    <w:abstractNumId w:val="27"/>
+    <w:abstractNumId w:val="32"/>
   </w:num>
   <w:num w:numId="24" w16cid:durableId="227307955">
-    <w:abstractNumId w:val="9"/>
+    <w:abstractNumId w:val="10"/>
   </w:num>
   <w:num w:numId="25" w16cid:durableId="17509084">
-    <w:abstractNumId w:val="20"/>
+    <w:abstractNumId w:val="25"/>
   </w:num>
   <w:num w:numId="26" w16cid:durableId="1146581446">
     <w:abstractNumId w:val="0"/>
   </w:num>
   <w:num w:numId="27" w16cid:durableId="389350057">
-    <w:abstractNumId w:val="10"/>
+    <w:abstractNumId w:val="11"/>
   </w:num>
   <w:num w:numId="28" w16cid:durableId="1149519509">
-    <w:abstractNumId w:val="17"/>
+    <w:abstractNumId w:val="21"/>
   </w:num>
   <w:num w:numId="29" w16cid:durableId="1244485211">
-    <w:abstractNumId w:val="11"/>
+    <w:abstractNumId w:val="12"/>
   </w:num>
   <w:num w:numId="30" w16cid:durableId="878470731">
     <w:abstractNumId w:val="3"/>
   </w:num>
   <w:num w:numId="31" w16cid:durableId="511141832">
-    <w:abstractNumId w:val="12"/>
+    <w:abstractNumId w:val="14"/>
   </w:num>
   <w:num w:numId="32" w16cid:durableId="1470854529">
     <w:abstractNumId w:val="5"/>
   </w:num>
   <w:num w:numId="33" w16cid:durableId="1618953520">
-    <w:abstractNumId w:val="30"/>
+    <w:abstractNumId w:val="35"/>
   </w:num>
   <w:num w:numId="34" w16cid:durableId="211234391">
     <w:abstractNumId w:val="1"/>
   </w:num>
   <w:num w:numId="35" w16cid:durableId="1606377627">
-    <w:abstractNumId w:val="24"/>
+    <w:abstractNumId w:val="29"/>
   </w:num>
   <w:num w:numId="36" w16cid:durableId="360866260">
+    <w:abstractNumId w:val="23"/>
+  </w:num>
+  <w:num w:numId="37" w16cid:durableId="527376701">
+    <w:abstractNumId w:val="17"/>
+  </w:num>
+  <w:num w:numId="38" w16cid:durableId="1741711442">
     <w:abstractNumId w:val="18"/>
   </w:num>
-  <w:num w:numId="37" w16cid:durableId="527376701">
-    <w:abstractNumId w:val="14"/>
+  <w:num w:numId="39" w16cid:durableId="836387608">
+    <w:abstractNumId w:val="22"/>
+  </w:num>
+  <w:num w:numId="40" w16cid:durableId="1845123811">
+    <w:abstractNumId w:val="13"/>
+  </w:num>
+  <w:num w:numId="41" w16cid:durableId="390660794">
+    <w:abstractNumId w:val="8"/>
+  </w:num>
+  <w:num w:numId="42" w16cid:durableId="1574511577">
+    <w:abstractNumId w:val="16"/>
   </w:num>
 </w:numbering>
 </file>

</xml_diff>

<commit_message>
8th and 9th Lecture on LL
</commit_message>
<xml_diff>
--- a/Notes/LL.docx
+++ b/Notes/LL.docx
@@ -162,24 +162,8 @@
         <w:rPr>
           <w:lang w:val="en-US"/>
         </w:rPr>
-        <w:t xml:space="preserve">Assign the </w:t>
-      </w:r>
-      <w:proofErr w:type="spellStart"/>
-      <w:proofErr w:type="gramStart"/>
-      <w:r>
-        <w:rPr>
-          <w:lang w:val="en-US"/>
-        </w:rPr>
-        <w:t>temp,head</w:t>
-      </w:r>
-      <w:proofErr w:type="gramEnd"/>
-      <w:r>
-        <w:rPr>
-          <w:lang w:val="en-US"/>
-        </w:rPr>
-        <w:t>,mover</w:t>
-      </w:r>
-      <w:proofErr w:type="spellEnd"/>
+        <w:t>Assign the temp,head,mover</w:t>
+      </w:r>
     </w:p>
     <w:p>
       <w:pPr>
@@ -249,43 +233,7 @@
           <w:bCs/>
           <w:lang w:val="en-US"/>
         </w:rPr>
-        <w:t>/</w:t>
-      </w:r>
-      <w:proofErr w:type="gramStart"/>
-      <w:r>
-        <w:rPr>
-          <w:b/>
-          <w:bCs/>
-          <w:lang w:val="en-US"/>
-        </w:rPr>
-        <w:t>/  Traversal</w:t>
-      </w:r>
-      <w:proofErr w:type="gramEnd"/>
-      <w:r>
-        <w:rPr>
-          <w:b/>
-          <w:bCs/>
-          <w:lang w:val="en-US"/>
-        </w:rPr>
-        <w:t xml:space="preserve"> </w:t>
-      </w:r>
-      <w:proofErr w:type="spellStart"/>
-      <w:r>
-        <w:rPr>
-          <w:b/>
-          <w:bCs/>
-          <w:lang w:val="en-US"/>
-        </w:rPr>
-        <w:t>os</w:t>
-      </w:r>
-      <w:proofErr w:type="spellEnd"/>
-      <w:r>
-        <w:rPr>
-          <w:b/>
-          <w:bCs/>
-          <w:lang w:val="en-US"/>
-        </w:rPr>
-        <w:t xml:space="preserve"> LL</w:t>
+        <w:t>//  Traversal os LL</w:t>
       </w:r>
     </w:p>
     <w:p>
@@ -321,21 +269,7 @@
         <w:rPr>
           <w:lang w:val="en-US"/>
         </w:rPr>
-        <w:t xml:space="preserve">Till the </w:t>
-      </w:r>
-      <w:proofErr w:type="gramStart"/>
-      <w:r>
-        <w:rPr>
-          <w:lang w:val="en-US"/>
-        </w:rPr>
-        <w:t>temp !</w:t>
-      </w:r>
-      <w:proofErr w:type="gramEnd"/>
-      <w:r>
-        <w:rPr>
-          <w:lang w:val="en-US"/>
-        </w:rPr>
-        <w:t>= null</w:t>
+        <w:t>Till the temp != null</w:t>
       </w:r>
     </w:p>
     <w:p>
@@ -406,23 +340,7 @@
         <w:rPr>
           <w:lang w:val="en-US"/>
         </w:rPr>
-        <w:t xml:space="preserve">Assign the head to the </w:t>
-      </w:r>
-      <w:proofErr w:type="spellStart"/>
-      <w:proofErr w:type="gramStart"/>
-      <w:r>
-        <w:rPr>
-          <w:lang w:val="en-US"/>
-        </w:rPr>
-        <w:t>temp,count</w:t>
-      </w:r>
-      <w:proofErr w:type="spellEnd"/>
-      <w:proofErr w:type="gramEnd"/>
-      <w:r>
-        <w:rPr>
-          <w:lang w:val="en-US"/>
-        </w:rPr>
-        <w:t xml:space="preserve"> =0</w:t>
+        <w:t>Assign the head to the temp,count =0</w:t>
       </w:r>
     </w:p>
     <w:p>
@@ -440,21 +358,7 @@
         <w:rPr>
           <w:lang w:val="en-US"/>
         </w:rPr>
-        <w:t xml:space="preserve">Till the </w:t>
-      </w:r>
-      <w:proofErr w:type="gramStart"/>
-      <w:r>
-        <w:rPr>
-          <w:lang w:val="en-US"/>
-        </w:rPr>
-        <w:t>temp !</w:t>
-      </w:r>
-      <w:proofErr w:type="gramEnd"/>
-      <w:r>
-        <w:rPr>
-          <w:lang w:val="en-US"/>
-        </w:rPr>
-        <w:t>= null</w:t>
+        <w:t>Till the temp != null</w:t>
       </w:r>
     </w:p>
     <w:p>
@@ -543,21 +447,7 @@
         <w:rPr>
           <w:lang w:val="en-US"/>
         </w:rPr>
-        <w:t xml:space="preserve">Till the </w:t>
-      </w:r>
-      <w:proofErr w:type="gramStart"/>
-      <w:r>
-        <w:rPr>
-          <w:lang w:val="en-US"/>
-        </w:rPr>
-        <w:t>temp !</w:t>
-      </w:r>
-      <w:proofErr w:type="gramEnd"/>
-      <w:r>
-        <w:rPr>
-          <w:lang w:val="en-US"/>
-        </w:rPr>
-        <w:t>= null</w:t>
+        <w:t>Till the temp != null</w:t>
       </w:r>
     </w:p>
     <w:p>
@@ -575,21 +465,7 @@
         <w:rPr>
           <w:lang w:val="en-US"/>
         </w:rPr>
-        <w:t xml:space="preserve">If temp’s </w:t>
-      </w:r>
-      <w:proofErr w:type="gramStart"/>
-      <w:r>
-        <w:rPr>
-          <w:lang w:val="en-US"/>
-        </w:rPr>
-        <w:t>data  =</w:t>
-      </w:r>
-      <w:proofErr w:type="gramEnd"/>
-      <w:r>
-        <w:rPr>
-          <w:lang w:val="en-US"/>
-        </w:rPr>
-        <w:t xml:space="preserve">= target </w:t>
+        <w:t xml:space="preserve">If temp’s data  == target </w:t>
       </w:r>
     </w:p>
     <w:p>
@@ -931,21 +807,7 @@
         <w:rPr>
           <w:lang w:val="en-US"/>
         </w:rPr>
-        <w:t xml:space="preserve">Base condition </w:t>
-      </w:r>
-      <w:proofErr w:type="gramStart"/>
-      <w:r>
-        <w:rPr>
-          <w:lang w:val="en-US"/>
-        </w:rPr>
-        <w:t>check</w:t>
-      </w:r>
-      <w:proofErr w:type="gramEnd"/>
-      <w:r>
-        <w:rPr>
-          <w:lang w:val="en-US"/>
-        </w:rPr>
-        <w:t xml:space="preserve"> the head is null or having the single element </w:t>
+        <w:t xml:space="preserve">Base condition check the head is null or having the single element </w:t>
       </w:r>
     </w:p>
     <w:p>
@@ -959,19 +821,11 @@
           <w:lang w:val="en-US"/>
         </w:rPr>
       </w:pPr>
-      <w:proofErr w:type="spellStart"/>
-      <w:r>
-        <w:rPr>
-          <w:lang w:val="en-US"/>
-        </w:rPr>
-        <w:t>Retun</w:t>
-      </w:r>
-      <w:proofErr w:type="spellEnd"/>
-      <w:r>
-        <w:rPr>
-          <w:lang w:val="en-US"/>
-        </w:rPr>
-        <w:t xml:space="preserve"> null</w:t>
+      <w:r>
+        <w:rPr>
+          <w:lang w:val="en-US"/>
+        </w:rPr>
+        <w:t>Retun null</w:t>
       </w:r>
     </w:p>
     <w:p>
@@ -1091,35 +945,7 @@
         <w:rPr>
           <w:lang w:val="en-US"/>
         </w:rPr>
-        <w:t>Head == null (</w:t>
-      </w:r>
-      <w:proofErr w:type="gramStart"/>
-      <w:r>
-        <w:rPr>
-          <w:lang w:val="en-US"/>
-        </w:rPr>
-        <w:t>0 )</w:t>
-      </w:r>
-      <w:proofErr w:type="gramEnd"/>
-      <w:r>
-        <w:rPr>
-          <w:lang w:val="en-US"/>
-        </w:rPr>
-        <w:t xml:space="preserve"> || </w:t>
-      </w:r>
-      <w:proofErr w:type="spellStart"/>
-      <w:r>
-        <w:rPr>
-          <w:lang w:val="en-US"/>
-        </w:rPr>
-        <w:t>head.next</w:t>
-      </w:r>
-      <w:proofErr w:type="spellEnd"/>
-      <w:r>
-        <w:rPr>
-          <w:lang w:val="en-US"/>
-        </w:rPr>
-        <w:t xml:space="preserve"> == null (1)</w:t>
+        <w:t>Head == null (0 ) || head.next == null (1)</w:t>
       </w:r>
     </w:p>
     <w:p>
@@ -1155,21 +981,7 @@
         <w:rPr>
           <w:lang w:val="en-US"/>
         </w:rPr>
-        <w:t xml:space="preserve">Go till the second </w:t>
-      </w:r>
-      <w:proofErr w:type="gramStart"/>
-      <w:r>
-        <w:rPr>
-          <w:lang w:val="en-US"/>
-        </w:rPr>
-        <w:t>last !</w:t>
-      </w:r>
-      <w:proofErr w:type="gramEnd"/>
-      <w:r>
-        <w:rPr>
-          <w:lang w:val="en-US"/>
-        </w:rPr>
-        <w:t>= null</w:t>
+        <w:t>Go till the second last != null</w:t>
       </w:r>
     </w:p>
     <w:p>
@@ -1242,16 +1054,8 @@
         <w:rPr>
           <w:lang w:val="en-US"/>
         </w:rPr>
-        <w:t xml:space="preserve">Check the for base </w:t>
-      </w:r>
-      <w:proofErr w:type="spellStart"/>
-      <w:r>
-        <w:rPr>
-          <w:lang w:val="en-US"/>
-        </w:rPr>
-        <w:t>condiion</w:t>
-      </w:r>
-      <w:proofErr w:type="spellEnd"/>
+        <w:t>Check the for base condiion</w:t>
+      </w:r>
     </w:p>
     <w:p>
       <w:pPr>
@@ -1310,21 +1114,7 @@
         <w:rPr>
           <w:lang w:val="en-US"/>
         </w:rPr>
-        <w:t xml:space="preserve">Assign </w:t>
-      </w:r>
-      <w:proofErr w:type="spellStart"/>
-      <w:r>
-        <w:rPr>
-          <w:lang w:val="en-US"/>
-        </w:rPr>
-        <w:t>prev</w:t>
-      </w:r>
-      <w:proofErr w:type="spellEnd"/>
-      <w:r>
-        <w:rPr>
-          <w:lang w:val="en-US"/>
-        </w:rPr>
-        <w:t xml:space="preserve"> = null</w:t>
+        <w:t>Assign prev = null</w:t>
       </w:r>
     </w:p>
     <w:p>
@@ -1360,27 +1150,13 @@
         <w:rPr>
           <w:lang w:val="en-US"/>
         </w:rPr>
-        <w:t xml:space="preserve">Go </w:t>
-      </w:r>
-      <w:proofErr w:type="gramStart"/>
-      <w:r>
-        <w:rPr>
-          <w:lang w:val="en-US"/>
-        </w:rPr>
-        <w:t xml:space="preserve">till </w:t>
-      </w:r>
-      <w:r>
-        <w:rPr>
-          <w:lang w:val="en-US"/>
-        </w:rPr>
-        <w:t xml:space="preserve"> the</w:t>
-      </w:r>
-      <w:proofErr w:type="gramEnd"/>
-      <w:r>
-        <w:rPr>
-          <w:lang w:val="en-US"/>
-        </w:rPr>
-        <w:t xml:space="preserve"> last element </w:t>
+        <w:t xml:space="preserve">Go till </w:t>
+      </w:r>
+      <w:r>
+        <w:rPr>
+          <w:lang w:val="en-US"/>
+        </w:rPr>
+        <w:t xml:space="preserve"> the last element </w:t>
       </w:r>
     </w:p>
     <w:p>
@@ -1434,30 +1210,8 @@
         <w:rPr>
           <w:lang w:val="en-US"/>
         </w:rPr>
-        <w:t xml:space="preserve">Prev next = </w:t>
-      </w:r>
-      <w:proofErr w:type="spellStart"/>
-      <w:r>
-        <w:rPr>
-          <w:lang w:val="en-US"/>
-        </w:rPr>
-        <w:t>prev</w:t>
-      </w:r>
-      <w:proofErr w:type="spellEnd"/>
-      <w:r>
-        <w:rPr>
-          <w:lang w:val="en-US"/>
-        </w:rPr>
-        <w:t xml:space="preserve"> next </w:t>
-      </w:r>
-      <w:proofErr w:type="spellStart"/>
-      <w:r>
-        <w:rPr>
-          <w:lang w:val="en-US"/>
-        </w:rPr>
-        <w:t>next</w:t>
-      </w:r>
-      <w:proofErr w:type="spellEnd"/>
+        <w:t>Prev next = prev next next</w:t>
+      </w:r>
     </w:p>
     <w:p>
       <w:pPr>
@@ -1474,21 +1228,7 @@
         <w:rPr>
           <w:lang w:val="en-US"/>
         </w:rPr>
-        <w:t xml:space="preserve">Else move to the </w:t>
-      </w:r>
-      <w:proofErr w:type="spellStart"/>
-      <w:r>
-        <w:rPr>
-          <w:lang w:val="en-US"/>
-        </w:rPr>
-        <w:t>prv</w:t>
-      </w:r>
-      <w:proofErr w:type="spellEnd"/>
-      <w:r>
-        <w:rPr>
-          <w:lang w:val="en-US"/>
-        </w:rPr>
-        <w:t xml:space="preserve"> = temp</w:t>
+        <w:t>Else move to the prv = temp</w:t>
       </w:r>
     </w:p>
     <w:p>
@@ -1563,28 +1303,12 @@
           <w:lang w:val="en-US"/>
         </w:rPr>
       </w:pPr>
-      <w:proofErr w:type="spellStart"/>
-      <w:r>
-        <w:rPr>
-          <w:lang w:val="en-US"/>
-        </w:rPr>
-        <w:t>Head.data</w:t>
-      </w:r>
-      <w:proofErr w:type="spellEnd"/>
-      <w:r>
-        <w:rPr>
-          <w:lang w:val="en-US"/>
-        </w:rPr>
-        <w:t xml:space="preserve"> == </w:t>
-      </w:r>
-      <w:proofErr w:type="spellStart"/>
-      <w:r>
-        <w:rPr>
-          <w:lang w:val="en-US"/>
-        </w:rPr>
-        <w:t>el</w:t>
-      </w:r>
-      <w:proofErr w:type="spellEnd"/>
+      <w:r>
+        <w:rPr>
+          <w:lang w:val="en-US"/>
+        </w:rPr>
+        <w:t>Head.data == el</w:t>
+      </w:r>
     </w:p>
     <w:p>
       <w:pPr>
@@ -1601,16 +1325,8 @@
         <w:rPr>
           <w:lang w:val="en-US"/>
         </w:rPr>
-        <w:t xml:space="preserve">Same as the </w:t>
-      </w:r>
-      <w:proofErr w:type="spellStart"/>
-      <w:r>
-        <w:rPr>
-          <w:lang w:val="en-US"/>
-        </w:rPr>
-        <w:t>head.data</w:t>
-      </w:r>
-      <w:proofErr w:type="spellEnd"/>
+        <w:t>Same as the head.data</w:t>
+      </w:r>
     </w:p>
     <w:p>
       <w:pPr>
@@ -1793,23 +1509,7 @@
         <w:rPr>
           <w:lang w:val="en-US"/>
         </w:rPr>
-        <w:t xml:space="preserve">Go till the last that is </w:t>
-      </w:r>
-      <w:proofErr w:type="spellStart"/>
-      <w:proofErr w:type="gramStart"/>
-      <w:r>
-        <w:rPr>
-          <w:lang w:val="en-US"/>
-        </w:rPr>
-        <w:t>temp.next</w:t>
-      </w:r>
-      <w:proofErr w:type="spellEnd"/>
-      <w:proofErr w:type="gramEnd"/>
-      <w:r>
-        <w:rPr>
-          <w:lang w:val="en-US"/>
-        </w:rPr>
-        <w:t xml:space="preserve"> != null</w:t>
+        <w:t>Go till the last that is temp.next != null</w:t>
       </w:r>
     </w:p>
     <w:p>
@@ -1827,21 +1527,7 @@
         <w:rPr>
           <w:lang w:val="en-US"/>
         </w:rPr>
-        <w:t xml:space="preserve">Create the node and </w:t>
-      </w:r>
-      <w:proofErr w:type="gramStart"/>
-      <w:r>
-        <w:rPr>
-          <w:lang w:val="en-US"/>
-        </w:rPr>
-        <w:t>it’s</w:t>
-      </w:r>
-      <w:proofErr w:type="gramEnd"/>
-      <w:r>
-        <w:rPr>
-          <w:lang w:val="en-US"/>
-        </w:rPr>
-        <w:t xml:space="preserve"> next points to the null</w:t>
+        <w:t>Create the node and it’s next points to the null</w:t>
       </w:r>
     </w:p>
     <w:p>
@@ -1855,30 +1541,12 @@
           <w:lang w:val="en-US"/>
         </w:rPr>
       </w:pPr>
-      <w:proofErr w:type="spellStart"/>
-      <w:proofErr w:type="gramStart"/>
-      <w:r>
-        <w:rPr>
-          <w:lang w:val="en-US"/>
-        </w:rPr>
-        <w:t>Temp;s</w:t>
-      </w:r>
-      <w:proofErr w:type="spellEnd"/>
-      <w:proofErr w:type="gramEnd"/>
-      <w:r>
-        <w:rPr>
-          <w:lang w:val="en-US"/>
-        </w:rPr>
-        <w:t xml:space="preserve"> next points to  the </w:t>
-      </w:r>
-      <w:proofErr w:type="spellStart"/>
-      <w:r>
-        <w:rPr>
-          <w:lang w:val="en-US"/>
-        </w:rPr>
-        <w:t>nn</w:t>
-      </w:r>
-      <w:proofErr w:type="spellEnd"/>
+      <w:r>
+        <w:rPr>
+          <w:lang w:val="en-US"/>
+        </w:rPr>
+        <w:t>Temp;s next points to  the nn</w:t>
+      </w:r>
     </w:p>
     <w:p>
       <w:pPr>
@@ -1948,21 +1616,7 @@
         <w:rPr>
           <w:lang w:val="en-US"/>
         </w:rPr>
-        <w:t xml:space="preserve">If the length is greater than </w:t>
-      </w:r>
-      <w:proofErr w:type="gramStart"/>
-      <w:r>
-        <w:rPr>
-          <w:lang w:val="en-US"/>
-        </w:rPr>
-        <w:t>1  call</w:t>
-      </w:r>
-      <w:proofErr w:type="gramEnd"/>
-      <w:r>
-        <w:rPr>
-          <w:lang w:val="en-US"/>
-        </w:rPr>
-        <w:t xml:space="preserve"> the INSERT HEAD FUNCTION</w:t>
+        <w:t>If the length is greater than 1  call the INSERT HEAD FUNCTION</w:t>
       </w:r>
     </w:p>
     <w:p>
@@ -2034,21 +1688,7 @@
         <w:rPr>
           <w:lang w:val="en-US"/>
         </w:rPr>
-        <w:t xml:space="preserve">Go till the last </w:t>
-      </w:r>
-      <w:proofErr w:type="gramStart"/>
-      <w:r>
-        <w:rPr>
-          <w:lang w:val="en-US"/>
-        </w:rPr>
-        <w:t>temp !</w:t>
-      </w:r>
-      <w:proofErr w:type="gramEnd"/>
-      <w:r>
-        <w:rPr>
-          <w:lang w:val="en-US"/>
-        </w:rPr>
-        <w:t>= null</w:t>
+        <w:t>Go till the last temp != null</w:t>
       </w:r>
     </w:p>
     <w:p>
@@ -2066,21 +1706,7 @@
         <w:rPr>
           <w:lang w:val="en-US"/>
         </w:rPr>
-        <w:t xml:space="preserve">Increase the </w:t>
-      </w:r>
-      <w:proofErr w:type="gramStart"/>
-      <w:r>
-        <w:rPr>
-          <w:lang w:val="en-US"/>
-        </w:rPr>
-        <w:t>count  by</w:t>
-      </w:r>
-      <w:proofErr w:type="gramEnd"/>
-      <w:r>
-        <w:rPr>
-          <w:lang w:val="en-US"/>
-        </w:rPr>
-        <w:t xml:space="preserve"> 1</w:t>
+        <w:t>Increase the count  by 1</w:t>
       </w:r>
     </w:p>
     <w:p>
@@ -2098,21 +1724,7 @@
         <w:rPr>
           <w:lang w:val="en-US"/>
         </w:rPr>
-        <w:t xml:space="preserve">If count == k-1 that Is </w:t>
-      </w:r>
-      <w:proofErr w:type="spellStart"/>
-      <w:r>
-        <w:rPr>
-          <w:lang w:val="en-US"/>
-        </w:rPr>
-        <w:t>befor</w:t>
-      </w:r>
-      <w:proofErr w:type="spellEnd"/>
-      <w:r>
-        <w:rPr>
-          <w:lang w:val="en-US"/>
-        </w:rPr>
-        <w:t xml:space="preserve"> the kth node</w:t>
+        <w:t>If count == k-1 that Is befor the kth node</w:t>
       </w:r>
     </w:p>
     <w:p>
@@ -2148,21 +1760,7 @@
         <w:rPr>
           <w:lang w:val="en-US"/>
         </w:rPr>
-        <w:t xml:space="preserve">Remember </w:t>
-      </w:r>
-      <w:proofErr w:type="spellStart"/>
-      <w:r>
-        <w:rPr>
-          <w:lang w:val="en-US"/>
-        </w:rPr>
-        <w:t>nn’s</w:t>
-      </w:r>
-      <w:proofErr w:type="spellEnd"/>
-      <w:r>
-        <w:rPr>
-          <w:lang w:val="en-US"/>
-        </w:rPr>
-        <w:t xml:space="preserve"> next points to the temp’s next</w:t>
+        <w:t>Remember nn’s next points to the temp’s next</w:t>
       </w:r>
     </w:p>
     <w:p>
@@ -2180,30 +1778,8 @@
         <w:rPr>
           <w:lang w:val="en-US"/>
         </w:rPr>
-        <w:t xml:space="preserve">Temp’s next points </w:t>
-      </w:r>
-      <w:proofErr w:type="gramStart"/>
-      <w:r>
-        <w:rPr>
-          <w:lang w:val="en-US"/>
-        </w:rPr>
-        <w:t>to  the</w:t>
-      </w:r>
-      <w:proofErr w:type="gramEnd"/>
-      <w:r>
-        <w:rPr>
-          <w:lang w:val="en-US"/>
-        </w:rPr>
-        <w:t xml:space="preserve"> </w:t>
-      </w:r>
-      <w:proofErr w:type="spellStart"/>
-      <w:r>
-        <w:rPr>
-          <w:lang w:val="en-US"/>
-        </w:rPr>
-        <w:t>nn</w:t>
-      </w:r>
-      <w:proofErr w:type="spellEnd"/>
+        <w:t>Temp’s next points to  the nn</w:t>
+      </w:r>
     </w:p>
     <w:p>
       <w:pPr>
@@ -2220,18 +1796,8 @@
         <w:rPr>
           <w:lang w:val="en-US"/>
         </w:rPr>
-        <w:t xml:space="preserve">Else temp = </w:t>
-      </w:r>
-      <w:proofErr w:type="spellStart"/>
-      <w:proofErr w:type="gramStart"/>
-      <w:r>
-        <w:rPr>
-          <w:lang w:val="en-US"/>
-        </w:rPr>
-        <w:t>temp.next</w:t>
-      </w:r>
-      <w:proofErr w:type="spellEnd"/>
-      <w:proofErr w:type="gramEnd"/>
+        <w:t>Else temp = temp.next</w:t>
+      </w:r>
     </w:p>
     <w:p>
       <w:pPr>
@@ -2265,29 +1831,7 @@
         <w:rPr>
           <w:lang w:val="en-US"/>
         </w:rPr>
-        <w:t xml:space="preserve">Base condition head is null not k ==1 </w:t>
-      </w:r>
-      <w:proofErr w:type="spellStart"/>
-      <w:proofErr w:type="gramStart"/>
-      <w:r>
-        <w:rPr>
-          <w:lang w:val="en-US"/>
-        </w:rPr>
-        <w:t>becoz</w:t>
-      </w:r>
-      <w:proofErr w:type="spellEnd"/>
-      <w:r>
-        <w:rPr>
-          <w:lang w:val="en-US"/>
-        </w:rPr>
-        <w:t xml:space="preserve">  value</w:t>
-      </w:r>
-      <w:proofErr w:type="gramEnd"/>
-      <w:r>
-        <w:rPr>
-          <w:lang w:val="en-US"/>
-        </w:rPr>
-        <w:t xml:space="preserve"> Is found for the null</w:t>
+        <w:t>Base condition head is null not k ==1 becoz  value Is found for the null</w:t>
       </w:r>
     </w:p>
     <w:p>
@@ -2305,21 +1849,7 @@
         <w:rPr>
           <w:lang w:val="en-US"/>
         </w:rPr>
-        <w:t xml:space="preserve">If value is in the head head’s </w:t>
-      </w:r>
-      <w:proofErr w:type="gramStart"/>
-      <w:r>
-        <w:rPr>
-          <w:lang w:val="en-US"/>
-        </w:rPr>
-        <w:t>data  =</w:t>
-      </w:r>
-      <w:proofErr w:type="gramEnd"/>
-      <w:r>
-        <w:rPr>
-          <w:lang w:val="en-US"/>
-        </w:rPr>
-        <w:t xml:space="preserve"> given data</w:t>
+        <w:t>If value is in the head head’s data  = given data</w:t>
       </w:r>
     </w:p>
     <w:p>
@@ -2355,21 +1885,7 @@
         <w:rPr>
           <w:lang w:val="en-US"/>
         </w:rPr>
-        <w:t xml:space="preserve">While temp’s </w:t>
-      </w:r>
-      <w:proofErr w:type="gramStart"/>
-      <w:r>
-        <w:rPr>
-          <w:lang w:val="en-US"/>
-        </w:rPr>
-        <w:t>next !</w:t>
-      </w:r>
-      <w:proofErr w:type="gramEnd"/>
-      <w:r>
-        <w:rPr>
-          <w:lang w:val="en-US"/>
-        </w:rPr>
-        <w:t>= null</w:t>
+        <w:t>While temp’s next != null</w:t>
       </w:r>
     </w:p>
     <w:p>
@@ -2387,16 +1903,8 @@
         <w:rPr>
           <w:lang w:val="en-US"/>
         </w:rPr>
-        <w:t xml:space="preserve">Inside the loop temp’s next data == </w:t>
-      </w:r>
-      <w:proofErr w:type="spellStart"/>
-      <w:r>
-        <w:rPr>
-          <w:lang w:val="en-US"/>
-        </w:rPr>
-        <w:t>val</w:t>
-      </w:r>
-      <w:proofErr w:type="spellEnd"/>
+        <w:t>Inside the loop temp’s next data == val</w:t>
+      </w:r>
     </w:p>
     <w:p>
       <w:pPr>
@@ -2431,16 +1939,8 @@
         <w:rPr>
           <w:lang w:val="en-US"/>
         </w:rPr>
-        <w:t xml:space="preserve">Temp’s next points to the </w:t>
-      </w:r>
-      <w:proofErr w:type="spellStart"/>
-      <w:r>
-        <w:rPr>
-          <w:lang w:val="en-US"/>
-        </w:rPr>
-        <w:t>nn</w:t>
-      </w:r>
-      <w:proofErr w:type="spellEnd"/>
+        <w:t>Temp’s next points to the nn</w:t>
+      </w:r>
     </w:p>
     <w:p>
       <w:pPr>
@@ -2457,18 +1957,8 @@
         <w:rPr>
           <w:lang w:val="en-US"/>
         </w:rPr>
-        <w:t xml:space="preserve">Else the temp = </w:t>
-      </w:r>
-      <w:proofErr w:type="spellStart"/>
-      <w:proofErr w:type="gramStart"/>
-      <w:r>
-        <w:rPr>
-          <w:lang w:val="en-US"/>
-        </w:rPr>
-        <w:t>temp.next</w:t>
-      </w:r>
-      <w:proofErr w:type="spellEnd"/>
-      <w:proofErr w:type="gramEnd"/>
+        <w:t>Else the temp = temp.next</w:t>
+      </w:r>
     </w:p>
     <w:p>
       <w:pPr>
@@ -2625,7 +2115,6 @@
           <w:lang w:val="en-US"/>
         </w:rPr>
       </w:pPr>
-      <w:proofErr w:type="gramStart"/>
       <w:r>
         <w:rPr>
           <w:b/>
@@ -2640,16 +2129,7 @@
           <w:bCs/>
           <w:lang w:val="en-US"/>
         </w:rPr>
-        <w:t>OF</w:t>
-      </w:r>
-      <w:proofErr w:type="gramEnd"/>
-      <w:r>
-        <w:rPr>
-          <w:b/>
-          <w:bCs/>
-          <w:lang w:val="en-US"/>
-        </w:rPr>
-        <w:t xml:space="preserve"> DLL</w:t>
+        <w:t>OF DLL</w:t>
       </w:r>
     </w:p>
     <w:p>
@@ -2773,21 +2253,7 @@
         <w:rPr>
           <w:lang w:val="en-US"/>
         </w:rPr>
-        <w:t xml:space="preserve">Remember the head using </w:t>
-      </w:r>
-      <w:proofErr w:type="spellStart"/>
-      <w:r>
-        <w:rPr>
-          <w:lang w:val="en-US"/>
-        </w:rPr>
-        <w:t>prev</w:t>
-      </w:r>
-      <w:proofErr w:type="spellEnd"/>
-      <w:r>
-        <w:rPr>
-          <w:lang w:val="en-US"/>
-        </w:rPr>
-        <w:t xml:space="preserve"> variable</w:t>
+        <w:t>Remember the head using prev variable</w:t>
       </w:r>
     </w:p>
     <w:p>
@@ -2807,18 +2273,8 @@
         <w:rPr>
           <w:lang w:val="en-US"/>
         </w:rPr>
-        <w:t xml:space="preserve">Loop till </w:t>
-      </w:r>
-      <w:proofErr w:type="spellStart"/>
-      <w:proofErr w:type="gramStart"/>
-      <w:r>
-        <w:rPr>
-          <w:lang w:val="en-US"/>
-        </w:rPr>
-        <w:t>arr.length</w:t>
-      </w:r>
-      <w:proofErr w:type="spellEnd"/>
-      <w:proofErr w:type="gramEnd"/>
+        <w:t>Loop till arr.length</w:t>
+      </w:r>
     </w:p>
     <w:p>
       <w:pPr>
@@ -2877,30 +2333,8 @@
         <w:rPr>
           <w:lang w:val="en-US"/>
         </w:rPr>
-        <w:t xml:space="preserve">Point the </w:t>
-      </w:r>
-      <w:proofErr w:type="spellStart"/>
-      <w:r>
-        <w:rPr>
-          <w:lang w:val="en-US"/>
-        </w:rPr>
-        <w:t>temp’back</w:t>
-      </w:r>
-      <w:proofErr w:type="spellEnd"/>
-      <w:r>
-        <w:rPr>
-          <w:lang w:val="en-US"/>
-        </w:rPr>
-        <w:t xml:space="preserve"> to the </w:t>
-      </w:r>
-      <w:proofErr w:type="spellStart"/>
-      <w:r>
-        <w:rPr>
-          <w:lang w:val="en-US"/>
-        </w:rPr>
-        <w:t>prev</w:t>
-      </w:r>
-      <w:proofErr w:type="spellEnd"/>
+        <w:t>Point the temp’back to the prev</w:t>
+      </w:r>
     </w:p>
     <w:p>
       <w:pPr>
@@ -2915,21 +2349,11 @@
           <w:lang w:val="en-US"/>
         </w:rPr>
       </w:pPr>
-      <w:proofErr w:type="spellStart"/>
-      <w:proofErr w:type="gramStart"/>
-      <w:r>
-        <w:rPr>
-          <w:lang w:val="en-US"/>
-        </w:rPr>
-        <w:t>Prev,s</w:t>
-      </w:r>
-      <w:proofErr w:type="spellEnd"/>
-      <w:proofErr w:type="gramEnd"/>
-      <w:r>
-        <w:rPr>
-          <w:lang w:val="en-US"/>
-        </w:rPr>
-        <w:t xml:space="preserve"> next points to the temp</w:t>
+      <w:r>
+        <w:rPr>
+          <w:lang w:val="en-US"/>
+        </w:rPr>
+        <w:t>Prev,s next points to the temp</w:t>
       </w:r>
     </w:p>
     <w:p>
@@ -3003,21 +2427,7 @@
         <w:rPr>
           <w:lang w:val="en-US"/>
         </w:rPr>
-        <w:t xml:space="preserve">Base </w:t>
-      </w:r>
-      <w:proofErr w:type="spellStart"/>
-      <w:r>
-        <w:rPr>
-          <w:lang w:val="en-US"/>
-        </w:rPr>
-        <w:t>codition</w:t>
-      </w:r>
-      <w:proofErr w:type="spellEnd"/>
-      <w:r>
-        <w:rPr>
-          <w:lang w:val="en-US"/>
-        </w:rPr>
-        <w:t xml:space="preserve"> </w:t>
+        <w:t xml:space="preserve">Base codition </w:t>
       </w:r>
     </w:p>
     <w:p>
@@ -3071,21 +2481,7 @@
         <w:rPr>
           <w:lang w:val="en-US"/>
         </w:rPr>
-        <w:t xml:space="preserve">Remember the head use the </w:t>
-      </w:r>
-      <w:proofErr w:type="spellStart"/>
-      <w:r>
-        <w:rPr>
-          <w:lang w:val="en-US"/>
-        </w:rPr>
-        <w:t>prev</w:t>
-      </w:r>
-      <w:proofErr w:type="spellEnd"/>
-      <w:r>
-        <w:rPr>
-          <w:lang w:val="en-US"/>
-        </w:rPr>
-        <w:t xml:space="preserve"> variable</w:t>
+        <w:t>Remember the head use the prev variable</w:t>
       </w:r>
     </w:p>
     <w:p>
@@ -3121,21 +2517,7 @@
         <w:rPr>
           <w:lang w:val="en-US"/>
         </w:rPr>
-        <w:t xml:space="preserve">Point the </w:t>
-      </w:r>
-      <w:proofErr w:type="spellStart"/>
-      <w:r>
-        <w:rPr>
-          <w:lang w:val="en-US"/>
-        </w:rPr>
-        <w:t>prev’s</w:t>
-      </w:r>
-      <w:proofErr w:type="spellEnd"/>
-      <w:r>
-        <w:rPr>
-          <w:lang w:val="en-US"/>
-        </w:rPr>
-        <w:t xml:space="preserve"> next to the new head</w:t>
+        <w:t>Point the prev’s next to the new head</w:t>
       </w:r>
     </w:p>
     <w:p>
@@ -3153,16 +2535,8 @@
         <w:rPr>
           <w:lang w:val="en-US"/>
         </w:rPr>
-        <w:t xml:space="preserve">Head’s back points to the </w:t>
-      </w:r>
-      <w:proofErr w:type="spellStart"/>
-      <w:r>
-        <w:rPr>
-          <w:lang w:val="en-US"/>
-        </w:rPr>
-        <w:t>prev</w:t>
-      </w:r>
-      <w:proofErr w:type="spellEnd"/>
+        <w:t>Head’s back points to the prev</w:t>
+      </w:r>
     </w:p>
     <w:p>
       <w:pPr>
@@ -3276,23 +2650,7 @@
         <w:rPr>
           <w:lang w:val="en-US"/>
         </w:rPr>
-        <w:t>Head’s next == null (</w:t>
-      </w:r>
-      <w:proofErr w:type="spellStart"/>
-      <w:proofErr w:type="gramStart"/>
-      <w:r>
-        <w:rPr>
-          <w:lang w:val="en-US"/>
-        </w:rPr>
-        <w:t>i,e</w:t>
-      </w:r>
-      <w:proofErr w:type="spellEnd"/>
-      <w:proofErr w:type="gramEnd"/>
-      <w:r>
-        <w:rPr>
-          <w:lang w:val="en-US"/>
-        </w:rPr>
-        <w:t>) last element or single element</w:t>
+        <w:t>Head’s next == null (i,e) last element or single element</w:t>
       </w:r>
     </w:p>
     <w:p>
@@ -3328,21 +2686,7 @@
         <w:rPr>
           <w:lang w:val="en-US"/>
         </w:rPr>
-        <w:t xml:space="preserve">Remember the head using </w:t>
-      </w:r>
-      <w:proofErr w:type="spellStart"/>
-      <w:r>
-        <w:rPr>
-          <w:lang w:val="en-US"/>
-        </w:rPr>
-        <w:t>prev</w:t>
-      </w:r>
-      <w:proofErr w:type="spellEnd"/>
-      <w:r>
-        <w:rPr>
-          <w:lang w:val="en-US"/>
-        </w:rPr>
-        <w:t xml:space="preserve"> variable</w:t>
+        <w:t>Remember the head using prev variable</w:t>
       </w:r>
     </w:p>
     <w:p>
@@ -3414,16 +2758,8 @@
         <w:rPr>
           <w:lang w:val="en-US"/>
         </w:rPr>
-        <w:t xml:space="preserve">Prev’s next points to </w:t>
-      </w:r>
-      <w:proofErr w:type="gramStart"/>
-      <w:r>
-        <w:rPr>
-          <w:lang w:val="en-US"/>
-        </w:rPr>
-        <w:t>the  null</w:t>
-      </w:r>
-      <w:proofErr w:type="gramEnd"/>
+        <w:t>Prev’s next points to the  null</w:t>
+      </w:r>
     </w:p>
     <w:p>
       <w:pPr>
@@ -3691,21 +3027,7 @@
         <w:rPr>
           <w:lang w:val="en-US"/>
         </w:rPr>
-        <w:t xml:space="preserve">Front’s back points to the </w:t>
-      </w:r>
-      <w:proofErr w:type="spellStart"/>
-      <w:r>
-        <w:rPr>
-          <w:lang w:val="en-US"/>
-        </w:rPr>
-        <w:t>prev</w:t>
-      </w:r>
-      <w:proofErr w:type="spellEnd"/>
-      <w:r>
-        <w:rPr>
-          <w:lang w:val="en-US"/>
-        </w:rPr>
-        <w:t xml:space="preserve"> </w:t>
+        <w:t xml:space="preserve">Front’s back points to the prev </w:t>
       </w:r>
     </w:p>
     <w:p>
@@ -3741,21 +3063,7 @@
         <w:rPr>
           <w:lang w:val="en-US"/>
         </w:rPr>
-        <w:t xml:space="preserve">Temp’s </w:t>
-      </w:r>
-      <w:proofErr w:type="gramStart"/>
-      <w:r>
-        <w:rPr>
-          <w:lang w:val="en-US"/>
-        </w:rPr>
-        <w:t>back  =</w:t>
-      </w:r>
-      <w:proofErr w:type="gramEnd"/>
-      <w:r>
-        <w:rPr>
-          <w:lang w:val="en-US"/>
-        </w:rPr>
-        <w:t xml:space="preserve"> null</w:t>
+        <w:t>Temp’s back  = null</w:t>
       </w:r>
     </w:p>
     <w:p>
@@ -3809,63 +3117,7 @@
         <w:rPr>
           <w:lang w:val="en-US"/>
         </w:rPr>
-        <w:t xml:space="preserve">If </w:t>
-      </w:r>
-      <w:proofErr w:type="gramStart"/>
-      <w:r>
-        <w:rPr>
-          <w:lang w:val="en-US"/>
-        </w:rPr>
-        <w:t>k  is</w:t>
-      </w:r>
-      <w:proofErr w:type="gramEnd"/>
-      <w:r>
-        <w:rPr>
-          <w:lang w:val="en-US"/>
-        </w:rPr>
-        <w:t xml:space="preserve"> tail node (</w:t>
-      </w:r>
-      <w:proofErr w:type="spellStart"/>
-      <w:r>
-        <w:rPr>
-          <w:lang w:val="en-US"/>
-        </w:rPr>
-        <w:t>i,e</w:t>
-      </w:r>
-      <w:proofErr w:type="spellEnd"/>
-      <w:r>
-        <w:rPr>
-          <w:lang w:val="en-US"/>
-        </w:rPr>
-        <w:t xml:space="preserve">) </w:t>
-      </w:r>
-      <w:proofErr w:type="spellStart"/>
-      <w:r>
-        <w:rPr>
-          <w:lang w:val="en-US"/>
-        </w:rPr>
-        <w:t>Dll</w:t>
-      </w:r>
-      <w:proofErr w:type="spellEnd"/>
-      <w:r>
-        <w:rPr>
-          <w:lang w:val="en-US"/>
-        </w:rPr>
-        <w:t xml:space="preserve"> have the </w:t>
-      </w:r>
-      <w:proofErr w:type="spellStart"/>
-      <w:r>
-        <w:rPr>
-          <w:lang w:val="en-US"/>
-        </w:rPr>
-        <w:t>prev</w:t>
-      </w:r>
-      <w:proofErr w:type="spellEnd"/>
-      <w:r>
-        <w:rPr>
-          <w:lang w:val="en-US"/>
-        </w:rPr>
-        <w:t xml:space="preserve"> and  front element</w:t>
+        <w:t>If k  is tail node (i,e) Dll have the prev and  front element</w:t>
       </w:r>
     </w:p>
     <w:p>
@@ -3901,14 +3153,7 @@
         <w:rPr>
           <w:lang w:val="en-US"/>
         </w:rPr>
-        <w:t xml:space="preserve">Front points to the </w:t>
-      </w:r>
-      <w:proofErr w:type="gramStart"/>
-      <w:r>
-        <w:rPr>
-          <w:lang w:val="en-US"/>
-        </w:rPr>
-        <w:t xml:space="preserve">temp’s </w:t>
+        <w:t xml:space="preserve">Front points to the temp’s </w:t>
       </w:r>
       <w:r>
         <w:rPr>
@@ -3916,7 +3161,6 @@
         </w:rPr>
         <w:t xml:space="preserve"> next</w:t>
       </w:r>
-      <w:proofErr w:type="gramEnd"/>
     </w:p>
     <w:p>
       <w:pPr>
@@ -4100,21 +3344,7 @@
         <w:rPr>
           <w:lang w:val="en-US"/>
         </w:rPr>
-        <w:t xml:space="preserve">Create the new node called </w:t>
-      </w:r>
-      <w:proofErr w:type="gramStart"/>
-      <w:r>
-        <w:rPr>
-          <w:lang w:val="en-US"/>
-        </w:rPr>
-        <w:t>temp  with</w:t>
-      </w:r>
-      <w:proofErr w:type="gramEnd"/>
-      <w:r>
-        <w:rPr>
-          <w:lang w:val="en-US"/>
-        </w:rPr>
-        <w:t xml:space="preserve"> the value</w:t>
+        <w:t>Create the new node called temp  with the value</w:t>
       </w:r>
     </w:p>
     <w:p>
@@ -4269,21 +3499,7 @@
         <w:rPr>
           <w:lang w:val="en-US"/>
         </w:rPr>
-        <w:t xml:space="preserve">Create the new </w:t>
-      </w:r>
-      <w:proofErr w:type="gramStart"/>
-      <w:r>
-        <w:rPr>
-          <w:lang w:val="en-US"/>
-        </w:rPr>
-        <w:t>node  and</w:t>
-      </w:r>
-      <w:proofErr w:type="gramEnd"/>
-      <w:r>
-        <w:rPr>
-          <w:lang w:val="en-US"/>
-        </w:rPr>
-        <w:t xml:space="preserve"> points next and back to null</w:t>
+        <w:t>Create the new node  and points next and back to null</w:t>
       </w:r>
     </w:p>
     <w:p>
@@ -4333,19 +3549,11 @@
           <w:lang w:val="en-US"/>
         </w:rPr>
       </w:pPr>
-      <w:proofErr w:type="spellStart"/>
-      <w:r>
-        <w:rPr>
-          <w:lang w:val="en-US"/>
-        </w:rPr>
-        <w:t>Nn’s</w:t>
-      </w:r>
-      <w:proofErr w:type="spellEnd"/>
-      <w:r>
-        <w:rPr>
-          <w:lang w:val="en-US"/>
-        </w:rPr>
-        <w:t xml:space="preserve"> next points to the null</w:t>
+      <w:r>
+        <w:rPr>
+          <w:lang w:val="en-US"/>
+        </w:rPr>
+        <w:t>Nn’s next points to the null</w:t>
       </w:r>
     </w:p>
     <w:p>
@@ -4363,16 +3571,8 @@
         <w:rPr>
           <w:lang w:val="en-US"/>
         </w:rPr>
-        <w:t xml:space="preserve">Head’s next points to the </w:t>
-      </w:r>
-      <w:proofErr w:type="spellStart"/>
-      <w:r>
-        <w:rPr>
-          <w:lang w:val="en-US"/>
-        </w:rPr>
-        <w:t>nn</w:t>
-      </w:r>
-      <w:proofErr w:type="spellEnd"/>
+        <w:t>Head’s next points to the nn</w:t>
+      </w:r>
     </w:p>
     <w:p>
       <w:pPr>
@@ -4385,19 +3585,11 @@
           <w:lang w:val="en-US"/>
         </w:rPr>
       </w:pPr>
-      <w:proofErr w:type="spellStart"/>
-      <w:r>
-        <w:rPr>
-          <w:lang w:val="en-US"/>
-        </w:rPr>
-        <w:t>Nn’s</w:t>
-      </w:r>
-      <w:proofErr w:type="spellEnd"/>
-      <w:r>
-        <w:rPr>
-          <w:lang w:val="en-US"/>
-        </w:rPr>
-        <w:t xml:space="preserve"> back points to the head</w:t>
+      <w:r>
+        <w:rPr>
+          <w:lang w:val="en-US"/>
+        </w:rPr>
+        <w:t>Nn’s back points to the head</w:t>
       </w:r>
     </w:p>
     <w:p>
@@ -4432,21 +3624,7 @@
         <w:rPr>
           <w:lang w:val="en-US"/>
         </w:rPr>
-        <w:t>Base condition head == null k ==</w:t>
-      </w:r>
-      <w:proofErr w:type="gramStart"/>
-      <w:r>
-        <w:rPr>
-          <w:lang w:val="en-US"/>
-        </w:rPr>
-        <w:t>1  :</w:t>
-      </w:r>
-      <w:proofErr w:type="gramEnd"/>
-      <w:r>
-        <w:rPr>
-          <w:lang w:val="en-US"/>
-        </w:rPr>
-        <w:t xml:space="preserve"> length =  0</w:t>
+        <w:t>Base condition head == null k ==1  : length =  0</w:t>
       </w:r>
     </w:p>
     <w:p>
@@ -4482,21 +3660,7 @@
         <w:rPr>
           <w:lang w:val="en-US"/>
         </w:rPr>
-        <w:t xml:space="preserve">k == </w:t>
-      </w:r>
-      <w:proofErr w:type="gramStart"/>
-      <w:r>
-        <w:rPr>
-          <w:lang w:val="en-US"/>
-        </w:rPr>
-        <w:t>1 :</w:t>
-      </w:r>
-      <w:proofErr w:type="gramEnd"/>
-      <w:r>
-        <w:rPr>
-          <w:lang w:val="en-US"/>
-        </w:rPr>
-        <w:t xml:space="preserve"> length = n</w:t>
+        <w:t>k == 1 : length = n</w:t>
       </w:r>
     </w:p>
     <w:p>
@@ -4604,21 +3768,7 @@
         <w:rPr>
           <w:lang w:val="en-US"/>
         </w:rPr>
-        <w:t xml:space="preserve">initialize </w:t>
-      </w:r>
-      <w:proofErr w:type="spellStart"/>
-      <w:r>
-        <w:rPr>
-          <w:lang w:val="en-US"/>
-        </w:rPr>
-        <w:t>prev</w:t>
-      </w:r>
-      <w:proofErr w:type="spellEnd"/>
-      <w:r>
-        <w:rPr>
-          <w:lang w:val="en-US"/>
-        </w:rPr>
-        <w:t xml:space="preserve"> front count = 0</w:t>
+        <w:t>initialize prev front count = 0</w:t>
       </w:r>
     </w:p>
     <w:p>
@@ -4690,21 +3840,7 @@
         <w:rPr>
           <w:lang w:val="en-US"/>
         </w:rPr>
-        <w:t xml:space="preserve">Point the </w:t>
-      </w:r>
-      <w:proofErr w:type="spellStart"/>
-      <w:r>
-        <w:rPr>
-          <w:lang w:val="en-US"/>
-        </w:rPr>
-        <w:t>prev</w:t>
-      </w:r>
-      <w:proofErr w:type="spellEnd"/>
-      <w:r>
-        <w:rPr>
-          <w:lang w:val="en-US"/>
-        </w:rPr>
-        <w:t xml:space="preserve"> to the temp’s back</w:t>
+        <w:t>Point the prev to the temp’s back</w:t>
       </w:r>
     </w:p>
     <w:p>
@@ -4754,19 +3890,11 @@
           <w:lang w:val="en-US"/>
         </w:rPr>
       </w:pPr>
-      <w:proofErr w:type="spellStart"/>
-      <w:r>
-        <w:rPr>
-          <w:lang w:val="en-US"/>
-        </w:rPr>
-        <w:t>Nn’s</w:t>
-      </w:r>
-      <w:proofErr w:type="spellEnd"/>
-      <w:r>
-        <w:rPr>
-          <w:lang w:val="en-US"/>
-        </w:rPr>
-        <w:t xml:space="preserve"> next points to the front</w:t>
+      <w:r>
+        <w:rPr>
+          <w:lang w:val="en-US"/>
+        </w:rPr>
+        <w:t>Nn’s next points to the front</w:t>
       </w:r>
     </w:p>
     <w:p>
@@ -4784,16 +3912,8 @@
         <w:rPr>
           <w:lang w:val="en-US"/>
         </w:rPr>
-        <w:t xml:space="preserve">Front’s back points to the </w:t>
-      </w:r>
-      <w:proofErr w:type="spellStart"/>
-      <w:r>
-        <w:rPr>
-          <w:lang w:val="en-US"/>
-        </w:rPr>
-        <w:t>nn</w:t>
-      </w:r>
-      <w:proofErr w:type="spellEnd"/>
+        <w:t>Front’s back points to the nn</w:t>
+      </w:r>
     </w:p>
     <w:p>
       <w:pPr>
@@ -4810,16 +3930,8 @@
         <w:rPr>
           <w:lang w:val="en-US"/>
         </w:rPr>
-        <w:t xml:space="preserve">Prev’s next points to the </w:t>
-      </w:r>
-      <w:proofErr w:type="spellStart"/>
-      <w:r>
-        <w:rPr>
-          <w:lang w:val="en-US"/>
-        </w:rPr>
-        <w:t>nn</w:t>
-      </w:r>
-      <w:proofErr w:type="spellEnd"/>
+        <w:t>Prev’s next points to the nn</w:t>
+      </w:r>
     </w:p>
     <w:p>
       <w:pPr>
@@ -4832,28 +3944,12 @@
           <w:lang w:val="en-US"/>
         </w:rPr>
       </w:pPr>
-      <w:proofErr w:type="spellStart"/>
-      <w:r>
-        <w:rPr>
-          <w:lang w:val="en-US"/>
-        </w:rPr>
-        <w:t>Nn’s</w:t>
-      </w:r>
-      <w:proofErr w:type="spellEnd"/>
-      <w:r>
-        <w:rPr>
-          <w:lang w:val="en-US"/>
-        </w:rPr>
-        <w:t xml:space="preserve"> back points to the </w:t>
-      </w:r>
-      <w:proofErr w:type="spellStart"/>
-      <w:r>
-        <w:rPr>
-          <w:lang w:val="en-US"/>
-        </w:rPr>
-        <w:t>prev</w:t>
-      </w:r>
-      <w:proofErr w:type="spellEnd"/>
+      <w:r>
+        <w:rPr>
+          <w:lang w:val="en-US"/>
+        </w:rPr>
+        <w:t>Nn’s back points to the prev</w:t>
+      </w:r>
     </w:p>
     <w:p>
       <w:pPr>
@@ -4907,33 +4003,11 @@
         </w:rPr>
         <w:t xml:space="preserve">Same as the kth position one difference is </w:t>
       </w:r>
-      <w:proofErr w:type="spellStart"/>
-      <w:r>
-        <w:rPr>
-          <w:lang w:val="en-US"/>
-        </w:rPr>
-        <w:t>temp.</w:t>
-      </w:r>
-      <w:proofErr w:type="gramStart"/>
-      <w:r>
-        <w:rPr>
-          <w:lang w:val="en-US"/>
-        </w:rPr>
-        <w:t>data</w:t>
-      </w:r>
-      <w:proofErr w:type="spellEnd"/>
-      <w:r>
-        <w:rPr>
-          <w:lang w:val="en-US"/>
-        </w:rPr>
-        <w:t xml:space="preserve">  =</w:t>
-      </w:r>
-      <w:proofErr w:type="gramEnd"/>
-      <w:r>
-        <w:rPr>
-          <w:lang w:val="en-US"/>
-        </w:rPr>
-        <w:t>= given data</w:t>
+      <w:r>
+        <w:rPr>
+          <w:lang w:val="en-US"/>
+        </w:rPr>
+        <w:t>temp.data  == given data</w:t>
       </w:r>
     </w:p>
     <w:p>
@@ -5042,25 +4116,7 @@
           <w:bCs/>
           <w:lang w:val="en-US"/>
         </w:rPr>
-        <w:t xml:space="preserve">//REVERSE THE DLL </w:t>
-      </w:r>
-      <w:proofErr w:type="gramStart"/>
-      <w:r>
-        <w:rPr>
-          <w:b/>
-          <w:bCs/>
-          <w:lang w:val="en-US"/>
-        </w:rPr>
-        <w:t>-  BRUTE</w:t>
-      </w:r>
-      <w:proofErr w:type="gramEnd"/>
-      <w:r>
-        <w:rPr>
-          <w:b/>
-          <w:bCs/>
-          <w:lang w:val="en-US"/>
-        </w:rPr>
-        <w:t xml:space="preserve"> FORCE</w:t>
+        <w:t>//REVERSE THE DLL -  BRUTE FORCE</w:t>
       </w:r>
     </w:p>
     <w:p>
@@ -5204,35 +4260,7 @@
         <w:rPr>
           <w:lang w:val="en-US"/>
         </w:rPr>
-        <w:t xml:space="preserve">Store the temp </w:t>
-      </w:r>
-      <w:proofErr w:type="gramStart"/>
-      <w:r>
-        <w:rPr>
-          <w:lang w:val="en-US"/>
-        </w:rPr>
-        <w:t>data  =</w:t>
-      </w:r>
-      <w:proofErr w:type="gramEnd"/>
-      <w:r>
-        <w:rPr>
-          <w:lang w:val="en-US"/>
-        </w:rPr>
-        <w:t xml:space="preserve"> </w:t>
-      </w:r>
-      <w:proofErr w:type="spellStart"/>
-      <w:r>
-        <w:rPr>
-          <w:lang w:val="en-US"/>
-        </w:rPr>
-        <w:t>stack.peek</w:t>
-      </w:r>
-      <w:proofErr w:type="spellEnd"/>
-      <w:r>
-        <w:rPr>
-          <w:lang w:val="en-US"/>
-        </w:rPr>
-        <w:t xml:space="preserve"> (first element in the stack)</w:t>
+        <w:t>Store the temp data  = stack.peek (first element in the stack)</w:t>
       </w:r>
     </w:p>
     <w:p>
@@ -5357,21 +4385,7 @@
         <w:rPr>
           <w:lang w:val="en-US"/>
         </w:rPr>
-        <w:t xml:space="preserve">Remember the last that is current back </w:t>
-      </w:r>
-      <w:proofErr w:type="spellStart"/>
-      <w:r>
-        <w:rPr>
-          <w:lang w:val="en-US"/>
-        </w:rPr>
-        <w:t>befor</w:t>
-      </w:r>
-      <w:proofErr w:type="spellEnd"/>
-      <w:r>
-        <w:rPr>
-          <w:lang w:val="en-US"/>
-        </w:rPr>
-        <w:t xml:space="preserve"> swapping</w:t>
+        <w:t>Remember the last that is current back befor swapping</w:t>
       </w:r>
     </w:p>
     <w:p>
@@ -5421,19 +4435,11 @@
           <w:lang w:val="en-US"/>
         </w:rPr>
       </w:pPr>
-      <w:proofErr w:type="gramStart"/>
-      <w:r>
-        <w:rPr>
-          <w:lang w:val="en-US"/>
-        </w:rPr>
-        <w:t>Current  moves</w:t>
-      </w:r>
-      <w:proofErr w:type="gramEnd"/>
-      <w:r>
-        <w:rPr>
-          <w:lang w:val="en-US"/>
-        </w:rPr>
-        <w:t xml:space="preserve"> to the current back (After swapping)</w:t>
+      <w:r>
+        <w:rPr>
+          <w:lang w:val="en-US"/>
+        </w:rPr>
+        <w:t>Current  moves to the current back (After swapping)</w:t>
       </w:r>
     </w:p>
     <w:p>
@@ -5451,21 +4457,7 @@
         <w:rPr>
           <w:lang w:val="en-US"/>
         </w:rPr>
-        <w:t xml:space="preserve">Return the last </w:t>
-      </w:r>
-      <w:proofErr w:type="spellStart"/>
-      <w:r>
-        <w:rPr>
-          <w:lang w:val="en-US"/>
-        </w:rPr>
-        <w:t>bach</w:t>
-      </w:r>
-      <w:proofErr w:type="spellEnd"/>
-      <w:r>
-        <w:rPr>
-          <w:lang w:val="en-US"/>
-        </w:rPr>
-        <w:t xml:space="preserve"> as new head</w:t>
+        <w:t>Return the last bach as new head</w:t>
       </w:r>
     </w:p>
     <w:p>
@@ -5771,33 +4763,11 @@
           <w:lang w:val="en-US"/>
         </w:rPr>
       </w:pPr>
-      <w:proofErr w:type="spellStart"/>
-      <w:r>
-        <w:rPr>
-          <w:lang w:val="en-US"/>
-        </w:rPr>
-        <w:t>Out side</w:t>
-      </w:r>
-      <w:proofErr w:type="spellEnd"/>
-      <w:r>
-        <w:rPr>
-          <w:lang w:val="en-US"/>
-        </w:rPr>
-        <w:t xml:space="preserve"> while loop add the carry if have the value create the </w:t>
-      </w:r>
-      <w:proofErr w:type="spellStart"/>
-      <w:r>
-        <w:rPr>
-          <w:lang w:val="en-US"/>
-        </w:rPr>
-        <w:t>nn</w:t>
-      </w:r>
-      <w:proofErr w:type="spellEnd"/>
-      <w:r>
-        <w:rPr>
-          <w:lang w:val="en-US"/>
-        </w:rPr>
-        <w:t xml:space="preserve"> and put the value</w:t>
+      <w:r>
+        <w:rPr>
+          <w:lang w:val="en-US"/>
+        </w:rPr>
+        <w:t>Out side while loop add the carry if have the value create the nn and put the value</w:t>
       </w:r>
     </w:p>
     <w:p>
@@ -5816,16 +4786,8 @@
         <w:rPr>
           <w:lang w:val="en-US"/>
         </w:rPr>
-        <w:t xml:space="preserve">Point the current next to the </w:t>
-      </w:r>
-      <w:proofErr w:type="spellStart"/>
-      <w:r>
-        <w:rPr>
-          <w:lang w:val="en-US"/>
-        </w:rPr>
-        <w:t>nn</w:t>
-      </w:r>
-      <w:proofErr w:type="spellEnd"/>
+        <w:t>Point the current next to the nn</w:t>
+      </w:r>
     </w:p>
     <w:p>
       <w:pPr>
@@ -5988,16 +4950,8 @@
         <w:rPr>
           <w:lang w:val="en-US"/>
         </w:rPr>
-        <w:t xml:space="preserve">Even </w:t>
-      </w:r>
-      <w:proofErr w:type="gramStart"/>
-      <w:r>
-        <w:rPr>
-          <w:lang w:val="en-US"/>
-        </w:rPr>
-        <w:t>function :</w:t>
-      </w:r>
-      <w:proofErr w:type="gramEnd"/>
+        <w:t>Even function :</w:t>
+      </w:r>
     </w:p>
     <w:p>
       <w:pPr>
@@ -6010,33 +4964,11 @@
           <w:lang w:val="en-US"/>
         </w:rPr>
       </w:pPr>
-      <w:proofErr w:type="gramStart"/>
-      <w:r>
-        <w:rPr>
-          <w:lang w:val="en-US"/>
-        </w:rPr>
-        <w:t>Val  =</w:t>
-      </w:r>
-      <w:proofErr w:type="gramEnd"/>
-      <w:r>
-        <w:rPr>
-          <w:lang w:val="en-US"/>
-        </w:rPr>
-        <w:t xml:space="preserve"> n/2 it’s integer and floor </w:t>
-      </w:r>
-      <w:proofErr w:type="spellStart"/>
-      <w:r>
-        <w:rPr>
-          <w:lang w:val="en-US"/>
-        </w:rPr>
-        <w:t>decreasecount</w:t>
-      </w:r>
-      <w:proofErr w:type="spellEnd"/>
-      <w:r>
-        <w:rPr>
-          <w:lang w:val="en-US"/>
-        </w:rPr>
-        <w:t xml:space="preserve"> - 0</w:t>
+      <w:r>
+        <w:rPr>
+          <w:lang w:val="en-US"/>
+        </w:rPr>
+        <w:t>Val  = n/2 it’s integer and floor decreasecount - 0</w:t>
       </w:r>
     </w:p>
     <w:p>
@@ -6090,16 +5022,8 @@
         <w:rPr>
           <w:lang w:val="en-US"/>
         </w:rPr>
-        <w:t xml:space="preserve">If count == </w:t>
-      </w:r>
-      <w:proofErr w:type="spellStart"/>
-      <w:r>
-        <w:rPr>
-          <w:lang w:val="en-US"/>
-        </w:rPr>
-        <w:t>val</w:t>
-      </w:r>
-      <w:proofErr w:type="spellEnd"/>
+        <w:t>If count == val</w:t>
+      </w:r>
     </w:p>
     <w:p>
       <w:pPr>
@@ -6134,18 +5058,8 @@
         <w:rPr>
           <w:lang w:val="en-US"/>
         </w:rPr>
-        <w:t xml:space="preserve">Else move the temp = </w:t>
-      </w:r>
-      <w:proofErr w:type="spellStart"/>
-      <w:proofErr w:type="gramStart"/>
-      <w:r>
-        <w:rPr>
-          <w:lang w:val="en-US"/>
-        </w:rPr>
-        <w:t>temp.next</w:t>
-      </w:r>
-      <w:proofErr w:type="spellEnd"/>
-      <w:proofErr w:type="gramEnd"/>
+        <w:t>Else move the temp = temp.next</w:t>
+      </w:r>
     </w:p>
     <w:p>
       <w:pPr>
@@ -6162,16 +5076,8 @@
         <w:rPr>
           <w:lang w:val="en-US"/>
         </w:rPr>
-        <w:t xml:space="preserve">Odd </w:t>
-      </w:r>
-      <w:proofErr w:type="gramStart"/>
-      <w:r>
-        <w:rPr>
-          <w:lang w:val="en-US"/>
-        </w:rPr>
-        <w:t>function :</w:t>
-      </w:r>
-      <w:proofErr w:type="gramEnd"/>
+        <w:t>Odd function :</w:t>
+      </w:r>
     </w:p>
     <w:p>
       <w:pPr>
@@ -6260,16 +5166,8 @@
         <w:rPr>
           <w:lang w:val="en-US"/>
         </w:rPr>
-        <w:t xml:space="preserve">If count == </w:t>
-      </w:r>
-      <w:proofErr w:type="spellStart"/>
-      <w:r>
-        <w:rPr>
-          <w:lang w:val="en-US"/>
-        </w:rPr>
-        <w:t>val</w:t>
-      </w:r>
-      <w:proofErr w:type="spellEnd"/>
+        <w:t>If count == val</w:t>
+      </w:r>
     </w:p>
     <w:p>
       <w:pPr>
@@ -6375,23 +5273,7 @@
         <w:rPr>
           <w:lang w:val="en-US"/>
         </w:rPr>
-        <w:t xml:space="preserve">Traverse till the </w:t>
-      </w:r>
-      <w:proofErr w:type="spellStart"/>
-      <w:proofErr w:type="gramStart"/>
-      <w:r>
-        <w:rPr>
-          <w:lang w:val="en-US"/>
-        </w:rPr>
-        <w:t>fast.next</w:t>
-      </w:r>
-      <w:proofErr w:type="spellEnd"/>
-      <w:proofErr w:type="gramEnd"/>
-      <w:r>
-        <w:rPr>
-          <w:lang w:val="en-US"/>
-        </w:rPr>
-        <w:t xml:space="preserve"> != null and fast != null</w:t>
+        <w:t>Traverse till the fast.next != null and fast != null</w:t>
       </w:r>
     </w:p>
     <w:p>
@@ -6427,14 +5309,7 @@
         <w:rPr>
           <w:lang w:val="en-US"/>
         </w:rPr>
-        <w:t xml:space="preserve">Fast to </w:t>
-      </w:r>
-      <w:proofErr w:type="gramStart"/>
-      <w:r>
-        <w:rPr>
-          <w:lang w:val="en-US"/>
-        </w:rPr>
-        <w:t xml:space="preserve">double  </w:t>
+        <w:t xml:space="preserve">Fast to double  </w:t>
       </w:r>
       <w:r>
         <w:rPr>
@@ -6448,7 +5323,6 @@
         </w:rPr>
         <w:t>ove</w:t>
       </w:r>
-      <w:proofErr w:type="gramEnd"/>
     </w:p>
     <w:p>
       <w:pPr>
@@ -6673,35 +5547,7 @@
         <w:rPr>
           <w:lang w:val="en-US"/>
         </w:rPr>
-        <w:t xml:space="preserve">Pop the </w:t>
-      </w:r>
-      <w:proofErr w:type="spellStart"/>
-      <w:r>
-        <w:rPr>
-          <w:lang w:val="en-US"/>
-        </w:rPr>
-        <w:t>temp.data</w:t>
-      </w:r>
-      <w:proofErr w:type="spellEnd"/>
-      <w:r>
-        <w:rPr>
-          <w:lang w:val="en-US"/>
-        </w:rPr>
-        <w:t xml:space="preserve"> at the </w:t>
-      </w:r>
-      <w:proofErr w:type="spellStart"/>
-      <w:r>
-        <w:rPr>
-          <w:lang w:val="en-US"/>
-        </w:rPr>
-        <w:t>peek</w:t>
-      </w:r>
-      <w:proofErr w:type="spellEnd"/>
-      <w:r>
-        <w:rPr>
-          <w:lang w:val="en-US"/>
-        </w:rPr>
-        <w:t xml:space="preserve"> of the stack</w:t>
+        <w:t>Pop the temp.data at the peek of the stack</w:t>
       </w:r>
     </w:p>
     <w:p>
@@ -6755,21 +5601,7 @@
         <w:rPr>
           <w:lang w:val="en-US"/>
         </w:rPr>
-        <w:t xml:space="preserve">Initialize the </w:t>
-      </w:r>
-      <w:proofErr w:type="spellStart"/>
-      <w:r>
-        <w:rPr>
-          <w:lang w:val="en-US"/>
-        </w:rPr>
-        <w:t>prev</w:t>
-      </w:r>
-      <w:proofErr w:type="spellEnd"/>
-      <w:r>
-        <w:rPr>
-          <w:lang w:val="en-US"/>
-        </w:rPr>
-        <w:t xml:space="preserve"> = null</w:t>
+        <w:t>Initialize the prev = null</w:t>
       </w:r>
     </w:p>
     <w:p>
@@ -6841,16 +5673,8 @@
         <w:rPr>
           <w:lang w:val="en-US"/>
         </w:rPr>
-        <w:t xml:space="preserve">Temp’s next points to the </w:t>
-      </w:r>
-      <w:proofErr w:type="spellStart"/>
-      <w:r>
-        <w:rPr>
-          <w:lang w:val="en-US"/>
-        </w:rPr>
-        <w:t>prev</w:t>
-      </w:r>
-      <w:proofErr w:type="spellEnd"/>
+        <w:t>Temp’s next points to the prev</w:t>
+      </w:r>
     </w:p>
     <w:p>
       <w:pPr>
@@ -6867,21 +5691,7 @@
         <w:rPr>
           <w:lang w:val="en-US"/>
         </w:rPr>
-        <w:t xml:space="preserve">Move the </w:t>
-      </w:r>
-      <w:proofErr w:type="spellStart"/>
-      <w:r>
-        <w:rPr>
-          <w:lang w:val="en-US"/>
-        </w:rPr>
-        <w:t>prev</w:t>
-      </w:r>
-      <w:proofErr w:type="spellEnd"/>
-      <w:r>
-        <w:rPr>
-          <w:lang w:val="en-US"/>
-        </w:rPr>
-        <w:t xml:space="preserve"> to the temp </w:t>
+        <w:t xml:space="preserve">Move the prev to the temp </w:t>
       </w:r>
     </w:p>
     <w:p>
@@ -6934,23 +5744,7 @@
         <w:rPr>
           <w:lang w:val="en-US"/>
         </w:rPr>
-        <w:t xml:space="preserve">Base condition head == null or </w:t>
-      </w:r>
-      <w:proofErr w:type="spellStart"/>
-      <w:proofErr w:type="gramStart"/>
-      <w:r>
-        <w:rPr>
-          <w:lang w:val="en-US"/>
-        </w:rPr>
-        <w:t>head.next</w:t>
-      </w:r>
-      <w:proofErr w:type="spellEnd"/>
-      <w:proofErr w:type="gramEnd"/>
-      <w:r>
-        <w:rPr>
-          <w:lang w:val="en-US"/>
-        </w:rPr>
-        <w:t xml:space="preserve"> == null</w:t>
+        <w:t>Base condition head == null or head.next == null</w:t>
       </w:r>
     </w:p>
     <w:p>
@@ -7004,21 +5798,7 @@
         <w:rPr>
           <w:lang w:val="en-US"/>
         </w:rPr>
-        <w:t xml:space="preserve">Remember the </w:t>
-      </w:r>
-      <w:proofErr w:type="gramStart"/>
-      <w:r>
-        <w:rPr>
-          <w:lang w:val="en-US"/>
-        </w:rPr>
-        <w:t>front  =</w:t>
-      </w:r>
-      <w:proofErr w:type="gramEnd"/>
-      <w:r>
-        <w:rPr>
-          <w:lang w:val="en-US"/>
-        </w:rPr>
-        <w:t xml:space="preserve"> head’s next</w:t>
+        <w:t>Remember the front  = head’s next</w:t>
       </w:r>
     </w:p>
     <w:p>
@@ -7083,6 +5863,382 @@
           <w:lang w:val="en-US"/>
         </w:rPr>
       </w:pPr>
+      <w:r>
+        <w:rPr>
+          <w:b/>
+          <w:bCs/>
+          <w:lang w:val="en-US"/>
+        </w:rPr>
+        <w:t>LECTURE 8</w:t>
+      </w:r>
+    </w:p>
+    <w:p>
+      <w:pPr>
+        <w:rPr>
+          <w:lang w:val="en-US"/>
+        </w:rPr>
+      </w:pPr>
+      <w:r>
+        <w:rPr>
+          <w:lang w:val="en-US"/>
+        </w:rPr>
+        <w:t>TOPICS COVERED</w:t>
+      </w:r>
+    </w:p>
+    <w:p>
+      <w:pPr>
+        <w:rPr>
+          <w:b/>
+          <w:bCs/>
+          <w:lang w:val="en-US"/>
+        </w:rPr>
+      </w:pPr>
+      <w:r>
+        <w:rPr>
+          <w:b/>
+          <w:bCs/>
+          <w:lang w:val="en-US"/>
+        </w:rPr>
+        <w:t>DETECT THE LOOP</w:t>
+      </w:r>
+    </w:p>
+    <w:p>
+      <w:pPr>
+        <w:rPr>
+          <w:b/>
+          <w:bCs/>
+          <w:lang w:val="en-US"/>
+        </w:rPr>
+      </w:pPr>
+      <w:r>
+        <w:rPr>
+          <w:b/>
+          <w:bCs/>
+          <w:lang w:val="en-US"/>
+        </w:rPr>
+        <w:t>// BRUTE FORCE</w:t>
+      </w:r>
+    </w:p>
+    <w:p>
+      <w:pPr>
+        <w:pStyle w:val="ListParagraph"/>
+        <w:numPr>
+          <w:ilvl w:val="0"/>
+          <w:numId w:val="43"/>
+        </w:numPr>
+        <w:rPr>
+          <w:lang w:val="en-US"/>
+        </w:rPr>
+      </w:pPr>
+      <w:r>
+        <w:rPr>
+          <w:lang w:val="en-US"/>
+        </w:rPr>
+        <w:t>Using hash map</w:t>
+      </w:r>
+    </w:p>
+    <w:p>
+      <w:pPr>
+        <w:pStyle w:val="ListParagraph"/>
+        <w:numPr>
+          <w:ilvl w:val="0"/>
+          <w:numId w:val="43"/>
+        </w:numPr>
+        <w:rPr>
+          <w:lang w:val="en-US"/>
+        </w:rPr>
+      </w:pPr>
+      <w:r>
+        <w:rPr>
+          <w:lang w:val="en-US"/>
+        </w:rPr>
+        <w:t>Initialize the hasp map node is the key and integer is the value node means full object</w:t>
+      </w:r>
+    </w:p>
+    <w:p>
+      <w:pPr>
+        <w:pStyle w:val="ListParagraph"/>
+        <w:numPr>
+          <w:ilvl w:val="0"/>
+          <w:numId w:val="43"/>
+        </w:numPr>
+        <w:rPr>
+          <w:lang w:val="en-US"/>
+        </w:rPr>
+      </w:pPr>
+      <w:r>
+        <w:rPr>
+          <w:lang w:val="en-US"/>
+        </w:rPr>
+        <w:t>Initialize the temp = head</w:t>
+      </w:r>
+    </w:p>
+    <w:p>
+      <w:pPr>
+        <w:pStyle w:val="ListParagraph"/>
+        <w:numPr>
+          <w:ilvl w:val="0"/>
+          <w:numId w:val="43"/>
+        </w:numPr>
+        <w:rPr>
+          <w:lang w:val="en-US"/>
+        </w:rPr>
+      </w:pPr>
+      <w:r>
+        <w:rPr>
+          <w:lang w:val="en-US"/>
+        </w:rPr>
+        <w:t>Traverse till the last not null</w:t>
+      </w:r>
+    </w:p>
+    <w:p>
+      <w:pPr>
+        <w:pStyle w:val="ListParagraph"/>
+        <w:numPr>
+          <w:ilvl w:val="0"/>
+          <w:numId w:val="43"/>
+        </w:numPr>
+        <w:rPr>
+          <w:lang w:val="en-US"/>
+        </w:rPr>
+      </w:pPr>
+      <w:r>
+        <w:rPr>
+          <w:lang w:val="en-US"/>
+        </w:rPr>
+        <w:t>Check for the one step like if the temp’s key is already in the hash set</w:t>
+      </w:r>
+    </w:p>
+    <w:p>
+      <w:pPr>
+        <w:pStyle w:val="ListParagraph"/>
+        <w:numPr>
+          <w:ilvl w:val="0"/>
+          <w:numId w:val="43"/>
+        </w:numPr>
+        <w:rPr>
+          <w:lang w:val="en-US"/>
+        </w:rPr>
+      </w:pPr>
+      <w:r>
+        <w:rPr>
+          <w:lang w:val="en-US"/>
+        </w:rPr>
+        <w:t>If not put the node in the hash set</w:t>
+      </w:r>
+    </w:p>
+    <w:p>
+      <w:pPr>
+        <w:pStyle w:val="ListParagraph"/>
+        <w:numPr>
+          <w:ilvl w:val="0"/>
+          <w:numId w:val="43"/>
+        </w:numPr>
+        <w:rPr>
+          <w:lang w:val="en-US"/>
+        </w:rPr>
+      </w:pPr>
+      <w:r>
+        <w:rPr>
+          <w:lang w:val="en-US"/>
+        </w:rPr>
+        <w:t>Move the temp to the temp.next</w:t>
+      </w:r>
+    </w:p>
+    <w:p>
+      <w:pPr>
+        <w:rPr>
+          <w:b/>
+          <w:bCs/>
+          <w:lang w:val="en-US"/>
+        </w:rPr>
+      </w:pPr>
+      <w:r>
+        <w:rPr>
+          <w:b/>
+          <w:bCs/>
+          <w:lang w:val="en-US"/>
+        </w:rPr>
+        <w:t>// OPTIMAL CODE</w:t>
+      </w:r>
+    </w:p>
+    <w:p>
+      <w:pPr>
+        <w:pStyle w:val="ListParagraph"/>
+        <w:numPr>
+          <w:ilvl w:val="0"/>
+          <w:numId w:val="45"/>
+        </w:numPr>
+        <w:rPr>
+          <w:lang w:val="en-US"/>
+        </w:rPr>
+      </w:pPr>
+      <w:r>
+        <w:rPr>
+          <w:lang w:val="en-US"/>
+        </w:rPr>
+        <w:t>Using slow and fast pointers</w:t>
+      </w:r>
+    </w:p>
+    <w:p>
+      <w:pPr>
+        <w:pStyle w:val="ListParagraph"/>
+        <w:numPr>
+          <w:ilvl w:val="0"/>
+          <w:numId w:val="45"/>
+        </w:numPr>
+        <w:rPr>
+          <w:lang w:val="en-US"/>
+        </w:rPr>
+      </w:pPr>
+      <w:r>
+        <w:rPr>
+          <w:lang w:val="en-US"/>
+        </w:rPr>
+        <w:t>Initialize the slow = head</w:t>
+      </w:r>
+    </w:p>
+    <w:p>
+      <w:pPr>
+        <w:pStyle w:val="ListParagraph"/>
+        <w:numPr>
+          <w:ilvl w:val="0"/>
+          <w:numId w:val="45"/>
+        </w:numPr>
+        <w:rPr>
+          <w:lang w:val="en-US"/>
+        </w:rPr>
+      </w:pPr>
+      <w:r>
+        <w:rPr>
+          <w:lang w:val="en-US"/>
+        </w:rPr>
+        <w:t>Initialize the fast = head</w:t>
+      </w:r>
+    </w:p>
+    <w:p>
+      <w:pPr>
+        <w:pStyle w:val="ListParagraph"/>
+        <w:numPr>
+          <w:ilvl w:val="0"/>
+          <w:numId w:val="45"/>
+        </w:numPr>
+        <w:rPr>
+          <w:lang w:val="en-US"/>
+        </w:rPr>
+      </w:pPr>
+      <w:r>
+        <w:rPr>
+          <w:lang w:val="en-US"/>
+        </w:rPr>
+        <w:t>Traverse the fast not equal to  the null and fast’s next not equal to  the null</w:t>
+      </w:r>
+    </w:p>
+    <w:p>
+      <w:pPr>
+        <w:pStyle w:val="ListParagraph"/>
+        <w:numPr>
+          <w:ilvl w:val="0"/>
+          <w:numId w:val="45"/>
+        </w:numPr>
+        <w:rPr>
+          <w:lang w:val="en-US"/>
+        </w:rPr>
+      </w:pPr>
+      <w:r>
+        <w:rPr>
+          <w:lang w:val="en-US"/>
+        </w:rPr>
+        <w:t>Slow moves to  the one point</w:t>
+      </w:r>
+    </w:p>
+    <w:p>
+      <w:pPr>
+        <w:pStyle w:val="ListParagraph"/>
+        <w:numPr>
+          <w:ilvl w:val="0"/>
+          <w:numId w:val="45"/>
+        </w:numPr>
+        <w:rPr>
+          <w:lang w:val="en-US"/>
+        </w:rPr>
+      </w:pPr>
+      <w:r>
+        <w:rPr>
+          <w:lang w:val="en-US"/>
+        </w:rPr>
+        <w:t>Fast moves to  the double point</w:t>
+      </w:r>
+    </w:p>
+    <w:p>
+      <w:pPr>
+        <w:pStyle w:val="ListParagraph"/>
+        <w:numPr>
+          <w:ilvl w:val="0"/>
+          <w:numId w:val="45"/>
+        </w:numPr>
+        <w:rPr>
+          <w:lang w:val="en-US"/>
+        </w:rPr>
+      </w:pPr>
+      <w:r>
+        <w:rPr>
+          <w:lang w:val="en-US"/>
+        </w:rPr>
+        <w:t>If slow == fast means it is in the same loop of the element</w:t>
+      </w:r>
+    </w:p>
+    <w:p>
+      <w:pPr>
+        <w:pStyle w:val="ListParagraph"/>
+        <w:numPr>
+          <w:ilvl w:val="0"/>
+          <w:numId w:val="45"/>
+        </w:numPr>
+        <w:rPr>
+          <w:lang w:val="en-US"/>
+        </w:rPr>
+      </w:pPr>
+      <w:r>
+        <w:rPr>
+          <w:lang w:val="en-US"/>
+        </w:rPr>
+        <w:t>Return true</w:t>
+      </w:r>
+    </w:p>
+    <w:p>
+      <w:pPr>
+        <w:pStyle w:val="ListParagraph"/>
+        <w:numPr>
+          <w:ilvl w:val="0"/>
+          <w:numId w:val="45"/>
+        </w:numPr>
+        <w:rPr>
+          <w:lang w:val="en-US"/>
+        </w:rPr>
+      </w:pPr>
+      <w:r>
+        <w:rPr>
+          <w:lang w:val="en-US"/>
+        </w:rPr>
+        <w:t>If not is in equal means it is linear data structure return false</w:t>
+      </w:r>
+    </w:p>
+    <w:p>
+      <w:pPr>
+        <w:rPr>
+          <w:lang w:val="en-US"/>
+        </w:rPr>
+      </w:pPr>
+    </w:p>
+    <w:p>
+      <w:pPr>
+        <w:rPr>
+          <w:b/>
+          <w:bCs/>
+          <w:lang w:val="en-US"/>
+        </w:rPr>
+      </w:pPr>
     </w:p>
     <w:p>
       <w:pPr>
@@ -7104,9 +6260,457 @@
     <w:p>
       <w:pPr>
         <w:rPr>
-          <w:lang w:val="en-US"/>
-        </w:rPr>
-      </w:pPr>
+          <w:b/>
+          <w:bCs/>
+          <w:lang w:val="en-US"/>
+        </w:rPr>
+      </w:pPr>
+      <w:r>
+        <w:rPr>
+          <w:b/>
+          <w:bCs/>
+          <w:lang w:val="en-US"/>
+        </w:rPr>
+        <w:lastRenderedPageBreak/>
+        <w:t>LECTUER 9</w:t>
+      </w:r>
+    </w:p>
+    <w:p>
+      <w:pPr>
+        <w:rPr>
+          <w:lang w:val="en-US"/>
+        </w:rPr>
+      </w:pPr>
+      <w:r>
+        <w:rPr>
+          <w:lang w:val="en-US"/>
+        </w:rPr>
+        <w:t>TOPICS COVERED</w:t>
+      </w:r>
+    </w:p>
+    <w:p>
+      <w:pPr>
+        <w:rPr>
+          <w:b/>
+          <w:bCs/>
+          <w:lang w:val="en-US"/>
+        </w:rPr>
+      </w:pPr>
+      <w:r>
+        <w:rPr>
+          <w:b/>
+          <w:bCs/>
+          <w:lang w:val="en-US"/>
+        </w:rPr>
+        <w:t>STARTING POINT OF THE LOOP</w:t>
+      </w:r>
+    </w:p>
+    <w:p>
+      <w:pPr>
+        <w:rPr>
+          <w:b/>
+          <w:bCs/>
+          <w:lang w:val="en-US"/>
+        </w:rPr>
+      </w:pPr>
+      <w:r>
+        <w:rPr>
+          <w:b/>
+          <w:bCs/>
+          <w:lang w:val="en-US"/>
+        </w:rPr>
+        <w:t>// BRUTE FORCE</w:t>
+      </w:r>
+    </w:p>
+    <w:p>
+      <w:pPr>
+        <w:pStyle w:val="ListParagraph"/>
+        <w:numPr>
+          <w:ilvl w:val="0"/>
+          <w:numId w:val="46"/>
+        </w:numPr>
+        <w:rPr>
+          <w:lang w:val="en-US"/>
+        </w:rPr>
+      </w:pPr>
+      <w:r>
+        <w:rPr>
+          <w:lang w:val="en-US"/>
+        </w:rPr>
+        <w:t>Using hash map</w:t>
+      </w:r>
+    </w:p>
+    <w:p>
+      <w:pPr>
+        <w:pStyle w:val="ListParagraph"/>
+        <w:numPr>
+          <w:ilvl w:val="0"/>
+          <w:numId w:val="46"/>
+        </w:numPr>
+        <w:rPr>
+          <w:lang w:val="en-US"/>
+        </w:rPr>
+      </w:pPr>
+      <w:r>
+        <w:rPr>
+          <w:lang w:val="en-US"/>
+        </w:rPr>
+        <w:t>Initialize the temp = head and hast map set</w:t>
+      </w:r>
+    </w:p>
+    <w:p>
+      <w:pPr>
+        <w:pStyle w:val="ListParagraph"/>
+        <w:numPr>
+          <w:ilvl w:val="0"/>
+          <w:numId w:val="46"/>
+        </w:numPr>
+        <w:rPr>
+          <w:lang w:val="en-US"/>
+        </w:rPr>
+      </w:pPr>
+      <w:r>
+        <w:rPr>
+          <w:lang w:val="en-US"/>
+        </w:rPr>
+        <w:t>Traverse till the last that is temp != null</w:t>
+      </w:r>
+    </w:p>
+    <w:p>
+      <w:pPr>
+        <w:pStyle w:val="ListParagraph"/>
+        <w:numPr>
+          <w:ilvl w:val="0"/>
+          <w:numId w:val="46"/>
+        </w:numPr>
+        <w:rPr>
+          <w:lang w:val="en-US"/>
+        </w:rPr>
+      </w:pPr>
+      <w:r>
+        <w:rPr>
+          <w:lang w:val="en-US"/>
+        </w:rPr>
+        <w:t xml:space="preserve">If check the node is already in the hash set </w:t>
+      </w:r>
+    </w:p>
+    <w:p>
+      <w:pPr>
+        <w:pStyle w:val="ListParagraph"/>
+        <w:numPr>
+          <w:ilvl w:val="0"/>
+          <w:numId w:val="46"/>
+        </w:numPr>
+        <w:rPr>
+          <w:lang w:val="en-US"/>
+        </w:rPr>
+      </w:pPr>
+      <w:r>
+        <w:rPr>
+          <w:lang w:val="en-US"/>
+        </w:rPr>
+        <w:t>Return the temp</w:t>
+      </w:r>
+    </w:p>
+    <w:p>
+      <w:pPr>
+        <w:pStyle w:val="ListParagraph"/>
+        <w:numPr>
+          <w:ilvl w:val="0"/>
+          <w:numId w:val="46"/>
+        </w:numPr>
+        <w:rPr>
+          <w:lang w:val="en-US"/>
+        </w:rPr>
+      </w:pPr>
+      <w:r>
+        <w:rPr>
+          <w:lang w:val="en-US"/>
+        </w:rPr>
+        <w:t>If not put the temp to the hash set</w:t>
+      </w:r>
+    </w:p>
+    <w:p>
+      <w:pPr>
+        <w:pStyle w:val="ListParagraph"/>
+        <w:numPr>
+          <w:ilvl w:val="0"/>
+          <w:numId w:val="46"/>
+        </w:numPr>
+        <w:rPr>
+          <w:lang w:val="en-US"/>
+        </w:rPr>
+      </w:pPr>
+      <w:r>
+        <w:rPr>
+          <w:lang w:val="en-US"/>
+        </w:rPr>
+        <w:t>Move the temp to the next</w:t>
+      </w:r>
+    </w:p>
+    <w:p>
+      <w:pPr>
+        <w:pStyle w:val="ListParagraph"/>
+        <w:numPr>
+          <w:ilvl w:val="0"/>
+          <w:numId w:val="46"/>
+        </w:numPr>
+        <w:rPr>
+          <w:lang w:val="en-US"/>
+        </w:rPr>
+      </w:pPr>
+      <w:r>
+        <w:rPr>
+          <w:lang w:val="en-US"/>
+        </w:rPr>
+        <w:t>Return null if not present</w:t>
+      </w:r>
+    </w:p>
+    <w:p>
+      <w:pPr>
+        <w:rPr>
+          <w:b/>
+          <w:bCs/>
+          <w:lang w:val="en-US"/>
+        </w:rPr>
+      </w:pPr>
+      <w:r>
+        <w:rPr>
+          <w:b/>
+          <w:bCs/>
+          <w:lang w:val="en-US"/>
+        </w:rPr>
+        <w:t>// OPTIMAL CODE</w:t>
+      </w:r>
+    </w:p>
+    <w:p>
+      <w:pPr>
+        <w:pStyle w:val="ListParagraph"/>
+        <w:numPr>
+          <w:ilvl w:val="0"/>
+          <w:numId w:val="48"/>
+        </w:numPr>
+        <w:rPr>
+          <w:lang w:val="en-US"/>
+        </w:rPr>
+      </w:pPr>
+      <w:r>
+        <w:rPr>
+          <w:lang w:val="en-US"/>
+        </w:rPr>
+        <w:t>Using slow and fast pointer</w:t>
+      </w:r>
+    </w:p>
+    <w:p>
+      <w:pPr>
+        <w:pStyle w:val="ListParagraph"/>
+        <w:numPr>
+          <w:ilvl w:val="0"/>
+          <w:numId w:val="48"/>
+        </w:numPr>
+        <w:rPr>
+          <w:lang w:val="en-US"/>
+        </w:rPr>
+      </w:pPr>
+      <w:r>
+        <w:rPr>
+          <w:lang w:val="en-US"/>
+        </w:rPr>
+        <w:t>Traverse till  the fast is not null and fast’s next not null</w:t>
+      </w:r>
+    </w:p>
+    <w:p>
+      <w:pPr>
+        <w:pStyle w:val="ListParagraph"/>
+        <w:numPr>
+          <w:ilvl w:val="0"/>
+          <w:numId w:val="48"/>
+        </w:numPr>
+        <w:rPr>
+          <w:lang w:val="en-US"/>
+        </w:rPr>
+      </w:pPr>
+      <w:r>
+        <w:rPr>
+          <w:lang w:val="en-US"/>
+        </w:rPr>
+        <w:t>Slow moves to  the one point</w:t>
+      </w:r>
+    </w:p>
+    <w:p>
+      <w:pPr>
+        <w:pStyle w:val="ListParagraph"/>
+        <w:numPr>
+          <w:ilvl w:val="0"/>
+          <w:numId w:val="48"/>
+        </w:numPr>
+        <w:rPr>
+          <w:lang w:val="en-US"/>
+        </w:rPr>
+      </w:pPr>
+      <w:r>
+        <w:rPr>
+          <w:lang w:val="en-US"/>
+        </w:rPr>
+        <w:t>Fast moves to  the double point</w:t>
+      </w:r>
+    </w:p>
+    <w:p>
+      <w:pPr>
+        <w:pStyle w:val="ListParagraph"/>
+        <w:numPr>
+          <w:ilvl w:val="0"/>
+          <w:numId w:val="48"/>
+        </w:numPr>
+        <w:rPr>
+          <w:lang w:val="en-US"/>
+        </w:rPr>
+      </w:pPr>
+      <w:r>
+        <w:rPr>
+          <w:lang w:val="en-US"/>
+        </w:rPr>
+        <w:t xml:space="preserve">If slow is equal to the fast there is a loop </w:t>
+      </w:r>
+    </w:p>
+    <w:p>
+      <w:pPr>
+        <w:pStyle w:val="ListParagraph"/>
+        <w:numPr>
+          <w:ilvl w:val="0"/>
+          <w:numId w:val="48"/>
+        </w:numPr>
+        <w:rPr>
+          <w:lang w:val="en-US"/>
+        </w:rPr>
+      </w:pPr>
+      <w:r>
+        <w:rPr>
+          <w:lang w:val="en-US"/>
+        </w:rPr>
+        <w:t>2</w:t>
+      </w:r>
+      <w:r>
+        <w:rPr>
+          <w:vertAlign w:val="superscript"/>
+          <w:lang w:val="en-US"/>
+        </w:rPr>
+        <w:t>nd</w:t>
+      </w:r>
+      <w:r>
+        <w:rPr>
+          <w:lang w:val="en-US"/>
+        </w:rPr>
+        <w:t xml:space="preserve"> job is to find the starting point</w:t>
+      </w:r>
+    </w:p>
+    <w:p>
+      <w:pPr>
+        <w:pStyle w:val="ListParagraph"/>
+        <w:numPr>
+          <w:ilvl w:val="0"/>
+          <w:numId w:val="48"/>
+        </w:numPr>
+        <w:rPr>
+          <w:lang w:val="en-US"/>
+        </w:rPr>
+      </w:pPr>
+      <w:r>
+        <w:rPr>
+          <w:lang w:val="en-US"/>
+        </w:rPr>
+        <w:t>Initialize the slow equal to the head</w:t>
+      </w:r>
+    </w:p>
+    <w:p>
+      <w:pPr>
+        <w:pStyle w:val="ListParagraph"/>
+        <w:numPr>
+          <w:ilvl w:val="0"/>
+          <w:numId w:val="48"/>
+        </w:numPr>
+        <w:rPr>
+          <w:lang w:val="en-US"/>
+        </w:rPr>
+      </w:pPr>
+      <w:r>
+        <w:rPr>
+          <w:lang w:val="en-US"/>
+        </w:rPr>
+        <w:t>Traverse till slow is equal to the fast</w:t>
+      </w:r>
+    </w:p>
+    <w:p>
+      <w:pPr>
+        <w:pStyle w:val="ListParagraph"/>
+        <w:numPr>
+          <w:ilvl w:val="0"/>
+          <w:numId w:val="48"/>
+        </w:numPr>
+        <w:rPr>
+          <w:lang w:val="en-US"/>
+        </w:rPr>
+      </w:pPr>
+      <w:r>
+        <w:rPr>
+          <w:lang w:val="en-US"/>
+        </w:rPr>
+        <w:t>If not move the slow to one and fast to one</w:t>
+      </w:r>
+    </w:p>
+    <w:p>
+      <w:pPr>
+        <w:pStyle w:val="ListParagraph"/>
+        <w:numPr>
+          <w:ilvl w:val="0"/>
+          <w:numId w:val="48"/>
+        </w:numPr>
+        <w:rPr>
+          <w:lang w:val="en-US"/>
+        </w:rPr>
+      </w:pPr>
+      <w:r>
+        <w:rPr>
+          <w:lang w:val="en-US"/>
+        </w:rPr>
+        <w:t>If not means return  slow</w:t>
+      </w:r>
+    </w:p>
+    <w:p>
+      <w:pPr>
+        <w:pStyle w:val="ListParagraph"/>
+        <w:numPr>
+          <w:ilvl w:val="0"/>
+          <w:numId w:val="48"/>
+        </w:numPr>
+        <w:rPr>
+          <w:lang w:val="en-US"/>
+        </w:rPr>
+      </w:pPr>
+      <w:r>
+        <w:rPr>
+          <w:lang w:val="en-US"/>
+        </w:rPr>
+        <w:t xml:space="preserve">If not outside the loop </w:t>
+      </w:r>
+    </w:p>
+    <w:p>
+      <w:pPr>
+        <w:pStyle w:val="ListParagraph"/>
+        <w:numPr>
+          <w:ilvl w:val="0"/>
+          <w:numId w:val="48"/>
+        </w:numPr>
+        <w:rPr>
+          <w:lang w:val="en-US"/>
+        </w:rPr>
+      </w:pPr>
+      <w:r>
+        <w:rPr>
+          <w:lang w:val="en-US"/>
+        </w:rPr>
+        <w:t>Return the null</w:t>
+      </w:r>
     </w:p>
     <w:p>
       <w:pPr>
@@ -7149,6 +6753,95 @@
 <file path=word/numbering.xml><?xml version="1.0" encoding="utf-8"?>
 <w:numbering xmlns:wpc="http://schemas.microsoft.com/office/word/2010/wordprocessingCanvas" xmlns:cx="http://schemas.microsoft.com/office/drawing/2014/chartex" xmlns:cx1="http://schemas.microsoft.com/office/drawing/2015/9/8/chartex" xmlns:cx2="http://schemas.microsoft.com/office/drawing/2015/10/21/chartex" xmlns:cx3="http://schemas.microsoft.com/office/drawing/2016/5/9/chartex" xmlns:cx4="http://schemas.microsoft.com/office/drawing/2016/5/10/chartex" xmlns:cx5="http://schemas.microsoft.com/office/drawing/2016/5/11/chartex" xmlns:cx6="http://schemas.microsoft.com/office/drawing/2016/5/12/chartex" xmlns:cx7="http://schemas.microsoft.com/office/drawing/2016/5/13/chartex" xmlns:cx8="http://schemas.microsoft.com/office/drawing/2016/5/14/chartex" xmlns:mc="http://schemas.openxmlformats.org/markup-compatibility/2006" xmlns:aink="http://schemas.microsoft.com/office/drawing/2016/ink" xmlns:am3d="http://schemas.microsoft.com/office/drawing/2017/model3d" xmlns:o="urn:schemas-microsoft-com:office:office" xmlns:oel="http://schemas.microsoft.com/office/2019/extlst" xmlns:r="http://schemas.openxmlformats.org/officeDocument/2006/relationships" xmlns:m="http://schemas.openxmlformats.org/officeDocument/2006/math" xmlns:v="urn:schemas-microsoft-com:vml" xmlns:wp14="http://schemas.microsoft.com/office/word/2010/wordprocessingDrawing" xmlns:wp="http://schemas.openxmlformats.org/drawingml/2006/wordprocessingDrawing" xmlns:w10="urn:schemas-microsoft-com:office:word" xmlns:w="http://schemas.openxmlformats.org/wordprocessingml/2006/main" xmlns:w14="http://schemas.microsoft.com/office/word/2010/wordml" xmlns:w15="http://schemas.microsoft.com/office/word/2012/wordml" xmlns:w16cex="http://schemas.microsoft.com/office/word/2018/wordml/cex" xmlns:w16cid="http://schemas.microsoft.com/office/word/2016/wordml/cid" xmlns:w16="http://schemas.microsoft.com/office/word/2018/wordml" xmlns:w16du="http://schemas.microsoft.com/office/word/2023/wordml/word16du" xmlns:w16sdtdh="http://schemas.microsoft.com/office/word/2020/wordml/sdtdatahash" xmlns:w16se="http://schemas.microsoft.com/office/word/2015/wordml/symex" xmlns:wpg="http://schemas.microsoft.com/office/word/2010/wordprocessingGroup" xmlns:wpi="http://schemas.microsoft.com/office/word/2010/wordprocessingInk" xmlns:wne="http://schemas.microsoft.com/office/word/2006/wordml" xmlns:wps="http://schemas.microsoft.com/office/word/2010/wordprocessingShape" mc:Ignorable="w14 w15 w16se w16cid w16 w16cex w16sdtdh w16du wp14">
   <w:abstractNum w:abstractNumId="0" w15:restartNumberingAfterBreak="0">
+    <w:nsid w:val="006E1B54"/>
+    <w:multiLevelType w:val="hybridMultilevel"/>
+    <w:tmpl w:val="4CCA5D74"/>
+    <w:lvl w:ilvl="0" w:tplc="E268592C">
+      <w:start w:val="1"/>
+      <w:numFmt w:val="decimal"/>
+      <w:lvlText w:val="%1)"/>
+      <w:lvlJc w:val="left"/>
+      <w:pPr>
+        <w:ind w:left="708" w:hanging="360"/>
+      </w:pPr>
+      <w:rPr>
+        <w:rFonts w:hint="default"/>
+      </w:rPr>
+    </w:lvl>
+    <w:lvl w:ilvl="1" w:tplc="40090019" w:tentative="1">
+      <w:start w:val="1"/>
+      <w:numFmt w:val="lowerLetter"/>
+      <w:lvlText w:val="%2."/>
+      <w:lvlJc w:val="left"/>
+      <w:pPr>
+        <w:ind w:left="1428" w:hanging="360"/>
+      </w:pPr>
+    </w:lvl>
+    <w:lvl w:ilvl="2" w:tplc="4009001B" w:tentative="1">
+      <w:start w:val="1"/>
+      <w:numFmt w:val="lowerRoman"/>
+      <w:lvlText w:val="%3."/>
+      <w:lvlJc w:val="right"/>
+      <w:pPr>
+        <w:ind w:left="2148" w:hanging="180"/>
+      </w:pPr>
+    </w:lvl>
+    <w:lvl w:ilvl="3" w:tplc="4009000F" w:tentative="1">
+      <w:start w:val="1"/>
+      <w:numFmt w:val="decimal"/>
+      <w:lvlText w:val="%4."/>
+      <w:lvlJc w:val="left"/>
+      <w:pPr>
+        <w:ind w:left="2868" w:hanging="360"/>
+      </w:pPr>
+    </w:lvl>
+    <w:lvl w:ilvl="4" w:tplc="40090019" w:tentative="1">
+      <w:start w:val="1"/>
+      <w:numFmt w:val="lowerLetter"/>
+      <w:lvlText w:val="%5."/>
+      <w:lvlJc w:val="left"/>
+      <w:pPr>
+        <w:ind w:left="3588" w:hanging="360"/>
+      </w:pPr>
+    </w:lvl>
+    <w:lvl w:ilvl="5" w:tplc="4009001B" w:tentative="1">
+      <w:start w:val="1"/>
+      <w:numFmt w:val="lowerRoman"/>
+      <w:lvlText w:val="%6."/>
+      <w:lvlJc w:val="right"/>
+      <w:pPr>
+        <w:ind w:left="4308" w:hanging="180"/>
+      </w:pPr>
+    </w:lvl>
+    <w:lvl w:ilvl="6" w:tplc="4009000F" w:tentative="1">
+      <w:start w:val="1"/>
+      <w:numFmt w:val="decimal"/>
+      <w:lvlText w:val="%7."/>
+      <w:lvlJc w:val="left"/>
+      <w:pPr>
+        <w:ind w:left="5028" w:hanging="360"/>
+      </w:pPr>
+    </w:lvl>
+    <w:lvl w:ilvl="7" w:tplc="40090019" w:tentative="1">
+      <w:start w:val="1"/>
+      <w:numFmt w:val="lowerLetter"/>
+      <w:lvlText w:val="%8."/>
+      <w:lvlJc w:val="left"/>
+      <w:pPr>
+        <w:ind w:left="5748" w:hanging="360"/>
+      </w:pPr>
+    </w:lvl>
+    <w:lvl w:ilvl="8" w:tplc="4009001B" w:tentative="1">
+      <w:start w:val="1"/>
+      <w:numFmt w:val="lowerRoman"/>
+      <w:lvlText w:val="%9."/>
+      <w:lvlJc w:val="right"/>
+      <w:pPr>
+        <w:ind w:left="6468" w:hanging="180"/>
+      </w:pPr>
+    </w:lvl>
+  </w:abstractNum>
+  <w:abstractNum w:abstractNumId="1" w15:restartNumberingAfterBreak="0">
     <w:nsid w:val="0268032E"/>
     <w:multiLevelType w:val="hybridMultilevel"/>
     <w:tmpl w:val="91EE05AC"/>
@@ -7239,7 +6932,7 @@
       </w:pPr>
     </w:lvl>
   </w:abstractNum>
-  <w:abstractNum w:abstractNumId="1" w15:restartNumberingAfterBreak="0">
+  <w:abstractNum w:abstractNumId="2" w15:restartNumberingAfterBreak="0">
     <w:nsid w:val="030E5EAC"/>
     <w:multiLevelType w:val="hybridMultilevel"/>
     <w:tmpl w:val="6D388AA2"/>
@@ -7328,7 +7021,7 @@
       </w:pPr>
     </w:lvl>
   </w:abstractNum>
-  <w:abstractNum w:abstractNumId="2" w15:restartNumberingAfterBreak="0">
+  <w:abstractNum w:abstractNumId="3" w15:restartNumberingAfterBreak="0">
     <w:nsid w:val="0652362B"/>
     <w:multiLevelType w:val="hybridMultilevel"/>
     <w:tmpl w:val="7E785478"/>
@@ -7419,7 +7112,7 @@
       </w:pPr>
     </w:lvl>
   </w:abstractNum>
-  <w:abstractNum w:abstractNumId="3" w15:restartNumberingAfterBreak="0">
+  <w:abstractNum w:abstractNumId="4" w15:restartNumberingAfterBreak="0">
     <w:nsid w:val="0CA42F0D"/>
     <w:multiLevelType w:val="hybridMultilevel"/>
     <w:tmpl w:val="0ED8E312"/>
@@ -7508,7 +7201,185 @@
       </w:pPr>
     </w:lvl>
   </w:abstractNum>
-  <w:abstractNum w:abstractNumId="4" w15:restartNumberingAfterBreak="0">
+  <w:abstractNum w:abstractNumId="5" w15:restartNumberingAfterBreak="0">
+    <w:nsid w:val="0D675B4A"/>
+    <w:multiLevelType w:val="hybridMultilevel"/>
+    <w:tmpl w:val="628C0124"/>
+    <w:lvl w:ilvl="0" w:tplc="ABD46078">
+      <w:start w:val="1"/>
+      <w:numFmt w:val="decimal"/>
+      <w:lvlText w:val="%1)"/>
+      <w:lvlJc w:val="left"/>
+      <w:pPr>
+        <w:ind w:left="612" w:hanging="360"/>
+      </w:pPr>
+      <w:rPr>
+        <w:rFonts w:hint="default"/>
+      </w:rPr>
+    </w:lvl>
+    <w:lvl w:ilvl="1" w:tplc="40090019" w:tentative="1">
+      <w:start w:val="1"/>
+      <w:numFmt w:val="lowerLetter"/>
+      <w:lvlText w:val="%2."/>
+      <w:lvlJc w:val="left"/>
+      <w:pPr>
+        <w:ind w:left="1332" w:hanging="360"/>
+      </w:pPr>
+    </w:lvl>
+    <w:lvl w:ilvl="2" w:tplc="4009001B" w:tentative="1">
+      <w:start w:val="1"/>
+      <w:numFmt w:val="lowerRoman"/>
+      <w:lvlText w:val="%3."/>
+      <w:lvlJc w:val="right"/>
+      <w:pPr>
+        <w:ind w:left="2052" w:hanging="180"/>
+      </w:pPr>
+    </w:lvl>
+    <w:lvl w:ilvl="3" w:tplc="4009000F" w:tentative="1">
+      <w:start w:val="1"/>
+      <w:numFmt w:val="decimal"/>
+      <w:lvlText w:val="%4."/>
+      <w:lvlJc w:val="left"/>
+      <w:pPr>
+        <w:ind w:left="2772" w:hanging="360"/>
+      </w:pPr>
+    </w:lvl>
+    <w:lvl w:ilvl="4" w:tplc="40090019" w:tentative="1">
+      <w:start w:val="1"/>
+      <w:numFmt w:val="lowerLetter"/>
+      <w:lvlText w:val="%5."/>
+      <w:lvlJc w:val="left"/>
+      <w:pPr>
+        <w:ind w:left="3492" w:hanging="360"/>
+      </w:pPr>
+    </w:lvl>
+    <w:lvl w:ilvl="5" w:tplc="4009001B" w:tentative="1">
+      <w:start w:val="1"/>
+      <w:numFmt w:val="lowerRoman"/>
+      <w:lvlText w:val="%6."/>
+      <w:lvlJc w:val="right"/>
+      <w:pPr>
+        <w:ind w:left="4212" w:hanging="180"/>
+      </w:pPr>
+    </w:lvl>
+    <w:lvl w:ilvl="6" w:tplc="4009000F" w:tentative="1">
+      <w:start w:val="1"/>
+      <w:numFmt w:val="decimal"/>
+      <w:lvlText w:val="%7."/>
+      <w:lvlJc w:val="left"/>
+      <w:pPr>
+        <w:ind w:left="4932" w:hanging="360"/>
+      </w:pPr>
+    </w:lvl>
+    <w:lvl w:ilvl="7" w:tplc="40090019" w:tentative="1">
+      <w:start w:val="1"/>
+      <w:numFmt w:val="lowerLetter"/>
+      <w:lvlText w:val="%8."/>
+      <w:lvlJc w:val="left"/>
+      <w:pPr>
+        <w:ind w:left="5652" w:hanging="360"/>
+      </w:pPr>
+    </w:lvl>
+    <w:lvl w:ilvl="8" w:tplc="4009001B" w:tentative="1">
+      <w:start w:val="1"/>
+      <w:numFmt w:val="lowerRoman"/>
+      <w:lvlText w:val="%9."/>
+      <w:lvlJc w:val="right"/>
+      <w:pPr>
+        <w:ind w:left="6372" w:hanging="180"/>
+      </w:pPr>
+    </w:lvl>
+  </w:abstractNum>
+  <w:abstractNum w:abstractNumId="6" w15:restartNumberingAfterBreak="0">
+    <w:nsid w:val="11F6314F"/>
+    <w:multiLevelType w:val="hybridMultilevel"/>
+    <w:tmpl w:val="66B0C58C"/>
+    <w:lvl w:ilvl="0" w:tplc="A672D4BA">
+      <w:start w:val="1"/>
+      <w:numFmt w:val="decimal"/>
+      <w:lvlText w:val="%1)"/>
+      <w:lvlJc w:val="left"/>
+      <w:pPr>
+        <w:ind w:left="612" w:hanging="360"/>
+      </w:pPr>
+      <w:rPr>
+        <w:rFonts w:hint="default"/>
+      </w:rPr>
+    </w:lvl>
+    <w:lvl w:ilvl="1" w:tplc="40090019" w:tentative="1">
+      <w:start w:val="1"/>
+      <w:numFmt w:val="lowerLetter"/>
+      <w:lvlText w:val="%2."/>
+      <w:lvlJc w:val="left"/>
+      <w:pPr>
+        <w:ind w:left="1332" w:hanging="360"/>
+      </w:pPr>
+    </w:lvl>
+    <w:lvl w:ilvl="2" w:tplc="4009001B" w:tentative="1">
+      <w:start w:val="1"/>
+      <w:numFmt w:val="lowerRoman"/>
+      <w:lvlText w:val="%3."/>
+      <w:lvlJc w:val="right"/>
+      <w:pPr>
+        <w:ind w:left="2052" w:hanging="180"/>
+      </w:pPr>
+    </w:lvl>
+    <w:lvl w:ilvl="3" w:tplc="4009000F" w:tentative="1">
+      <w:start w:val="1"/>
+      <w:numFmt w:val="decimal"/>
+      <w:lvlText w:val="%4."/>
+      <w:lvlJc w:val="left"/>
+      <w:pPr>
+        <w:ind w:left="2772" w:hanging="360"/>
+      </w:pPr>
+    </w:lvl>
+    <w:lvl w:ilvl="4" w:tplc="40090019" w:tentative="1">
+      <w:start w:val="1"/>
+      <w:numFmt w:val="lowerLetter"/>
+      <w:lvlText w:val="%5."/>
+      <w:lvlJc w:val="left"/>
+      <w:pPr>
+        <w:ind w:left="3492" w:hanging="360"/>
+      </w:pPr>
+    </w:lvl>
+    <w:lvl w:ilvl="5" w:tplc="4009001B" w:tentative="1">
+      <w:start w:val="1"/>
+      <w:numFmt w:val="lowerRoman"/>
+      <w:lvlText w:val="%6."/>
+      <w:lvlJc w:val="right"/>
+      <w:pPr>
+        <w:ind w:left="4212" w:hanging="180"/>
+      </w:pPr>
+    </w:lvl>
+    <w:lvl w:ilvl="6" w:tplc="4009000F" w:tentative="1">
+      <w:start w:val="1"/>
+      <w:numFmt w:val="decimal"/>
+      <w:lvlText w:val="%7."/>
+      <w:lvlJc w:val="left"/>
+      <w:pPr>
+        <w:ind w:left="4932" w:hanging="360"/>
+      </w:pPr>
+    </w:lvl>
+    <w:lvl w:ilvl="7" w:tplc="40090019" w:tentative="1">
+      <w:start w:val="1"/>
+      <w:numFmt w:val="lowerLetter"/>
+      <w:lvlText w:val="%8."/>
+      <w:lvlJc w:val="left"/>
+      <w:pPr>
+        <w:ind w:left="5652" w:hanging="360"/>
+      </w:pPr>
+    </w:lvl>
+    <w:lvl w:ilvl="8" w:tplc="4009001B" w:tentative="1">
+      <w:start w:val="1"/>
+      <w:numFmt w:val="lowerRoman"/>
+      <w:lvlText w:val="%9."/>
+      <w:lvlJc w:val="right"/>
+      <w:pPr>
+        <w:ind w:left="6372" w:hanging="180"/>
+      </w:pPr>
+    </w:lvl>
+  </w:abstractNum>
+  <w:abstractNum w:abstractNumId="7" w15:restartNumberingAfterBreak="0">
     <w:nsid w:val="144D797E"/>
     <w:multiLevelType w:val="hybridMultilevel"/>
     <w:tmpl w:val="81588A76"/>
@@ -7597,7 +7468,7 @@
       </w:pPr>
     </w:lvl>
   </w:abstractNum>
-  <w:abstractNum w:abstractNumId="5" w15:restartNumberingAfterBreak="0">
+  <w:abstractNum w:abstractNumId="8" w15:restartNumberingAfterBreak="0">
     <w:nsid w:val="14FC3A61"/>
     <w:multiLevelType w:val="hybridMultilevel"/>
     <w:tmpl w:val="075A498E"/>
@@ -7686,7 +7557,7 @@
       </w:pPr>
     </w:lvl>
   </w:abstractNum>
-  <w:abstractNum w:abstractNumId="6" w15:restartNumberingAfterBreak="0">
+  <w:abstractNum w:abstractNumId="9" w15:restartNumberingAfterBreak="0">
     <w:nsid w:val="180411F7"/>
     <w:multiLevelType w:val="hybridMultilevel"/>
     <w:tmpl w:val="6B2293B8"/>
@@ -7775,7 +7646,7 @@
       </w:pPr>
     </w:lvl>
   </w:abstractNum>
-  <w:abstractNum w:abstractNumId="7" w15:restartNumberingAfterBreak="0">
+  <w:abstractNum w:abstractNumId="10" w15:restartNumberingAfterBreak="0">
     <w:nsid w:val="1E4A2576"/>
     <w:multiLevelType w:val="hybridMultilevel"/>
     <w:tmpl w:val="20FCC3D2"/>
@@ -7864,7 +7735,7 @@
       </w:pPr>
     </w:lvl>
   </w:abstractNum>
-  <w:abstractNum w:abstractNumId="8" w15:restartNumberingAfterBreak="0">
+  <w:abstractNum w:abstractNumId="11" w15:restartNumberingAfterBreak="0">
     <w:nsid w:val="1F960227"/>
     <w:multiLevelType w:val="hybridMultilevel"/>
     <w:tmpl w:val="B00A1B04"/>
@@ -7953,7 +7824,7 @@
       </w:pPr>
     </w:lvl>
   </w:abstractNum>
-  <w:abstractNum w:abstractNumId="9" w15:restartNumberingAfterBreak="0">
+  <w:abstractNum w:abstractNumId="12" w15:restartNumberingAfterBreak="0">
     <w:nsid w:val="1FCF0514"/>
     <w:multiLevelType w:val="hybridMultilevel"/>
     <w:tmpl w:val="6BBA516E"/>
@@ -8042,7 +7913,7 @@
       </w:pPr>
     </w:lvl>
   </w:abstractNum>
-  <w:abstractNum w:abstractNumId="10" w15:restartNumberingAfterBreak="0">
+  <w:abstractNum w:abstractNumId="13" w15:restartNumberingAfterBreak="0">
     <w:nsid w:val="20337965"/>
     <w:multiLevelType w:val="hybridMultilevel"/>
     <w:tmpl w:val="B86A740E"/>
@@ -8131,7 +8002,96 @@
       </w:pPr>
     </w:lvl>
   </w:abstractNum>
-  <w:abstractNum w:abstractNumId="11" w15:restartNumberingAfterBreak="0">
+  <w:abstractNum w:abstractNumId="14" w15:restartNumberingAfterBreak="0">
+    <w:nsid w:val="21CC471A"/>
+    <w:multiLevelType w:val="hybridMultilevel"/>
+    <w:tmpl w:val="678846DC"/>
+    <w:lvl w:ilvl="0" w:tplc="5428D35E">
+      <w:start w:val="1"/>
+      <w:numFmt w:val="decimal"/>
+      <w:lvlText w:val="%1)"/>
+      <w:lvlJc w:val="left"/>
+      <w:pPr>
+        <w:ind w:left="612" w:hanging="360"/>
+      </w:pPr>
+      <w:rPr>
+        <w:rFonts w:hint="default"/>
+      </w:rPr>
+    </w:lvl>
+    <w:lvl w:ilvl="1" w:tplc="40090019" w:tentative="1">
+      <w:start w:val="1"/>
+      <w:numFmt w:val="lowerLetter"/>
+      <w:lvlText w:val="%2."/>
+      <w:lvlJc w:val="left"/>
+      <w:pPr>
+        <w:ind w:left="1332" w:hanging="360"/>
+      </w:pPr>
+    </w:lvl>
+    <w:lvl w:ilvl="2" w:tplc="4009001B" w:tentative="1">
+      <w:start w:val="1"/>
+      <w:numFmt w:val="lowerRoman"/>
+      <w:lvlText w:val="%3."/>
+      <w:lvlJc w:val="right"/>
+      <w:pPr>
+        <w:ind w:left="2052" w:hanging="180"/>
+      </w:pPr>
+    </w:lvl>
+    <w:lvl w:ilvl="3" w:tplc="4009000F" w:tentative="1">
+      <w:start w:val="1"/>
+      <w:numFmt w:val="decimal"/>
+      <w:lvlText w:val="%4."/>
+      <w:lvlJc w:val="left"/>
+      <w:pPr>
+        <w:ind w:left="2772" w:hanging="360"/>
+      </w:pPr>
+    </w:lvl>
+    <w:lvl w:ilvl="4" w:tplc="40090019" w:tentative="1">
+      <w:start w:val="1"/>
+      <w:numFmt w:val="lowerLetter"/>
+      <w:lvlText w:val="%5."/>
+      <w:lvlJc w:val="left"/>
+      <w:pPr>
+        <w:ind w:left="3492" w:hanging="360"/>
+      </w:pPr>
+    </w:lvl>
+    <w:lvl w:ilvl="5" w:tplc="4009001B" w:tentative="1">
+      <w:start w:val="1"/>
+      <w:numFmt w:val="lowerRoman"/>
+      <w:lvlText w:val="%6."/>
+      <w:lvlJc w:val="right"/>
+      <w:pPr>
+        <w:ind w:left="4212" w:hanging="180"/>
+      </w:pPr>
+    </w:lvl>
+    <w:lvl w:ilvl="6" w:tplc="4009000F" w:tentative="1">
+      <w:start w:val="1"/>
+      <w:numFmt w:val="decimal"/>
+      <w:lvlText w:val="%7."/>
+      <w:lvlJc w:val="left"/>
+      <w:pPr>
+        <w:ind w:left="4932" w:hanging="360"/>
+      </w:pPr>
+    </w:lvl>
+    <w:lvl w:ilvl="7" w:tplc="40090019" w:tentative="1">
+      <w:start w:val="1"/>
+      <w:numFmt w:val="lowerLetter"/>
+      <w:lvlText w:val="%8."/>
+      <w:lvlJc w:val="left"/>
+      <w:pPr>
+        <w:ind w:left="5652" w:hanging="360"/>
+      </w:pPr>
+    </w:lvl>
+    <w:lvl w:ilvl="8" w:tplc="4009001B" w:tentative="1">
+      <w:start w:val="1"/>
+      <w:numFmt w:val="lowerRoman"/>
+      <w:lvlText w:val="%9."/>
+      <w:lvlJc w:val="right"/>
+      <w:pPr>
+        <w:ind w:left="6372" w:hanging="180"/>
+      </w:pPr>
+    </w:lvl>
+  </w:abstractNum>
+  <w:abstractNum w:abstractNumId="15" w15:restartNumberingAfterBreak="0">
     <w:nsid w:val="242A296D"/>
     <w:multiLevelType w:val="hybridMultilevel"/>
     <w:tmpl w:val="060C32C2"/>
@@ -8220,7 +8180,7 @@
       </w:pPr>
     </w:lvl>
   </w:abstractNum>
-  <w:abstractNum w:abstractNumId="12" w15:restartNumberingAfterBreak="0">
+  <w:abstractNum w:abstractNumId="16" w15:restartNumberingAfterBreak="0">
     <w:nsid w:val="275F100E"/>
     <w:multiLevelType w:val="hybridMultilevel"/>
     <w:tmpl w:val="48F094D4"/>
@@ -8309,7 +8269,7 @@
       </w:pPr>
     </w:lvl>
   </w:abstractNum>
-  <w:abstractNum w:abstractNumId="13" w15:restartNumberingAfterBreak="0">
+  <w:abstractNum w:abstractNumId="17" w15:restartNumberingAfterBreak="0">
     <w:nsid w:val="2E5F2160"/>
     <w:multiLevelType w:val="hybridMultilevel"/>
     <w:tmpl w:val="E9EA74D6"/>
@@ -8398,7 +8358,7 @@
       </w:pPr>
     </w:lvl>
   </w:abstractNum>
-  <w:abstractNum w:abstractNumId="14" w15:restartNumberingAfterBreak="0">
+  <w:abstractNum w:abstractNumId="18" w15:restartNumberingAfterBreak="0">
     <w:nsid w:val="3197186A"/>
     <w:multiLevelType w:val="hybridMultilevel"/>
     <w:tmpl w:val="C4687E7C"/>
@@ -8487,7 +8447,7 @@
       </w:pPr>
     </w:lvl>
   </w:abstractNum>
-  <w:abstractNum w:abstractNumId="15" w15:restartNumberingAfterBreak="0">
+  <w:abstractNum w:abstractNumId="19" w15:restartNumberingAfterBreak="0">
     <w:nsid w:val="333F3E92"/>
     <w:multiLevelType w:val="hybridMultilevel"/>
     <w:tmpl w:val="7AA6B9F0"/>
@@ -8576,7 +8536,96 @@
       </w:pPr>
     </w:lvl>
   </w:abstractNum>
-  <w:abstractNum w:abstractNumId="16" w15:restartNumberingAfterBreak="0">
+  <w:abstractNum w:abstractNumId="20" w15:restartNumberingAfterBreak="0">
+    <w:nsid w:val="36800C7C"/>
+    <w:multiLevelType w:val="hybridMultilevel"/>
+    <w:tmpl w:val="0862DD7E"/>
+    <w:lvl w:ilvl="0" w:tplc="F9889DAA">
+      <w:start w:val="1"/>
+      <w:numFmt w:val="decimal"/>
+      <w:lvlText w:val="%1)"/>
+      <w:lvlJc w:val="left"/>
+      <w:pPr>
+        <w:ind w:left="564" w:hanging="360"/>
+      </w:pPr>
+      <w:rPr>
+        <w:rFonts w:hint="default"/>
+      </w:rPr>
+    </w:lvl>
+    <w:lvl w:ilvl="1" w:tplc="40090019" w:tentative="1">
+      <w:start w:val="1"/>
+      <w:numFmt w:val="lowerLetter"/>
+      <w:lvlText w:val="%2."/>
+      <w:lvlJc w:val="left"/>
+      <w:pPr>
+        <w:ind w:left="1284" w:hanging="360"/>
+      </w:pPr>
+    </w:lvl>
+    <w:lvl w:ilvl="2" w:tplc="4009001B" w:tentative="1">
+      <w:start w:val="1"/>
+      <w:numFmt w:val="lowerRoman"/>
+      <w:lvlText w:val="%3."/>
+      <w:lvlJc w:val="right"/>
+      <w:pPr>
+        <w:ind w:left="2004" w:hanging="180"/>
+      </w:pPr>
+    </w:lvl>
+    <w:lvl w:ilvl="3" w:tplc="4009000F" w:tentative="1">
+      <w:start w:val="1"/>
+      <w:numFmt w:val="decimal"/>
+      <w:lvlText w:val="%4."/>
+      <w:lvlJc w:val="left"/>
+      <w:pPr>
+        <w:ind w:left="2724" w:hanging="360"/>
+      </w:pPr>
+    </w:lvl>
+    <w:lvl w:ilvl="4" w:tplc="40090019" w:tentative="1">
+      <w:start w:val="1"/>
+      <w:numFmt w:val="lowerLetter"/>
+      <w:lvlText w:val="%5."/>
+      <w:lvlJc w:val="left"/>
+      <w:pPr>
+        <w:ind w:left="3444" w:hanging="360"/>
+      </w:pPr>
+    </w:lvl>
+    <w:lvl w:ilvl="5" w:tplc="4009001B" w:tentative="1">
+      <w:start w:val="1"/>
+      <w:numFmt w:val="lowerRoman"/>
+      <w:lvlText w:val="%6."/>
+      <w:lvlJc w:val="right"/>
+      <w:pPr>
+        <w:ind w:left="4164" w:hanging="180"/>
+      </w:pPr>
+    </w:lvl>
+    <w:lvl w:ilvl="6" w:tplc="4009000F" w:tentative="1">
+      <w:start w:val="1"/>
+      <w:numFmt w:val="decimal"/>
+      <w:lvlText w:val="%7."/>
+      <w:lvlJc w:val="left"/>
+      <w:pPr>
+        <w:ind w:left="4884" w:hanging="360"/>
+      </w:pPr>
+    </w:lvl>
+    <w:lvl w:ilvl="7" w:tplc="40090019" w:tentative="1">
+      <w:start w:val="1"/>
+      <w:numFmt w:val="lowerLetter"/>
+      <w:lvlText w:val="%8."/>
+      <w:lvlJc w:val="left"/>
+      <w:pPr>
+        <w:ind w:left="5604" w:hanging="360"/>
+      </w:pPr>
+    </w:lvl>
+    <w:lvl w:ilvl="8" w:tplc="4009001B" w:tentative="1">
+      <w:start w:val="1"/>
+      <w:numFmt w:val="lowerRoman"/>
+      <w:lvlText w:val="%9."/>
+      <w:lvlJc w:val="right"/>
+      <w:pPr>
+        <w:ind w:left="6324" w:hanging="180"/>
+      </w:pPr>
+    </w:lvl>
+  </w:abstractNum>
+  <w:abstractNum w:abstractNumId="21" w15:restartNumberingAfterBreak="0">
     <w:nsid w:val="3B4A32D1"/>
     <w:multiLevelType w:val="hybridMultilevel"/>
     <w:tmpl w:val="FEE09E62"/>
@@ -8665,7 +8714,7 @@
       </w:pPr>
     </w:lvl>
   </w:abstractNum>
-  <w:abstractNum w:abstractNumId="17" w15:restartNumberingAfterBreak="0">
+  <w:abstractNum w:abstractNumId="22" w15:restartNumberingAfterBreak="0">
     <w:nsid w:val="3B850DBE"/>
     <w:multiLevelType w:val="hybridMultilevel"/>
     <w:tmpl w:val="4FC6AD1C"/>
@@ -8754,7 +8803,7 @@
       </w:pPr>
     </w:lvl>
   </w:abstractNum>
-  <w:abstractNum w:abstractNumId="18" w15:restartNumberingAfterBreak="0">
+  <w:abstractNum w:abstractNumId="23" w15:restartNumberingAfterBreak="0">
     <w:nsid w:val="3CDF784D"/>
     <w:multiLevelType w:val="hybridMultilevel"/>
     <w:tmpl w:val="0900C048"/>
@@ -8843,7 +8892,7 @@
       </w:pPr>
     </w:lvl>
   </w:abstractNum>
-  <w:abstractNum w:abstractNumId="19" w15:restartNumberingAfterBreak="0">
+  <w:abstractNum w:abstractNumId="24" w15:restartNumberingAfterBreak="0">
     <w:nsid w:val="3F8223B4"/>
     <w:multiLevelType w:val="hybridMultilevel"/>
     <w:tmpl w:val="52FAA676"/>
@@ -8932,7 +8981,7 @@
       </w:pPr>
     </w:lvl>
   </w:abstractNum>
-  <w:abstractNum w:abstractNumId="20" w15:restartNumberingAfterBreak="0">
+  <w:abstractNum w:abstractNumId="25" w15:restartNumberingAfterBreak="0">
     <w:nsid w:val="3FFE33F4"/>
     <w:multiLevelType w:val="hybridMultilevel"/>
     <w:tmpl w:val="D416EAD0"/>
@@ -9021,7 +9070,7 @@
       </w:pPr>
     </w:lvl>
   </w:abstractNum>
-  <w:abstractNum w:abstractNumId="21" w15:restartNumberingAfterBreak="0">
+  <w:abstractNum w:abstractNumId="26" w15:restartNumberingAfterBreak="0">
     <w:nsid w:val="44B80AD7"/>
     <w:multiLevelType w:val="hybridMultilevel"/>
     <w:tmpl w:val="9EA6BB22"/>
@@ -9110,7 +9159,7 @@
       </w:pPr>
     </w:lvl>
   </w:abstractNum>
-  <w:abstractNum w:abstractNumId="22" w15:restartNumberingAfterBreak="0">
+  <w:abstractNum w:abstractNumId="27" w15:restartNumberingAfterBreak="0">
     <w:nsid w:val="49CB4204"/>
     <w:multiLevelType w:val="hybridMultilevel"/>
     <w:tmpl w:val="DC765278"/>
@@ -9199,7 +9248,7 @@
       </w:pPr>
     </w:lvl>
   </w:abstractNum>
-  <w:abstractNum w:abstractNumId="23" w15:restartNumberingAfterBreak="0">
+  <w:abstractNum w:abstractNumId="28" w15:restartNumberingAfterBreak="0">
     <w:nsid w:val="4AB40EFA"/>
     <w:multiLevelType w:val="hybridMultilevel"/>
     <w:tmpl w:val="4DB23E4A"/>
@@ -9288,7 +9337,7 @@
       </w:pPr>
     </w:lvl>
   </w:abstractNum>
-  <w:abstractNum w:abstractNumId="24" w15:restartNumberingAfterBreak="0">
+  <w:abstractNum w:abstractNumId="29" w15:restartNumberingAfterBreak="0">
     <w:nsid w:val="4B860BE4"/>
     <w:multiLevelType w:val="hybridMultilevel"/>
     <w:tmpl w:val="C95074B6"/>
@@ -9377,7 +9426,96 @@
       </w:pPr>
     </w:lvl>
   </w:abstractNum>
-  <w:abstractNum w:abstractNumId="25" w15:restartNumberingAfterBreak="0">
+  <w:abstractNum w:abstractNumId="30" w15:restartNumberingAfterBreak="0">
+    <w:nsid w:val="4B927420"/>
+    <w:multiLevelType w:val="hybridMultilevel"/>
+    <w:tmpl w:val="3A16C198"/>
+    <w:lvl w:ilvl="0" w:tplc="1CCC2E9A">
+      <w:start w:val="1"/>
+      <w:numFmt w:val="decimal"/>
+      <w:lvlText w:val="%1)"/>
+      <w:lvlJc w:val="left"/>
+      <w:pPr>
+        <w:ind w:left="564" w:hanging="360"/>
+      </w:pPr>
+      <w:rPr>
+        <w:rFonts w:hint="default"/>
+      </w:rPr>
+    </w:lvl>
+    <w:lvl w:ilvl="1" w:tplc="40090019" w:tentative="1">
+      <w:start w:val="1"/>
+      <w:numFmt w:val="lowerLetter"/>
+      <w:lvlText w:val="%2."/>
+      <w:lvlJc w:val="left"/>
+      <w:pPr>
+        <w:ind w:left="1284" w:hanging="360"/>
+      </w:pPr>
+    </w:lvl>
+    <w:lvl w:ilvl="2" w:tplc="4009001B" w:tentative="1">
+      <w:start w:val="1"/>
+      <w:numFmt w:val="lowerRoman"/>
+      <w:lvlText w:val="%3."/>
+      <w:lvlJc w:val="right"/>
+      <w:pPr>
+        <w:ind w:left="2004" w:hanging="180"/>
+      </w:pPr>
+    </w:lvl>
+    <w:lvl w:ilvl="3" w:tplc="4009000F" w:tentative="1">
+      <w:start w:val="1"/>
+      <w:numFmt w:val="decimal"/>
+      <w:lvlText w:val="%4."/>
+      <w:lvlJc w:val="left"/>
+      <w:pPr>
+        <w:ind w:left="2724" w:hanging="360"/>
+      </w:pPr>
+    </w:lvl>
+    <w:lvl w:ilvl="4" w:tplc="40090019" w:tentative="1">
+      <w:start w:val="1"/>
+      <w:numFmt w:val="lowerLetter"/>
+      <w:lvlText w:val="%5."/>
+      <w:lvlJc w:val="left"/>
+      <w:pPr>
+        <w:ind w:left="3444" w:hanging="360"/>
+      </w:pPr>
+    </w:lvl>
+    <w:lvl w:ilvl="5" w:tplc="4009001B" w:tentative="1">
+      <w:start w:val="1"/>
+      <w:numFmt w:val="lowerRoman"/>
+      <w:lvlText w:val="%6."/>
+      <w:lvlJc w:val="right"/>
+      <w:pPr>
+        <w:ind w:left="4164" w:hanging="180"/>
+      </w:pPr>
+    </w:lvl>
+    <w:lvl w:ilvl="6" w:tplc="4009000F" w:tentative="1">
+      <w:start w:val="1"/>
+      <w:numFmt w:val="decimal"/>
+      <w:lvlText w:val="%7."/>
+      <w:lvlJc w:val="left"/>
+      <w:pPr>
+        <w:ind w:left="4884" w:hanging="360"/>
+      </w:pPr>
+    </w:lvl>
+    <w:lvl w:ilvl="7" w:tplc="40090019" w:tentative="1">
+      <w:start w:val="1"/>
+      <w:numFmt w:val="lowerLetter"/>
+      <w:lvlText w:val="%8."/>
+      <w:lvlJc w:val="left"/>
+      <w:pPr>
+        <w:ind w:left="5604" w:hanging="360"/>
+      </w:pPr>
+    </w:lvl>
+    <w:lvl w:ilvl="8" w:tplc="4009001B" w:tentative="1">
+      <w:start w:val="1"/>
+      <w:numFmt w:val="lowerRoman"/>
+      <w:lvlText w:val="%9."/>
+      <w:lvlJc w:val="right"/>
+      <w:pPr>
+        <w:ind w:left="6324" w:hanging="180"/>
+      </w:pPr>
+    </w:lvl>
+  </w:abstractNum>
+  <w:abstractNum w:abstractNumId="31" w15:restartNumberingAfterBreak="0">
     <w:nsid w:val="4CFC2CCB"/>
     <w:multiLevelType w:val="hybridMultilevel"/>
     <w:tmpl w:val="538EE982"/>
@@ -9466,7 +9604,7 @@
       </w:pPr>
     </w:lvl>
   </w:abstractNum>
-  <w:abstractNum w:abstractNumId="26" w15:restartNumberingAfterBreak="0">
+  <w:abstractNum w:abstractNumId="32" w15:restartNumberingAfterBreak="0">
     <w:nsid w:val="4DBB4D77"/>
     <w:multiLevelType w:val="hybridMultilevel"/>
     <w:tmpl w:val="BFCA3FA0"/>
@@ -9555,7 +9693,7 @@
       </w:pPr>
     </w:lvl>
   </w:abstractNum>
-  <w:abstractNum w:abstractNumId="27" w15:restartNumberingAfterBreak="0">
+  <w:abstractNum w:abstractNumId="33" w15:restartNumberingAfterBreak="0">
     <w:nsid w:val="500D58EB"/>
     <w:multiLevelType w:val="hybridMultilevel"/>
     <w:tmpl w:val="1DA6B6BC"/>
@@ -9646,7 +9784,7 @@
       </w:pPr>
     </w:lvl>
   </w:abstractNum>
-  <w:abstractNum w:abstractNumId="28" w15:restartNumberingAfterBreak="0">
+  <w:abstractNum w:abstractNumId="34" w15:restartNumberingAfterBreak="0">
     <w:nsid w:val="57286165"/>
     <w:multiLevelType w:val="hybridMultilevel"/>
     <w:tmpl w:val="A9DA9432"/>
@@ -9735,7 +9873,7 @@
       </w:pPr>
     </w:lvl>
   </w:abstractNum>
-  <w:abstractNum w:abstractNumId="29" w15:restartNumberingAfterBreak="0">
+  <w:abstractNum w:abstractNumId="35" w15:restartNumberingAfterBreak="0">
     <w:nsid w:val="59875CC3"/>
     <w:multiLevelType w:val="hybridMultilevel"/>
     <w:tmpl w:val="8D9052A8"/>
@@ -9824,7 +9962,7 @@
       </w:pPr>
     </w:lvl>
   </w:abstractNum>
-  <w:abstractNum w:abstractNumId="30" w15:restartNumberingAfterBreak="0">
+  <w:abstractNum w:abstractNumId="36" w15:restartNumberingAfterBreak="0">
     <w:nsid w:val="5ED42B1B"/>
     <w:multiLevelType w:val="hybridMultilevel"/>
     <w:tmpl w:val="230E4CBE"/>
@@ -9913,7 +10051,7 @@
       </w:pPr>
     </w:lvl>
   </w:abstractNum>
-  <w:abstractNum w:abstractNumId="31" w15:restartNumberingAfterBreak="0">
+  <w:abstractNum w:abstractNumId="37" w15:restartNumberingAfterBreak="0">
     <w:nsid w:val="5F0931D9"/>
     <w:multiLevelType w:val="hybridMultilevel"/>
     <w:tmpl w:val="B2F028A8"/>
@@ -10002,7 +10140,7 @@
       </w:pPr>
     </w:lvl>
   </w:abstractNum>
-  <w:abstractNum w:abstractNumId="32" w15:restartNumberingAfterBreak="0">
+  <w:abstractNum w:abstractNumId="38" w15:restartNumberingAfterBreak="0">
     <w:nsid w:val="61512C07"/>
     <w:multiLevelType w:val="hybridMultilevel"/>
     <w:tmpl w:val="78526BF0"/>
@@ -10091,7 +10229,7 @@
       </w:pPr>
     </w:lvl>
   </w:abstractNum>
-  <w:abstractNum w:abstractNumId="33" w15:restartNumberingAfterBreak="0">
+  <w:abstractNum w:abstractNumId="39" w15:restartNumberingAfterBreak="0">
     <w:nsid w:val="6741648B"/>
     <w:multiLevelType w:val="hybridMultilevel"/>
     <w:tmpl w:val="09D0E646"/>
@@ -10180,7 +10318,7 @@
       </w:pPr>
     </w:lvl>
   </w:abstractNum>
-  <w:abstractNum w:abstractNumId="34" w15:restartNumberingAfterBreak="0">
+  <w:abstractNum w:abstractNumId="40" w15:restartNumberingAfterBreak="0">
     <w:nsid w:val="6BBD7F97"/>
     <w:multiLevelType w:val="hybridMultilevel"/>
     <w:tmpl w:val="C712AB82"/>
@@ -10269,7 +10407,7 @@
       </w:pPr>
     </w:lvl>
   </w:abstractNum>
-  <w:abstractNum w:abstractNumId="35" w15:restartNumberingAfterBreak="0">
+  <w:abstractNum w:abstractNumId="41" w15:restartNumberingAfterBreak="0">
     <w:nsid w:val="6C787C33"/>
     <w:multiLevelType w:val="hybridMultilevel"/>
     <w:tmpl w:val="52226456"/>
@@ -10358,7 +10496,7 @@
       </w:pPr>
     </w:lvl>
   </w:abstractNum>
-  <w:abstractNum w:abstractNumId="36" w15:restartNumberingAfterBreak="0">
+  <w:abstractNum w:abstractNumId="42" w15:restartNumberingAfterBreak="0">
     <w:nsid w:val="6C891ED1"/>
     <w:multiLevelType w:val="hybridMultilevel"/>
     <w:tmpl w:val="AFC6B320"/>
@@ -10447,7 +10585,7 @@
       </w:pPr>
     </w:lvl>
   </w:abstractNum>
-  <w:abstractNum w:abstractNumId="37" w15:restartNumberingAfterBreak="0">
+  <w:abstractNum w:abstractNumId="43" w15:restartNumberingAfterBreak="0">
     <w:nsid w:val="6FA56498"/>
     <w:multiLevelType w:val="hybridMultilevel"/>
     <w:tmpl w:val="EC9CE2A6"/>
@@ -10538,7 +10676,7 @@
       </w:pPr>
     </w:lvl>
   </w:abstractNum>
-  <w:abstractNum w:abstractNumId="38" w15:restartNumberingAfterBreak="0">
+  <w:abstractNum w:abstractNumId="44" w15:restartNumberingAfterBreak="0">
     <w:nsid w:val="73402F57"/>
     <w:multiLevelType w:val="hybridMultilevel"/>
     <w:tmpl w:val="62780A74"/>
@@ -10627,7 +10765,7 @@
       </w:pPr>
     </w:lvl>
   </w:abstractNum>
-  <w:abstractNum w:abstractNumId="39" w15:restartNumberingAfterBreak="0">
+  <w:abstractNum w:abstractNumId="45" w15:restartNumberingAfterBreak="0">
     <w:nsid w:val="74704194"/>
     <w:multiLevelType w:val="hybridMultilevel"/>
     <w:tmpl w:val="54C47C80"/>
@@ -10716,7 +10854,7 @@
       </w:pPr>
     </w:lvl>
   </w:abstractNum>
-  <w:abstractNum w:abstractNumId="40" w15:restartNumberingAfterBreak="0">
+  <w:abstractNum w:abstractNumId="46" w15:restartNumberingAfterBreak="0">
     <w:nsid w:val="7527302C"/>
     <w:multiLevelType w:val="hybridMultilevel"/>
     <w:tmpl w:val="4A6C8924"/>
@@ -10805,7 +10943,7 @@
       </w:pPr>
     </w:lvl>
   </w:abstractNum>
-  <w:abstractNum w:abstractNumId="41" w15:restartNumberingAfterBreak="0">
+  <w:abstractNum w:abstractNumId="47" w15:restartNumberingAfterBreak="0">
     <w:nsid w:val="7F715AAC"/>
     <w:multiLevelType w:val="hybridMultilevel"/>
     <w:tmpl w:val="20FCC3D2"/>
@@ -10895,130 +11033,148 @@
     </w:lvl>
   </w:abstractNum>
   <w:num w:numId="1" w16cid:durableId="1929191308">
+    <w:abstractNumId w:val="39"/>
+  </w:num>
+  <w:num w:numId="2" w16cid:durableId="1452818009">
+    <w:abstractNumId w:val="34"/>
+  </w:num>
+  <w:num w:numId="3" w16cid:durableId="379129943">
+    <w:abstractNumId w:val="29"/>
+  </w:num>
+  <w:num w:numId="4" w16cid:durableId="1063913110">
+    <w:abstractNumId w:val="44"/>
+  </w:num>
+  <w:num w:numId="5" w16cid:durableId="1823230013">
+    <w:abstractNumId w:val="47"/>
+  </w:num>
+  <w:num w:numId="6" w16cid:durableId="1228151261">
+    <w:abstractNumId w:val="10"/>
+  </w:num>
+  <w:num w:numId="7" w16cid:durableId="516432532">
+    <w:abstractNumId w:val="7"/>
+  </w:num>
+  <w:num w:numId="8" w16cid:durableId="1301885363">
+    <w:abstractNumId w:val="9"/>
+  </w:num>
+  <w:num w:numId="9" w16cid:durableId="1485926871">
     <w:abstractNumId w:val="33"/>
   </w:num>
-  <w:num w:numId="2" w16cid:durableId="1452818009">
+  <w:num w:numId="10" w16cid:durableId="382295947">
+    <w:abstractNumId w:val="45"/>
+  </w:num>
+  <w:num w:numId="11" w16cid:durableId="266929314">
+    <w:abstractNumId w:val="37"/>
+  </w:num>
+  <w:num w:numId="12" w16cid:durableId="858810609">
+    <w:abstractNumId w:val="19"/>
+  </w:num>
+  <w:num w:numId="13" w16cid:durableId="920332385">
+    <w:abstractNumId w:val="36"/>
+  </w:num>
+  <w:num w:numId="14" w16cid:durableId="1438059950">
+    <w:abstractNumId w:val="12"/>
+  </w:num>
+  <w:num w:numId="15" w16cid:durableId="1506941495">
+    <w:abstractNumId w:val="42"/>
+  </w:num>
+  <w:num w:numId="16" w16cid:durableId="1229996536">
+    <w:abstractNumId w:val="25"/>
+  </w:num>
+  <w:num w:numId="17" w16cid:durableId="47920956">
+    <w:abstractNumId w:val="40"/>
+  </w:num>
+  <w:num w:numId="18" w16cid:durableId="1369448543">
+    <w:abstractNumId w:val="43"/>
+  </w:num>
+  <w:num w:numId="19" w16cid:durableId="283193473">
+    <w:abstractNumId w:val="3"/>
+  </w:num>
+  <w:num w:numId="20" w16cid:durableId="848714178">
+    <w:abstractNumId w:val="32"/>
+  </w:num>
+  <w:num w:numId="21" w16cid:durableId="857545553">
+    <w:abstractNumId w:val="24"/>
+  </w:num>
+  <w:num w:numId="22" w16cid:durableId="492532390">
+    <w:abstractNumId w:val="46"/>
+  </w:num>
+  <w:num w:numId="23" w16cid:durableId="396367076">
+    <w:abstractNumId w:val="38"/>
+  </w:num>
+  <w:num w:numId="24" w16cid:durableId="227307955">
+    <w:abstractNumId w:val="13"/>
+  </w:num>
+  <w:num w:numId="25" w16cid:durableId="17509084">
+    <w:abstractNumId w:val="31"/>
+  </w:num>
+  <w:num w:numId="26" w16cid:durableId="1146581446">
+    <w:abstractNumId w:val="1"/>
+  </w:num>
+  <w:num w:numId="27" w16cid:durableId="389350057">
+    <w:abstractNumId w:val="15"/>
+  </w:num>
+  <w:num w:numId="28" w16cid:durableId="1149519509">
+    <w:abstractNumId w:val="26"/>
+  </w:num>
+  <w:num w:numId="29" w16cid:durableId="1244485211">
+    <w:abstractNumId w:val="16"/>
+  </w:num>
+  <w:num w:numId="30" w16cid:durableId="878470731">
+    <w:abstractNumId w:val="4"/>
+  </w:num>
+  <w:num w:numId="31" w16cid:durableId="511141832">
+    <w:abstractNumId w:val="18"/>
+  </w:num>
+  <w:num w:numId="32" w16cid:durableId="1470854529">
+    <w:abstractNumId w:val="8"/>
+  </w:num>
+  <w:num w:numId="33" w16cid:durableId="1618953520">
+    <w:abstractNumId w:val="41"/>
+  </w:num>
+  <w:num w:numId="34" w16cid:durableId="211234391">
+    <w:abstractNumId w:val="2"/>
+  </w:num>
+  <w:num w:numId="35" w16cid:durableId="1606377627">
+    <w:abstractNumId w:val="35"/>
+  </w:num>
+  <w:num w:numId="36" w16cid:durableId="360866260">
     <w:abstractNumId w:val="28"/>
   </w:num>
-  <w:num w:numId="3" w16cid:durableId="379129943">
-    <w:abstractNumId w:val="24"/>
+  <w:num w:numId="37" w16cid:durableId="527376701">
+    <w:abstractNumId w:val="22"/>
   </w:num>
-  <w:num w:numId="4" w16cid:durableId="1063913110">
-    <w:abstractNumId w:val="38"/>
+  <w:num w:numId="38" w16cid:durableId="1741711442">
+    <w:abstractNumId w:val="23"/>
   </w:num>
-  <w:num w:numId="5" w16cid:durableId="1823230013">
-    <w:abstractNumId w:val="41"/>
+  <w:num w:numId="39" w16cid:durableId="836387608">
+    <w:abstractNumId w:val="27"/>
   </w:num>
-  <w:num w:numId="6" w16cid:durableId="1228151261">
-    <w:abstractNumId w:val="7"/>
+  <w:num w:numId="40" w16cid:durableId="1845123811">
+    <w:abstractNumId w:val="17"/>
   </w:num>
-  <w:num w:numId="7" w16cid:durableId="516432532">
-    <w:abstractNumId w:val="4"/>
+  <w:num w:numId="41" w16cid:durableId="390660794">
+    <w:abstractNumId w:val="11"/>
   </w:num>
-  <w:num w:numId="8" w16cid:durableId="1301885363">
+  <w:num w:numId="42" w16cid:durableId="1574511577">
+    <w:abstractNumId w:val="21"/>
+  </w:num>
+  <w:num w:numId="43" w16cid:durableId="1029722799">
     <w:abstractNumId w:val="6"/>
   </w:num>
-  <w:num w:numId="9" w16cid:durableId="1485926871">
-    <w:abstractNumId w:val="27"/>
-  </w:num>
-  <w:num w:numId="10" w16cid:durableId="382295947">
-    <w:abstractNumId w:val="39"/>
-  </w:num>
-  <w:num w:numId="11" w16cid:durableId="266929314">
-    <w:abstractNumId w:val="31"/>
-  </w:num>
-  <w:num w:numId="12" w16cid:durableId="858810609">
-    <w:abstractNumId w:val="15"/>
-  </w:num>
-  <w:num w:numId="13" w16cid:durableId="920332385">
+  <w:num w:numId="44" w16cid:durableId="1927299459">
     <w:abstractNumId w:val="30"/>
   </w:num>
-  <w:num w:numId="14" w16cid:durableId="1438059950">
-    <w:abstractNumId w:val="9"/>
+  <w:num w:numId="45" w16cid:durableId="1100493774">
+    <w:abstractNumId w:val="14"/>
   </w:num>
-  <w:num w:numId="15" w16cid:durableId="1506941495">
-    <w:abstractNumId w:val="36"/>
-  </w:num>
-  <w:num w:numId="16" w16cid:durableId="1229996536">
+  <w:num w:numId="46" w16cid:durableId="756750740">
     <w:abstractNumId w:val="20"/>
   </w:num>
-  <w:num w:numId="17" w16cid:durableId="47920956">
-    <w:abstractNumId w:val="34"/>
-  </w:num>
-  <w:num w:numId="18" w16cid:durableId="1369448543">
-    <w:abstractNumId w:val="37"/>
-  </w:num>
-  <w:num w:numId="19" w16cid:durableId="283193473">
-    <w:abstractNumId w:val="2"/>
-  </w:num>
-  <w:num w:numId="20" w16cid:durableId="848714178">
-    <w:abstractNumId w:val="26"/>
-  </w:num>
-  <w:num w:numId="21" w16cid:durableId="857545553">
-    <w:abstractNumId w:val="19"/>
-  </w:num>
-  <w:num w:numId="22" w16cid:durableId="492532390">
-    <w:abstractNumId w:val="40"/>
-  </w:num>
-  <w:num w:numId="23" w16cid:durableId="396367076">
-    <w:abstractNumId w:val="32"/>
-  </w:num>
-  <w:num w:numId="24" w16cid:durableId="227307955">
-    <w:abstractNumId w:val="10"/>
-  </w:num>
-  <w:num w:numId="25" w16cid:durableId="17509084">
-    <w:abstractNumId w:val="25"/>
-  </w:num>
-  <w:num w:numId="26" w16cid:durableId="1146581446">
+  <w:num w:numId="47" w16cid:durableId="2046325363">
     <w:abstractNumId w:val="0"/>
   </w:num>
-  <w:num w:numId="27" w16cid:durableId="389350057">
-    <w:abstractNumId w:val="11"/>
-  </w:num>
-  <w:num w:numId="28" w16cid:durableId="1149519509">
-    <w:abstractNumId w:val="21"/>
-  </w:num>
-  <w:num w:numId="29" w16cid:durableId="1244485211">
-    <w:abstractNumId w:val="12"/>
-  </w:num>
-  <w:num w:numId="30" w16cid:durableId="878470731">
-    <w:abstractNumId w:val="3"/>
-  </w:num>
-  <w:num w:numId="31" w16cid:durableId="511141832">
-    <w:abstractNumId w:val="14"/>
-  </w:num>
-  <w:num w:numId="32" w16cid:durableId="1470854529">
+  <w:num w:numId="48" w16cid:durableId="1699773954">
     <w:abstractNumId w:val="5"/>
-  </w:num>
-  <w:num w:numId="33" w16cid:durableId="1618953520">
-    <w:abstractNumId w:val="35"/>
-  </w:num>
-  <w:num w:numId="34" w16cid:durableId="211234391">
-    <w:abstractNumId w:val="1"/>
-  </w:num>
-  <w:num w:numId="35" w16cid:durableId="1606377627">
-    <w:abstractNumId w:val="29"/>
-  </w:num>
-  <w:num w:numId="36" w16cid:durableId="360866260">
-    <w:abstractNumId w:val="23"/>
-  </w:num>
-  <w:num w:numId="37" w16cid:durableId="527376701">
-    <w:abstractNumId w:val="17"/>
-  </w:num>
-  <w:num w:numId="38" w16cid:durableId="1741711442">
-    <w:abstractNumId w:val="18"/>
-  </w:num>
-  <w:num w:numId="39" w16cid:durableId="836387608">
-    <w:abstractNumId w:val="22"/>
-  </w:num>
-  <w:num w:numId="40" w16cid:durableId="1845123811">
-    <w:abstractNumId w:val="13"/>
-  </w:num>
-  <w:num w:numId="41" w16cid:durableId="390660794">
-    <w:abstractNumId w:val="8"/>
-  </w:num>
-  <w:num w:numId="42" w16cid:durableId="1574511577">
-    <w:abstractNumId w:val="16"/>
   </w:num>
 </w:numbering>
 </file>

</xml_diff>